<commit_message>
Bog: opdateret forord med Becker-afsnit
Erstatter forordet med Niklas' redigerede version. Det nye forord
inkluderer et tilføjet afsnit om Rollin E. Becker som Sutherlands
nærmeste elev og direkte mentor for James Jealous — så genealogien
Still → Sutherland → Becker → Jealous nu trækkes klart op i bogens
første sider.

Forordet er hardcoded i render_forord() i byg_bog.py (bog-only),
så app'ens info.html forbliver uberørt. App'en (ude hos behandlere)
ændres ikke.

Det redigerbare udkast bruger samme bog-version af forordet via
byg_redigerbart.render_forord().
</commit_message>
<xml_diff>
--- a/tools/output/manuskript-redigerbar.docx
+++ b/tools/output/manuskript-redigerbar.docx
@@ -559,15 +559,23 @@
         <w:pStyle w:val="BodyText"/>
       </w:pPr>
       <w:r>
-        <w:t xml:space="preserve">Osteopaten James Jealous gjorde netop dette, da han lod de osteopatiske principper møde den embryologiske proces, som den tyske embryolog Erich Blechschmidt havde studeret minutiøst gennem tusindvis af skanninger af fostret i dets forskellige faser af vækst og udvikling. Det var dette møde, der gjorde det muligt for Jealous at samle brikkerne og skabe den biodynamiske model. Hans formuleringer er den fælles reference for alle grene af det biodynamiske arbejde — såvel inden for osteopatien som inden for kranio-sakral terapien.</w:t>
-      </w:r>
-    </w:p>
-    <w:p>
-      <w:pPr>
-        <w:pStyle w:val="BodyText"/>
-      </w:pPr>
-      <w:r>
-        <w:t xml:space="preserve">Min egen rejse har afsæt i den biomekaniske gren af kranio-sakral terapi. Den benyttede jeg de første syv år af min karriere og underviste i. Sidenhen begyndte jeg at anvende den biodynamiske model — det er den jeg har arbejdet med de seneste 17 år, både i min egen klinik og på de kurser hvor jeg har undervist kolleger. Gennem hele min karriere har det været naturligt for mig at inddrage inspiration fra andre traditioner og lade mit arbejde farves og forvandles af deres erfaringer og indsigter.</w:t>
+        <w:t xml:space="preserve">Rollin E. Becker var en af Sutherlands nærmeste elever og fulgte hans arbejde og visioner — han var optaget af at dykke dybere og med egne hænder opleve, hvad hans lærer fortalte. Han blev ved Sutherlands side frem til hans død og gav ikke alene faklen videre, men bidrog selv med sine egne erfaringer og blev en enestående mentor for mange osteopater — herunder James Jealous.</w:t>
+      </w:r>
+    </w:p>
+    <w:p>
+      <w:pPr>
+        <w:pStyle w:val="BodyText"/>
+      </w:pPr>
+      <w:r>
+        <w:t xml:space="preserve">James Jealous lærte direkte fra Dr. Becker og førte essensen af Sutherlands indsigter ad nye veje, da han lod de osteopatiske principper møde den embryologiske proces, som den tyske embryolog Erich Blechschmidt havde studeret minutiøst gennem tusindvis af skanninger af fostret i dets forskellige faser af vækst og udvikling. Det var dette møde, der gjorde det muligt for Jealous at samle brikkerne og skabe den biodynamiske model. Hans formuleringer er den fælles reference for alle grene af det biodynamiske arbejde — såvel inden for osteopatien som inden for kranio-sakral terapien.</w:t>
+      </w:r>
+    </w:p>
+    <w:p>
+      <w:pPr>
+        <w:pStyle w:val="BodyText"/>
+      </w:pPr>
+      <w:r>
+        <w:t xml:space="preserve">Min egen rejse har afsæt i den biomekaniske gren af kranio-sakral terapi. Den benyttede jeg de første syv år af min karriere og underviste i. Sidenhen begyndte jeg at anvende den biodynamiske model — det er den jeg har arbejdet med de seneste 17 år, både i min egen klinik og på de kurser, hvor jeg har undervist kolleger. Gennem hele min karriere har det været naturligt for mig at inddrage inspiration fra andre traditioner og lade mit arbejde farves og forvandles af deres erfaringer og indsigter.</w:t>
       </w:r>
     </w:p>
     <w:p>

</xml_diff>

<commit_message>
Redigerbart udkast: 3 inspirations-paragraffer pr. begreb og rum
For hvert af de 18 begreber og 5 rum tilføjes en INSPIRATION-blok
med tre kursiv-paragraffer (35-50 ord) der byder nye vinkler:

- Sansning og embodied detail
- Forbindelse til moderne forskning eller andre traditioner
- Pragmatisk observation om når det IKKE viser sig

Inspirations-blokken placeres efter alle brødtekst-sektioner,
lige før REFLEKSIONSSPØRGSMÅL. Markeret med
'[INSPIRATION — nye vinkler at overveje]' så de visuelt skiller
sig fra eksisterende tekst, og hver paragraf står i kursiv.

Tilføjet kun i det redigerbare udkast (manuskript-redigerbar.docx),
ikke i selve bogen eller appen — det er Niklas' inspirationsmateriale
til hans egen redaktion.
</commit_message>
<xml_diff>
--- a/tools/output/manuskript-redigerbar.docx
+++ b/tools/output/manuskript-redigerbar.docx
@@ -2361,6 +2361,54 @@
           <w:bCs/>
           <w:b/>
         </w:rPr>
+        <w:t xml:space="preserve">[INSPIRATION — nye vinkler at overveje]</w:t>
+      </w:r>
+    </w:p>
+    <w:p>
+      <w:pPr>
+        <w:pStyle w:val="BodyText"/>
+      </w:pPr>
+      <w:r>
+        <w:rPr>
+          <w:iCs/>
+          <w:i/>
+        </w:rPr>
+        <w:t xml:space="preserve">Når Dynamisk Stilhed viser sig i hænderne, er det ofte ikke som fravær men som en kvalitet af bæren — som om vævet hviler i noget der holder det. Mange behandlere beskriver det som at sidde over et dybt vand de ikke længere skal forstyrre.</w:t>
+      </w:r>
+    </w:p>
+    <w:p>
+      <w:pPr>
+        <w:pStyle w:val="BodyText"/>
+      </w:pPr>
+      <w:r>
+        <w:rPr>
+          <w:iCs/>
+          <w:i/>
+        </w:rPr>
+        <w:t xml:space="preserve">Stilheden lader sig genkende på tværs af traditioner — i zazen-meditation, i den apophatiske teologis gud-uden-egenskaber, i ørkenfædrenes hesychia. Det betyder ikke at de er det samme — kun at mennesket har erfaret denne kvalitet før, og at vi ikke står alene i den.</w:t>
+      </w:r>
+    </w:p>
+    <w:p>
+      <w:pPr>
+        <w:pStyle w:val="BodyText"/>
+      </w:pPr>
+      <w:r>
+        <w:rPr>
+          <w:iCs/>
+          <w:i/>
+        </w:rPr>
+        <w:t xml:space="preserve">Den kommer ikke på vores invitation, og hyppigst slet ikke. De fleste behandlinger forløber uden at Dynamisk Stilhed viser sig direkte, og det er som det skal være. At vente på den er ofte den sikreste måde at lukke døren til den.</w:t>
+      </w:r>
+    </w:p>
+    <w:p>
+      <w:pPr>
+        <w:pStyle w:val="BodyText"/>
+      </w:pPr>
+      <w:r>
+        <w:rPr>
+          <w:bCs/>
+          <w:b/>
+        </w:rPr>
         <w:t xml:space="preserve">[REFLEKSIONSSPØRGSMÅL]</w:t>
       </w:r>
     </w:p>
@@ -2511,6 +2559,96 @@
           <w:bCs/>
           <w:b/>
         </w:rPr>
+        <w:t xml:space="preserve">[INSPIRATION — nye vinkler at overveje]</w:t>
+      </w:r>
+    </w:p>
+    <w:p>
+      <w:pPr>
+        <w:pStyle w:val="BodyText"/>
+      </w:pPr>
+      <w:r>
+        <w:rPr>
+          <w:iCs/>
+          <w:i/>
+        </w:rPr>
+        <w:t xml:space="preserve">Sutherland skelnede skarpt mellem det fysiske åndedrag og Breath of Life. De er ikke det samme, men de mødes — som om åndedrættet er en daglig påmindelse om noget langt dybere der bærer vores liv hvert øjeblik, ikke kun ved indånding.</w:t>
+      </w:r>
+    </w:p>
+    <w:p>
+      <w:pPr>
+        <w:pStyle w:val="BodyText"/>
+      </w:pPr>
+      <w:r>
+        <w:rPr>
+          <w:iCs/>
+          <w:i/>
+        </w:rPr>
+        <w:t xml:space="preserve">Klienter beskriver nogle gange en oplevelse af</w:t>
+      </w:r>
+      <w:r>
+        <w:rPr>
+          <w:iCs/>
+          <w:i/>
+        </w:rPr>
+        <w:t xml:space="preserve"> </w:t>
+      </w:r>
+      <w:r>
+        <w:rPr>
+          <w:iCs/>
+          <w:i/>
+        </w:rPr>
+        <w:t xml:space="preserve">‘</w:t>
+      </w:r>
+      <w:r>
+        <w:rPr>
+          <w:iCs/>
+          <w:i/>
+        </w:rPr>
+        <w:t xml:space="preserve">første åndedrag</w:t>
+      </w:r>
+      <w:r>
+        <w:rPr>
+          <w:iCs/>
+          <w:i/>
+        </w:rPr>
+        <w:t xml:space="preserve">’</w:t>
+      </w:r>
+      <w:r>
+        <w:rPr>
+          <w:iCs/>
+          <w:i/>
+        </w:rPr>
+        <w:t xml:space="preserve"> </w:t>
+      </w:r>
+      <w:r>
+        <w:rPr>
+          <w:iCs/>
+          <w:i/>
+        </w:rPr>
+        <w:t xml:space="preserve">under en behandling — noget der trækker vejret i dem som de ikke selv styrer. Det er ofte i sådanne øjeblikke at heling, der har ventet, finder sin egen vej ind.</w:t>
+      </w:r>
+    </w:p>
+    <w:p>
+      <w:pPr>
+        <w:pStyle w:val="BodyText"/>
+      </w:pPr>
+      <w:r>
+        <w:rPr>
+          <w:iCs/>
+          <w:i/>
+        </w:rPr>
+        <w:t xml:space="preserve">Når Breath of Life føles fjern, er det som regel ikke et tegn på at den er væk — kun at vi leder efter den med vores aktive opmærksomhed. Den findes oftest når vi holder op med at lede og bare bliver i det vi mærker.</w:t>
+      </w:r>
+    </w:p>
+    <w:p>
+      <w:pPr>
+        <w:pStyle w:val="BodyText"/>
+      </w:pPr>
+      <w:r>
+        <w:rPr>
+          <w:bCs/>
+          <w:b/>
+        </w:rPr>
         <w:t xml:space="preserve">[REFLEKSIONSSPØRGSMÅL]</w:t>
       </w:r>
     </w:p>
@@ -2681,6 +2819,54 @@
           <w:bCs/>
           <w:b/>
         </w:rPr>
+        <w:t xml:space="preserve">[INSPIRATION — nye vinkler at overveje]</w:t>
+      </w:r>
+    </w:p>
+    <w:p>
+      <w:pPr>
+        <w:pStyle w:val="BodyText"/>
+      </w:pPr>
+      <w:r>
+        <w:rPr>
+          <w:iCs/>
+          <w:i/>
+        </w:rPr>
+        <w:t xml:space="preserve">Den 100-sekunders cyklus er ikke en målbar konstant — Sutherland talte om 6-10 cyklusser per 10. minut, Jealous formulerede 100 sekunder vejledende. Tallene er pejlemærker, ikke definitioner. Det egentlige er at en langsom rytme bærer livet på et niveau under den hurtige.</w:t>
+      </w:r>
+    </w:p>
+    <w:p>
+      <w:pPr>
+        <w:pStyle w:val="BodyText"/>
+      </w:pPr>
+      <w:r>
+        <w:rPr>
+          <w:iCs/>
+          <w:i/>
+        </w:rPr>
+        <w:t xml:space="preserve">Læringen af Primary Respiration sker ikke gennem måling men gennem mentor-overlevering: en erfaren behandler holder hænderne med dig på en klient, og over tid genkender du det han eller hun mærker. Det er en mundtlig tradition mere end en målbar færdighed.</w:t>
+      </w:r>
+    </w:p>
+    <w:p>
+      <w:pPr>
+        <w:pStyle w:val="BodyText"/>
+      </w:pPr>
+      <w:r>
+        <w:rPr>
+          <w:iCs/>
+          <w:i/>
+        </w:rPr>
+        <w:t xml:space="preserve">Forskellen fra den kranielle rytme (CRI på 8-12 cyklusser per minut) er væsentlig — Primary Respiration er noget andet, langsommere, dybere. Begge findes, men de svarer ikke på de samme behandlings-greb. Bevidst at adskille dem skærper hænderne.</w:t>
+      </w:r>
+    </w:p>
+    <w:p>
+      <w:pPr>
+        <w:pStyle w:val="BodyText"/>
+      </w:pPr>
+      <w:r>
+        <w:rPr>
+          <w:bCs/>
+          <w:b/>
+        </w:rPr>
         <w:t xml:space="preserve">[REFLEKSIONSSPØRGSMÅL]</w:t>
       </w:r>
     </w:p>
@@ -2831,6 +3017,54 @@
           <w:bCs/>
           <w:b/>
         </w:rPr>
+        <w:t xml:space="preserve">[INSPIRATION — nye vinkler at overveje]</w:t>
+      </w:r>
+    </w:p>
+    <w:p>
+      <w:pPr>
+        <w:pStyle w:val="BodyText"/>
+      </w:pPr>
+      <w:r>
+        <w:rPr>
+          <w:iCs/>
+          <w:i/>
+        </w:rPr>
+        <w:t xml:space="preserve">Sills’ typologi af midtlinjer — primal, quantum, fluid, notochordal — kan være nyttig: hver midtlinje opstår som svar på et bestemt udviklingsfald. At mærke flere på samme klient handler om at vide hvilken man arbejder med, ikke om at samle dem alle.</w:t>
+      </w:r>
+    </w:p>
+    <w:p>
+      <w:pPr>
+        <w:pStyle w:val="BodyText"/>
+      </w:pPr>
+      <w:r>
+        <w:rPr>
+          <w:iCs/>
+          <w:i/>
+        </w:rPr>
+        <w:t xml:space="preserve">Embryologisk er midtlinjen ikke en linje men en proces. Notochorden, der dannes i tredje uge, organiserer alt omkring sig — og bliver siden til midten af mellemvirvelskiverne. Noget af denne organiserende impuls fortsætter i kroppen hele livet.</w:t>
+      </w:r>
+    </w:p>
+    <w:p>
+      <w:pPr>
+        <w:pStyle w:val="BodyText"/>
+      </w:pPr>
+      <w:r>
+        <w:rPr>
+          <w:iCs/>
+          <w:i/>
+        </w:rPr>
+        <w:t xml:space="preserve">Den følte midtlinje matcher ikke altid den anatomiske. Klienter kan have funktionelle midtlinjer der er forskudt af gamle traumer — bækkenet et sted, hovedet et andet. At arbejde med disse parallelle akser kræver tålmodighed mere end korrektion.</w:t>
+      </w:r>
+    </w:p>
+    <w:p>
+      <w:pPr>
+        <w:pStyle w:val="BodyText"/>
+      </w:pPr>
+      <w:r>
+        <w:rPr>
+          <w:bCs/>
+          <w:b/>
+        </w:rPr>
         <w:t xml:space="preserve">[REFLEKSIONSSPØRGSMÅL]</w:t>
       </w:r>
     </w:p>
@@ -2981,6 +3215,138 @@
           <w:bCs/>
           <w:b/>
         </w:rPr>
+        <w:t xml:space="preserve">[INSPIRATION — nye vinkler at overveje]</w:t>
+      </w:r>
+    </w:p>
+    <w:p>
+      <w:pPr>
+        <w:pStyle w:val="BodyText"/>
+      </w:pPr>
+      <w:r>
+        <w:rPr>
+          <w:iCs/>
+          <w:i/>
+        </w:rPr>
+        <w:t xml:space="preserve">Becker insisterede på at sundheden altid er til stede — også hos den syge, også hos den døende. Det er en fagligt vigtig position: vi behandler ikke noget vi tilføjer, men noget der allerede er der, som har brug for plads til at udfolde sig.</w:t>
+      </w:r>
+    </w:p>
+    <w:p>
+      <w:pPr>
+        <w:pStyle w:val="BodyText"/>
+      </w:pPr>
+      <w:r>
+        <w:rPr>
+          <w:iCs/>
+          <w:i/>
+        </w:rPr>
+        <w:t xml:space="preserve">I kontrast til symptom-fokuseret medicin starter biodynamikken fra det modsatte sted: ikke</w:t>
+      </w:r>
+      <w:r>
+        <w:rPr>
+          <w:iCs/>
+          <w:i/>
+        </w:rPr>
+        <w:t xml:space="preserve"> </w:t>
+      </w:r>
+      <w:r>
+        <w:rPr>
+          <w:iCs/>
+          <w:i/>
+        </w:rPr>
+        <w:t xml:space="preserve">‘</w:t>
+      </w:r>
+      <w:r>
+        <w:rPr>
+          <w:iCs/>
+          <w:i/>
+        </w:rPr>
+        <w:t xml:space="preserve">hvad er galt</w:t>
+      </w:r>
+      <w:r>
+        <w:rPr>
+          <w:iCs/>
+          <w:i/>
+        </w:rPr>
+        <w:t xml:space="preserve">’</w:t>
+      </w:r>
+      <w:r>
+        <w:rPr>
+          <w:iCs/>
+          <w:i/>
+        </w:rPr>
+        <w:t xml:space="preserve"> </w:t>
+      </w:r>
+      <w:r>
+        <w:rPr>
+          <w:iCs/>
+          <w:i/>
+        </w:rPr>
+        <w:t xml:space="preserve">men</w:t>
+      </w:r>
+      <w:r>
+        <w:rPr>
+          <w:iCs/>
+          <w:i/>
+        </w:rPr>
+        <w:t xml:space="preserve"> </w:t>
+      </w:r>
+      <w:r>
+        <w:rPr>
+          <w:iCs/>
+          <w:i/>
+        </w:rPr>
+        <w:t xml:space="preserve">‘</w:t>
+      </w:r>
+      <w:r>
+        <w:rPr>
+          <w:iCs/>
+          <w:i/>
+        </w:rPr>
+        <w:t xml:space="preserve">hvad er rigtigt</w:t>
+      </w:r>
+      <w:r>
+        <w:rPr>
+          <w:iCs/>
+          <w:i/>
+        </w:rPr>
+        <w:t xml:space="preserve">’</w:t>
+      </w:r>
+      <w:r>
+        <w:rPr>
+          <w:iCs/>
+          <w:i/>
+        </w:rPr>
+        <w:t xml:space="preserve"> </w:t>
+      </w:r>
+      <w:r>
+        <w:rPr>
+          <w:iCs/>
+          <w:i/>
+        </w:rPr>
+        <w:t xml:space="preserve">— også midt i krisen. Det er ikke optimisme. Det er en faglig disciplin der ændrer hvilke informationer vi mærker.</w:t>
+      </w:r>
+    </w:p>
+    <w:p>
+      <w:pPr>
+        <w:pStyle w:val="BodyText"/>
+      </w:pPr>
+      <w:r>
+        <w:rPr>
+          <w:iCs/>
+          <w:i/>
+        </w:rPr>
+        <w:t xml:space="preserve">Hvad gør vi når klienten ikke kan mærke sundheden i sig selv? Vi venter ikke på at de finder den. Vi arbejder fra antagelsen om at den findes, og lader vores hænder hvile på det sted hvor den endnu kan ses.</w:t>
+      </w:r>
+    </w:p>
+    <w:p>
+      <w:pPr>
+        <w:pStyle w:val="BodyText"/>
+      </w:pPr>
+      <w:r>
+        <w:rPr>
+          <w:bCs/>
+          <w:b/>
+        </w:rPr>
         <w:t xml:space="preserve">[REFLEKSIONSSPØRGSMÅL]</w:t>
       </w:r>
     </w:p>
@@ -3131,6 +3497,54 @@
           <w:bCs/>
           <w:b/>
         </w:rPr>
+        <w:t xml:space="preserve">[INSPIRATION — nye vinkler at overveje]</w:t>
+      </w:r>
+    </w:p>
+    <w:p>
+      <w:pPr>
+        <w:pStyle w:val="BodyText"/>
+      </w:pPr>
+      <w:r>
+        <w:rPr>
+          <w:iCs/>
+          <w:i/>
+        </w:rPr>
+        <w:t xml:space="preserve">Motion Present er ikke én bevægelse men et væv af mange — fra cellulær mikrobevægelse til store fasciale ruller. At lære at lytte til dem alle uden at vælge er en disciplin: vi bliver ikke specialister i én rytme men generalister i bevægelsens fylde.</w:t>
+      </w:r>
+    </w:p>
+    <w:p>
+      <w:pPr>
+        <w:pStyle w:val="BodyText"/>
+      </w:pPr>
+      <w:r>
+        <w:rPr>
+          <w:iCs/>
+          <w:i/>
+        </w:rPr>
+        <w:t xml:space="preserve">Når Motion Present pludselig stiger i intensitet, er det ofte fordi systemet har fundet noget at arbejde med. Når den falder næsten til nul, er vi sjældent ude i et tomrum — oftest tæt på Stillpoint eller The Neutral. Begge tilstande er informative.</w:t>
+      </w:r>
+    </w:p>
+    <w:p>
+      <w:pPr>
+        <w:pStyle w:val="BodyText"/>
+      </w:pPr>
+      <w:r>
+        <w:rPr>
+          <w:iCs/>
+          <w:i/>
+        </w:rPr>
+        <w:t xml:space="preserve">At se efter motion præsent er ikke det samme som at lede efter den. Når vi leder, sender vi små signaler ind i feltet og forstyrrer det vi forsøger at observere. Lytten har en helt anden kvalitet — den modtager uden at sende.</w:t>
+      </w:r>
+    </w:p>
+    <w:p>
+      <w:pPr>
+        <w:pStyle w:val="BodyText"/>
+      </w:pPr>
+      <w:r>
+        <w:rPr>
+          <w:bCs/>
+          <w:b/>
+        </w:rPr>
         <w:t xml:space="preserve">[REFLEKSIONSSPØRGSMÅL]</w:t>
       </w:r>
     </w:p>
@@ -3317,6 +3731,96 @@
           <w:bCs/>
           <w:b/>
         </w:rPr>
+        <w:t xml:space="preserve">[INSPIRATION — nye vinkler at overveje]</w:t>
+      </w:r>
+    </w:p>
+    <w:p>
+      <w:pPr>
+        <w:pStyle w:val="BodyText"/>
+      </w:pPr>
+      <w:r>
+        <w:rPr>
+          <w:iCs/>
+          <w:i/>
+        </w:rPr>
+        <w:t xml:space="preserve">Fulcrums er ikke faste anatomiske punkter — de bevæger sig, opløses, dannes. En sund fulcrum er bevægelig; en dysfunktionel er rigid og isoleret. At skelne mellem dem er kerneobservationen i biodynamisk arbejde, og en daglig øvelse.</w:t>
+      </w:r>
+    </w:p>
+    <w:p>
+      <w:pPr>
+        <w:pStyle w:val="BodyText"/>
+      </w:pPr>
+      <w:r>
+        <w:rPr>
+          <w:iCs/>
+          <w:i/>
+        </w:rPr>
+        <w:t xml:space="preserve">Beckers begreb</w:t>
+      </w:r>
+      <w:r>
+        <w:rPr>
+          <w:iCs/>
+          <w:i/>
+        </w:rPr>
+        <w:t xml:space="preserve"> </w:t>
+      </w:r>
+      <w:r>
+        <w:rPr>
+          <w:iCs/>
+          <w:i/>
+        </w:rPr>
+        <w:t xml:space="preserve">‘</w:t>
+      </w:r>
+      <w:r>
+        <w:rPr>
+          <w:iCs/>
+          <w:i/>
+        </w:rPr>
+        <w:t xml:space="preserve">fulcrum of health</w:t>
+      </w:r>
+      <w:r>
+        <w:rPr>
+          <w:iCs/>
+          <w:i/>
+        </w:rPr>
+        <w:t xml:space="preserve">’</w:t>
+      </w:r>
+      <w:r>
+        <w:rPr>
+          <w:iCs/>
+          <w:i/>
+        </w:rPr>
+        <w:t xml:space="preserve"> </w:t>
+      </w:r>
+      <w:r>
+        <w:rPr>
+          <w:iCs/>
+          <w:i/>
+        </w:rPr>
+        <w:t xml:space="preserve">er en udvikling: det er det sted hvor systemets organisering er stærkest, ikke hvor det er mest belastet. At lokalisere det forskydende fulcrum tager bagsædet — vi sætter os i sundhedens fulcrum først.</w:t>
+      </w:r>
+    </w:p>
+    <w:p>
+      <w:pPr>
+        <w:pStyle w:val="BodyText"/>
+      </w:pPr>
+      <w:r>
+        <w:rPr>
+          <w:iCs/>
+          <w:i/>
+        </w:rPr>
+        <w:t xml:space="preserve">Når et fulcrum spontant flytter sig under hænderne, har systemet selv valgt næste fokus. Vores opgave er ikke at følge med fysisk men at give plads i opmærksomheden. Den nye placering bringer ofte information som det gamle fulcrum havde holdt skjult.</w:t>
+      </w:r>
+    </w:p>
+    <w:p>
+      <w:pPr>
+        <w:pStyle w:val="BodyText"/>
+      </w:pPr>
+      <w:r>
+        <w:rPr>
+          <w:bCs/>
+          <w:b/>
+        </w:rPr>
         <w:t xml:space="preserve">[REFLEKSIONSSPØRGSMÅL]</w:t>
       </w:r>
     </w:p>
@@ -3467,6 +3971,54 @@
           <w:bCs/>
           <w:b/>
         </w:rPr>
+        <w:t xml:space="preserve">[INSPIRATION — nye vinkler at overveje]</w:t>
+      </w:r>
+    </w:p>
+    <w:p>
+      <w:pPr>
+        <w:pStyle w:val="BodyText"/>
+      </w:pPr>
+      <w:r>
+        <w:rPr>
+          <w:iCs/>
+          <w:i/>
+        </w:rPr>
+        <w:t xml:space="preserve">Klienter beskriver stillpoints meget forskelligt — nogle som fald, nogle som svæven, nogle som klarhed der pludselig kommer. Det fælles træk er at noget sker uden anstrengelse. Det fortæller os noget om hvilken slags handling helingen er: ofte handler det om ikke-handling.</w:t>
+      </w:r>
+    </w:p>
+    <w:p>
+      <w:pPr>
+        <w:pStyle w:val="BodyText"/>
+      </w:pPr>
+      <w:r>
+        <w:rPr>
+          <w:iCs/>
+          <w:i/>
+        </w:rPr>
+        <w:t xml:space="preserve">Forskellen mellem en behandler-induceret stillpoint og en spontan er værd at mærke. Den inducerede er en indgang; den spontane er ofte en dybere proces. Begge har værdi — men kun hvis vi kan skelne dem og ikke prøver at fremtvinge det andet.</w:t>
+      </w:r>
+    </w:p>
+    <w:p>
+      <w:pPr>
+        <w:pStyle w:val="BodyText"/>
+      </w:pPr>
+      <w:r>
+        <w:rPr>
+          <w:iCs/>
+          <w:i/>
+        </w:rPr>
+        <w:t xml:space="preserve">Det der følger efter et stillpoint er lige så vigtigt som selve punktet. Mange terapeutiske ændringer sker ikke i stilheden men i den genoptagne bevægelse bagefter — som om systemet har genvejet sig selv og nu udfolder den nye balance.</w:t>
+      </w:r>
+    </w:p>
+    <w:p>
+      <w:pPr>
+        <w:pStyle w:val="BodyText"/>
+      </w:pPr>
+      <w:r>
+        <w:rPr>
+          <w:bCs/>
+          <w:b/>
+        </w:rPr>
         <w:t xml:space="preserve">[REFLEKSIONSSPØRGSMÅL]</w:t>
       </w:r>
     </w:p>
@@ -3617,6 +4169,54 @@
           <w:bCs/>
           <w:b/>
         </w:rPr>
+        <w:t xml:space="preserve">[INSPIRATION — nye vinkler at overveje]</w:t>
+      </w:r>
+    </w:p>
+    <w:p>
+      <w:pPr>
+        <w:pStyle w:val="BodyText"/>
+      </w:pPr>
+      <w:r>
+        <w:rPr>
+          <w:iCs/>
+          <w:i/>
+        </w:rPr>
+        <w:t xml:space="preserve">Alkymisten ville sige: bly forvandles ikke til guld ved kraft, men ved eksponering for et felt. Transmutation i biodynamikken har den samme logik. Vi tilfører ikke noget — vi skaber et felt hvor vævets egne kvaliteter kan ændre form.</w:t>
+      </w:r>
+    </w:p>
+    <w:p>
+      <w:pPr>
+        <w:pStyle w:val="BodyText"/>
+      </w:pPr>
+      <w:r>
+        <w:rPr>
+          <w:iCs/>
+          <w:i/>
+        </w:rPr>
+        <w:t xml:space="preserve">Den synlige transmutation går ofte gennem en mellemtilstand — fra rigid struktur til væskelignende kvalitet, og derfra til noget endnu mere flydende. Hvert lag tager den tid det tager. Vi kan ikke springe et lag over uden at handlingen mister sin substans.</w:t>
+      </w:r>
+    </w:p>
+    <w:p>
+      <w:pPr>
+        <w:pStyle w:val="BodyText"/>
+      </w:pPr>
+      <w:r>
+        <w:rPr>
+          <w:iCs/>
+          <w:i/>
+        </w:rPr>
+        <w:t xml:space="preserve">Når transmutation er ufuldstændig, er det sjældent fordi den er stoppet — oftere fordi den er i et lag vi ikke kan mærke endnu. Vores tålmodighed er det enkelte stærkeste redskab. Helingen sker stadig, men i sit eget tempo.</w:t>
+      </w:r>
+    </w:p>
+    <w:p>
+      <w:pPr>
+        <w:pStyle w:val="BodyText"/>
+      </w:pPr>
+      <w:r>
+        <w:rPr>
+          <w:bCs/>
+          <w:b/>
+        </w:rPr>
         <w:t xml:space="preserve">[REFLEKSIONSSPØRGSMÅL]</w:t>
       </w:r>
     </w:p>
@@ -3803,6 +4403,96 @@
           <w:bCs/>
           <w:b/>
         </w:rPr>
+        <w:t xml:space="preserve">[INSPIRATION — nye vinkler at overveje]</w:t>
+      </w:r>
+    </w:p>
+    <w:p>
+      <w:pPr>
+        <w:pStyle w:val="BodyText"/>
+      </w:pPr>
+      <w:r>
+        <w:rPr>
+          <w:iCs/>
+          <w:i/>
+        </w:rPr>
+        <w:t xml:space="preserve">The Neutral forveksles let med afslapning, men er ikke det samme. Afslapning er en reduktion af spænding; The Neutral er en samling af alle systemers aktivitet i et fælles centrum. Klienten er ikke</w:t>
+      </w:r>
+      <w:r>
+        <w:rPr>
+          <w:iCs/>
+          <w:i/>
+        </w:rPr>
+        <w:t xml:space="preserve"> </w:t>
+      </w:r>
+      <w:r>
+        <w:rPr>
+          <w:iCs/>
+          <w:i/>
+        </w:rPr>
+        <w:t xml:space="preserve">‘</w:t>
+      </w:r>
+      <w:r>
+        <w:rPr>
+          <w:iCs/>
+          <w:i/>
+        </w:rPr>
+        <w:t xml:space="preserve">slap</w:t>
+      </w:r>
+      <w:r>
+        <w:rPr>
+          <w:iCs/>
+          <w:i/>
+        </w:rPr>
+        <w:t xml:space="preserve">’</w:t>
+      </w:r>
+      <w:r>
+        <w:rPr>
+          <w:iCs/>
+          <w:i/>
+        </w:rPr>
+        <w:t xml:space="preserve"> </w:t>
+      </w:r>
+      <w:r>
+        <w:rPr>
+          <w:iCs/>
+          <w:i/>
+        </w:rPr>
+        <w:t xml:space="preserve">— de er fuldt til stede, bare uden distance.</w:t>
+      </w:r>
+    </w:p>
+    <w:p>
+      <w:pPr>
+        <w:pStyle w:val="BodyText"/>
+      </w:pPr>
+      <w:r>
+        <w:rPr>
+          <w:iCs/>
+          <w:i/>
+        </w:rPr>
+        <w:t xml:space="preserve">Polyvagalt set svarer The Neutral nok mest til en dyb ventral vagal aktivitet med tilstrækkelig sympatisk tone til at opretholde nærvær. Det er ikke en passiv tilstand — det er en aktiv-balanceret tilstand som systemet kun finder under særlige betingelser.</w:t>
+      </w:r>
+    </w:p>
+    <w:p>
+      <w:pPr>
+        <w:pStyle w:val="BodyText"/>
+      </w:pPr>
+      <w:r>
+        <w:rPr>
+          <w:iCs/>
+          <w:i/>
+        </w:rPr>
+        <w:t xml:space="preserve">Mange behandlinger lykkes ikke med at nå The Neutral, og det er som det skal være. Den er ikke et behandlings-mål men en forudsætning, der nogle gange er der, nogle gange ikke. At kræve den er at lukke den ude.</w:t>
+      </w:r>
+    </w:p>
+    <w:p>
+      <w:pPr>
+        <w:pStyle w:val="BodyText"/>
+      </w:pPr>
+      <w:r>
+        <w:rPr>
+          <w:bCs/>
+          <w:b/>
+        </w:rPr>
         <w:t xml:space="preserve">[REFLEKSIONSSPØRGSMÅL]</w:t>
       </w:r>
     </w:p>
@@ -3953,6 +4643,89 @@
           <w:bCs/>
           <w:b/>
         </w:rPr>
+        <w:t xml:space="preserve">[INSPIRATION — nye vinkler at overveje]</w:t>
+      </w:r>
+    </w:p>
+    <w:p>
+      <w:pPr>
+        <w:pStyle w:val="BodyText"/>
+      </w:pPr>
+      <w:r>
+        <w:rPr>
+          <w:iCs/>
+          <w:i/>
+        </w:rPr>
+        <w:t xml:space="preserve">Automatic Shifting demonstrerer at systemet selv bestemmer rækkefølgen af heling. Hvad der ser kaotisk ud er sjældent kaos — det er en intelligens vi ikke kan forudsige. Vores job er ikke at organisere processen men at holde plads til den.</w:t>
+      </w:r>
+    </w:p>
+    <w:p>
+      <w:pPr>
+        <w:pStyle w:val="BodyText"/>
+      </w:pPr>
+      <w:r>
+        <w:rPr>
+          <w:iCs/>
+          <w:i/>
+        </w:rPr>
+        <w:t xml:space="preserve">Når shifting går hurtigt fra område til område, kan det føles som om der ikke</w:t>
+      </w:r>
+      <w:r>
+        <w:rPr>
+          <w:iCs/>
+          <w:i/>
+        </w:rPr>
+        <w:t xml:space="preserve"> </w:t>
+      </w:r>
+      <w:r>
+        <w:rPr>
+          <w:iCs/>
+          <w:i/>
+        </w:rPr>
+        <w:t xml:space="preserve">‘</w:t>
+      </w:r>
+      <w:r>
+        <w:rPr>
+          <w:iCs/>
+          <w:i/>
+        </w:rPr>
+        <w:t xml:space="preserve">sker noget</w:t>
+      </w:r>
+      <w:r>
+        <w:rPr>
+          <w:iCs/>
+          <w:i/>
+        </w:rPr>
+        <w:t xml:space="preserve">’</w:t>
+      </w:r>
+      <w:r>
+        <w:rPr>
+          <w:iCs/>
+          <w:i/>
+        </w:rPr>
+        <w:t xml:space="preserve">. Men noget af det dybeste arbejde sker netop her — systemet ordner relationer mellem dele snarere end at arbejde lokalt. At blive i åbenheden kræver disciplin.</w:t>
+      </w:r>
+    </w:p>
+    <w:p>
+      <w:pPr>
+        <w:pStyle w:val="BodyText"/>
+      </w:pPr>
+      <w:r>
+        <w:rPr>
+          <w:iCs/>
+          <w:i/>
+        </w:rPr>
+        <w:t xml:space="preserve">Behandlerens største fristelse i Automatic Shifting er at gribe ind med teknik. Vi vil hjælpe noget. Men oftest hjælper vi mest ved at trække vores intention tilbage og lade processen styre. Det er ofte først bagefter at meningen viser sig.</w:t>
+      </w:r>
+    </w:p>
+    <w:p>
+      <w:pPr>
+        <w:pStyle w:val="BodyText"/>
+      </w:pPr>
+      <w:r>
+        <w:rPr>
+          <w:bCs/>
+          <w:b/>
+        </w:rPr>
         <w:t xml:space="preserve">[REFLEKSIONSSPØRGSMÅL]</w:t>
       </w:r>
     </w:p>
@@ -4103,6 +4876,89 @@
           <w:bCs/>
           <w:b/>
         </w:rPr>
+        <w:t xml:space="preserve">[INSPIRATION — nye vinkler at overveje]</w:t>
+      </w:r>
+    </w:p>
+    <w:p>
+      <w:pPr>
+        <w:pStyle w:val="BodyText"/>
+      </w:pPr>
+      <w:r>
+        <w:rPr>
+          <w:iCs/>
+          <w:i/>
+        </w:rPr>
+        <w:t xml:space="preserve">Disciplinen ved ikke at have en plan er sværere end den lyder. Vores uddannelse har trænet os i at observere, vurdere, vælge intervention. At slippe alt det er ikke at blive passiv — det er at flytte tilliden fra vores plan til systemets.</w:t>
+      </w:r>
+    </w:p>
+    <w:p>
+      <w:pPr>
+        <w:pStyle w:val="BodyText"/>
+      </w:pPr>
+      <w:r>
+        <w:rPr>
+          <w:iCs/>
+          <w:i/>
+        </w:rPr>
+        <w:t xml:space="preserve">Den iboende plan er ikke det samme som</w:t>
+      </w:r>
+      <w:r>
+        <w:rPr>
+          <w:iCs/>
+          <w:i/>
+        </w:rPr>
+        <w:t xml:space="preserve"> </w:t>
+      </w:r>
+      <w:r>
+        <w:rPr>
+          <w:iCs/>
+          <w:i/>
+        </w:rPr>
+        <w:t xml:space="preserve">‘</w:t>
+      </w:r>
+      <w:r>
+        <w:rPr>
+          <w:iCs/>
+          <w:i/>
+        </w:rPr>
+        <w:t xml:space="preserve">lade hvad som helst ske</w:t>
+      </w:r>
+      <w:r>
+        <w:rPr>
+          <w:iCs/>
+          <w:i/>
+        </w:rPr>
+        <w:t xml:space="preserve">’</w:t>
+      </w:r>
+      <w:r>
+        <w:rPr>
+          <w:iCs/>
+          <w:i/>
+        </w:rPr>
+        <w:t xml:space="preserve">. Vi mærker stadig, vi vurderer stadig, vi reagerer stadig på sikkerhedsspørgsmål. Forskellen er hvor vi henter retningen — fra protokollen eller fra det levende system.</w:t>
+      </w:r>
+    </w:p>
+    <w:p>
+      <w:pPr>
+        <w:pStyle w:val="BodyText"/>
+      </w:pPr>
+      <w:r>
+        <w:rPr>
+          <w:iCs/>
+          <w:i/>
+        </w:rPr>
+        <w:t xml:space="preserve">Nogle gange er den iboende plan smerte. Klienten oplever ubehag, og vores trang til at lindre er stærk. At blive ved med at stole på planen kræver at vi kender forskellen mellem nyttig smerte (transmutation) og ikke-nyttig smerte (overvældelse).</w:t>
+      </w:r>
+    </w:p>
+    <w:p>
+      <w:pPr>
+        <w:pStyle w:val="BodyText"/>
+      </w:pPr>
+      <w:r>
+        <w:rPr>
+          <w:bCs/>
+          <w:b/>
+        </w:rPr>
         <w:t xml:space="preserve">[REFLEKSIONSSPØRGSMÅL]</w:t>
       </w:r>
     </w:p>
@@ -4291,6 +5147,131 @@
           <w:bCs/>
           <w:b/>
         </w:rPr>
+        <w:t xml:space="preserve">[INSPIRATION — nye vinkler at overveje]</w:t>
+      </w:r>
+    </w:p>
+    <w:p>
+      <w:pPr>
+        <w:pStyle w:val="BodyText"/>
+      </w:pPr>
+      <w:r>
+        <w:rPr>
+          <w:iCs/>
+          <w:i/>
+        </w:rPr>
+        <w:t xml:space="preserve">Modern fascia-forskning (Schleip, Stecco) bekræfter at kroppens</w:t>
+      </w:r>
+      <w:r>
+        <w:rPr>
+          <w:iCs/>
+          <w:i/>
+        </w:rPr>
+        <w:t xml:space="preserve"> </w:t>
+      </w:r>
+      <w:r>
+        <w:rPr>
+          <w:iCs/>
+          <w:i/>
+        </w:rPr>
+        <w:t xml:space="preserve">‘</w:t>
+      </w:r>
+      <w:r>
+        <w:rPr>
+          <w:iCs/>
+          <w:i/>
+        </w:rPr>
+        <w:t xml:space="preserve">tørre</w:t>
+      </w:r>
+      <w:r>
+        <w:rPr>
+          <w:iCs/>
+          <w:i/>
+        </w:rPr>
+        <w:t xml:space="preserve">’</w:t>
+      </w:r>
+      <w:r>
+        <w:rPr>
+          <w:iCs/>
+          <w:i/>
+        </w:rPr>
+        <w:t xml:space="preserve"> </w:t>
+      </w:r>
+      <w:r>
+        <w:rPr>
+          <w:iCs/>
+          <w:i/>
+        </w:rPr>
+        <w:t xml:space="preserve">væv slet ikke er tørt — fascia er gennemvædet af interstitielt fluid og bevæger sig som en sammenhængende fluid-matrix. Sutherlands intuition for over 100 år siden viser sig at have anatomisk substans.</w:t>
+      </w:r>
+    </w:p>
+    <w:p>
+      <w:pPr>
+        <w:pStyle w:val="BodyText"/>
+      </w:pPr>
+      <w:r>
+        <w:rPr>
+          <w:iCs/>
+          <w:i/>
+        </w:rPr>
+        <w:t xml:space="preserve">Fluid body opleves ofte først som en kvalitet i hænderne, ikke som en mekanisk bevægelse vi kan beskrive. Det er som om kroppen pludselig bliver</w:t>
+      </w:r>
+      <w:r>
+        <w:rPr>
+          <w:iCs/>
+          <w:i/>
+        </w:rPr>
+        <w:t xml:space="preserve"> </w:t>
+      </w:r>
+      <w:r>
+        <w:rPr>
+          <w:iCs/>
+          <w:i/>
+        </w:rPr>
+        <w:t xml:space="preserve">‘</w:t>
+      </w:r>
+      <w:r>
+        <w:rPr>
+          <w:iCs/>
+          <w:i/>
+        </w:rPr>
+        <w:t xml:space="preserve">vådere</w:t>
+      </w:r>
+      <w:r>
+        <w:rPr>
+          <w:iCs/>
+          <w:i/>
+        </w:rPr>
+        <w:t xml:space="preserve">’</w:t>
+      </w:r>
+      <w:r>
+        <w:rPr>
+          <w:iCs/>
+          <w:i/>
+        </w:rPr>
+        <w:t xml:space="preserve">. Den oplevelse er real og målbar — vævs-impedans og lokal hydration ændrer sig.</w:t>
+      </w:r>
+    </w:p>
+    <w:p>
+      <w:pPr>
+        <w:pStyle w:val="BodyText"/>
+      </w:pPr>
+      <w:r>
+        <w:rPr>
+          <w:iCs/>
+          <w:i/>
+        </w:rPr>
+        <w:t xml:space="preserve">Når fluid body føles låst, er det sjældent at væsken er væk — den er bare ikke i bevægelse. Det vi lytter efter er det første tegn på at strømmen begynder igen. Det første tegn er ofte mindre end vi forventer.</w:t>
+      </w:r>
+    </w:p>
+    <w:p>
+      <w:pPr>
+        <w:pStyle w:val="BodyText"/>
+      </w:pPr>
+      <w:r>
+        <w:rPr>
+          <w:bCs/>
+          <w:b/>
+        </w:rPr>
         <w:t xml:space="preserve">[REFLEKSIONSSPØRGSMÅL]</w:t>
       </w:r>
     </w:p>
@@ -4453,6 +5434,166 @@
           <w:bCs/>
           <w:b/>
         </w:rPr>
+        <w:t xml:space="preserve">[INSPIRATION — nye vinkler at overveje]</w:t>
+      </w:r>
+    </w:p>
+    <w:p>
+      <w:pPr>
+        <w:pStyle w:val="BodyText"/>
+      </w:pPr>
+      <w:r>
+        <w:rPr>
+          <w:iCs/>
+          <w:i/>
+        </w:rPr>
+        <w:t xml:space="preserve">Læsionsfeltet ligner i sin struktur traume-kortet hos Levine, van der Kolk og Porges: et område der har trukket sig tilbage for at beskytte helheden. At se det som beskyttelse, ikke fejl, ændrer behandlingens grundtone fundamentalt.</w:t>
+      </w:r>
+    </w:p>
+    <w:p>
+      <w:pPr>
+        <w:pStyle w:val="BodyText"/>
+      </w:pPr>
+      <w:r>
+        <w:rPr>
+          <w:iCs/>
+          <w:i/>
+        </w:rPr>
+        <w:t xml:space="preserve">Læsionens visdom er ofte gemt i hvad den engang reddede. At spørge</w:t>
+      </w:r>
+      <w:r>
+        <w:rPr>
+          <w:iCs/>
+          <w:i/>
+        </w:rPr>
+        <w:t xml:space="preserve"> </w:t>
+      </w:r>
+      <w:r>
+        <w:rPr>
+          <w:iCs/>
+          <w:i/>
+        </w:rPr>
+        <w:t xml:space="preserve">‘</w:t>
+      </w:r>
+      <w:r>
+        <w:rPr>
+          <w:iCs/>
+          <w:i/>
+        </w:rPr>
+        <w:t xml:space="preserve">hvad ville være sket uden denne tilbagetrækning</w:t>
+      </w:r>
+      <w:r>
+        <w:rPr>
+          <w:iCs/>
+          <w:i/>
+        </w:rPr>
+        <w:t xml:space="preserve">’</w:t>
+      </w:r>
+      <w:r>
+        <w:rPr>
+          <w:iCs/>
+          <w:i/>
+        </w:rPr>
+        <w:t xml:space="preserve"> </w:t>
+      </w:r>
+      <w:r>
+        <w:rPr>
+          <w:iCs/>
+          <w:i/>
+        </w:rPr>
+        <w:t xml:space="preserve">åbner et helt andet rum end</w:t>
+      </w:r>
+      <w:r>
+        <w:rPr>
+          <w:iCs/>
+          <w:i/>
+        </w:rPr>
+        <w:t xml:space="preserve"> </w:t>
+      </w:r>
+      <w:r>
+        <w:rPr>
+          <w:iCs/>
+          <w:i/>
+        </w:rPr>
+        <w:t xml:space="preserve">‘</w:t>
+      </w:r>
+      <w:r>
+        <w:rPr>
+          <w:iCs/>
+          <w:i/>
+        </w:rPr>
+        <w:t xml:space="preserve">hvordan får vi den tilbage</w:t>
+      </w:r>
+      <w:r>
+        <w:rPr>
+          <w:iCs/>
+          <w:i/>
+        </w:rPr>
+        <w:t xml:space="preserve">’</w:t>
+      </w:r>
+      <w:r>
+        <w:rPr>
+          <w:iCs/>
+          <w:i/>
+        </w:rPr>
+        <w:t xml:space="preserve">. Behandling bliver ikke korrektion men anerkendelse.</w:t>
+      </w:r>
+    </w:p>
+    <w:p>
+      <w:pPr>
+        <w:pStyle w:val="BodyText"/>
+      </w:pPr>
+      <w:r>
+        <w:rPr>
+          <w:iCs/>
+          <w:i/>
+        </w:rPr>
+        <w:t xml:space="preserve">Når feltet ikke vil løslade, er det oftest fordi grundpræmissen — sikkerhed nu — endnu ikke er etableret. Vi kan ikke springe det skridt over. Først nervesystemets dybe besked om</w:t>
+      </w:r>
+      <w:r>
+        <w:rPr>
+          <w:iCs/>
+          <w:i/>
+        </w:rPr>
+        <w:t xml:space="preserve"> </w:t>
+      </w:r>
+      <w:r>
+        <w:rPr>
+          <w:iCs/>
+          <w:i/>
+        </w:rPr>
+        <w:t xml:space="preserve">‘</w:t>
+      </w:r>
+      <w:r>
+        <w:rPr>
+          <w:iCs/>
+          <w:i/>
+        </w:rPr>
+        <w:t xml:space="preserve">her er sikkert</w:t>
+      </w:r>
+      <w:r>
+        <w:rPr>
+          <w:iCs/>
+          <w:i/>
+        </w:rPr>
+        <w:t xml:space="preserve">’</w:t>
+      </w:r>
+      <w:r>
+        <w:rPr>
+          <w:iCs/>
+          <w:i/>
+        </w:rPr>
+        <w:t xml:space="preserve">, så kan læsionen begynde at slippe.</w:t>
+      </w:r>
+    </w:p>
+    <w:p>
+      <w:pPr>
+        <w:pStyle w:val="BodyText"/>
+      </w:pPr>
+      <w:r>
+        <w:rPr>
+          <w:bCs/>
+          <w:b/>
+        </w:rPr>
         <w:t xml:space="preserve">[REFLEKSIONSSPØRGSMÅL]</w:t>
       </w:r>
     </w:p>
@@ -4613,6 +5754,131 @@
           <w:bCs/>
           <w:b/>
         </w:rPr>
+        <w:t xml:space="preserve">[INSPIRATION — nye vinkler at overveje]</w:t>
+      </w:r>
+    </w:p>
+    <w:p>
+      <w:pPr>
+        <w:pStyle w:val="BodyText"/>
+      </w:pPr>
+      <w:r>
+        <w:rPr>
+          <w:iCs/>
+          <w:i/>
+        </w:rPr>
+        <w:t xml:space="preserve">Potency forveksles let med energi-begreber fra andre traditioner (qi, prana, orgon). Forskellene er væsentlige: Potency er specifikt knyttet til sundheds- og helingsprocesser, ikke en almen livsenergi. At blande begreberne sammen mister noget af det biodynamiske.</w:t>
+      </w:r>
+    </w:p>
+    <w:p>
+      <w:pPr>
+        <w:pStyle w:val="BodyText"/>
+      </w:pPr>
+      <w:r>
+        <w:rPr>
+          <w:iCs/>
+          <w:i/>
+        </w:rPr>
+        <w:t xml:space="preserve">Bound potency findes overalt hvor systemet har skullet låse noget for at overleve. Når den frigives, er den ikke</w:t>
+      </w:r>
+      <w:r>
+        <w:rPr>
+          <w:iCs/>
+          <w:i/>
+        </w:rPr>
+        <w:t xml:space="preserve"> </w:t>
+      </w:r>
+      <w:r>
+        <w:rPr>
+          <w:iCs/>
+          <w:i/>
+        </w:rPr>
+        <w:t xml:space="preserve">‘</w:t>
+      </w:r>
+      <w:r>
+        <w:rPr>
+          <w:iCs/>
+          <w:i/>
+        </w:rPr>
+        <w:t xml:space="preserve">mere kraft</w:t>
+      </w:r>
+      <w:r>
+        <w:rPr>
+          <w:iCs/>
+          <w:i/>
+        </w:rPr>
+        <w:t xml:space="preserve">’</w:t>
+      </w:r>
+      <w:r>
+        <w:rPr>
+          <w:iCs/>
+          <w:i/>
+        </w:rPr>
+        <w:t xml:space="preserve"> </w:t>
+      </w:r>
+      <w:r>
+        <w:rPr>
+          <w:iCs/>
+          <w:i/>
+        </w:rPr>
+        <w:t xml:space="preserve">— det er den oprindelige kraft der ikke længere er bundet til en bestemt opgave. Den vender tilbage til helheden.</w:t>
+      </w:r>
+    </w:p>
+    <w:p>
+      <w:pPr>
+        <w:pStyle w:val="BodyText"/>
+      </w:pPr>
+      <w:r>
+        <w:rPr>
+          <w:iCs/>
+          <w:i/>
+        </w:rPr>
+        <w:t xml:space="preserve">Potency bevæger sig ikke som en partikel — den manifesterer sig som ændringer i feltet. At mærke potency i hænderne er at mærke tilstandsskift snarere end at mærke</w:t>
+      </w:r>
+      <w:r>
+        <w:rPr>
+          <w:iCs/>
+          <w:i/>
+        </w:rPr>
+        <w:t xml:space="preserve"> </w:t>
+      </w:r>
+      <w:r>
+        <w:rPr>
+          <w:iCs/>
+          <w:i/>
+        </w:rPr>
+        <w:t xml:space="preserve">‘</w:t>
+      </w:r>
+      <w:r>
+        <w:rPr>
+          <w:iCs/>
+          <w:i/>
+        </w:rPr>
+        <w:t xml:space="preserve">noget der bevæger sig</w:t>
+      </w:r>
+      <w:r>
+        <w:rPr>
+          <w:iCs/>
+          <w:i/>
+        </w:rPr>
+        <w:t xml:space="preserve">’</w:t>
+      </w:r>
+      <w:r>
+        <w:rPr>
+          <w:iCs/>
+          <w:i/>
+        </w:rPr>
+        <w:t xml:space="preserve">. Det skaber et andet sprog for det vi gør.</w:t>
+      </w:r>
+    </w:p>
+    <w:p>
+      <w:pPr>
+        <w:pStyle w:val="BodyText"/>
+      </w:pPr>
+      <w:r>
+        <w:rPr>
+          <w:bCs/>
+          <w:b/>
+        </w:rPr>
         <w:t xml:space="preserve">[REFLEKSIONSSPØRGSMÅL]</w:t>
       </w:r>
     </w:p>
@@ -4775,6 +6041,138 @@
           <w:bCs/>
           <w:b/>
         </w:rPr>
+        <w:t xml:space="preserve">[INSPIRATION — nye vinkler at overveje]</w:t>
+      </w:r>
+    </w:p>
+    <w:p>
+      <w:pPr>
+        <w:pStyle w:val="BodyText"/>
+      </w:pPr>
+      <w:r>
+        <w:rPr>
+          <w:iCs/>
+          <w:i/>
+        </w:rPr>
+        <w:t xml:space="preserve">Den første ignition skete ved unionens øjeblik, ved fødslen, ved første åndedræt. Det er ikke metafor — der er målbare tærskelfænomener i den embryonale udvikling der svarer til denne formulering. Hver tærskel er et</w:t>
+      </w:r>
+      <w:r>
+        <w:rPr>
+          <w:iCs/>
+          <w:i/>
+        </w:rPr>
+        <w:t xml:space="preserve"> </w:t>
+      </w:r>
+      <w:r>
+        <w:rPr>
+          <w:iCs/>
+          <w:i/>
+        </w:rPr>
+        <w:t xml:space="preserve">‘</w:t>
+      </w:r>
+      <w:r>
+        <w:rPr>
+          <w:iCs/>
+          <w:i/>
+        </w:rPr>
+        <w:t xml:space="preserve">lys-tændes</w:t>
+      </w:r>
+      <w:r>
+        <w:rPr>
+          <w:iCs/>
+          <w:i/>
+        </w:rPr>
+        <w:t xml:space="preserve">’</w:t>
+      </w:r>
+      <w:r>
+        <w:rPr>
+          <w:iCs/>
+          <w:i/>
+        </w:rPr>
+        <w:t xml:space="preserve"> </w:t>
+      </w:r>
+      <w:r>
+        <w:rPr>
+          <w:iCs/>
+          <w:i/>
+        </w:rPr>
+        <w:t xml:space="preserve">øjeblik.</w:t>
+      </w:r>
+    </w:p>
+    <w:p>
+      <w:pPr>
+        <w:pStyle w:val="BodyText"/>
+      </w:pPr>
+      <w:r>
+        <w:rPr>
+          <w:iCs/>
+          <w:i/>
+        </w:rPr>
+        <w:t xml:space="preserve">Re-ignition efter sygdom eller traume er ikke en restauration af det gamle — det er en ny ignition. Klienten kommer ikke</w:t>
+      </w:r>
+      <w:r>
+        <w:rPr>
+          <w:iCs/>
+          <w:i/>
+        </w:rPr>
+        <w:t xml:space="preserve"> </w:t>
+      </w:r>
+      <w:r>
+        <w:rPr>
+          <w:iCs/>
+          <w:i/>
+        </w:rPr>
+        <w:t xml:space="preserve">‘</w:t>
+      </w:r>
+      <w:r>
+        <w:rPr>
+          <w:iCs/>
+          <w:i/>
+        </w:rPr>
+        <w:t xml:space="preserve">tilbage</w:t>
+      </w:r>
+      <w:r>
+        <w:rPr>
+          <w:iCs/>
+          <w:i/>
+        </w:rPr>
+        <w:t xml:space="preserve">’</w:t>
+      </w:r>
+      <w:r>
+        <w:rPr>
+          <w:iCs/>
+          <w:i/>
+        </w:rPr>
+        <w:t xml:space="preserve"> </w:t>
+      </w:r>
+      <w:r>
+        <w:rPr>
+          <w:iCs/>
+          <w:i/>
+        </w:rPr>
+        <w:t xml:space="preserve">til som de var; de bevæger sig fremad til en ny baseline. Det er vigtigt ikke at forveksle de to.</w:t>
+      </w:r>
+    </w:p>
+    <w:p>
+      <w:pPr>
+        <w:pStyle w:val="BodyText"/>
+      </w:pPr>
+      <w:r>
+        <w:rPr>
+          <w:iCs/>
+          <w:i/>
+        </w:rPr>
+        <w:t xml:space="preserve">Når ignition ikke vil ske, er det sjældent fordi der mangler kraft. Oftere mangler der den indre tærskelbetingelse — en tilstand af tilstrækkelig hvile, tilstrækkelig sikkerhed, tilstrækkelig orientering. Vi tænder ikke ilden; vi forbereder brændet.</w:t>
+      </w:r>
+    </w:p>
+    <w:p>
+      <w:pPr>
+        <w:pStyle w:val="BodyText"/>
+      </w:pPr>
+      <w:r>
+        <w:rPr>
+          <w:bCs/>
+          <w:b/>
+        </w:rPr>
         <w:t xml:space="preserve">[REFLEKSIONSSPØRGSMÅL]</w:t>
       </w:r>
     </w:p>
@@ -4925,6 +6323,138 @@
           <w:bCs/>
           <w:b/>
         </w:rPr>
+        <w:t xml:space="preserve">[INSPIRATION — nye vinkler at overveje]</w:t>
+      </w:r>
+    </w:p>
+    <w:p>
+      <w:pPr>
+        <w:pStyle w:val="BodyText"/>
+      </w:pPr>
+      <w:r>
+        <w:rPr>
+          <w:iCs/>
+          <w:i/>
+        </w:rPr>
+        <w:t xml:space="preserve">Aksiale fluktuationer følger ikke altid samme retning. Nogle gange er de overvejende cephal-caudale; andre gange er de spiralerende. At mærke retningen og dens variation er en finmotorisk evne der udvikles over år, ikke uger.</w:t>
+      </w:r>
+    </w:p>
+    <w:p>
+      <w:pPr>
+        <w:pStyle w:val="BodyText"/>
+      </w:pPr>
+      <w:r>
+        <w:rPr>
+          <w:iCs/>
+          <w:i/>
+        </w:rPr>
+        <w:t xml:space="preserve">Klienten oplever fluktuationerne forskelligt afhængigt af hvor i kroppen de mærker dem. I bækkenet ofte som vugning; i kraniet som let pres-forandring; langs columna som bølgende fornemmelse. Disse beskrivelser hjælper med at konfirmere hvad hænderne mærker.</w:t>
+      </w:r>
+    </w:p>
+    <w:p>
+      <w:pPr>
+        <w:pStyle w:val="BodyText"/>
+      </w:pPr>
+      <w:r>
+        <w:rPr>
+          <w:iCs/>
+          <w:i/>
+        </w:rPr>
+        <w:t xml:space="preserve">Når fluktuationerne er blokerede, mærkes de ofte som</w:t>
+      </w:r>
+      <w:r>
+        <w:rPr>
+          <w:iCs/>
+          <w:i/>
+        </w:rPr>
+        <w:t xml:space="preserve"> </w:t>
+      </w:r>
+      <w:r>
+        <w:rPr>
+          <w:iCs/>
+          <w:i/>
+        </w:rPr>
+        <w:t xml:space="preserve">‘</w:t>
+      </w:r>
+      <w:r>
+        <w:rPr>
+          <w:iCs/>
+          <w:i/>
+        </w:rPr>
+        <w:t xml:space="preserve">tør</w:t>
+      </w:r>
+      <w:r>
+        <w:rPr>
+          <w:iCs/>
+          <w:i/>
+        </w:rPr>
+        <w:t xml:space="preserve">’</w:t>
+      </w:r>
+      <w:r>
+        <w:rPr>
+          <w:iCs/>
+          <w:i/>
+        </w:rPr>
+        <w:t xml:space="preserve"> </w:t>
+      </w:r>
+      <w:r>
+        <w:rPr>
+          <w:iCs/>
+          <w:i/>
+        </w:rPr>
+        <w:t xml:space="preserve">eller</w:t>
+      </w:r>
+      <w:r>
+        <w:rPr>
+          <w:iCs/>
+          <w:i/>
+        </w:rPr>
+        <w:t xml:space="preserve"> </w:t>
+      </w:r>
+      <w:r>
+        <w:rPr>
+          <w:iCs/>
+          <w:i/>
+        </w:rPr>
+        <w:t xml:space="preserve">‘</w:t>
+      </w:r>
+      <w:r>
+        <w:rPr>
+          <w:iCs/>
+          <w:i/>
+        </w:rPr>
+        <w:t xml:space="preserve">klistret</w:t>
+      </w:r>
+      <w:r>
+        <w:rPr>
+          <w:iCs/>
+          <w:i/>
+        </w:rPr>
+        <w:t xml:space="preserve">’</w:t>
+      </w:r>
+      <w:r>
+        <w:rPr>
+          <w:iCs/>
+          <w:i/>
+        </w:rPr>
+        <w:t xml:space="preserve"> </w:t>
+      </w:r>
+      <w:r>
+        <w:rPr>
+          <w:iCs/>
+          <w:i/>
+        </w:rPr>
+        <w:t xml:space="preserve">kvalitet i vævet. Det er ikke en fagligt korrekt beskrivelse, men det er den behandlerens hænder ofte rapporterer. At give plads til denne fagligt-upræcise observation er en del af håndværket.</w:t>
+      </w:r>
+    </w:p>
+    <w:p>
+      <w:pPr>
+        <w:pStyle w:val="BodyText"/>
+      </w:pPr>
+      <w:r>
+        <w:rPr>
+          <w:bCs/>
+          <w:b/>
+        </w:rPr>
         <w:t xml:space="preserve">[REFLEKSIONSSPØRGSMÅL]</w:t>
       </w:r>
     </w:p>
@@ -5076,6 +6606,124 @@
       </w:pPr>
       <w:r>
         <w:t xml:space="preserve">Helheden kender vejen — vores rolle er at støtte dens naturlige bevægelse mod integration. Når vi som behandlere starter med sundheden i delen, vil endepunktet naturligt være genforeningen med helheden.</w:t>
+      </w:r>
+    </w:p>
+    <w:p>
+      <w:pPr>
+        <w:pStyle w:val="BodyText"/>
+      </w:pPr>
+      <w:r>
+        <w:rPr>
+          <w:bCs/>
+          <w:b/>
+        </w:rPr>
+        <w:t xml:space="preserve">[INSPIRATION — nye vinkler at overveje]</w:t>
+      </w:r>
+    </w:p>
+    <w:p>
+      <w:pPr>
+        <w:pStyle w:val="BodyText"/>
+      </w:pPr>
+      <w:r>
+        <w:rPr>
+          <w:iCs/>
+          <w:i/>
+        </w:rPr>
+        <w:t xml:space="preserve">Wholeness er ikke et tilføjet begreb i biodynamikken — det er det første princip alle andre begreber forudsætter. Når Sutherland talte om</w:t>
+      </w:r>
+      <w:r>
+        <w:rPr>
+          <w:iCs/>
+          <w:i/>
+        </w:rPr>
+        <w:t xml:space="preserve"> </w:t>
+      </w:r>
+      <w:r>
+        <w:rPr>
+          <w:iCs/>
+          <w:i/>
+        </w:rPr>
+        <w:t xml:space="preserve">‘</w:t>
+      </w:r>
+      <w:r>
+        <w:rPr>
+          <w:iCs/>
+          <w:i/>
+        </w:rPr>
+        <w:t xml:space="preserve">helhedens orden</w:t>
+      </w:r>
+      <w:r>
+        <w:rPr>
+          <w:iCs/>
+          <w:i/>
+        </w:rPr>
+        <w:t xml:space="preserve">’</w:t>
+      </w:r>
+      <w:r>
+        <w:rPr>
+          <w:iCs/>
+          <w:i/>
+        </w:rPr>
+        <w:t xml:space="preserve">, var det ikke filosofi; det var observation: kroppen organiserer sig fra helhed mod del, ikke omvendt.</w:t>
+      </w:r>
+    </w:p>
+    <w:p>
+      <w:pPr>
+        <w:pStyle w:val="BodyText"/>
+      </w:pPr>
+      <w:r>
+        <w:rPr>
+          <w:iCs/>
+          <w:i/>
+        </w:rPr>
+        <w:t xml:space="preserve">Når dele af kroppen</w:t>
+      </w:r>
+      <w:r>
+        <w:rPr>
+          <w:iCs/>
+          <w:i/>
+        </w:rPr>
+        <w:t xml:space="preserve"> </w:t>
+      </w:r>
+      <w:r>
+        <w:rPr>
+          <w:iCs/>
+          <w:i/>
+        </w:rPr>
+        <w:t xml:space="preserve">‘</w:t>
+      </w:r>
+      <w:r>
+        <w:rPr>
+          <w:iCs/>
+          <w:i/>
+        </w:rPr>
+        <w:t xml:space="preserve">føles separate</w:t>
+      </w:r>
+      <w:r>
+        <w:rPr>
+          <w:iCs/>
+          <w:i/>
+        </w:rPr>
+        <w:t xml:space="preserve">’</w:t>
+      </w:r>
+      <w:r>
+        <w:rPr>
+          <w:iCs/>
+          <w:i/>
+        </w:rPr>
+        <w:t xml:space="preserve">, er det altid en relativ adskillelse, ikke en absolut. Helheden er der stadig, men dens kommunikationskanaler er sløret. Vores arbejde er at gøre de kanaler mærkbare igen, ikke at samle delene.</w:t>
+      </w:r>
+    </w:p>
+    <w:p>
+      <w:pPr>
+        <w:pStyle w:val="BodyText"/>
+      </w:pPr>
+      <w:r>
+        <w:rPr>
+          <w:iCs/>
+          <w:i/>
+        </w:rPr>
+        <w:t xml:space="preserve">Praktisk wholeness er ikke filosofi — det er en målbar observation: når én del bevæger sig, bevæger andre dele sig samtidigt og koordineret. Når denne koordination ikke findes, lokalt eller globalt, er der noget at lytte til.</w:t>
       </w:r>
     </w:p>
     <w:p>
@@ -10534,52 +12182,7 @@
           <w:bCs/>
           <w:b/>
         </w:rPr>
-        <w:t xml:space="preserve">[REFLEKSIONSSPØRGSMÅL]</w:t>
-      </w:r>
-    </w:p>
-    <w:p>
-      <w:pPr>
-        <w:numPr>
-          <w:ilvl w:val="0"/>
-          <w:numId w:val="1057"/>
-        </w:numPr>
-      </w:pPr>
-      <w:r>
-        <w:t xml:space="preserve">Tænk på et område i en klients krop der har båret en kompensation længe. Hvilken slags samtale opstår mellem dine hænder og dets historie?</w:t>
-      </w:r>
-    </w:p>
-    <w:p>
-      <w:pPr>
-        <w:numPr>
-          <w:ilvl w:val="0"/>
-          <w:numId w:val="1057"/>
-        </w:numPr>
-      </w:pPr>
-      <w:r>
-        <w:t xml:space="preserve">Stivhed og åbning lever i hinanden i samme væv. Mærk lige nu i din egen krop — hvor sidder den samtidighed for dig?</w:t>
-      </w:r>
-    </w:p>
-    <w:p>
-      <w:pPr>
-        <w:numPr>
-          <w:ilvl w:val="0"/>
-          <w:numId w:val="1057"/>
-        </w:numPr>
-      </w:pPr>
-      <w:r>
-        <w:t xml:space="preserve">Det vi kalder dysfunktion gav engang mening for systemet. Hvad gjorde det muligt at overleve dengang, og hvad har det kostet siden?</w:t>
-      </w:r>
-    </w:p>
-    <w:p>
-      <w:pPr>
-        <w:pStyle w:val="FirstParagraph"/>
-      </w:pPr>
-      <w:r>
-        <w:rPr>
-          <w:bCs/>
-          <w:b/>
-        </w:rPr>
-        <w:t xml:space="preserve">[BRØDTEKST: Rum B — Væskekroppen]</w:t>
+        <w:t xml:space="preserve">[INSPIRATION — nye vinkler at overveje]</w:t>
       </w:r>
     </w:p>
     <w:p>
@@ -10591,597 +12194,946 @@
           <w:iCs/>
           <w:i/>
         </w:rPr>
-        <w:t xml:space="preserve">Når tilliden etableres og kroppen begynder at slippe sin vagtsomhed, mærker du hvordan noget dybere vågner under dine hænder. Væskekroppen — millioner af år gammel og vis — begynder at røre på sig.</w:t>
-      </w:r>
-    </w:p>
-    <w:p>
-      <w:pPr>
-        <w:pStyle w:val="BodyText"/>
-      </w:pPr>
-      <w:r>
-        <w:rPr>
-          <w:bCs/>
-          <w:b/>
-        </w:rPr>
-        <w:t xml:space="preserve">Væskekroppens vågnende respons</w:t>
-      </w:r>
-    </w:p>
-    <w:p>
-      <w:pPr>
-        <w:pStyle w:val="BodyText"/>
-      </w:pPr>
-      <w:r>
-        <w:t xml:space="preserve">Her lever væskekroppen i sin naturlige tilstand — som ét levende kontinuum gennem hele organismen. Alle væsker fungerer som en funktionel enhed hvor respons sker simultant gennem hele matrixen, ikke sekvensielt som i nervesystemet. Dette er niveauet hvor kroppen kan gå til The Neutral, hvor det autonome nervesystem bliver fleksibelt og kan suspenderes, så de embryologiske kræfter kan overtage.</w:t>
-      </w:r>
-    </w:p>
-    <w:p>
-      <w:pPr>
-        <w:pStyle w:val="BodyText"/>
-      </w:pPr>
-      <w:r>
-        <w:t xml:space="preserve">Væskekroppen fungerer som bro mellem det energetiske blueprint og den fysiske krop. Den bærer protoplasma-kvaliteterne fra fosterstadiet videre gennem livet. Her findes kapaciteten til Automatic Shifting — hvor behandlingen springer fra sted til sted orkestreret af helhedens prioriteter. Den oprindelige midtlinje er det naturlige fulcrum som alt organiserer sig omkring.</w:t>
-      </w:r>
-    </w:p>
-    <w:p>
-      <w:pPr>
-        <w:pStyle w:val="BodyText"/>
-      </w:pPr>
-      <w:r>
-        <w:t xml:space="preserve">Du oplever et hav af væske der ånder under Primary Respiration. Simultan respons gennem hele væskekroppen som én samlet substans. Kapaciteten til at gå til The Neutral og kontakte de embryologiske kræfter. Det autonome nervesystems fleksibilitet og evne til suspension. Automatic Shifting som naturlig mulighed i væskemediet. Den oprindelige midtlinje som stabilt, organiserende fulcrum.</w:t>
-      </w:r>
-    </w:p>
-    <w:p>
-      <w:pPr>
-        <w:pStyle w:val="BodyText"/>
-      </w:pPr>
-      <w:r>
-        <w:rPr>
-          <w:bCs/>
-          <w:b/>
-        </w:rPr>
-        <w:t xml:space="preserve">Den medbragte tilstand</w:t>
-      </w:r>
-    </w:p>
-    <w:p>
-      <w:pPr>
-        <w:pStyle w:val="BodyText"/>
-      </w:pPr>
-      <w:r>
-        <w:t xml:space="preserve">Væskekroppen rummer hele Rum A — både den normale fysiske krop og alle dens dysfunktionelle områder. De traumatiske tilstande, arvævet, de låste mønstre fra den fysiske krop eksisterer stadig i væskens matrix, men nu i en anden kontekst. De rigide strukturer begynder at få væskekvalitet uden at være fuldt forløst.</w:t>
-      </w:r>
-    </w:p>
-    <w:p>
-      <w:pPr>
-        <w:pStyle w:val="BodyText"/>
-      </w:pPr>
-      <w:r>
-        <w:t xml:space="preserve">Det autonome nervesystems låsthed fra Rum A er stadig til stede men møder nu væskekroppens iboende fleksibilitet. De kompenserende midtlinjer og falske fulcrums eksisterer side om side med den oprindelige midtlinje. Adskillelsen mellem systemer begynder at opløses men er ikke fuldt integreret.</w:t>
-      </w:r>
-    </w:p>
-    <w:p>
-      <w:pPr>
-        <w:pStyle w:val="BodyText"/>
-      </w:pPr>
-      <w:r>
-        <w:t xml:space="preserve">Du mærker den fysiske krops normale funktion nu holdt i væskekontinuumet. Læsionsfelter og traumatiske aftryk der stadig ikke kan gå til neutral. Fast væv der begynder at få væskekvalitet men bevarer sin låsthed. Både normale og falske fulcrums rummet simultant i væsken. Det autonome nervesystems gradvise overgang mod fleksibilitet. Potentialet for heling der endnu ikke er aktiveret.</w:t>
-      </w:r>
-    </w:p>
-    <w:p>
-      <w:pPr>
-        <w:pStyle w:val="BodyText"/>
-      </w:pPr>
-      <w:r>
-        <w:rPr>
-          <w:bCs/>
-          <w:b/>
-        </w:rPr>
-        <w:t xml:space="preserve">Åbningen mod det relationelle</w:t>
-      </w:r>
-    </w:p>
-    <w:p>
-      <w:pPr>
-        <w:pStyle w:val="BodyText"/>
-      </w:pPr>
-      <w:r>
-        <w:t xml:space="preserve">Væskekroppen søger nu forbindelse til det større terapeutiske rum — det fælles felt mellem behandler og klient. Dette er ikke længere kun individuel proces men begyndelsen på erkendelsen af at heling sker i relation. Det relationelle aspekt er naturligt for os som pattedyr — vi er biologisk skabt til at co-regulere, til at finde balance gennem forbindelse.</w:t>
-      </w:r>
-    </w:p>
-    <w:p>
-      <w:pPr>
-        <w:pStyle w:val="BodyText"/>
-      </w:pPr>
-      <w:r>
-        <w:t xml:space="preserve">Her forberedes mødet mellem behandlerens og klientens væskekroppe. Grænsen ved huden viser sig at være mere flydende end antaget. Det terapeutiske rum bliver en container hvor dybere processer kan udfolde sig trygt. Denne zone peger mod vores naturlige behov for fællesskab — familie, venskaber, det nære samfund.</w:t>
-      </w:r>
-    </w:p>
-    <w:p>
-      <w:pPr>
-        <w:pStyle w:val="BodyText"/>
-      </w:pPr>
-      <w:r>
-        <w:t xml:space="preserve">Du fornemmer længslen efter det relationelle og fælles terapeutiske rum. Forberedelsen til mødet mellem to væskekroppe. Det biologiske behov for co-regulering og forbindelse. Grænsen mellem behandler og klient bliver mere gennemsigtig. Det terapeutiske rum som tryg container for dybere processer. Åbningen mod vores naturlige funktion som sociale væsener.</w:t>
-      </w:r>
-    </w:p>
-    <w:p>
-      <w:pPr>
-        <w:pStyle w:val="BodyText"/>
-      </w:pPr>
-      <w:r>
-        <w:rPr>
-          <w:bCs/>
-          <w:b/>
-        </w:rPr>
-        <w:t xml:space="preserve">Som ét levende kontinuum</w:t>
-      </w:r>
-    </w:p>
-    <w:p>
-      <w:pPr>
-        <w:pStyle w:val="BodyText"/>
-      </w:pPr>
-      <w:r>
-        <w:t xml:space="preserve">Væskekroppen er ét sammenhængende felt der ånder gennem alt det vi rører ved. Det medbragte fra det fysiske og den vågnende respons lever i samme matrix, og åbningen mod det relationelle ligger latent i selve væskens bevægelse. Hukommelsen om det fysiske er væskekroppens måde at bære helheden — og selve denne hukommelse gør forløsning mulig, fordi intet er forsvundet. Når vi følger væskens egen rytme, opdager vi at vores opgave ikke er at forene noget. Det er allerede forenet. Vi tillader bare at det viser sig.</w:t>
-      </w:r>
-    </w:p>
-    <w:p>
-      <w:pPr>
-        <w:pStyle w:val="BodyText"/>
-      </w:pPr>
-      <w:r>
-        <w:rPr>
-          <w:bCs/>
-          <w:b/>
-        </w:rPr>
-        <w:t xml:space="preserve">[REFLEKSIONSSPØRGSMÅL]</w:t>
-      </w:r>
-    </w:p>
-    <w:p>
-      <w:pPr>
-        <w:numPr>
-          <w:ilvl w:val="0"/>
-          <w:numId w:val="1058"/>
-        </w:numPr>
-      </w:pPr>
-      <w:r>
-        <w:t xml:space="preserve">Hvis det allerede er forenet, hvad ændrer det så ved den helingshandling du tror du udfører?</w:t>
-      </w:r>
-    </w:p>
-    <w:p>
-      <w:pPr>
-        <w:numPr>
-          <w:ilvl w:val="0"/>
-          <w:numId w:val="1058"/>
-        </w:numPr>
-      </w:pPr>
-      <w:r>
-        <w:t xml:space="preserve">Væsken bærer hukommelse på en måde strukturen ikke gør. I dit seneste klient-arbejde — hvilken slags hukommelse mærkede du væsken bære?</w:t>
-      </w:r>
-    </w:p>
-    <w:p>
-      <w:pPr>
-        <w:numPr>
-          <w:ilvl w:val="0"/>
-          <w:numId w:val="1058"/>
-        </w:numPr>
-      </w:pPr>
-      <w:r>
-        <w:t xml:space="preserve">Lige før dine hænder slipper ledelsen, sker der noget i din egen krop. Beskriv den signal-bevægelse, hvis du kan finde ord for den.</w:t>
-      </w:r>
-    </w:p>
-    <w:p>
-      <w:pPr>
-        <w:pStyle w:val="FirstParagraph"/>
-      </w:pPr>
-      <w:r>
-        <w:rPr>
-          <w:bCs/>
-          <w:b/>
-        </w:rPr>
-        <w:t xml:space="preserve">[BRØDTEKST: Rum C — Det Relationelle Felt]</w:t>
-      </w:r>
-    </w:p>
-    <w:p>
-      <w:pPr>
-        <w:pStyle w:val="BodyText"/>
-      </w:pPr>
+        <w:t xml:space="preserve">Det er fristende at se Rum A som det</w:t>
+      </w:r>
       <w:r>
         <w:rPr>
           <w:iCs/>
           <w:i/>
         </w:rPr>
-        <w:t xml:space="preserve">Når væskekroppen har fundet sin rytme og grænsen mellem behandler og klient bliver mere flydende, opstår et fælles felt — et relationelt rum hvor vi møder vores naturlige biologiske arv som sociale væsener.</w:t>
-      </w:r>
-    </w:p>
-    <w:p>
-      <w:pPr>
-        <w:pStyle w:val="BodyText"/>
-      </w:pPr>
-      <w:r>
-        <w:rPr>
-          <w:bCs/>
-          <w:b/>
-        </w:rPr>
-        <w:t xml:space="preserve">Det relationelle som naturlig funktion</w:t>
-      </w:r>
-    </w:p>
-    <w:p>
-      <w:pPr>
-        <w:pStyle w:val="BodyText"/>
-      </w:pPr>
-      <w:r>
-        <w:t xml:space="preserve">Her udfolder Rum C sig som vores medfødte kapacitet til at fungere i relation. Som pattedyr er vi biologisk udviklet til at leve, udveksle og co-regulere med andre. Dette er ikke en tillært færdighed men en iboende del af vores natur — vi er skabt til at finde balance gennem forbindelse med familie, venskaber, kollegaer og det nære samfund.</w:t>
-      </w:r>
-    </w:p>
-    <w:p>
-      <w:pPr>
-        <w:pStyle w:val="BodyText"/>
-      </w:pPr>
-      <w:r>
-        <w:t xml:space="preserve">I behandlingssituationen manifesterer dette sig som det terapeutiske rum mellem behandler og klient — et fælles felt hvor begge systemer mødes og påvirker hinanden. Dette er et dybere niveau end det individuelle, hvor heling sker gennem selve relationen. Det nære samfund — vores by, region, arbejdsplads — udgør den naturlige kontekst hvor vores biologiske behov for tilhørsforhold og udveksling udfolder sig.</w:t>
-      </w:r>
-    </w:p>
-    <w:p>
-      <w:pPr>
-        <w:pStyle w:val="BodyText"/>
-      </w:pPr>
-      <w:r>
-        <w:t xml:space="preserve">Du oplever det fælles felt mellem behandler og klient som levende realitet. Co-regulering som naturlig biologisk funktion. Nervesystemernes gensidige påvirkning og stabilisering. Det relationelle rum som container for dybere processer. Forbindelse til familie, venskaber og nært samfund som helende kraft. Integration af det individuelle i den større sociale kontekst.</w:t>
-      </w:r>
-    </w:p>
-    <w:p>
-      <w:pPr>
-        <w:pStyle w:val="BodyText"/>
-      </w:pPr>
-      <w:r>
-        <w:rPr>
-          <w:bCs/>
-          <w:b/>
-        </w:rPr>
-        <w:t xml:space="preserve">Væskekroppens kvaliteter i det fælles</w:t>
-      </w:r>
-    </w:p>
-    <w:p>
-      <w:pPr>
-        <w:pStyle w:val="BodyText"/>
-      </w:pPr>
-      <w:r>
-        <w:t xml:space="preserve">Rum C inkluderer og udvider væskekroppens egenskaber fra Rum B ind i det relationelle felt. Den simultane respons gennem væskekroppen bliver nu til fælles respons mellem to eller flere systemer. Kapaciteten til The Neutral udvides til at omfatte det fælles rum. Automatic Shifting kan nu bevæge sig ikke kun gennem individet men gennem det relationelle felt.</w:t>
-      </w:r>
-    </w:p>
-    <w:p>
-      <w:pPr>
-        <w:pStyle w:val="BodyText"/>
-      </w:pPr>
-      <w:r>
-        <w:t xml:space="preserve">Den oprindelige midtlinje fra Rum B bliver reference ikke kun for individet men for hele det terapeutiske rum. Det autonome nervesystems fleksibilitet understøttes og forstærkes gennem mødet med andres regulerede systemer. De embryologiske kræfter arbejder nu gennem det relationelle interface.</w:t>
-      </w:r>
-    </w:p>
-    <w:p>
-      <w:pPr>
-        <w:pStyle w:val="BodyText"/>
-      </w:pPr>
-      <w:r>
-        <w:t xml:space="preserve">Du mærker væskekroppens egenskaber nu aktive i det fælles felt. Simultan respons gennem flere forbundne systemer. The Neutral som fælles tilstand mellem behandler og klient. Automatic Shifting gennem det relationelle rum. Co-regulering som forstærker nervesystemets fleksibilitet. De embryologiske kræfter arbejder gennem relationen.</w:t>
-      </w:r>
-    </w:p>
-    <w:p>
-      <w:pPr>
-        <w:pStyle w:val="BodyText"/>
-      </w:pPr>
-      <w:r>
-        <w:rPr>
-          <w:bCs/>
-          <w:b/>
-        </w:rPr>
-        <w:t xml:space="preserve">Broen til det universelle</w:t>
-      </w:r>
-    </w:p>
-    <w:p>
-      <w:pPr>
-        <w:pStyle w:val="BodyText"/>
-      </w:pPr>
-      <w:r>
-        <w:t xml:space="preserve">Rum C’s relationelle felt peger naturligt mod noget større — mod det som rækker ud over det nære og kendte. Her forberedes overgangen til det universelle, til det som forbinder hele menneskeheden. Det instinktive og fælles-menneskelige begynder at vise sig gennem det relationelle.</w:t>
-      </w:r>
-    </w:p>
-    <w:p>
-      <w:pPr>
-        <w:pStyle w:val="BodyText"/>
-      </w:pPr>
-      <w:r>
-        <w:t xml:space="preserve">Dette er ikke længere kun familie og lokalt samfund, men forbindelsen til noget der transcenderer individuelle og lokale grænser. The Long Tide’s universelle bevægelse fornemmes i baggrunden — den kraft som forbinder alt levende på tværs af det individuelle og det nært relationelle. Rum D forberedes gennem erkendelsen af at vi er del af noget langt større.</w:t>
-      </w:r>
-    </w:p>
-    <w:p>
-      <w:pPr>
-        <w:pStyle w:val="BodyText"/>
-      </w:pPr>
-      <w:r>
-        <w:t xml:space="preserve">Du fornemmer det universelle der viser sig gennem det partikulære. Forbindelsen til menneskeheden som helhed. Det instinktive og arketypiske der lever i alle. The Long Tide’s tilstedeværelse i baggrunden. Det fælles på tværs af alle individuelle og relationelle grænser. Åbningen mod Rum D hvor det universelle felt dominerer.</w:t>
-      </w:r>
-    </w:p>
-    <w:p>
-      <w:pPr>
-        <w:pStyle w:val="BodyText"/>
-      </w:pPr>
-      <w:r>
-        <w:rPr>
-          <w:bCs/>
-          <w:b/>
-        </w:rPr>
-        <w:t xml:space="preserve">Som ét fælles rum</w:t>
-      </w:r>
-    </w:p>
-    <w:p>
-      <w:pPr>
-        <w:pStyle w:val="BodyText"/>
-      </w:pPr>
-      <w:r>
-        <w:t xml:space="preserve">Det relationelle felt er ét fælles rum der opstår når to systemer møder hinanden. Væskekroppens kvaliteter lever videre i co-reguleringens biologiske rytme, og åbningen mod det universelle peger naturligt videre — alt vibrerer samtidigt i hvert øjeblik af mødet, som tonaliteter af samme forbindelse snarere end lag der skal gennemleves. At vi er sociale væsener tilhører vores fysiologi — vores arv som pattedyr. Helingen sker ofte præcis her hvor to nervesystemer finder hinanden, og når vi hviler i det fælles rum, peger det af sig selv mod noget større — som en naturlig forlængelse af det nære, ikke som en flugt fra det.</w:t>
-      </w:r>
-    </w:p>
-    <w:p>
-      <w:pPr>
-        <w:pStyle w:val="BodyText"/>
-      </w:pPr>
-      <w:r>
-        <w:rPr>
-          <w:bCs/>
-          <w:b/>
-        </w:rPr>
-        <w:t xml:space="preserve">[REFLEKSIONSSPØRGSMÅL]</w:t>
-      </w:r>
-    </w:p>
-    <w:p>
-      <w:pPr>
-        <w:numPr>
-          <w:ilvl w:val="0"/>
-          <w:numId w:val="1059"/>
-        </w:numPr>
-      </w:pPr>
-      <w:r>
-        <w:t xml:space="preserve">Det fælles rum opstår — det laves ikke. Hvilke betingelser i dig selv inviterer det frem?</w:t>
-      </w:r>
-    </w:p>
-    <w:p>
-      <w:pPr>
-        <w:numPr>
-          <w:ilvl w:val="0"/>
-          <w:numId w:val="1059"/>
-        </w:numPr>
-      </w:pPr>
-      <w:r>
-        <w:t xml:space="preserve">Et andet menneskes regulering registreres ofte i kroppen før i hovedet. Hvor møder du den først?</w:t>
-      </w:r>
-    </w:p>
-    <w:p>
-      <w:pPr>
-        <w:numPr>
-          <w:ilvl w:val="0"/>
-          <w:numId w:val="1059"/>
-        </w:numPr>
-      </w:pPr>
-      <w:r>
-        <w:t xml:space="preserve">Når feltet selv heler — vidne, vært eller ledsager — hvilken position er sværest at hvile i?</w:t>
-      </w:r>
-    </w:p>
-    <w:p>
-      <w:pPr>
-        <w:pStyle w:val="FirstParagraph"/>
-      </w:pPr>
-      <w:r>
-        <w:rPr>
-          <w:bCs/>
-          <w:b/>
-        </w:rPr>
-        <w:t xml:space="preserve">[BRØDTEKST: Rum D — The Long Tide / Primary Respiration]</w:t>
-      </w:r>
-    </w:p>
-    <w:p>
-      <w:pPr>
-        <w:pStyle w:val="BodyText"/>
-      </w:pPr>
+        <w:t xml:space="preserve"> </w:t>
+      </w:r>
       <w:r>
         <w:rPr>
           <w:iCs/>
           <w:i/>
         </w:rPr>
-        <w:t xml:space="preserve">Nu træder du ind i det universelle felt — hvor The Long Tide bevæger sig fra horisonten med sin dybe, langsomme rytme, bærende livets matrix og skabelonen for optimal funktion.</w:t>
-      </w:r>
-    </w:p>
-    <w:p>
-      <w:pPr>
-        <w:pStyle w:val="BodyText"/>
-      </w:pPr>
-      <w:r>
-        <w:rPr>
-          <w:bCs/>
-          <w:b/>
-        </w:rPr>
-        <w:t xml:space="preserve">The Long Tide som universelt felt</w:t>
-      </w:r>
-    </w:p>
-    <w:p>
-      <w:pPr>
-        <w:pStyle w:val="BodyText"/>
-      </w:pPr>
-      <w:r>
-        <w:t xml:space="preserve">Dette er Primary Respiration’s energetiske udtryk — den universelle bevægelse der kommer fra horisonten mod kroppens midtlinje med sin 100 sekunders cyklus. Her transcenderer vi det individuelle og det nært relationelle for at møde det som forbinder alt levende. The Long Tide bærer livets blueprint, den perfekte skabelon som aldrig mistes.</w:t>
-      </w:r>
-    </w:p>
-    <w:p>
-      <w:pPr>
-        <w:pStyle w:val="BodyText"/>
-      </w:pPr>
-      <w:r>
-        <w:t xml:space="preserve">I Rum D opleves direkte hvordan vi er del af noget langt større — ikke som idé men som levende erfaring. Det instinktive niveau aktiveres, millioner af års evolutionær visdom bliver tilgængelig. Dette er ikke enhed i den absolutte forstand som i Dynamisk Stilhed, men oplevelsen af at være forbundet med hele livets væv på tværs af alle grænser.</w:t>
-      </w:r>
-    </w:p>
-    <w:p>
-      <w:pPr>
-        <w:pStyle w:val="BodyText"/>
-      </w:pPr>
-      <w:r>
-        <w:t xml:space="preserve">Du oplever 100 sekunders cyklus — 6 cyklusser hver 10. minut. Bevægelse fra horisonten til midtlinjen som bærer livets matrix. Det universelle der transcenderer det individuelle og relationelle. Instinktiv erkendelse og urgammel visdom bliver tilgængelig. Forbindelse med hele menneskeheden og alt levende. Primary Respiration som organiserende kraft for al heling.</w:t>
-      </w:r>
-    </w:p>
-    <w:p>
-      <w:pPr>
-        <w:pStyle w:val="BodyText"/>
-      </w:pPr>
-      <w:r>
-        <w:rPr>
-          <w:bCs/>
-          <w:b/>
-        </w:rPr>
-        <w:t xml:space="preserve">Det relationelle felt integreret</w:t>
-      </w:r>
-    </w:p>
-    <w:p>
-      <w:pPr>
-        <w:pStyle w:val="BodyText"/>
-      </w:pPr>
-      <w:r>
-        <w:t xml:space="preserve">Rum D inkluderer og transcenderer Rum C’s relationelle kvaliteter. Det terapeutiske rum mellem behandler og klient bliver nu del af et større felt. Co-reguleringen udvides fra det nære til det universelle — vi regulerer ikke kun med hinanden men med livets egen rytme.</w:t>
-      </w:r>
-    </w:p>
-    <w:p>
-      <w:pPr>
-        <w:pStyle w:val="BodyText"/>
-      </w:pPr>
-      <w:r>
-        <w:t xml:space="preserve">Familien, venskaberne, det nære samfund fra Rum C er stadig til stede men nu som aspekter af noget større. The Long Tide organiserer alle de relationelle felter, forbinder dem i én samlet bevægelse. De embryologiske kræfter arbejder nu ikke kun gennem individet eller relationen men gennem hele det universelle felt.</w:t>
-      </w:r>
-    </w:p>
-    <w:p>
-      <w:pPr>
-        <w:pStyle w:val="BodyText"/>
-      </w:pPr>
-      <w:r>
-        <w:t xml:space="preserve">Du mærker Rum C’s relationelle felt nu båret af The Long Tide. Co-regulering udvides til universel synkronisering. Det nære samfund som del af hele menneskeheden. Alle individuelle og relationelle processer organiseret af én rytme. De embryologiske kræfter arbejder gennem det universelle. Integration af alle tidligere zoner i én samlet bevægelse.</w:t>
-      </w:r>
-    </w:p>
-    <w:p>
-      <w:pPr>
-        <w:pStyle w:val="BodyText"/>
-      </w:pPr>
-      <w:r>
-        <w:rPr>
-          <w:bCs/>
-          <w:b/>
-        </w:rPr>
-        <w:t xml:space="preserve">Porten til Dynamisk Stilhed</w:t>
-      </w:r>
-    </w:p>
-    <w:p>
-      <w:pPr>
-        <w:pStyle w:val="BodyText"/>
-      </w:pPr>
-      <w:r>
-        <w:t xml:space="preserve">I Rum D forberedes det ultimative møde med livets oprindelse. The Long Tide’s bevægelse peger naturligt mod sin egen kilde — Dynamisk Stilhed. I øjeblikke af fuldstændig synkronisering og overgivelse kan grænsen mellem bevægelse og stilhed blive gennemsigtig.</w:t>
-      </w:r>
-    </w:p>
-    <w:p>
-      <w:pPr>
-        <w:pStyle w:val="BodyText"/>
-      </w:pPr>
-      <w:r>
-        <w:t xml:space="preserve">Her fornemmes at selv The Long Tide udspringer fra noget dybere — det umanifesterede potentiale, livets arnested. Rum E’s kvaliteter begynder at vise sig som mulighed — ikke som noget vi kan gribe men som nådens potentiale. Paradokset hvor al bevægelse udspringer fra stilhed bliver til levende erfaring.</w:t>
-      </w:r>
-    </w:p>
-    <w:p>
-      <w:pPr>
-        <w:pStyle w:val="BodyText"/>
-      </w:pPr>
-      <w:r>
-        <w:t xml:space="preserve">Du fornemmer Dynamisk Stilhed som The Long Tide’s oprindelse. Porten til det umanifesterede potentiale. Bevægelse og stilhed som to aspekter af samme virkelighed. Muligheden for øjeblikkelig transmutation. Nådens potentiale der venter uden for viljen. Forberedelsen til Rum E’s paradoksale virkelighed.</w:t>
-      </w:r>
-    </w:p>
-    <w:p>
-      <w:pPr>
-        <w:pStyle w:val="BodyText"/>
-      </w:pPr>
-      <w:r>
-        <w:rPr>
-          <w:bCs/>
-          <w:b/>
-        </w:rPr>
-        <w:t xml:space="preserve">Som ét universelt felt</w:t>
-      </w:r>
-    </w:p>
-    <w:p>
-      <w:pPr>
-        <w:pStyle w:val="BodyText"/>
-      </w:pPr>
-      <w:r>
-        <w:t xml:space="preserve">The Long Tide er ét universelt felt der bevæger sig fra horisonten gennem alt vi rører ved. Det relationelle bæres med ind i en dybere rytme, og porten mod Dynamisk Stilhed begynder at vise sig — én kraft der altid har været til stede, ikke et hierarki af lag men aspekter af samme bevægelse. Vi mærker den nu fordi betingelserne har samlet sig — fordi sansningen er blevet stille nok til at horisonten kan høres. Når vi bliver bevæget af den, opdager vi at vi aldrig var adskilt fra livets store rytme; vi har bare manglet den ro der skal til for at lade den nå os.</w:t>
-      </w:r>
-    </w:p>
-    <w:p>
-      <w:pPr>
-        <w:pStyle w:val="BodyText"/>
-      </w:pPr>
-      <w:r>
-        <w:rPr>
-          <w:bCs/>
-          <w:b/>
-        </w:rPr>
-        <w:t xml:space="preserve">[REFLEKSIONSSPØRGSMÅL]</w:t>
-      </w:r>
-    </w:p>
-    <w:p>
-      <w:pPr>
-        <w:numPr>
-          <w:ilvl w:val="0"/>
-          <w:numId w:val="1060"/>
-        </w:numPr>
-      </w:pPr>
-      <w:r>
-        <w:t xml:space="preserve">Hvad sker der i et arbejde når du holder op med at lede efter The Long Tide og lader den finde dig?</w:t>
-      </w:r>
-    </w:p>
-    <w:p>
-      <w:pPr>
-        <w:numPr>
-          <w:ilvl w:val="0"/>
-          <w:numId w:val="1060"/>
-        </w:numPr>
-      </w:pPr>
-      <w:r>
-        <w:t xml:space="preserve">Roen der gør Long Tide hørbar er ikke teknik. Hvad i dit liv lige nu hjælper den ro frem, og hvad afskærmer den?</w:t>
-      </w:r>
-    </w:p>
-    <w:p>
-      <w:pPr>
-        <w:numPr>
-          <w:ilvl w:val="0"/>
-          <w:numId w:val="1060"/>
-        </w:numPr>
-      </w:pPr>
-      <w:r>
-        <w:t xml:space="preserve">Mellem at observere og at blive bevæget findes en fin skift. Beskriv øjeblikket — eller dets fravær — fra dit seneste klient-arbejde.</w:t>
-      </w:r>
-    </w:p>
-    <w:p>
-      <w:pPr>
-        <w:pStyle w:val="FirstParagraph"/>
-      </w:pPr>
-      <w:r>
-        <w:rPr>
-          <w:bCs/>
-          <w:b/>
-        </w:rPr>
-        <w:t xml:space="preserve">[BRØDTEKST: Rum E — Dynamisk Stilhed]</w:t>
-      </w:r>
-    </w:p>
-    <w:p>
-      <w:pPr>
-        <w:pStyle w:val="BodyText"/>
-      </w:pPr>
+        <w:t xml:space="preserve">‘</w:t>
+      </w:r>
       <w:r>
         <w:rPr>
           <w:iCs/>
           <w:i/>
         </w:rPr>
+        <w:t xml:space="preserve">overfladiske</w:t>
+      </w:r>
+      <w:r>
+        <w:rPr>
+          <w:iCs/>
+          <w:i/>
+        </w:rPr>
+        <w:t xml:space="preserve">’</w:t>
+      </w:r>
+      <w:r>
+        <w:rPr>
+          <w:iCs/>
+          <w:i/>
+        </w:rPr>
+        <w:t xml:space="preserve"> </w:t>
+      </w:r>
+      <w:r>
+        <w:rPr>
+          <w:iCs/>
+          <w:i/>
+        </w:rPr>
+        <w:t xml:space="preserve">niveau, men det er en fejlforståelse. Den fysiske krop er ikke under de andre rum — den er det levende fundament hvorfra de andre rum udfolder sig. At ankre godt i Rum A er ikke begrænsning. Det er forudsætning.</w:t>
+      </w:r>
+    </w:p>
+    <w:p>
+      <w:pPr>
+        <w:pStyle w:val="BodyText"/>
+      </w:pPr>
+      <w:r>
+        <w:rPr>
+          <w:iCs/>
+          <w:i/>
+        </w:rPr>
+        <w:t xml:space="preserve">Nogle klienter når aldrig længere end Rum A i et behandlingsforløb. Det er ikke en mangel ved behandlingen. Det er hvad systemet kan rumme på det tidspunkt. Hvis vi presser videre, lukker vi det ned. Tålmodigheden ligger i at lade Rum A være nok når det er nok.</w:t>
+      </w:r>
+    </w:p>
+    <w:p>
+      <w:pPr>
+        <w:pStyle w:val="BodyText"/>
+      </w:pPr>
+      <w:r>
+        <w:rPr>
+          <w:iCs/>
+          <w:i/>
+        </w:rPr>
+        <w:t xml:space="preserve">Den hyppigste fejl i biodynamisk arbejde er at springe over Rum A på vej til</w:t>
+      </w:r>
+      <w:r>
+        <w:rPr>
+          <w:iCs/>
+          <w:i/>
+        </w:rPr>
+        <w:t xml:space="preserve"> </w:t>
+      </w:r>
+      <w:r>
+        <w:rPr>
+          <w:iCs/>
+          <w:i/>
+        </w:rPr>
+        <w:t xml:space="preserve">‘</w:t>
+      </w:r>
+      <w:r>
+        <w:rPr>
+          <w:iCs/>
+          <w:i/>
+        </w:rPr>
+        <w:t xml:space="preserve">noget dybere</w:t>
+      </w:r>
+      <w:r>
+        <w:rPr>
+          <w:iCs/>
+          <w:i/>
+        </w:rPr>
+        <w:t xml:space="preserve">’</w:t>
+      </w:r>
+      <w:r>
+        <w:rPr>
+          <w:iCs/>
+          <w:i/>
+        </w:rPr>
+        <w:t xml:space="preserve">. Klienten oplever det som distance — som om behandleren ikke er der hvor de er. Den dybeste behandling begynder altid med at hænderne hviler på den krop der faktisk er.</w:t>
+      </w:r>
+    </w:p>
+    <w:p>
+      <w:pPr>
+        <w:pStyle w:val="BodyText"/>
+      </w:pPr>
+      <w:r>
+        <w:rPr>
+          <w:bCs/>
+          <w:b/>
+        </w:rPr>
+        <w:t xml:space="preserve">[REFLEKSIONSSPØRGSMÅL]</w:t>
+      </w:r>
+    </w:p>
+    <w:p>
+      <w:pPr>
+        <w:numPr>
+          <w:ilvl w:val="0"/>
+          <w:numId w:val="1057"/>
+        </w:numPr>
+      </w:pPr>
+      <w:r>
+        <w:t xml:space="preserve">Tænk på et område i en klients krop der har båret en kompensation længe. Hvilken slags samtale opstår mellem dine hænder og dets historie?</w:t>
+      </w:r>
+    </w:p>
+    <w:p>
+      <w:pPr>
+        <w:numPr>
+          <w:ilvl w:val="0"/>
+          <w:numId w:val="1057"/>
+        </w:numPr>
+      </w:pPr>
+      <w:r>
+        <w:t xml:space="preserve">Stivhed og åbning lever i hinanden i samme væv. Mærk lige nu i din egen krop — hvor sidder den samtidighed for dig?</w:t>
+      </w:r>
+    </w:p>
+    <w:p>
+      <w:pPr>
+        <w:numPr>
+          <w:ilvl w:val="0"/>
+          <w:numId w:val="1057"/>
+        </w:numPr>
+      </w:pPr>
+      <w:r>
+        <w:t xml:space="preserve">Det vi kalder dysfunktion gav engang mening for systemet. Hvad gjorde det muligt at overleve dengang, og hvad har det kostet siden?</w:t>
+      </w:r>
+    </w:p>
+    <w:p>
+      <w:pPr>
+        <w:pStyle w:val="FirstParagraph"/>
+      </w:pPr>
+      <w:r>
+        <w:rPr>
+          <w:bCs/>
+          <w:b/>
+        </w:rPr>
+        <w:t xml:space="preserve">[BRØDTEKST: Rum B — Væskekroppen]</w:t>
+      </w:r>
+    </w:p>
+    <w:p>
+      <w:pPr>
+        <w:pStyle w:val="BodyText"/>
+      </w:pPr>
+      <w:r>
+        <w:rPr>
+          <w:iCs/>
+          <w:i/>
+        </w:rPr>
+        <w:t xml:space="preserve">Når tilliden etableres og kroppen begynder at slippe sin vagtsomhed, mærker du hvordan noget dybere vågner under dine hænder. Væskekroppen — millioner af år gammel og vis — begynder at røre på sig.</w:t>
+      </w:r>
+    </w:p>
+    <w:p>
+      <w:pPr>
+        <w:pStyle w:val="BodyText"/>
+      </w:pPr>
+      <w:r>
+        <w:rPr>
+          <w:bCs/>
+          <w:b/>
+        </w:rPr>
+        <w:t xml:space="preserve">Væskekroppens vågnende respons</w:t>
+      </w:r>
+    </w:p>
+    <w:p>
+      <w:pPr>
+        <w:pStyle w:val="BodyText"/>
+      </w:pPr>
+      <w:r>
+        <w:t xml:space="preserve">Her lever væskekroppen i sin naturlige tilstand — som ét levende kontinuum gennem hele organismen. Alle væsker fungerer som en funktionel enhed hvor respons sker simultant gennem hele matrixen, ikke sekvensielt som i nervesystemet. Dette er niveauet hvor kroppen kan gå til The Neutral, hvor det autonome nervesystem bliver fleksibelt og kan suspenderes, så de embryologiske kræfter kan overtage.</w:t>
+      </w:r>
+    </w:p>
+    <w:p>
+      <w:pPr>
+        <w:pStyle w:val="BodyText"/>
+      </w:pPr>
+      <w:r>
+        <w:t xml:space="preserve">Væskekroppen fungerer som bro mellem det energetiske blueprint og den fysiske krop. Den bærer protoplasma-kvaliteterne fra fosterstadiet videre gennem livet. Her findes kapaciteten til Automatic Shifting — hvor behandlingen springer fra sted til sted orkestreret af helhedens prioriteter. Den oprindelige midtlinje er det naturlige fulcrum som alt organiserer sig omkring.</w:t>
+      </w:r>
+    </w:p>
+    <w:p>
+      <w:pPr>
+        <w:pStyle w:val="BodyText"/>
+      </w:pPr>
+      <w:r>
+        <w:t xml:space="preserve">Du oplever et hav af væske der ånder under Primary Respiration. Simultan respons gennem hele væskekroppen som én samlet substans. Kapaciteten til at gå til The Neutral og kontakte de embryologiske kræfter. Det autonome nervesystems fleksibilitet og evne til suspension. Automatic Shifting som naturlig mulighed i væskemediet. Den oprindelige midtlinje som stabilt, organiserende fulcrum.</w:t>
+      </w:r>
+    </w:p>
+    <w:p>
+      <w:pPr>
+        <w:pStyle w:val="BodyText"/>
+      </w:pPr>
+      <w:r>
+        <w:rPr>
+          <w:bCs/>
+          <w:b/>
+        </w:rPr>
+        <w:t xml:space="preserve">Den medbragte tilstand</w:t>
+      </w:r>
+    </w:p>
+    <w:p>
+      <w:pPr>
+        <w:pStyle w:val="BodyText"/>
+      </w:pPr>
+      <w:r>
+        <w:t xml:space="preserve">Væskekroppen rummer hele Rum A — både den normale fysiske krop og alle dens dysfunktionelle områder. De traumatiske tilstande, arvævet, de låste mønstre fra den fysiske krop eksisterer stadig i væskens matrix, men nu i en anden kontekst. De rigide strukturer begynder at få væskekvalitet uden at være fuldt forløst.</w:t>
+      </w:r>
+    </w:p>
+    <w:p>
+      <w:pPr>
+        <w:pStyle w:val="BodyText"/>
+      </w:pPr>
+      <w:r>
+        <w:t xml:space="preserve">Det autonome nervesystems låsthed fra Rum A er stadig til stede men møder nu væskekroppens iboende fleksibilitet. De kompenserende midtlinjer og falske fulcrums eksisterer side om side med den oprindelige midtlinje. Adskillelsen mellem systemer begynder at opløses men er ikke fuldt integreret.</w:t>
+      </w:r>
+    </w:p>
+    <w:p>
+      <w:pPr>
+        <w:pStyle w:val="BodyText"/>
+      </w:pPr>
+      <w:r>
+        <w:t xml:space="preserve">Du mærker den fysiske krops normale funktion nu holdt i væskekontinuumet. Læsionsfelter og traumatiske aftryk der stadig ikke kan gå til neutral. Fast væv der begynder at få væskekvalitet men bevarer sin låsthed. Både normale og falske fulcrums rummet simultant i væsken. Det autonome nervesystems gradvise overgang mod fleksibilitet. Potentialet for heling der endnu ikke er aktiveret.</w:t>
+      </w:r>
+    </w:p>
+    <w:p>
+      <w:pPr>
+        <w:pStyle w:val="BodyText"/>
+      </w:pPr>
+      <w:r>
+        <w:rPr>
+          <w:bCs/>
+          <w:b/>
+        </w:rPr>
+        <w:t xml:space="preserve">Åbningen mod det relationelle</w:t>
+      </w:r>
+    </w:p>
+    <w:p>
+      <w:pPr>
+        <w:pStyle w:val="BodyText"/>
+      </w:pPr>
+      <w:r>
+        <w:t xml:space="preserve">Væskekroppen søger nu forbindelse til det større terapeutiske rum — det fælles felt mellem behandler og klient. Dette er ikke længere kun individuel proces men begyndelsen på erkendelsen af at heling sker i relation. Det relationelle aspekt er naturligt for os som pattedyr — vi er biologisk skabt til at co-regulere, til at finde balance gennem forbindelse.</w:t>
+      </w:r>
+    </w:p>
+    <w:p>
+      <w:pPr>
+        <w:pStyle w:val="BodyText"/>
+      </w:pPr>
+      <w:r>
+        <w:t xml:space="preserve">Her forberedes mødet mellem behandlerens og klientens væskekroppe. Grænsen ved huden viser sig at være mere flydende end antaget. Det terapeutiske rum bliver en container hvor dybere processer kan udfolde sig trygt. Denne zone peger mod vores naturlige behov for fællesskab — familie, venskaber, det nære samfund.</w:t>
+      </w:r>
+    </w:p>
+    <w:p>
+      <w:pPr>
+        <w:pStyle w:val="BodyText"/>
+      </w:pPr>
+      <w:r>
+        <w:t xml:space="preserve">Du fornemmer længslen efter det relationelle og fælles terapeutiske rum. Forberedelsen til mødet mellem to væskekroppe. Det biologiske behov for co-regulering og forbindelse. Grænsen mellem behandler og klient bliver mere gennemsigtig. Det terapeutiske rum som tryg container for dybere processer. Åbningen mod vores naturlige funktion som sociale væsener.</w:t>
+      </w:r>
+    </w:p>
+    <w:p>
+      <w:pPr>
+        <w:pStyle w:val="BodyText"/>
+      </w:pPr>
+      <w:r>
+        <w:rPr>
+          <w:bCs/>
+          <w:b/>
+        </w:rPr>
+        <w:t xml:space="preserve">Som ét levende kontinuum</w:t>
+      </w:r>
+    </w:p>
+    <w:p>
+      <w:pPr>
+        <w:pStyle w:val="BodyText"/>
+      </w:pPr>
+      <w:r>
+        <w:t xml:space="preserve">Væskekroppen er ét sammenhængende felt der ånder gennem alt det vi rører ved. Det medbragte fra det fysiske og den vågnende respons lever i samme matrix, og åbningen mod det relationelle ligger latent i selve væskens bevægelse. Hukommelsen om det fysiske er væskekroppens måde at bære helheden — og selve denne hukommelse gør forløsning mulig, fordi intet er forsvundet. Når vi følger væskens egen rytme, opdager vi at vores opgave ikke er at forene noget. Det er allerede forenet. Vi tillader bare at det viser sig.</w:t>
+      </w:r>
+    </w:p>
+    <w:p>
+      <w:pPr>
+        <w:pStyle w:val="BodyText"/>
+      </w:pPr>
+      <w:r>
+        <w:rPr>
+          <w:bCs/>
+          <w:b/>
+        </w:rPr>
+        <w:t xml:space="preserve">[INSPIRATION — nye vinkler at overveje]</w:t>
+      </w:r>
+    </w:p>
+    <w:p>
+      <w:pPr>
+        <w:pStyle w:val="BodyText"/>
+      </w:pPr>
+      <w:r>
+        <w:rPr>
+          <w:iCs/>
+          <w:i/>
+        </w:rPr>
+        <w:t xml:space="preserve">Væskekroppen i Rum B er ikke kun blod og lymfe — det er hele den fascielle interstitielle fluid-matrix. Det vi mærker når Rum B vågner er denne matrix der begynder at bevæge sig som en sammenhængende enhed snarere end som adskilte kompartments.</w:t>
+      </w:r>
+    </w:p>
+    <w:p>
+      <w:pPr>
+        <w:pStyle w:val="BodyText"/>
+      </w:pPr>
+      <w:r>
+        <w:rPr>
+          <w:iCs/>
+          <w:i/>
+        </w:rPr>
+        <w:t xml:space="preserve">Overgangen fra Rum A til Rum B mærkes ofte først som en kvalitetsændring i vævet. Det bliver</w:t>
+      </w:r>
+      <w:r>
+        <w:rPr>
+          <w:iCs/>
+          <w:i/>
+        </w:rPr>
+        <w:t xml:space="preserve"> </w:t>
+      </w:r>
+      <w:r>
+        <w:rPr>
+          <w:iCs/>
+          <w:i/>
+        </w:rPr>
+        <w:t xml:space="preserve">‘</w:t>
+      </w:r>
+      <w:r>
+        <w:rPr>
+          <w:iCs/>
+          <w:i/>
+        </w:rPr>
+        <w:t xml:space="preserve">vådere</w:t>
+      </w:r>
+      <w:r>
+        <w:rPr>
+          <w:iCs/>
+          <w:i/>
+        </w:rPr>
+        <w:t xml:space="preserve">’</w:t>
+      </w:r>
+      <w:r>
+        <w:rPr>
+          <w:iCs/>
+          <w:i/>
+        </w:rPr>
+        <w:t xml:space="preserve">, mere flydende. Klienten beskriver det nogle gange som om de bliver tunge eller lette samtidigt. Det er paradokset ved væskekroppen — den har vægt og letvægt på én gang.</w:t>
+      </w:r>
+    </w:p>
+    <w:p>
+      <w:pPr>
+        <w:pStyle w:val="BodyText"/>
+      </w:pPr>
+      <w:r>
+        <w:rPr>
+          <w:iCs/>
+          <w:i/>
+        </w:rPr>
+        <w:t xml:space="preserve">Når Rum B nægter at vågne, er det oftest fordi nervesystemet endnu ikke har givet sin tilladelse. Væskekroppen er afhængig af parasympatisk dominans for at flyde frit. Hvis behandlingen forhastes, blokerer sympatisk aktivering den proces vi venter på.</w:t>
+      </w:r>
+    </w:p>
+    <w:p>
+      <w:pPr>
+        <w:pStyle w:val="BodyText"/>
+      </w:pPr>
+      <w:r>
+        <w:rPr>
+          <w:bCs/>
+          <w:b/>
+        </w:rPr>
+        <w:t xml:space="preserve">[REFLEKSIONSSPØRGSMÅL]</w:t>
+      </w:r>
+    </w:p>
+    <w:p>
+      <w:pPr>
+        <w:numPr>
+          <w:ilvl w:val="0"/>
+          <w:numId w:val="1058"/>
+        </w:numPr>
+      </w:pPr>
+      <w:r>
+        <w:t xml:space="preserve">Hvis det allerede er forenet, hvad ændrer det så ved den helingshandling du tror du udfører?</w:t>
+      </w:r>
+    </w:p>
+    <w:p>
+      <w:pPr>
+        <w:numPr>
+          <w:ilvl w:val="0"/>
+          <w:numId w:val="1058"/>
+        </w:numPr>
+      </w:pPr>
+      <w:r>
+        <w:t xml:space="preserve">Væsken bærer hukommelse på en måde strukturen ikke gør. I dit seneste klient-arbejde — hvilken slags hukommelse mærkede du væsken bære?</w:t>
+      </w:r>
+    </w:p>
+    <w:p>
+      <w:pPr>
+        <w:numPr>
+          <w:ilvl w:val="0"/>
+          <w:numId w:val="1058"/>
+        </w:numPr>
+      </w:pPr>
+      <w:r>
+        <w:t xml:space="preserve">Lige før dine hænder slipper ledelsen, sker der noget i din egen krop. Beskriv den signal-bevægelse, hvis du kan finde ord for den.</w:t>
+      </w:r>
+    </w:p>
+    <w:p>
+      <w:pPr>
+        <w:pStyle w:val="FirstParagraph"/>
+      </w:pPr>
+      <w:r>
+        <w:rPr>
+          <w:bCs/>
+          <w:b/>
+        </w:rPr>
+        <w:t xml:space="preserve">[BRØDTEKST: Rum C — Det Relationelle Felt]</w:t>
+      </w:r>
+    </w:p>
+    <w:p>
+      <w:pPr>
+        <w:pStyle w:val="BodyText"/>
+      </w:pPr>
+      <w:r>
+        <w:rPr>
+          <w:iCs/>
+          <w:i/>
+        </w:rPr>
+        <w:t xml:space="preserve">Når væskekroppen har fundet sin rytme og grænsen mellem behandler og klient bliver mere flydende, opstår et fælles felt — et relationelt rum hvor vi møder vores naturlige biologiske arv som sociale væsener.</w:t>
+      </w:r>
+    </w:p>
+    <w:p>
+      <w:pPr>
+        <w:pStyle w:val="BodyText"/>
+      </w:pPr>
+      <w:r>
+        <w:rPr>
+          <w:bCs/>
+          <w:b/>
+        </w:rPr>
+        <w:t xml:space="preserve">Det relationelle som naturlig funktion</w:t>
+      </w:r>
+    </w:p>
+    <w:p>
+      <w:pPr>
+        <w:pStyle w:val="BodyText"/>
+      </w:pPr>
+      <w:r>
+        <w:t xml:space="preserve">Her udfolder Rum C sig som vores medfødte kapacitet til at fungere i relation. Som pattedyr er vi biologisk udviklet til at leve, udveksle og co-regulere med andre. Dette er ikke en tillært færdighed men en iboende del af vores natur — vi er skabt til at finde balance gennem forbindelse med familie, venskaber, kollegaer og det nære samfund.</w:t>
+      </w:r>
+    </w:p>
+    <w:p>
+      <w:pPr>
+        <w:pStyle w:val="BodyText"/>
+      </w:pPr>
+      <w:r>
+        <w:t xml:space="preserve">I behandlingssituationen manifesterer dette sig som det terapeutiske rum mellem behandler og klient — et fælles felt hvor begge systemer mødes og påvirker hinanden. Dette er et dybere niveau end det individuelle, hvor heling sker gennem selve relationen. Det nære samfund — vores by, region, arbejdsplads — udgør den naturlige kontekst hvor vores biologiske behov for tilhørsforhold og udveksling udfolder sig.</w:t>
+      </w:r>
+    </w:p>
+    <w:p>
+      <w:pPr>
+        <w:pStyle w:val="BodyText"/>
+      </w:pPr>
+      <w:r>
+        <w:t xml:space="preserve">Du oplever det fælles felt mellem behandler og klient som levende realitet. Co-regulering som naturlig biologisk funktion. Nervesystemernes gensidige påvirkning og stabilisering. Det relationelle rum som container for dybere processer. Forbindelse til familie, venskaber og nært samfund som helende kraft. Integration af det individuelle i den større sociale kontekst.</w:t>
+      </w:r>
+    </w:p>
+    <w:p>
+      <w:pPr>
+        <w:pStyle w:val="BodyText"/>
+      </w:pPr>
+      <w:r>
+        <w:rPr>
+          <w:bCs/>
+          <w:b/>
+        </w:rPr>
+        <w:t xml:space="preserve">Væskekroppens kvaliteter i det fælles</w:t>
+      </w:r>
+    </w:p>
+    <w:p>
+      <w:pPr>
+        <w:pStyle w:val="BodyText"/>
+      </w:pPr>
+      <w:r>
+        <w:t xml:space="preserve">Rum C inkluderer og udvider væskekroppens egenskaber fra Rum B ind i det relationelle felt. Den simultane respons gennem væskekroppen bliver nu til fælles respons mellem to eller flere systemer. Kapaciteten til The Neutral udvides til at omfatte det fælles rum. Automatic Shifting kan nu bevæge sig ikke kun gennem individet men gennem det relationelle felt.</w:t>
+      </w:r>
+    </w:p>
+    <w:p>
+      <w:pPr>
+        <w:pStyle w:val="BodyText"/>
+      </w:pPr>
+      <w:r>
+        <w:t xml:space="preserve">Den oprindelige midtlinje fra Rum B bliver reference ikke kun for individet men for hele det terapeutiske rum. Det autonome nervesystems fleksibilitet understøttes og forstærkes gennem mødet med andres regulerede systemer. De embryologiske kræfter arbejder nu gennem det relationelle interface.</w:t>
+      </w:r>
+    </w:p>
+    <w:p>
+      <w:pPr>
+        <w:pStyle w:val="BodyText"/>
+      </w:pPr>
+      <w:r>
+        <w:t xml:space="preserve">Du mærker væskekroppens egenskaber nu aktive i det fælles felt. Simultan respons gennem flere forbundne systemer. The Neutral som fælles tilstand mellem behandler og klient. Automatic Shifting gennem det relationelle rum. Co-regulering som forstærker nervesystemets fleksibilitet. De embryologiske kræfter arbejder gennem relationen.</w:t>
+      </w:r>
+    </w:p>
+    <w:p>
+      <w:pPr>
+        <w:pStyle w:val="BodyText"/>
+      </w:pPr>
+      <w:r>
+        <w:rPr>
+          <w:bCs/>
+          <w:b/>
+        </w:rPr>
+        <w:t xml:space="preserve">Broen til det universelle</w:t>
+      </w:r>
+    </w:p>
+    <w:p>
+      <w:pPr>
+        <w:pStyle w:val="BodyText"/>
+      </w:pPr>
+      <w:r>
+        <w:t xml:space="preserve">Rum C’s relationelle felt peger naturligt mod noget større — mod det som rækker ud over det nære og kendte. Her forberedes overgangen til det universelle, til det som forbinder hele menneskeheden. Det instinktive og fælles-menneskelige begynder at vise sig gennem det relationelle.</w:t>
+      </w:r>
+    </w:p>
+    <w:p>
+      <w:pPr>
+        <w:pStyle w:val="BodyText"/>
+      </w:pPr>
+      <w:r>
+        <w:t xml:space="preserve">Dette er ikke længere kun familie og lokalt samfund, men forbindelsen til noget der transcenderer individuelle og lokale grænser. The Long Tide’s universelle bevægelse fornemmes i baggrunden — den kraft som forbinder alt levende på tværs af det individuelle og det nært relationelle. Rum D forberedes gennem erkendelsen af at vi er del af noget langt større.</w:t>
+      </w:r>
+    </w:p>
+    <w:p>
+      <w:pPr>
+        <w:pStyle w:val="BodyText"/>
+      </w:pPr>
+      <w:r>
+        <w:t xml:space="preserve">Du fornemmer det universelle der viser sig gennem det partikulære. Forbindelsen til menneskeheden som helhed. Det instinktive og arketypiske der lever i alle. The Long Tide’s tilstedeværelse i baggrunden. Det fælles på tværs af alle individuelle og relationelle grænser. Åbningen mod Rum D hvor det universelle felt dominerer.</w:t>
+      </w:r>
+    </w:p>
+    <w:p>
+      <w:pPr>
+        <w:pStyle w:val="BodyText"/>
+      </w:pPr>
+      <w:r>
+        <w:rPr>
+          <w:bCs/>
+          <w:b/>
+        </w:rPr>
+        <w:t xml:space="preserve">Som ét fælles rum</w:t>
+      </w:r>
+    </w:p>
+    <w:p>
+      <w:pPr>
+        <w:pStyle w:val="BodyText"/>
+      </w:pPr>
+      <w:r>
+        <w:t xml:space="preserve">Det relationelle felt er ét fælles rum der opstår når to systemer møder hinanden. Væskekroppens kvaliteter lever videre i co-reguleringens biologiske rytme, og åbningen mod det universelle peger naturligt videre — alt vibrerer samtidigt i hvert øjeblik af mødet, som tonaliteter af samme forbindelse snarere end lag der skal gennemleves. At vi er sociale væsener tilhører vores fysiologi — vores arv som pattedyr. Helingen sker ofte præcis her hvor to nervesystemer finder hinanden, og når vi hviler i det fælles rum, peger det af sig selv mod noget større — som en naturlig forlængelse af det nære, ikke som en flugt fra det.</w:t>
+      </w:r>
+    </w:p>
+    <w:p>
+      <w:pPr>
+        <w:pStyle w:val="BodyText"/>
+      </w:pPr>
+      <w:r>
+        <w:rPr>
+          <w:bCs/>
+          <w:b/>
+        </w:rPr>
+        <w:t xml:space="preserve">[INSPIRATION — nye vinkler at overveje]</w:t>
+      </w:r>
+    </w:p>
+    <w:p>
+      <w:pPr>
+        <w:pStyle w:val="BodyText"/>
+      </w:pPr>
+      <w:r>
+        <w:rPr>
+          <w:iCs/>
+          <w:i/>
+        </w:rPr>
+        <w:t xml:space="preserve">Rum C svarer biologisk til den ventral-vagale tilstand i Porges’ polyvagal-teori — det system der opstår når vi sociale pattedyr mødes uden trussel. Det er ikke en metaforisk parallel; det er det samme system. Vi bygger på en eksisterende neurobiologisk arkitektur.</w:t>
+      </w:r>
+    </w:p>
+    <w:p>
+      <w:pPr>
+        <w:pStyle w:val="BodyText"/>
+      </w:pPr>
+      <w:r>
+        <w:rPr>
+          <w:iCs/>
+          <w:i/>
+        </w:rPr>
+        <w:t xml:space="preserve">I det relationelle felt bliver behandleren også ændret. Det er ikke en énvejsbevægelse fra os til klienten. Vi mærker noget i os selv vågne i takt med klientens åbning. At anerkende dette uden at lade vores eget materiale fylde feltet er en daglig disciplin.</w:t>
+      </w:r>
+    </w:p>
+    <w:p>
+      <w:pPr>
+        <w:pStyle w:val="BodyText"/>
+      </w:pPr>
+      <w:r>
+        <w:rPr>
+          <w:iCs/>
+          <w:i/>
+        </w:rPr>
+        <w:t xml:space="preserve">Når det relationelle felt overvælder klienten, er det ofte fordi det er længe siden de har været i et trygt felt. Selv det at føle sig set kan være krævende. Vores opgave er ikke at gå frem, men at give feltet plads og tid til at modne i sit eget tempo.</w:t>
+      </w:r>
+    </w:p>
+    <w:p>
+      <w:pPr>
+        <w:pStyle w:val="BodyText"/>
+      </w:pPr>
+      <w:r>
+        <w:rPr>
+          <w:bCs/>
+          <w:b/>
+        </w:rPr>
+        <w:t xml:space="preserve">[REFLEKSIONSSPØRGSMÅL]</w:t>
+      </w:r>
+    </w:p>
+    <w:p>
+      <w:pPr>
+        <w:numPr>
+          <w:ilvl w:val="0"/>
+          <w:numId w:val="1059"/>
+        </w:numPr>
+      </w:pPr>
+      <w:r>
+        <w:t xml:space="preserve">Det fælles rum opstår — det laves ikke. Hvilke betingelser i dig selv inviterer det frem?</w:t>
+      </w:r>
+    </w:p>
+    <w:p>
+      <w:pPr>
+        <w:numPr>
+          <w:ilvl w:val="0"/>
+          <w:numId w:val="1059"/>
+        </w:numPr>
+      </w:pPr>
+      <w:r>
+        <w:t xml:space="preserve">Et andet menneskes regulering registreres ofte i kroppen før i hovedet. Hvor møder du den først?</w:t>
+      </w:r>
+    </w:p>
+    <w:p>
+      <w:pPr>
+        <w:numPr>
+          <w:ilvl w:val="0"/>
+          <w:numId w:val="1059"/>
+        </w:numPr>
+      </w:pPr>
+      <w:r>
+        <w:t xml:space="preserve">Når feltet selv heler — vidne, vært eller ledsager — hvilken position er sværest at hvile i?</w:t>
+      </w:r>
+    </w:p>
+    <w:p>
+      <w:pPr>
+        <w:pStyle w:val="FirstParagraph"/>
+      </w:pPr>
+      <w:r>
+        <w:rPr>
+          <w:bCs/>
+          <w:b/>
+        </w:rPr>
+        <w:t xml:space="preserve">[BRØDTEKST: Rum D — The Long Tide / Primary Respiration]</w:t>
+      </w:r>
+    </w:p>
+    <w:p>
+      <w:pPr>
+        <w:pStyle w:val="BodyText"/>
+      </w:pPr>
+      <w:r>
+        <w:rPr>
+          <w:iCs/>
+          <w:i/>
+        </w:rPr>
+        <w:t xml:space="preserve">Nu træder du ind i det universelle felt — hvor The Long Tide bevæger sig fra horisonten med sin dybe, langsomme rytme, bærende livets matrix og skabelonen for optimal funktion.</w:t>
+      </w:r>
+    </w:p>
+    <w:p>
+      <w:pPr>
+        <w:pStyle w:val="BodyText"/>
+      </w:pPr>
+      <w:r>
+        <w:rPr>
+          <w:bCs/>
+          <w:b/>
+        </w:rPr>
+        <w:t xml:space="preserve">The Long Tide som universelt felt</w:t>
+      </w:r>
+    </w:p>
+    <w:p>
+      <w:pPr>
+        <w:pStyle w:val="BodyText"/>
+      </w:pPr>
+      <w:r>
+        <w:t xml:space="preserve">Dette er Primary Respiration’s energetiske udtryk — den universelle bevægelse der kommer fra horisonten mod kroppens midtlinje med sin 100 sekunders cyklus. Her transcenderer vi det individuelle og det nært relationelle for at møde det som forbinder alt levende. The Long Tide bærer livets blueprint, den perfekte skabelon som aldrig mistes.</w:t>
+      </w:r>
+    </w:p>
+    <w:p>
+      <w:pPr>
+        <w:pStyle w:val="BodyText"/>
+      </w:pPr>
+      <w:r>
+        <w:t xml:space="preserve">I Rum D opleves direkte hvordan vi er del af noget langt større — ikke som idé men som levende erfaring. Det instinktive niveau aktiveres, millioner af års evolutionær visdom bliver tilgængelig. Dette er ikke enhed i den absolutte forstand som i Dynamisk Stilhed, men oplevelsen af at være forbundet med hele livets væv på tværs af alle grænser.</w:t>
+      </w:r>
+    </w:p>
+    <w:p>
+      <w:pPr>
+        <w:pStyle w:val="BodyText"/>
+      </w:pPr>
+      <w:r>
+        <w:t xml:space="preserve">Du oplever 100 sekunders cyklus — 6 cyklusser hver 10. minut. Bevægelse fra horisonten til midtlinjen som bærer livets matrix. Det universelle der transcenderer det individuelle og relationelle. Instinktiv erkendelse og urgammel visdom bliver tilgængelig. Forbindelse med hele menneskeheden og alt levende. Primary Respiration som organiserende kraft for al heling.</w:t>
+      </w:r>
+    </w:p>
+    <w:p>
+      <w:pPr>
+        <w:pStyle w:val="BodyText"/>
+      </w:pPr>
+      <w:r>
+        <w:rPr>
+          <w:bCs/>
+          <w:b/>
+        </w:rPr>
+        <w:t xml:space="preserve">Det relationelle felt integreret</w:t>
+      </w:r>
+    </w:p>
+    <w:p>
+      <w:pPr>
+        <w:pStyle w:val="BodyText"/>
+      </w:pPr>
+      <w:r>
+        <w:t xml:space="preserve">Rum D inkluderer og transcenderer Rum C’s relationelle kvaliteter. Det terapeutiske rum mellem behandler og klient bliver nu del af et større felt. Co-reguleringen udvides fra det nære til det universelle — vi regulerer ikke kun med hinanden men med livets egen rytme.</w:t>
+      </w:r>
+    </w:p>
+    <w:p>
+      <w:pPr>
+        <w:pStyle w:val="BodyText"/>
+      </w:pPr>
+      <w:r>
+        <w:t xml:space="preserve">Familien, venskaberne, det nære samfund fra Rum C er stadig til stede men nu som aspekter af noget større. The Long Tide organiserer alle de relationelle felter, forbinder dem i én samlet bevægelse. De embryologiske kræfter arbejder nu ikke kun gennem individet eller relationen men gennem hele det universelle felt.</w:t>
+      </w:r>
+    </w:p>
+    <w:p>
+      <w:pPr>
+        <w:pStyle w:val="BodyText"/>
+      </w:pPr>
+      <w:r>
+        <w:t xml:space="preserve">Du mærker Rum C’s relationelle felt nu båret af The Long Tide. Co-regulering udvides til universel synkronisering. Det nære samfund som del af hele menneskeheden. Alle individuelle og relationelle processer organiseret af én rytme. De embryologiske kræfter arbejder gennem det universelle. Integration af alle tidligere zoner i én samlet bevægelse.</w:t>
+      </w:r>
+    </w:p>
+    <w:p>
+      <w:pPr>
+        <w:pStyle w:val="BodyText"/>
+      </w:pPr>
+      <w:r>
+        <w:rPr>
+          <w:bCs/>
+          <w:b/>
+        </w:rPr>
+        <w:t xml:space="preserve">Porten til Dynamisk Stilhed</w:t>
+      </w:r>
+    </w:p>
+    <w:p>
+      <w:pPr>
+        <w:pStyle w:val="BodyText"/>
+      </w:pPr>
+      <w:r>
+        <w:t xml:space="preserve">I Rum D forberedes det ultimative møde med livets oprindelse. The Long Tide’s bevægelse peger naturligt mod sin egen kilde — Dynamisk Stilhed. I øjeblikke af fuldstændig synkronisering og overgivelse kan grænsen mellem bevægelse og stilhed blive gennemsigtig.</w:t>
+      </w:r>
+    </w:p>
+    <w:p>
+      <w:pPr>
+        <w:pStyle w:val="BodyText"/>
+      </w:pPr>
+      <w:r>
+        <w:t xml:space="preserve">Her fornemmes at selv The Long Tide udspringer fra noget dybere — det umanifesterede potentiale, livets arnested. Rum E’s kvaliteter begynder at vise sig som mulighed — ikke som noget vi kan gribe men som nådens potentiale. Paradokset hvor al bevægelse udspringer fra stilhed bliver til levende erfaring.</w:t>
+      </w:r>
+    </w:p>
+    <w:p>
+      <w:pPr>
+        <w:pStyle w:val="BodyText"/>
+      </w:pPr>
+      <w:r>
+        <w:t xml:space="preserve">Du fornemmer Dynamisk Stilhed som The Long Tide’s oprindelse. Porten til det umanifesterede potentiale. Bevægelse og stilhed som to aspekter af samme virkelighed. Muligheden for øjeblikkelig transmutation. Nådens potentiale der venter uden for viljen. Forberedelsen til Rum E’s paradoksale virkelighed.</w:t>
+      </w:r>
+    </w:p>
+    <w:p>
+      <w:pPr>
+        <w:pStyle w:val="BodyText"/>
+      </w:pPr>
+      <w:r>
+        <w:rPr>
+          <w:bCs/>
+          <w:b/>
+        </w:rPr>
+        <w:t xml:space="preserve">Som ét universelt felt</w:t>
+      </w:r>
+    </w:p>
+    <w:p>
+      <w:pPr>
+        <w:pStyle w:val="BodyText"/>
+      </w:pPr>
+      <w:r>
+        <w:t xml:space="preserve">The Long Tide er ét universelt felt der bevæger sig fra horisonten gennem alt vi rører ved. Det relationelle bæres med ind i en dybere rytme, og porten mod Dynamisk Stilhed begynder at vise sig — én kraft der altid har været til stede, ikke et hierarki af lag men aspekter af samme bevægelse. Vi mærker den nu fordi betingelserne har samlet sig — fordi sansningen er blevet stille nok til at horisonten kan høres. Når vi bliver bevæget af den, opdager vi at vi aldrig var adskilt fra livets store rytme; vi har bare manglet den ro der skal til for at lade den nå os.</w:t>
+      </w:r>
+    </w:p>
+    <w:p>
+      <w:pPr>
+        <w:pStyle w:val="BodyText"/>
+      </w:pPr>
+      <w:r>
+        <w:rPr>
+          <w:bCs/>
+          <w:b/>
+        </w:rPr>
+        <w:t xml:space="preserve">[INSPIRATION — nye vinkler at overveje]</w:t>
+      </w:r>
+    </w:p>
+    <w:p>
+      <w:pPr>
+        <w:pStyle w:val="BodyText"/>
+      </w:pPr>
+      <w:r>
+        <w:rPr>
+          <w:iCs/>
+          <w:i/>
+        </w:rPr>
+        <w:t xml:space="preserve">De 100 sekunder er ikke en målbar konstant — Sutherland talte om 6-10 cyklusser pr 10 minut, Jealous formulerede 100 sekunder som vejledende. At håndtere denne variation kræver at vi holder tallet løst. Det er en pejling, ikke en definition.</w:t>
+      </w:r>
+    </w:p>
+    <w:p>
+      <w:pPr>
+        <w:pStyle w:val="BodyText"/>
+      </w:pPr>
+      <w:r>
+        <w:rPr>
+          <w:iCs/>
+          <w:i/>
+        </w:rPr>
+        <w:t xml:space="preserve">Læringen af at mærke Long Tide sker ikke gennem instruktion men gennem mentor-overlevering: en erfaren behandler holder hænderne med dig på en klient, og over tid genkender du det som han eller hun mærker. Det er en mundtlig tradition mere end en målbar færdighed.</w:t>
+      </w:r>
+    </w:p>
+    <w:p>
+      <w:pPr>
+        <w:pStyle w:val="BodyText"/>
+      </w:pPr>
+      <w:r>
+        <w:rPr>
+          <w:iCs/>
+          <w:i/>
+        </w:rPr>
+        <w:t xml:space="preserve">En vanskelig erkendelse: nogle gange tror vi at mærke Long Tide, men det er noget andet — en intern rytme i os selv, en forventning, en forestilling. At kunne skelne mellem det indre billede af Long Tide og den faktiske oplevelse er en del af modningen.</w:t>
+      </w:r>
+    </w:p>
+    <w:p>
+      <w:pPr>
+        <w:pStyle w:val="BodyText"/>
+      </w:pPr>
+      <w:r>
+        <w:rPr>
+          <w:bCs/>
+          <w:b/>
+        </w:rPr>
+        <w:t xml:space="preserve">[REFLEKSIONSSPØRGSMÅL]</w:t>
+      </w:r>
+    </w:p>
+    <w:p>
+      <w:pPr>
+        <w:numPr>
+          <w:ilvl w:val="0"/>
+          <w:numId w:val="1060"/>
+        </w:numPr>
+      </w:pPr>
+      <w:r>
+        <w:t xml:space="preserve">Hvad sker der i et arbejde når du holder op med at lede efter The Long Tide og lader den finde dig?</w:t>
+      </w:r>
+    </w:p>
+    <w:p>
+      <w:pPr>
+        <w:numPr>
+          <w:ilvl w:val="0"/>
+          <w:numId w:val="1060"/>
+        </w:numPr>
+      </w:pPr>
+      <w:r>
+        <w:t xml:space="preserve">Roen der gør Long Tide hørbar er ikke teknik. Hvad i dit liv lige nu hjælper den ro frem, og hvad afskærmer den?</w:t>
+      </w:r>
+    </w:p>
+    <w:p>
+      <w:pPr>
+        <w:numPr>
+          <w:ilvl w:val="0"/>
+          <w:numId w:val="1060"/>
+        </w:numPr>
+      </w:pPr>
+      <w:r>
+        <w:t xml:space="preserve">Mellem at observere og at blive bevæget findes en fin skift. Beskriv øjeblikket — eller dets fravær — fra dit seneste klient-arbejde.</w:t>
+      </w:r>
+    </w:p>
+    <w:p>
+      <w:pPr>
+        <w:pStyle w:val="FirstParagraph"/>
+      </w:pPr>
+      <w:r>
+        <w:rPr>
+          <w:bCs/>
+          <w:b/>
+        </w:rPr>
+        <w:t xml:space="preserve">[BRØDTEKST: Rum E — Dynamisk Stilhed]</w:t>
+      </w:r>
+    </w:p>
+    <w:p>
+      <w:pPr>
+        <w:pStyle w:val="BodyText"/>
+      </w:pPr>
+      <w:r>
+        <w:rPr>
+          <w:iCs/>
+          <w:i/>
+        </w:rPr>
         <w:t xml:space="preserve">I sjældne øjeblikke af nåde træder du ind i Dynamisk Stilhed — paradoksernes verden hvor fuldstændig stilstand indeholder al bevægelse, hvor du er syg det ene øjeblik og det næste er det væk.</w:t>
       </w:r>
     </w:p>
@@ -11311,6 +13263,89 @@
       </w:pPr>
       <w:r>
         <w:t xml:space="preserve">Dynamisk Stilhed er ét umanifesteret felt der hverken kan gribes eller forklares — kun mødes. The Long Tides oprindelse og det vi kalder kærlighed er samme virkelighed set fra forskellige vinkler, og når vores ord her begynder at blive upræcise, er det fordi mysteriet og nåden er det eneste sprog der er tilbage. Adskillelsen mellem behandler og klient opløses sammen med adskillelsen mellem stilstand og bevægelse — tilbage er den rene tilstedeværelse hvor heling ikke længere er noget der gøres, men noget der er. Hvis Rum A var hvor vores hænder først mødte kroppen, er Rum E hvor kroppen og hænderne aldrig var adskilt fra livets oprindelse.</w:t>
+      </w:r>
+    </w:p>
+    <w:p>
+      <w:pPr>
+        <w:pStyle w:val="BodyText"/>
+      </w:pPr>
+      <w:r>
+        <w:rPr>
+          <w:bCs/>
+          <w:b/>
+        </w:rPr>
+        <w:t xml:space="preserve">[INSPIRATION — nye vinkler at overveje]</w:t>
+      </w:r>
+    </w:p>
+    <w:p>
+      <w:pPr>
+        <w:pStyle w:val="BodyText"/>
+      </w:pPr>
+      <w:r>
+        <w:rPr>
+          <w:iCs/>
+          <w:i/>
+        </w:rPr>
+        <w:t xml:space="preserve">Dynamisk Stilhed er ikke en højere bevidsthedstilstand eller et behandlings-mål. Den dukker op nogle gange uden at vi har planlagt det, og den lader sig ikke trænes. Det meste arbejde sker i Rum A til D, og det er som det skal være.</w:t>
+      </w:r>
+    </w:p>
+    <w:p>
+      <w:pPr>
+        <w:pStyle w:val="BodyText"/>
+      </w:pPr>
+      <w:r>
+        <w:rPr>
+          <w:iCs/>
+          <w:i/>
+        </w:rPr>
+        <w:t xml:space="preserve">Når sproget rammer sin grænse i Rum E, bliver det fristende at gribe til store ord. Sutherland kaldte den den dynamiske stilhed bag al bevægelse; Becker talte om det dybeste fulcrum; Jealous om mødet med den oprindelige sundhed. Hver tradition har sit ord — fænomenet er det samme.</w:t>
+      </w:r>
+    </w:p>
+    <w:p>
+      <w:pPr>
+        <w:pStyle w:val="BodyText"/>
+      </w:pPr>
+      <w:r>
+        <w:rPr>
+          <w:iCs/>
+          <w:i/>
+        </w:rPr>
+        <w:t xml:space="preserve">Polyvagalt set er Rum E sandsynligvis en tilstand af dyb parasympatisk dominans med kohærent kardio-vaskulær respons. Det forklarer ikke fænomenet — men det forhindrer at vi forveksler dybde med transcendens. Klienten er ikke</w:t>
+      </w:r>
+      <w:r>
+        <w:rPr>
+          <w:iCs/>
+          <w:i/>
+        </w:rPr>
+        <w:t xml:space="preserve"> </w:t>
+      </w:r>
+      <w:r>
+        <w:rPr>
+          <w:iCs/>
+          <w:i/>
+        </w:rPr>
+        <w:t xml:space="preserve">‘</w:t>
+      </w:r>
+      <w:r>
+        <w:rPr>
+          <w:iCs/>
+          <w:i/>
+        </w:rPr>
+        <w:t xml:space="preserve">ude af kroppen</w:t>
+      </w:r>
+      <w:r>
+        <w:rPr>
+          <w:iCs/>
+          <w:i/>
+        </w:rPr>
+        <w:t xml:space="preserve">’</w:t>
+      </w:r>
+      <w:r>
+        <w:rPr>
+          <w:iCs/>
+          <w:i/>
+        </w:rPr>
+        <w:t xml:space="preserve">; nervesystemet hviler i sin grundtone.</w:t>
       </w:r>
     </w:p>
     <w:p>

</xml_diff>

<commit_message>
Redigerbart udkast: 5 inspirations-paragraffer pr. begreb og rum (3+2)
</commit_message>
<xml_diff>
--- a/tools/output/manuskript-redigerbar.docx
+++ b/tools/output/manuskript-redigerbar.docx
@@ -2406,6 +2406,30 @@
       </w:pPr>
       <w:r>
         <w:rPr>
+          <w:iCs/>
+          <w:i/>
+        </w:rPr>
+        <w:t xml:space="preserve">I Dynamisk Stilhed er der ikke længere én der behandler og en der bliver behandlet. Der er kun feltet, som ved hvad det skal. Behandling bliver et vidnesbyrd om livets egen skabende kraft, og det vi kalder heling sker uden at nogen har gjort noget.</w:t>
+      </w:r>
+    </w:p>
+    <w:p>
+      <w:pPr>
+        <w:pStyle w:val="BodyText"/>
+      </w:pPr>
+      <w:r>
+        <w:rPr>
+          <w:iCs/>
+          <w:i/>
+        </w:rPr>
+        <w:t xml:space="preserve">Stilheden er ikke noget vi finder — den finder os, når vi har holdt op med at lede. Den er det dybeste hvilepunkt for hele organismen, det sted hvor selv længslen opløses. Her hviler det skabende princip i sig selv, og hver celle ved sin oprindelse igen.</w:t>
+      </w:r>
+    </w:p>
+    <w:p>
+      <w:pPr>
+        <w:pStyle w:val="BodyText"/>
+      </w:pPr>
+      <w:r>
+        <w:rPr>
           <w:bCs/>
           <w:b/>
         </w:rPr>
@@ -2639,6 +2663,30 @@
       </w:pPr>
       <w:r>
         <w:rPr>
+          <w:iCs/>
+          <w:i/>
+        </w:rPr>
+        <w:t xml:space="preserve">Breath of Life er det åndedrag, der animerer alt levende — fra zygotens første pulsering til den sidste sky af vores liv. Den bærer den helhed vi engang var, og hvis du lytter længe nok, kan du genkende dens nærvær som intim kontakt med det, der gjorde dig levende.</w:t>
+      </w:r>
+    </w:p>
+    <w:p>
+      <w:pPr>
+        <w:pStyle w:val="BodyText"/>
+      </w:pPr>
+      <w:r>
+        <w:rPr>
+          <w:iCs/>
+          <w:i/>
+        </w:rPr>
+        <w:t xml:space="preserve">Hvor Breath of Life slipper sit åndedrag, opstår form. Hvor den trækker sig tilbage, opløses form. Vores organisme er ikke skabt en gang i fortiden — den skabes i hvert eneste nu af denne åndedrags-bevægelse, og det er denne uafladelige skabelse vi mærker, når vi mærker liv.</w:t>
+      </w:r>
+    </w:p>
+    <w:p>
+      <w:pPr>
+        <w:pStyle w:val="BodyText"/>
+      </w:pPr>
+      <w:r>
+        <w:rPr>
           <w:bCs/>
           <w:b/>
         </w:rPr>
@@ -2857,6 +2905,30 @@
       </w:pPr>
       <w:r>
         <w:rPr>
+          <w:iCs/>
+          <w:i/>
+        </w:rPr>
+        <w:t xml:space="preserve">Primary Respiration er det åndedrag, der trækker vejret bag alt vi gør. Den er der, mens vi sover, mens vi bedøver os, mens vi dør. Den er livets egen pulsering, ikke vores. At lytte til den er at høre noget der altid har været der, men som vi sjældent hører.</w:t>
+      </w:r>
+    </w:p>
+    <w:p>
+      <w:pPr>
+        <w:pStyle w:val="BodyText"/>
+      </w:pPr>
+      <w:r>
+        <w:rPr>
+          <w:iCs/>
+          <w:i/>
+        </w:rPr>
+        <w:t xml:space="preserve">I Primary Respirations rytme rummer hele organismen sig selv. Der er ikke noget der står uden for dens orden — selv læsionen og det fastlåste pulserer indenfor den. Hvis vi kan lytte til denne ene rytme, lytter vi til alt det andet samtidigt, fordi alt hviler i den.</w:t>
+      </w:r>
+    </w:p>
+    <w:p>
+      <w:pPr>
+        <w:pStyle w:val="BodyText"/>
+      </w:pPr>
+      <w:r>
+        <w:rPr>
           <w:bCs/>
           <w:b/>
         </w:rPr>
@@ -3090,6 +3162,30 @@
       </w:pPr>
       <w:r>
         <w:rPr>
+          <w:iCs/>
+          <w:i/>
+        </w:rPr>
+        <w:t xml:space="preserve">Midtlinjen er det første der opstod i dig. Før du havde organer, før du havde lemmer, før du havde et indre og et ydre — havde du en akse. Den akse er den oprindelige beslutning om at være, og den bevæger sig fortsat i hver celle som den oprindelige hvisken om identitet.</w:t>
+      </w:r>
+    </w:p>
+    <w:p>
+      <w:pPr>
+        <w:pStyle w:val="BodyText"/>
+      </w:pPr>
+      <w:r>
+        <w:rPr>
+          <w:iCs/>
+          <w:i/>
+        </w:rPr>
+        <w:t xml:space="preserve">Midtlinjen kan ikke læsionere. Det er den ene struktur i kroppen som ikke kan tabe sig selv, fordi den er det vi taber os ud fra. Når vi vender tilbage til den, vender vi tilbage til det organiserende princip — den ubrudte tråd som al vores form spinder sig om.</w:t>
+      </w:r>
+    </w:p>
+    <w:p>
+      <w:pPr>
+        <w:pStyle w:val="BodyText"/>
+      </w:pPr>
+      <w:r>
+        <w:rPr>
           <w:bCs/>
           <w:b/>
         </w:rPr>
@@ -3288,6 +3384,30 @@
       </w:pPr>
       <w:r>
         <w:rPr>
+          <w:iCs/>
+          <w:i/>
+        </w:rPr>
+        <w:t xml:space="preserve">Sundheden kan ikke mistes. Den kan tilsløres, glemmes, dækkes til, men aldrig rives ud. Det er det, der gør biodynamisk arbejde muligt — vi behandler aldrig fra et fravær, vi henter altid fra noget der er der. Selv den mest dødssyge bærer sundheden som sin oprindelige skabelon.</w:t>
+      </w:r>
+    </w:p>
+    <w:p>
+      <w:pPr>
+        <w:pStyle w:val="BodyText"/>
+      </w:pPr>
+      <w:r>
+        <w:rPr>
+          <w:iCs/>
+          <w:i/>
+        </w:rPr>
+        <w:t xml:space="preserve">Når vi sætter os ved sundhedens side, ikke ved sygdommens, ændrer feltet karakter. Klienten mærker det med det samme — som om noget er trukket tilbage til hvor det hører hjemme. At sætte sig ved sundheden er ikke en metode. Det er en anerkendelse af det der altid var sandt.</w:t>
+      </w:r>
+    </w:p>
+    <w:p>
+      <w:pPr>
+        <w:pStyle w:val="BodyText"/>
+      </w:pPr>
+      <w:r>
+        <w:rPr>
           <w:bCs/>
           <w:b/>
         </w:rPr>
@@ -3486,6 +3606,72 @@
       </w:pPr>
       <w:r>
         <w:rPr>
+          <w:iCs/>
+          <w:i/>
+        </w:rPr>
+        <w:t xml:space="preserve">Liv er bevægelse. Hver celle, hver væske, hvert organ, hvert tankefelt udtrykker sig som bevægelse. Når vi lytter til Motion Present, lytter vi ikke til</w:t>
+      </w:r>
+      <w:r>
+        <w:rPr>
+          <w:iCs/>
+          <w:i/>
+        </w:rPr>
+        <w:t xml:space="preserve"> </w:t>
+      </w:r>
+      <w:r>
+        <w:rPr>
+          <w:iCs/>
+          <w:i/>
+        </w:rPr>
+        <w:t xml:space="preserve">‘</w:t>
+      </w:r>
+      <w:r>
+        <w:rPr>
+          <w:iCs/>
+          <w:i/>
+        </w:rPr>
+        <w:t xml:space="preserve">noget der bevæger sig</w:t>
+      </w:r>
+      <w:r>
+        <w:rPr>
+          <w:iCs/>
+          <w:i/>
+        </w:rPr>
+        <w:t xml:space="preserve">’</w:t>
+      </w:r>
+      <w:r>
+        <w:rPr>
+          <w:iCs/>
+          <w:i/>
+        </w:rPr>
+        <w:t xml:space="preserve"> </w:t>
+      </w:r>
+      <w:r>
+        <w:rPr>
+          <w:iCs/>
+          <w:i/>
+        </w:rPr>
+        <w:t xml:space="preserve">— vi lytter til selve det, at noget overhovedet er. Bevægelsen er livets signatur.</w:t>
+      </w:r>
+    </w:p>
+    <w:p>
+      <w:pPr>
+        <w:pStyle w:val="BodyText"/>
+      </w:pPr>
+      <w:r>
+        <w:rPr>
+          <w:iCs/>
+          <w:i/>
+        </w:rPr>
+        <w:t xml:space="preserve">Motion Present er aldrig fortid eller fremtid — den er kun nu. Det er det vi har at arbejde med. Hver gang opmærksomheden vender tilbage til det aktuelle, vender vi tilbage til det sted hvor heling kan ske. Ikke i forestillingen om hvad der burde være, men i hvad der er.</w:t>
+      </w:r>
+    </w:p>
+    <w:p>
+      <w:pPr>
+        <w:pStyle w:val="BodyText"/>
+      </w:pPr>
+      <w:r>
+        <w:rPr>
           <w:bCs/>
           <w:b/>
         </w:rPr>
@@ -3720,6 +3906,30 @@
       </w:pPr>
       <w:r>
         <w:rPr>
+          <w:iCs/>
+          <w:i/>
+        </w:rPr>
+        <w:t xml:space="preserve">Et fulcrum er det stille punkt al bevægelse organiserer sig omkring. Det er paradokset i bevægelse: den hviler altid på noget der ikke bevæger sig. I kroppen findes utallige sådanne hvilepunkter, fra den finest celle til hele organismens samlede center.</w:t>
+      </w:r>
+    </w:p>
+    <w:p>
+      <w:pPr>
+        <w:pStyle w:val="BodyText"/>
+      </w:pPr>
+      <w:r>
+        <w:rPr>
+          <w:iCs/>
+          <w:i/>
+        </w:rPr>
+        <w:t xml:space="preserve">Kroppen ved hvor dens fulcrums skal være. Når et fulcrum mistes — gennem skade, traume, vaner — finder kroppen kompenserende fulcrums for at fortsætte. Behandlingen åbner ikke for at ændre fulcrum, men for at den oprindelige kan vende tilbage og arbejdet kan organisere sig korrekt igen.</w:t>
+      </w:r>
+    </w:p>
+    <w:p>
+      <w:pPr>
+        <w:pStyle w:val="BodyText"/>
+      </w:pPr>
+      <w:r>
+        <w:rPr>
           <w:bCs/>
           <w:b/>
         </w:rPr>
@@ -3918,6 +4128,30 @@
       </w:pPr>
       <w:r>
         <w:rPr>
+          <w:iCs/>
+          <w:i/>
+        </w:rPr>
+        <w:t xml:space="preserve">I et stillpoint mødes evighed og øjeblik. Tiden bliver ikke stoppet — den ophører som tempo og bliver til ren tilstedeværelse. Det er her transmutation kan ske, fordi al fortid og fremtid samles i det ene punkt af nu, hvor systemet er åbent for sin egen forvandling.</w:t>
+      </w:r>
+    </w:p>
+    <w:p>
+      <w:pPr>
+        <w:pStyle w:val="BodyText"/>
+      </w:pPr>
+      <w:r>
+        <w:rPr>
+          <w:iCs/>
+          <w:i/>
+        </w:rPr>
+        <w:t xml:space="preserve">Et stillpoint er livets eget kys på sig selv. I det øjeblik anerkender systemet hele sin egen historie og hele sin egen mulighed på samme tid. Heling sker ikke i tid — den sker uden tid, som om kroppen tager et åndedrag i evigheden og kommer tilbage forvandlet.</w:t>
+      </w:r>
+    </w:p>
+    <w:p>
+      <w:pPr>
+        <w:pStyle w:val="BodyText"/>
+      </w:pPr>
+      <w:r>
+        <w:rPr>
           <w:bCs/>
           <w:b/>
         </w:rPr>
@@ -4116,6 +4350,30 @@
       </w:pPr>
       <w:r>
         <w:rPr>
+          <w:iCs/>
+          <w:i/>
+        </w:rPr>
+        <w:t xml:space="preserve">Transmutation er det øjeblik, hvor det rigide pludselig ved, at det er fluid. Strukturen mister ikke sig selv — den genkender sig selv som noget mere. Vi mærker det som en ændret kvalitet i hænderne, men i klientens system er det en dybere genkendelse: livet ved hvad det er igen.</w:t>
+      </w:r>
+    </w:p>
+    <w:p>
+      <w:pPr>
+        <w:pStyle w:val="BodyText"/>
+      </w:pPr>
+      <w:r>
+        <w:rPr>
+          <w:iCs/>
+          <w:i/>
+        </w:rPr>
+        <w:t xml:space="preserve">Når vævet transmuterer, bliver det ikke svagere — det bliver mere sandt. En lavere organiserings-grad opløses, og noget højere kan tage form. Det er ikke en omdannelse fra dårligt til godt, men fra glemt til husket. Den oprindelige skabelon træder frem fra under det, der havde dækket den til.</w:t>
+      </w:r>
+    </w:p>
+    <w:p>
+      <w:pPr>
+        <w:pStyle w:val="BodyText"/>
+      </w:pPr>
+      <w:r>
+        <w:rPr>
           <w:bCs/>
           <w:b/>
         </w:rPr>
@@ -4392,6 +4650,30 @@
       </w:pPr>
       <w:r>
         <w:rPr>
+          <w:iCs/>
+          <w:i/>
+        </w:rPr>
+        <w:t xml:space="preserve">The Neutral er døren til det dybere arbejde. Når den åbner sig, er det fordi nervesystemet har givet sin tilladelse til, at noget kan ske. Før The Neutral er vi forberedere; efter The Neutral er vi vidner til den proces som klienten selv bærer med sin egen indre intelligens.</w:t>
+      </w:r>
+    </w:p>
+    <w:p>
+      <w:pPr>
+        <w:pStyle w:val="BodyText"/>
+      </w:pPr>
+      <w:r>
+        <w:rPr>
+          <w:iCs/>
+          <w:i/>
+        </w:rPr>
+        <w:t xml:space="preserve">I The Neutral hviler alle systemer i samme centrum. Det fysiske, det fluide, det relationelle, det tidale — alt finder sit fælles fulcrum samtidigt. Det er en sjælden tilstand, og den åbner for det, vi ikke kan opnå med teknik, men kun ved at have skabt det rette rum.</w:t>
+      </w:r>
+    </w:p>
+    <w:p>
+      <w:pPr>
+        <w:pStyle w:val="BodyText"/>
+      </w:pPr>
+      <w:r>
+        <w:rPr>
           <w:bCs/>
           <w:b/>
         </w:rPr>
@@ -4625,6 +4907,30 @@
       </w:pPr>
       <w:r>
         <w:rPr>
+          <w:iCs/>
+          <w:i/>
+        </w:rPr>
+        <w:t xml:space="preserve">Automatic Shifting demonstrerer en intelligens i kroppen som er klogere end vores. Systemet ved hvor energien skal hen først, hvad der skal vente, hvad der skal opløses. Når vi giver plads, organiserer denne intelligens hele behandlingen for os. Vores rolle bliver at være vidne til dens udfoldelse.</w:t>
+      </w:r>
+    </w:p>
+    <w:p>
+      <w:pPr>
+        <w:pStyle w:val="BodyText"/>
+      </w:pPr>
+      <w:r>
+        <w:rPr>
+          <w:iCs/>
+          <w:i/>
+        </w:rPr>
+        <w:t xml:space="preserve">At lade Automatic Shifting bære behandlingen er som at lade en bølge bære båden i stedet for at ro. Vi bliver ikke passive — vi forbliver vågne, men retningen kommer fra noget andet end vores plan. Det er et andet sted at handle fra, og det åbner muligheder vi ikke kunne forudse.</w:t>
+      </w:r>
+    </w:p>
+    <w:p>
+      <w:pPr>
+        <w:pStyle w:val="BodyText"/>
+      </w:pPr>
+      <w:r>
+        <w:rPr>
           <w:bCs/>
           <w:b/>
         </w:rPr>
@@ -4823,6 +5129,30 @@
       </w:pPr>
       <w:r>
         <w:rPr>
+          <w:iCs/>
+          <w:i/>
+        </w:rPr>
+        <w:t xml:space="preserve">Den iboende plan er allerede skrevet. Den indeholder den optimale dosering, den rigtige rækkefølge, det præcise tempo, det rette område at arbejde med. Vores opgave er ikke at skrive den — den er der allerede. Vores opgave er at lytte den frem og lade den arbejde gennem os.</w:t>
+      </w:r>
+    </w:p>
+    <w:p>
+      <w:pPr>
+        <w:pStyle w:val="BodyText"/>
+      </w:pPr>
+      <w:r>
+        <w:rPr>
+          <w:iCs/>
+          <w:i/>
+        </w:rPr>
+        <w:t xml:space="preserve">Når den iboende plan udfolder sig, opdager vi at hvert greb vi havde forberedt allerede er foretaget af kroppen selv. Vi behøver ikke vælge teknik — kroppen har valgt for os. Det vi kalder god behandling er ofte ikke andet end at vi fik lov at være med, mens kroppen helede sig selv.</w:t>
+      </w:r>
+    </w:p>
+    <w:p>
+      <w:pPr>
+        <w:pStyle w:val="BodyText"/>
+      </w:pPr>
+      <w:r>
+        <w:rPr>
           <w:bCs/>
           <w:b/>
         </w:rPr>
@@ -5094,6 +5424,72 @@
       </w:pPr>
       <w:r>
         <w:rPr>
+          <w:iCs/>
+          <w:i/>
+        </w:rPr>
+        <w:t xml:space="preserve">Fluid Body er et ubrudt hav. Der er ingen separate organer, ingen adskilte kompartments — alt er ét sammenhængende felt af væske. Når vi mærker Fluid Body, mærker vi ikke</w:t>
+      </w:r>
+      <w:r>
+        <w:rPr>
+          <w:iCs/>
+          <w:i/>
+        </w:rPr>
+        <w:t xml:space="preserve"> </w:t>
+      </w:r>
+      <w:r>
+        <w:rPr>
+          <w:iCs/>
+          <w:i/>
+        </w:rPr>
+        <w:t xml:space="preserve">‘</w:t>
+      </w:r>
+      <w:r>
+        <w:rPr>
+          <w:iCs/>
+          <w:i/>
+        </w:rPr>
+        <w:t xml:space="preserve">kroppens væsker</w:t>
+      </w:r>
+      <w:r>
+        <w:rPr>
+          <w:iCs/>
+          <w:i/>
+        </w:rPr>
+        <w:t xml:space="preserve">’</w:t>
+      </w:r>
+      <w:r>
+        <w:rPr>
+          <w:iCs/>
+          <w:i/>
+        </w:rPr>
+        <w:t xml:space="preserve"> </w:t>
+      </w:r>
+      <w:r>
+        <w:rPr>
+          <w:iCs/>
+          <w:i/>
+        </w:rPr>
+        <w:t xml:space="preserve">— vi mærker selve det, at organismen flyder, lever, organiserer sig som én bevægelse.</w:t>
+      </w:r>
+    </w:p>
+    <w:p>
+      <w:pPr>
+        <w:pStyle w:val="BodyText"/>
+      </w:pPr>
+      <w:r>
+        <w:rPr>
+          <w:iCs/>
+          <w:i/>
+        </w:rPr>
+        <w:t xml:space="preserve">Vævet husker sin fluid-oprindelse. Hver eneste celle, der nu sidder i en fast struktur, var engang fri svømmen i et oceanrum. At vække Fluid Body er at vække denne hukommelse, og når den vågner, ved kroppen igen hvad den var, og kan derfra organisere sig på ny.</w:t>
+      </w:r>
+    </w:p>
+    <w:p>
+      <w:pPr>
+        <w:pStyle w:val="BodyText"/>
+      </w:pPr>
+      <w:r>
+        <w:rPr>
           <w:bCs/>
           <w:b/>
         </w:rPr>
@@ -5339,6 +5735,30 @@
       </w:pPr>
       <w:r>
         <w:rPr>
+          <w:iCs/>
+          <w:i/>
+        </w:rPr>
+        <w:t xml:space="preserve">Læsionen er ikke en fejl, men en intelligent beslutning. På et tidspunkt, hvor helheden var truet, valgte systemet at lade en del trække sig tilbage for at redde resten. Den del bærer endnu beslutningen i sig. At anerkende det valg er det første skridt til, at det kan slippes igen.</w:t>
+      </w:r>
+    </w:p>
+    <w:p>
+      <w:pPr>
+        <w:pStyle w:val="BodyText"/>
+      </w:pPr>
+      <w:r>
+        <w:rPr>
+          <w:iCs/>
+          <w:i/>
+        </w:rPr>
+        <w:t xml:space="preserve">Et læsionsfelt er som et tilbageholdt åndedrag. Engang trak systemet vejret ind for at beskytte sig — og glemte at puste ud igen. Vores opgave er ikke at trække åndedraget ud af det. Det er at skabe det felt, hvor det selv vover at puste ud, når det er klar.</w:t>
+      </w:r>
+    </w:p>
+    <w:p>
+      <w:pPr>
+        <w:pStyle w:val="BodyText"/>
+      </w:pPr>
+      <w:r>
+        <w:rPr>
           <w:bCs/>
           <w:b/>
         </w:rPr>
@@ -5708,6 +6128,30 @@
       </w:pPr>
       <w:r>
         <w:rPr>
+          <w:iCs/>
+          <w:i/>
+        </w:rPr>
+        <w:t xml:space="preserve">Potency er livets egen kraft som den manifesterer sig i organismen. Den er hverken energi i fysisk forstand eller spirit i abstrakt — den er mellemtingen, det fluide lys der gennemstrømmer alt levende og bærer dets sundhed. Når den frigives, bliver organismen mere sig selv.</w:t>
+      </w:r>
+    </w:p>
+    <w:p>
+      <w:pPr>
+        <w:pStyle w:val="BodyText"/>
+      </w:pPr>
+      <w:r>
+        <w:rPr>
+          <w:iCs/>
+          <w:i/>
+        </w:rPr>
+        <w:t xml:space="preserve">Potency er det, der gør heling mulig. Uden den er der kun bevægelse uden retning, kun rytme uden mening. Med den ved kroppen hvad den skal — og hvor den skal hen. Det er den biokemiske intelligens, men også noget mere: kraften der ved hvad helhed betyder.</w:t>
+      </w:r>
+    </w:p>
+    <w:p>
+      <w:pPr>
+        <w:pStyle w:val="BodyText"/>
+      </w:pPr>
+      <w:r>
+        <w:rPr>
           <w:bCs/>
           <w:b/>
         </w:rPr>
@@ -5960,6 +6404,30 @@
       </w:pPr>
       <w:r>
         <w:rPr>
+          <w:iCs/>
+          <w:i/>
+        </w:rPr>
+        <w:t xml:space="preserve">I ignition tændes livet i et nyt rum. Det er det øjeblik hvor potens og form mødes og noget begynder at være. Hver ignition er en ny fødsel, en ny mulighed, en ny tærskel til hvad organismen kan udfolde sig som. Det er ikke teknik — det er livets eget skabende moment.</w:t>
+      </w:r>
+    </w:p>
+    <w:p>
+      <w:pPr>
+        <w:pStyle w:val="BodyText"/>
+      </w:pPr>
+      <w:r>
+        <w:rPr>
+          <w:iCs/>
+          <w:i/>
+        </w:rPr>
+        <w:t xml:space="preserve">Når ignition lykkes, kalder den klienten længere ind i sig selv — længere ind i kroppen, dybere ind i nu, mere fuldt til stede. Det er ikke en aktivering, men en invitation. Og når klienten tager imod, sker der noget ingen behandling kunne have produceret: livet vågner i et område hvor det havde sovet.</w:t>
+      </w:r>
+    </w:p>
+    <w:p>
+      <w:pPr>
+        <w:pStyle w:val="BodyText"/>
+      </w:pPr>
+      <w:r>
+        <w:rPr>
           <w:bCs/>
           <w:b/>
         </w:rPr>
@@ -6158,6 +6626,30 @@
       </w:pPr>
       <w:r>
         <w:rPr>
+          <w:iCs/>
+          <w:i/>
+        </w:rPr>
+        <w:t xml:space="preserve">Aksiale fluktuationer er den centrale flod i kroppen. Den løber langs midtlinjen og forbinder bækken med kraniet, fortidens organisering med fremtidens mulighed. Når den flyder klart, er hele organismen koblet sammen i én strøm. Når den blokeres, fragmenteres helheden i adskilte distrikter.</w:t>
+      </w:r>
+    </w:p>
+    <w:p>
+      <w:pPr>
+        <w:pStyle w:val="BodyText"/>
+      </w:pPr>
+      <w:r>
+        <w:rPr>
+          <w:iCs/>
+          <w:i/>
+        </w:rPr>
+        <w:t xml:space="preserve">Når vi lytter til aksiale fluktuationer, lytter vi til kroppens hovedakse — det sted hvor liv strømmer mest tæt. Det er ikke et anatomisk fænomen, men en levende strømning der har hjemme i den oprindelige notochord-impuls og fortsætter livet igennem som organismens organisering omkring sin egen midte.</w:t>
+      </w:r>
+    </w:p>
+    <w:p>
+      <w:pPr>
+        <w:pStyle w:val="BodyText"/>
+      </w:pPr>
+      <w:r>
+        <w:rPr>
           <w:bCs/>
           <w:b/>
         </w:rPr>
@@ -6437,6 +6929,30 @@
           <w:i/>
         </w:rPr>
         <w:t xml:space="preserve">, er det altid en relativ adskillelse, ikke en absolut. Helheden er der stadig, men dens kommunikationskanaler er sløret. Vores arbejde er at gøre de kanaler mærkbare igen — ikke at samle delene, for de var aldrig adskilt.</w:t>
+      </w:r>
+    </w:p>
+    <w:p>
+      <w:pPr>
+        <w:pStyle w:val="BodyText"/>
+      </w:pPr>
+      <w:r>
+        <w:rPr>
+          <w:iCs/>
+          <w:i/>
+        </w:rPr>
+        <w:t xml:space="preserve">Wholeness er ikke noget vi opnår — det er udgangspunktet. Vi var aldrig ikke-hele. Hvad vi kalder helbredelse er ikke at sammenstykke fragmenter til en helhed, men at huske den helhed vi altid har været. Sundheden er ikke en præstation; den er erindring.</w:t>
+      </w:r>
+    </w:p>
+    <w:p>
+      <w:pPr>
+        <w:pStyle w:val="BodyText"/>
+      </w:pPr>
+      <w:r>
+        <w:rPr>
+          <w:iCs/>
+          <w:i/>
+        </w:rPr>
+        <w:t xml:space="preserve">At behandle én del af kroppen er at behandle hele kroppen. At lytte ét sted er at lytte alle steder. Helheden er ikke en sum, men et væv hvor hver tråd kender alle andre. Når én tråd blødgøres, vibrerer hele vævet — fordi der ikke findes adskilte tråde, kun et sammenhængende felt.</w:t>
       </w:r>
     </w:p>
     <w:p>
@@ -12017,207 +12533,10 @@
       </w:pPr>
       <w:r>
         <w:rPr>
-          <w:bCs/>
-          <w:b/>
-        </w:rPr>
-        <w:t xml:space="preserve">[REFLEKSIONSSPØRGSMÅL]</w:t>
-      </w:r>
-    </w:p>
-    <w:p>
-      <w:pPr>
-        <w:numPr>
-          <w:ilvl w:val="0"/>
-          <w:numId w:val="1057"/>
-        </w:numPr>
-      </w:pPr>
-      <w:r>
-        <w:t xml:space="preserve">Tænk på et område i en klients krop der har båret en kompensation længe. Hvilken slags samtale opstår mellem dine hænder og dets historie?</w:t>
-      </w:r>
-    </w:p>
-    <w:p>
-      <w:pPr>
-        <w:numPr>
-          <w:ilvl w:val="0"/>
-          <w:numId w:val="1057"/>
-        </w:numPr>
-      </w:pPr>
-      <w:r>
-        <w:t xml:space="preserve">Stivhed og åbning lever i hinanden i samme væv. Mærk lige nu i din egen krop — hvor sidder den samtidighed for dig?</w:t>
-      </w:r>
-    </w:p>
-    <w:p>
-      <w:pPr>
-        <w:numPr>
-          <w:ilvl w:val="0"/>
-          <w:numId w:val="1057"/>
-        </w:numPr>
-      </w:pPr>
-      <w:r>
-        <w:t xml:space="preserve">Det vi kalder dysfunktion gav engang mening for systemet. Hvad gjorde det muligt at overleve dengang, og hvad har det kostet siden?</w:t>
-      </w:r>
-    </w:p>
-    <w:p>
-      <w:pPr>
-        <w:pStyle w:val="FirstParagraph"/>
-      </w:pPr>
-      <w:r>
-        <w:rPr>
-          <w:bCs/>
-          <w:b/>
-        </w:rPr>
-        <w:t xml:space="preserve">[BRØDTEKST: Rum B — Væskekroppen]</w:t>
-      </w:r>
-    </w:p>
-    <w:p>
-      <w:pPr>
-        <w:pStyle w:val="BodyText"/>
-      </w:pPr>
-      <w:r>
-        <w:rPr>
           <w:iCs/>
           <w:i/>
         </w:rPr>
-        <w:t xml:space="preserve">Når tilliden etableres og kroppen begynder at slippe sin vagtsomhed, mærker du hvordan noget dybere vågner under dine hænder. Væskekroppen — millioner af år gammel og vis — begynder at røre på sig.</w:t>
-      </w:r>
-    </w:p>
-    <w:p>
-      <w:pPr>
-        <w:pStyle w:val="BodyText"/>
-      </w:pPr>
-      <w:r>
-        <w:rPr>
-          <w:bCs/>
-          <w:b/>
-        </w:rPr>
-        <w:t xml:space="preserve">Væskekroppens vågnende respons</w:t>
-      </w:r>
-    </w:p>
-    <w:p>
-      <w:pPr>
-        <w:pStyle w:val="BodyText"/>
-      </w:pPr>
-      <w:r>
-        <w:t xml:space="preserve">Her lever væskekroppen i sin naturlige tilstand — som ét levende kontinuum gennem hele organismen. Alle væsker fungerer som en funktionel enhed hvor respons sker simultant gennem hele matrixen, ikke sekvensielt som i nervesystemet. Dette er niveauet hvor kroppen kan gå til The Neutral, hvor det autonome nervesystem bliver fleksibelt og kan suspenderes, så de embryologiske kræfter kan overtage.</w:t>
-      </w:r>
-    </w:p>
-    <w:p>
-      <w:pPr>
-        <w:pStyle w:val="BodyText"/>
-      </w:pPr>
-      <w:r>
-        <w:t xml:space="preserve">Væskekroppen fungerer som bro mellem det energetiske blueprint og den fysiske krop. Den bærer protoplasma-kvaliteterne fra fosterstadiet videre gennem livet. Her findes kapaciteten til Automatic Shifting — hvor behandlingen springer fra sted til sted orkestreret af helhedens prioriteter. Den oprindelige midtlinje er det naturlige fulcrum som alt organiserer sig omkring.</w:t>
-      </w:r>
-    </w:p>
-    <w:p>
-      <w:pPr>
-        <w:pStyle w:val="BodyText"/>
-      </w:pPr>
-      <w:r>
-        <w:t xml:space="preserve">Du oplever et hav af væske der ånder under Primary Respiration. Simultan respons gennem hele væskekroppen som én samlet substans. Kapaciteten til at gå til The Neutral og kontakte de embryologiske kræfter. Det autonome nervesystems fleksibilitet og evne til suspension. Automatic Shifting som naturlig mulighed i væskemediet. Den oprindelige midtlinje som stabilt, organiserende fulcrum.</w:t>
-      </w:r>
-    </w:p>
-    <w:p>
-      <w:pPr>
-        <w:pStyle w:val="BodyText"/>
-      </w:pPr>
-      <w:r>
-        <w:rPr>
-          <w:bCs/>
-          <w:b/>
-        </w:rPr>
-        <w:t xml:space="preserve">Den medbragte tilstand</w:t>
-      </w:r>
-    </w:p>
-    <w:p>
-      <w:pPr>
-        <w:pStyle w:val="BodyText"/>
-      </w:pPr>
-      <w:r>
-        <w:t xml:space="preserve">Væskekroppen rummer hele Rum A — både den normale fysiske krop og alle dens dysfunktionelle områder. De traumatiske tilstande, arvævet, de låste mønstre fra den fysiske krop eksisterer stadig i væskens matrix, men nu i en anden kontekst. De rigide strukturer begynder at få væskekvalitet uden at være fuldt forløst.</w:t>
-      </w:r>
-    </w:p>
-    <w:p>
-      <w:pPr>
-        <w:pStyle w:val="BodyText"/>
-      </w:pPr>
-      <w:r>
-        <w:t xml:space="preserve">Det autonome nervesystems låsthed fra Rum A er stadig til stede men møder nu væskekroppens iboende fleksibilitet. De kompenserende midtlinjer og falske fulcrums eksisterer side om side med den oprindelige midtlinje. Adskillelsen mellem systemer begynder at opløses men er ikke fuldt integreret.</w:t>
-      </w:r>
-    </w:p>
-    <w:p>
-      <w:pPr>
-        <w:pStyle w:val="BodyText"/>
-      </w:pPr>
-      <w:r>
-        <w:t xml:space="preserve">Du mærker den fysiske krops normale funktion nu holdt i væskekontinuumet. Læsionsfelter og traumatiske aftryk der stadig ikke kan gå til neutral. Fast væv der begynder at få væskekvalitet men bevarer sin låsthed. Både normale og falske fulcrums rummet simultant i væsken. Det autonome nervesystems gradvise overgang mod fleksibilitet. Potentialet for heling der endnu ikke er aktiveret.</w:t>
-      </w:r>
-    </w:p>
-    <w:p>
-      <w:pPr>
-        <w:pStyle w:val="BodyText"/>
-      </w:pPr>
-      <w:r>
-        <w:rPr>
-          <w:bCs/>
-          <w:b/>
-        </w:rPr>
-        <w:t xml:space="preserve">Åbningen mod det relationelle</w:t>
-      </w:r>
-    </w:p>
-    <w:p>
-      <w:pPr>
-        <w:pStyle w:val="BodyText"/>
-      </w:pPr>
-      <w:r>
-        <w:t xml:space="preserve">Væskekroppen søger nu forbindelse til det større terapeutiske rum — det fælles felt mellem behandler og klient. Dette er ikke længere kun individuel proces men begyndelsen på erkendelsen af at heling sker i relation. Det relationelle aspekt er naturligt for os som pattedyr — vi er biologisk skabt til at co-regulere, til at finde balance gennem forbindelse.</w:t>
-      </w:r>
-    </w:p>
-    <w:p>
-      <w:pPr>
-        <w:pStyle w:val="BodyText"/>
-      </w:pPr>
-      <w:r>
-        <w:t xml:space="preserve">Her forberedes mødet mellem behandlerens og klientens væskekroppe. Grænsen ved huden viser sig at være mere flydende end antaget. Det terapeutiske rum bliver en container hvor dybere processer kan udfolde sig trygt. Denne zone peger mod vores naturlige behov for fællesskab — familie, venskaber, det nære samfund.</w:t>
-      </w:r>
-    </w:p>
-    <w:p>
-      <w:pPr>
-        <w:pStyle w:val="BodyText"/>
-      </w:pPr>
-      <w:r>
-        <w:t xml:space="preserve">Du fornemmer længslen efter det relationelle og fælles terapeutiske rum. Forberedelsen til mødet mellem to væskekroppe. Det biologiske behov for co-regulering og forbindelse. Grænsen mellem behandler og klient bliver mere gennemsigtig. Det terapeutiske rum som tryg container for dybere processer. Åbningen mod vores naturlige funktion som sociale væsener.</w:t>
-      </w:r>
-    </w:p>
-    <w:p>
-      <w:pPr>
-        <w:pStyle w:val="BodyText"/>
-      </w:pPr>
-      <w:r>
-        <w:rPr>
-          <w:bCs/>
-          <w:b/>
-        </w:rPr>
-        <w:t xml:space="preserve">Som ét levende kontinuum</w:t>
-      </w:r>
-    </w:p>
-    <w:p>
-      <w:pPr>
-        <w:pStyle w:val="BodyText"/>
-      </w:pPr>
-      <w:r>
-        <w:t xml:space="preserve">Væskekroppen er ét sammenhængende felt der ånder gennem alt det vi rører ved. Det medbragte fra det fysiske og den vågnende respons lever i samme matrix, og åbningen mod det relationelle ligger latent i selve væskens bevægelse. Hukommelsen om det fysiske er væskekroppens måde at bære helheden — og selve denne hukommelse gør forløsning mulig, fordi intet er forsvundet. Når vi følger væskens egen rytme, opdager vi at vores opgave ikke er at forene noget. Det er allerede forenet. Vi tillader bare at det viser sig.</w:t>
-      </w:r>
-    </w:p>
-    <w:p>
-      <w:pPr>
-        <w:pStyle w:val="BodyText"/>
-      </w:pPr>
-      <w:r>
-        <w:rPr>
-          <w:bCs/>
-          <w:b/>
-        </w:rPr>
-        <w:t xml:space="preserve">[INSPIRATION — nye vinkler at overveje]</w:t>
+        <w:t xml:space="preserve">Den fysiske krop er livets første indlejring. Det er her vi blev velkommen ind i dette inkarnerede liv, og det er her al vores erfaring har hvilet sig. At ankre i Rum A er at hilse på det tempel hvor sjælen har boet. Behandlingen begynder med denne anerkendelse.</w:t>
       </w:r>
     </w:p>
     <w:p>
@@ -12229,7 +12548,64 @@
           <w:iCs/>
           <w:i/>
         </w:rPr>
-        <w:t xml:space="preserve">Væskekroppen i Rum B er ikke kun blod og lymfe — det er hele kroppens samlede væskemiljø der begynder at bevæge sig som én sammenhængende enhed. Det vi mærker når Rum B vågner er denne matrix der træder ud af adskilte kompartments og bliver ét felt.</w:t>
+        <w:t xml:space="preserve">Rum A er døren ind til alt det dybere. Vi går ikke uden om kroppen for at nå Rum E — vi går igennem den. Hver dybde i de andre rum hviler på, at vi har taget tid til at hilse på, at klienten faktisk har en krop, der ligger her, lige nu, og er villig til at være vidne for sig selv.</w:t>
+      </w:r>
+    </w:p>
+    <w:p>
+      <w:pPr>
+        <w:pStyle w:val="BodyText"/>
+      </w:pPr>
+      <w:r>
+        <w:rPr>
+          <w:bCs/>
+          <w:b/>
+        </w:rPr>
+        <w:t xml:space="preserve">[REFLEKSIONSSPØRGSMÅL]</w:t>
+      </w:r>
+    </w:p>
+    <w:p>
+      <w:pPr>
+        <w:numPr>
+          <w:ilvl w:val="0"/>
+          <w:numId w:val="1057"/>
+        </w:numPr>
+      </w:pPr>
+      <w:r>
+        <w:t xml:space="preserve">Tænk på et område i en klients krop der har båret en kompensation længe. Hvilken slags samtale opstår mellem dine hænder og dets historie?</w:t>
+      </w:r>
+    </w:p>
+    <w:p>
+      <w:pPr>
+        <w:numPr>
+          <w:ilvl w:val="0"/>
+          <w:numId w:val="1057"/>
+        </w:numPr>
+      </w:pPr>
+      <w:r>
+        <w:t xml:space="preserve">Stivhed og åbning lever i hinanden i samme væv. Mærk lige nu i din egen krop — hvor sidder den samtidighed for dig?</w:t>
+      </w:r>
+    </w:p>
+    <w:p>
+      <w:pPr>
+        <w:numPr>
+          <w:ilvl w:val="0"/>
+          <w:numId w:val="1057"/>
+        </w:numPr>
+      </w:pPr>
+      <w:r>
+        <w:t xml:space="preserve">Det vi kalder dysfunktion gav engang mening for systemet. Hvad gjorde det muligt at overleve dengang, og hvad har det kostet siden?</w:t>
+      </w:r>
+    </w:p>
+    <w:p>
+      <w:pPr>
+        <w:pStyle w:val="FirstParagraph"/>
+      </w:pPr>
+      <w:r>
+        <w:rPr>
+          <w:bCs/>
+          <w:b/>
+        </w:rPr>
+        <w:t xml:space="preserve">[BRØDTEKST: Rum B — Væskekroppen]</w:t>
       </w:r>
     </w:p>
     <w:p>
@@ -12241,263 +12617,206 @@
           <w:iCs/>
           <w:i/>
         </w:rPr>
-        <w:t xml:space="preserve">Overgangen fra Rum A til Rum B mærkes ofte først som en kvalitetsændring i vævet. Det bliver</w:t>
-      </w:r>
+        <w:t xml:space="preserve">Når tilliden etableres og kroppen begynder at slippe sin vagtsomhed, mærker du hvordan noget dybere vågner under dine hænder. Væskekroppen — millioner af år gammel og vis — begynder at røre på sig.</w:t>
+      </w:r>
+    </w:p>
+    <w:p>
+      <w:pPr>
+        <w:pStyle w:val="BodyText"/>
+      </w:pPr>
+      <w:r>
+        <w:rPr>
+          <w:bCs/>
+          <w:b/>
+        </w:rPr>
+        <w:t xml:space="preserve">Væskekroppens vågnende respons</w:t>
+      </w:r>
+    </w:p>
+    <w:p>
+      <w:pPr>
+        <w:pStyle w:val="BodyText"/>
+      </w:pPr>
+      <w:r>
+        <w:t xml:space="preserve">Her lever væskekroppen i sin naturlige tilstand — som ét levende kontinuum gennem hele organismen. Alle væsker fungerer som en funktionel enhed hvor respons sker simultant gennem hele matrixen, ikke sekvensielt som i nervesystemet. Dette er niveauet hvor kroppen kan gå til The Neutral, hvor det autonome nervesystem bliver fleksibelt og kan suspenderes, så de embryologiske kræfter kan overtage.</w:t>
+      </w:r>
+    </w:p>
+    <w:p>
+      <w:pPr>
+        <w:pStyle w:val="BodyText"/>
+      </w:pPr>
+      <w:r>
+        <w:t xml:space="preserve">Væskekroppen fungerer som bro mellem det energetiske blueprint og den fysiske krop. Den bærer protoplasma-kvaliteterne fra fosterstadiet videre gennem livet. Her findes kapaciteten til Automatic Shifting — hvor behandlingen springer fra sted til sted orkestreret af helhedens prioriteter. Den oprindelige midtlinje er det naturlige fulcrum som alt organiserer sig omkring.</w:t>
+      </w:r>
+    </w:p>
+    <w:p>
+      <w:pPr>
+        <w:pStyle w:val="BodyText"/>
+      </w:pPr>
+      <w:r>
+        <w:t xml:space="preserve">Du oplever et hav af væske der ånder under Primary Respiration. Simultan respons gennem hele væskekroppen som én samlet substans. Kapaciteten til at gå til The Neutral og kontakte de embryologiske kræfter. Det autonome nervesystems fleksibilitet og evne til suspension. Automatic Shifting som naturlig mulighed i væskemediet. Den oprindelige midtlinje som stabilt, organiserende fulcrum.</w:t>
+      </w:r>
+    </w:p>
+    <w:p>
+      <w:pPr>
+        <w:pStyle w:val="BodyText"/>
+      </w:pPr>
+      <w:r>
+        <w:rPr>
+          <w:bCs/>
+          <w:b/>
+        </w:rPr>
+        <w:t xml:space="preserve">Den medbragte tilstand</w:t>
+      </w:r>
+    </w:p>
+    <w:p>
+      <w:pPr>
+        <w:pStyle w:val="BodyText"/>
+      </w:pPr>
+      <w:r>
+        <w:t xml:space="preserve">Væskekroppen rummer hele Rum A — både den normale fysiske krop og alle dens dysfunktionelle områder. De traumatiske tilstande, arvævet, de låste mønstre fra den fysiske krop eksisterer stadig i væskens matrix, men nu i en anden kontekst. De rigide strukturer begynder at få væskekvalitet uden at være fuldt forløst.</w:t>
+      </w:r>
+    </w:p>
+    <w:p>
+      <w:pPr>
+        <w:pStyle w:val="BodyText"/>
+      </w:pPr>
+      <w:r>
+        <w:t xml:space="preserve">Det autonome nervesystems låsthed fra Rum A er stadig til stede men møder nu væskekroppens iboende fleksibilitet. De kompenserende midtlinjer og falske fulcrums eksisterer side om side med den oprindelige midtlinje. Adskillelsen mellem systemer begynder at opløses men er ikke fuldt integreret.</w:t>
+      </w:r>
+    </w:p>
+    <w:p>
+      <w:pPr>
+        <w:pStyle w:val="BodyText"/>
+      </w:pPr>
+      <w:r>
+        <w:t xml:space="preserve">Du mærker den fysiske krops normale funktion nu holdt i væskekontinuumet. Læsionsfelter og traumatiske aftryk der stadig ikke kan gå til neutral. Fast væv der begynder at få væskekvalitet men bevarer sin låsthed. Både normale og falske fulcrums rummet simultant i væsken. Det autonome nervesystems gradvise overgang mod fleksibilitet. Potentialet for heling der endnu ikke er aktiveret.</w:t>
+      </w:r>
+    </w:p>
+    <w:p>
+      <w:pPr>
+        <w:pStyle w:val="BodyText"/>
+      </w:pPr>
+      <w:r>
+        <w:rPr>
+          <w:bCs/>
+          <w:b/>
+        </w:rPr>
+        <w:t xml:space="preserve">Åbningen mod det relationelle</w:t>
+      </w:r>
+    </w:p>
+    <w:p>
+      <w:pPr>
+        <w:pStyle w:val="BodyText"/>
+      </w:pPr>
+      <w:r>
+        <w:t xml:space="preserve">Væskekroppen søger nu forbindelse til det større terapeutiske rum — det fælles felt mellem behandler og klient. Dette er ikke længere kun individuel proces men begyndelsen på erkendelsen af at heling sker i relation. Det relationelle aspekt er naturligt for os som pattedyr — vi er biologisk skabt til at co-regulere, til at finde balance gennem forbindelse.</w:t>
+      </w:r>
+    </w:p>
+    <w:p>
+      <w:pPr>
+        <w:pStyle w:val="BodyText"/>
+      </w:pPr>
+      <w:r>
+        <w:t xml:space="preserve">Her forberedes mødet mellem behandlerens og klientens væskekroppe. Grænsen ved huden viser sig at være mere flydende end antaget. Det terapeutiske rum bliver en container hvor dybere processer kan udfolde sig trygt. Denne zone peger mod vores naturlige behov for fællesskab — familie, venskaber, det nære samfund.</w:t>
+      </w:r>
+    </w:p>
+    <w:p>
+      <w:pPr>
+        <w:pStyle w:val="BodyText"/>
+      </w:pPr>
+      <w:r>
+        <w:t xml:space="preserve">Du fornemmer længslen efter det relationelle og fælles terapeutiske rum. Forberedelsen til mødet mellem to væskekroppe. Det biologiske behov for co-regulering og forbindelse. Grænsen mellem behandler og klient bliver mere gennemsigtig. Det terapeutiske rum som tryg container for dybere processer. Åbningen mod vores naturlige funktion som sociale væsener.</w:t>
+      </w:r>
+    </w:p>
+    <w:p>
+      <w:pPr>
+        <w:pStyle w:val="BodyText"/>
+      </w:pPr>
+      <w:r>
+        <w:rPr>
+          <w:bCs/>
+          <w:b/>
+        </w:rPr>
+        <w:t xml:space="preserve">Som ét levende kontinuum</w:t>
+      </w:r>
+    </w:p>
+    <w:p>
+      <w:pPr>
+        <w:pStyle w:val="BodyText"/>
+      </w:pPr>
+      <w:r>
+        <w:t xml:space="preserve">Væskekroppen er ét sammenhængende felt der ånder gennem alt det vi rører ved. Det medbragte fra det fysiske og den vågnende respons lever i samme matrix, og åbningen mod det relationelle ligger latent i selve væskens bevægelse. Hukommelsen om det fysiske er væskekroppens måde at bære helheden — og selve denne hukommelse gør forløsning mulig, fordi intet er forsvundet. Når vi følger væskens egen rytme, opdager vi at vores opgave ikke er at forene noget. Det er allerede forenet. Vi tillader bare at det viser sig.</w:t>
+      </w:r>
+    </w:p>
+    <w:p>
+      <w:pPr>
+        <w:pStyle w:val="BodyText"/>
+      </w:pPr>
+      <w:r>
+        <w:rPr>
+          <w:bCs/>
+          <w:b/>
+        </w:rPr>
+        <w:t xml:space="preserve">[INSPIRATION — nye vinkler at overveje]</w:t>
+      </w:r>
+    </w:p>
+    <w:p>
+      <w:pPr>
+        <w:pStyle w:val="BodyText"/>
+      </w:pPr>
       <w:r>
         <w:rPr>
           <w:iCs/>
           <w:i/>
         </w:rPr>
-        <w:t xml:space="preserve"> </w:t>
-      </w:r>
+        <w:t xml:space="preserve">Væskekroppen i Rum B er ikke kun blod og lymfe — det er hele kroppens samlede væskemiljø der begynder at bevæge sig som én sammenhængende enhed. Det vi mærker når Rum B vågner er denne matrix der træder ud af adskilte kompartments og bliver ét felt.</w:t>
+      </w:r>
+    </w:p>
+    <w:p>
+      <w:pPr>
+        <w:pStyle w:val="BodyText"/>
+      </w:pPr>
       <w:r>
         <w:rPr>
           <w:iCs/>
           <w:i/>
         </w:rPr>
-        <w:t xml:space="preserve">‘</w:t>
+        <w:t xml:space="preserve">Overgangen fra Rum A til Rum B mærkes ofte først som en kvalitetsændring i vævet. Det bliver</w:t>
       </w:r>
       <w:r>
         <w:rPr>
           <w:iCs/>
           <w:i/>
         </w:rPr>
-        <w:t xml:space="preserve">vådere</w:t>
+        <w:t xml:space="preserve"> </w:t>
       </w:r>
       <w:r>
         <w:rPr>
           <w:iCs/>
           <w:i/>
         </w:rPr>
-        <w:t xml:space="preserve">’</w:t>
+        <w:t xml:space="preserve">‘</w:t>
       </w:r>
       <w:r>
         <w:rPr>
           <w:iCs/>
           <w:i/>
         </w:rPr>
-        <w:t xml:space="preserve">, mere flydende. Klienten beskriver det nogle gange som om de bliver tunge eller lette samtidigt. Det er paradokset ved væskekroppen — den har vægt og letvægt på én gang.</w:t>
-      </w:r>
-    </w:p>
-    <w:p>
-      <w:pPr>
-        <w:pStyle w:val="BodyText"/>
-      </w:pPr>
+        <w:t xml:space="preserve">vådere</w:t>
+      </w:r>
       <w:r>
         <w:rPr>
           <w:iCs/>
           <w:i/>
         </w:rPr>
-        <w:t xml:space="preserve">Når Rum B nægter at vågne, er det oftest fordi nervesystemet endnu ikke har givet sin tilladelse. Væskekroppen er afhængig af parasympatisk dominans for at flyde frit. Hvis behandlingen forhastes, blokerer den sympatiske aktivering den proces vi venter på.</w:t>
-      </w:r>
-    </w:p>
-    <w:p>
-      <w:pPr>
-        <w:pStyle w:val="BodyText"/>
-      </w:pPr>
-      <w:r>
-        <w:rPr>
-          <w:bCs/>
-          <w:b/>
-        </w:rPr>
-        <w:t xml:space="preserve">[REFLEKSIONSSPØRGSMÅL]</w:t>
-      </w:r>
-    </w:p>
-    <w:p>
-      <w:pPr>
-        <w:numPr>
-          <w:ilvl w:val="0"/>
-          <w:numId w:val="1058"/>
-        </w:numPr>
-      </w:pPr>
-      <w:r>
-        <w:t xml:space="preserve">Hvis det allerede er forenet, hvad ændrer det så ved den helingshandling du tror du udfører?</w:t>
-      </w:r>
-    </w:p>
-    <w:p>
-      <w:pPr>
-        <w:numPr>
-          <w:ilvl w:val="0"/>
-          <w:numId w:val="1058"/>
-        </w:numPr>
-      </w:pPr>
-      <w:r>
-        <w:t xml:space="preserve">Væsken bærer hukommelse på en måde strukturen ikke gør. I dit seneste klient-arbejde — hvilken slags hukommelse mærkede du væsken bære?</w:t>
-      </w:r>
-    </w:p>
-    <w:p>
-      <w:pPr>
-        <w:numPr>
-          <w:ilvl w:val="0"/>
-          <w:numId w:val="1058"/>
-        </w:numPr>
-      </w:pPr>
-      <w:r>
-        <w:t xml:space="preserve">Lige før dine hænder slipper ledelsen, sker der noget i din egen krop. Beskriv den signal-bevægelse, hvis du kan finde ord for den.</w:t>
-      </w:r>
-    </w:p>
-    <w:p>
-      <w:pPr>
-        <w:pStyle w:val="FirstParagraph"/>
-      </w:pPr>
-      <w:r>
-        <w:rPr>
-          <w:bCs/>
-          <w:b/>
-        </w:rPr>
-        <w:t xml:space="preserve">[BRØDTEKST: Rum C — Det Relationelle Felt]</w:t>
-      </w:r>
-    </w:p>
-    <w:p>
-      <w:pPr>
-        <w:pStyle w:val="BodyText"/>
-      </w:pPr>
+        <w:t xml:space="preserve">’</w:t>
+      </w:r>
       <w:r>
         <w:rPr>
           <w:iCs/>
           <w:i/>
         </w:rPr>
-        <w:t xml:space="preserve">Når væskekroppen har fundet sin rytme og grænsen mellem behandler og klient bliver mere flydende, opstår et fælles felt — et relationelt rum hvor vi møder vores naturlige biologiske arv som sociale væsener.</w:t>
-      </w:r>
-    </w:p>
-    <w:p>
-      <w:pPr>
-        <w:pStyle w:val="BodyText"/>
-      </w:pPr>
-      <w:r>
-        <w:rPr>
-          <w:bCs/>
-          <w:b/>
-        </w:rPr>
-        <w:t xml:space="preserve">Det relationelle som naturlig funktion</w:t>
-      </w:r>
-    </w:p>
-    <w:p>
-      <w:pPr>
-        <w:pStyle w:val="BodyText"/>
-      </w:pPr>
-      <w:r>
-        <w:t xml:space="preserve">Her udfolder Rum C sig som vores medfødte kapacitet til at fungere i relation. Som pattedyr er vi biologisk udviklet til at leve, udveksle og co-regulere med andre. Dette er ikke en tillært færdighed men en iboende del af vores natur — vi er skabt til at finde balance gennem forbindelse med familie, venskaber, kollegaer og det nære samfund.</w:t>
-      </w:r>
-    </w:p>
-    <w:p>
-      <w:pPr>
-        <w:pStyle w:val="BodyText"/>
-      </w:pPr>
-      <w:r>
-        <w:t xml:space="preserve">I behandlingssituationen manifesterer dette sig som det terapeutiske rum mellem behandler og klient — et fælles felt hvor begge systemer mødes og påvirker hinanden. Dette er et dybere niveau end det individuelle, hvor heling sker gennem selve relationen. Det nære samfund — vores by, region, arbejdsplads — udgør den naturlige kontekst hvor vores biologiske behov for tilhørsforhold og udveksling udfolder sig.</w:t>
-      </w:r>
-    </w:p>
-    <w:p>
-      <w:pPr>
-        <w:pStyle w:val="BodyText"/>
-      </w:pPr>
-      <w:r>
-        <w:t xml:space="preserve">Du oplever det fælles felt mellem behandler og klient som levende realitet. Co-regulering som naturlig biologisk funktion. Nervesystemernes gensidige påvirkning og stabilisering. Det relationelle rum som container for dybere processer. Forbindelse til familie, venskaber og nært samfund som helende kraft. Integration af det individuelle i den større sociale kontekst.</w:t>
-      </w:r>
-    </w:p>
-    <w:p>
-      <w:pPr>
-        <w:pStyle w:val="BodyText"/>
-      </w:pPr>
-      <w:r>
-        <w:rPr>
-          <w:bCs/>
-          <w:b/>
-        </w:rPr>
-        <w:t xml:space="preserve">Væskekroppens kvaliteter i det fælles</w:t>
-      </w:r>
-    </w:p>
-    <w:p>
-      <w:pPr>
-        <w:pStyle w:val="BodyText"/>
-      </w:pPr>
-      <w:r>
-        <w:t xml:space="preserve">Rum C inkluderer og udvider væskekroppens egenskaber fra Rum B ind i det relationelle felt. Den simultane respons gennem væskekroppen bliver nu til fælles respons mellem to eller flere systemer. Kapaciteten til The Neutral udvides til at omfatte det fælles rum. Automatic Shifting kan nu bevæge sig ikke kun gennem individet men gennem det relationelle felt.</w:t>
-      </w:r>
-    </w:p>
-    <w:p>
-      <w:pPr>
-        <w:pStyle w:val="BodyText"/>
-      </w:pPr>
-      <w:r>
-        <w:t xml:space="preserve">Den oprindelige midtlinje fra Rum B bliver reference ikke kun for individet men for hele det terapeutiske rum. Det autonome nervesystems fleksibilitet understøttes og forstærkes gennem mødet med andres regulerede systemer. De embryologiske kræfter arbejder nu gennem det relationelle interface.</w:t>
-      </w:r>
-    </w:p>
-    <w:p>
-      <w:pPr>
-        <w:pStyle w:val="BodyText"/>
-      </w:pPr>
-      <w:r>
-        <w:t xml:space="preserve">Du mærker væskekroppens egenskaber nu aktive i det fælles felt. Simultan respons gennem flere forbundne systemer. The Neutral som fælles tilstand mellem behandler og klient. Automatic Shifting gennem det relationelle rum. Co-regulering som forstærker nervesystemets fleksibilitet. De embryologiske kræfter arbejder gennem relationen.</w:t>
-      </w:r>
-    </w:p>
-    <w:p>
-      <w:pPr>
-        <w:pStyle w:val="BodyText"/>
-      </w:pPr>
-      <w:r>
-        <w:rPr>
-          <w:bCs/>
-          <w:b/>
-        </w:rPr>
-        <w:t xml:space="preserve">Broen til det universelle</w:t>
-      </w:r>
-    </w:p>
-    <w:p>
-      <w:pPr>
-        <w:pStyle w:val="BodyText"/>
-      </w:pPr>
-      <w:r>
-        <w:t xml:space="preserve">Rum C’s relationelle felt peger naturligt mod noget større — mod det som rækker ud over det nære og kendte. Her forberedes overgangen til det universelle, til det som forbinder hele menneskeheden. Det instinktive og fælles-menneskelige begynder at vise sig gennem det relationelle.</w:t>
-      </w:r>
-    </w:p>
-    <w:p>
-      <w:pPr>
-        <w:pStyle w:val="BodyText"/>
-      </w:pPr>
-      <w:r>
-        <w:t xml:space="preserve">Dette er ikke længere kun familie og lokalt samfund, men forbindelsen til noget der transcenderer individuelle og lokale grænser. The Long Tide’s universelle bevægelse fornemmes i baggrunden — den kraft som forbinder alt levende på tværs af det individuelle og det nært relationelle. Rum D forberedes gennem erkendelsen af at vi er del af noget langt større.</w:t>
-      </w:r>
-    </w:p>
-    <w:p>
-      <w:pPr>
-        <w:pStyle w:val="BodyText"/>
-      </w:pPr>
-      <w:r>
-        <w:t xml:space="preserve">Du fornemmer det universelle der viser sig gennem det partikulære. Forbindelsen til menneskeheden som helhed. Det instinktive og arketypiske der lever i alle. The Long Tide’s tilstedeværelse i baggrunden. Det fælles på tværs af alle individuelle og relationelle grænser. Åbningen mod Rum D hvor det universelle felt dominerer.</w:t>
-      </w:r>
-    </w:p>
-    <w:p>
-      <w:pPr>
-        <w:pStyle w:val="BodyText"/>
-      </w:pPr>
-      <w:r>
-        <w:rPr>
-          <w:bCs/>
-          <w:b/>
-        </w:rPr>
-        <w:t xml:space="preserve">Som ét fælles rum</w:t>
-      </w:r>
-    </w:p>
-    <w:p>
-      <w:pPr>
-        <w:pStyle w:val="BodyText"/>
-      </w:pPr>
-      <w:r>
-        <w:t xml:space="preserve">Det relationelle felt er ét fælles rum der opstår når to systemer møder hinanden. Væskekroppens kvaliteter lever videre i co-reguleringens biologiske rytme, og åbningen mod det universelle peger naturligt videre — alt vibrerer samtidigt i hvert øjeblik af mødet, som tonaliteter af samme forbindelse snarere end lag der skal gennemleves. At vi er sociale væsener tilhører vores fysiologi — vores arv som pattedyr. Helingen sker ofte præcis her hvor to nervesystemer finder hinanden, og når vi hviler i det fælles rum, peger det af sig selv mod noget større — som en naturlig forlængelse af det nære, ikke som en flugt fra det.</w:t>
-      </w:r>
-    </w:p>
-    <w:p>
-      <w:pPr>
-        <w:pStyle w:val="BodyText"/>
-      </w:pPr>
-      <w:r>
-        <w:rPr>
-          <w:bCs/>
-          <w:b/>
-        </w:rPr>
-        <w:t xml:space="preserve">[INSPIRATION — nye vinkler at overveje]</w:t>
+        <w:t xml:space="preserve">, mere flydende. Klienten beskriver det nogle gange som om de bliver tunge eller lette samtidigt. Det er paradokset ved væskekroppen — den har vægt og letvægt på én gang.</w:t>
       </w:r>
     </w:p>
     <w:p>
@@ -12509,7 +12828,7 @@
           <w:iCs/>
           <w:i/>
         </w:rPr>
-        <w:t xml:space="preserve">Det relationelle felt er ikke metafor men biologi. Når to nervesystemer mødes uden trussel, opstår en målbar fælles regulering — det er det system der opstod blandt sociale pattedyr og som vi alle bærer. Vi bygger på en eksisterende neurobiologisk arkitektur, ikke på spirituel idé.</w:t>
+        <w:t xml:space="preserve">Når Rum B nægter at vågne, er det oftest fordi nervesystemet endnu ikke har givet sin tilladelse. Væskekroppen er afhængig af parasympatisk dominans for at flyde frit. Hvis behandlingen forhastes, blokerer den sympatiske aktivering den proces vi venter på.</w:t>
       </w:r>
     </w:p>
     <w:p>
@@ -12521,7 +12840,7 @@
           <w:iCs/>
           <w:i/>
         </w:rPr>
-        <w:t xml:space="preserve">I det relationelle felt bliver behandleren også ændret. Det er ikke en énvejsbevægelse fra os til klienten. Vi mærker noget i os selv vågne i takt med klientens åbning. At anerkende dette uden at lade vores eget materiale fylde feltet er en daglig disciplin.</w:t>
+        <w:t xml:space="preserve">Væskekroppen er det indre hav vi alle bærer i os. Det rummer livets oprindelige medium, det miljø vi blev til i, det miljø hver eneste celle stadig svømmer i. Når Rum B vågner, kommer vi i kontakt med vores egen primære natur — bevægelig, fluide, levende, organiserende sig selv.</w:t>
       </w:r>
     </w:p>
     <w:p>
@@ -12533,7 +12852,7 @@
           <w:iCs/>
           <w:i/>
         </w:rPr>
-        <w:t xml:space="preserve">Når det relationelle felt overvælder klienten, er det ofte fordi det er længe siden de har været i et trygt felt. Selv det at føle sig set kan være krævende. Vores opgave er ikke at gå frem, men at give feltet plads og tid til at modne i sit eget tempo.</w:t>
+        <w:t xml:space="preserve">Rum B er broen mellem den fysiske krop og det subtile felt. Her opløses tørheden, og noget begynder at flyde. Klienten oplever det ofte som lettelse — som om noget der var holdt fast slipper. I virkeligheden er det vævet der mindes om sin egen flydende natur og giver sig hen til den.</w:t>
       </w:r>
     </w:p>
     <w:p>
@@ -12552,33 +12871,33 @@
       <w:pPr>
         <w:numPr>
           <w:ilvl w:val="0"/>
-          <w:numId w:val="1059"/>
-        </w:numPr>
-      </w:pPr>
-      <w:r>
-        <w:t xml:space="preserve">Det fælles rum opstår — det laves ikke. Hvilke betingelser i dig selv inviterer det frem?</w:t>
-      </w:r>
-    </w:p>
-    <w:p>
-      <w:pPr>
-        <w:numPr>
-          <w:ilvl w:val="0"/>
-          <w:numId w:val="1059"/>
-        </w:numPr>
-      </w:pPr>
-      <w:r>
-        <w:t xml:space="preserve">Et andet menneskes regulering registreres ofte i kroppen før i hovedet. Hvor møder du den først?</w:t>
-      </w:r>
-    </w:p>
-    <w:p>
-      <w:pPr>
-        <w:numPr>
-          <w:ilvl w:val="0"/>
-          <w:numId w:val="1059"/>
-        </w:numPr>
-      </w:pPr>
-      <w:r>
-        <w:t xml:space="preserve">Når feltet selv heler — vidne, vært eller ledsager — hvilken position er sværest at hvile i?</w:t>
+          <w:numId w:val="1058"/>
+        </w:numPr>
+      </w:pPr>
+      <w:r>
+        <w:t xml:space="preserve">Hvis det allerede er forenet, hvad ændrer det så ved den helingshandling du tror du udfører?</w:t>
+      </w:r>
+    </w:p>
+    <w:p>
+      <w:pPr>
+        <w:numPr>
+          <w:ilvl w:val="0"/>
+          <w:numId w:val="1058"/>
+        </w:numPr>
+      </w:pPr>
+      <w:r>
+        <w:t xml:space="preserve">Væsken bærer hukommelse på en måde strukturen ikke gør. I dit seneste klient-arbejde — hvilken slags hukommelse mærkede du væsken bære?</w:t>
+      </w:r>
+    </w:p>
+    <w:p>
+      <w:pPr>
+        <w:numPr>
+          <w:ilvl w:val="0"/>
+          <w:numId w:val="1058"/>
+        </w:numPr>
+      </w:pPr>
+      <w:r>
+        <w:t xml:space="preserve">Lige før dine hænder slipper ledelsen, sker der noget i din egen krop. Beskriv den signal-bevægelse, hvis du kan finde ord for den.</w:t>
       </w:r>
     </w:p>
     <w:p>
@@ -12590,7 +12909,7 @@
           <w:bCs/>
           <w:b/>
         </w:rPr>
-        <w:t xml:space="preserve">[BRØDTEKST: Rum D — The Long Tide / Primary Respiration]</w:t>
+        <w:t xml:space="preserve">[BRØDTEKST: Rum C — Det Relationelle Felt]</w:t>
       </w:r>
     </w:p>
     <w:p>
@@ -12602,135 +12921,135 @@
           <w:iCs/>
           <w:i/>
         </w:rPr>
-        <w:t xml:space="preserve">Nu træder du ind i det universelle felt — hvor The Long Tide bevæger sig fra horisonten med sin dybe, langsomme rytme, bærende livets matrix og skabelonen for optimal funktion.</w:t>
-      </w:r>
-    </w:p>
-    <w:p>
-      <w:pPr>
-        <w:pStyle w:val="BodyText"/>
-      </w:pPr>
-      <w:r>
-        <w:rPr>
-          <w:bCs/>
-          <w:b/>
-        </w:rPr>
-        <w:t xml:space="preserve">The Long Tide som universelt felt</w:t>
-      </w:r>
-    </w:p>
-    <w:p>
-      <w:pPr>
-        <w:pStyle w:val="BodyText"/>
-      </w:pPr>
-      <w:r>
-        <w:t xml:space="preserve">Dette er Primary Respiration’s energetiske udtryk — den universelle bevægelse der kommer fra horisonten mod kroppens midtlinje med sin 100 sekunders cyklus. Her transcenderer vi det individuelle og det nært relationelle for at møde det som forbinder alt levende. The Long Tide bærer livets blueprint, den perfekte skabelon som aldrig mistes.</w:t>
-      </w:r>
-    </w:p>
-    <w:p>
-      <w:pPr>
-        <w:pStyle w:val="BodyText"/>
-      </w:pPr>
-      <w:r>
-        <w:t xml:space="preserve">I Rum D opleves direkte hvordan vi er del af noget langt større — ikke som idé men som levende erfaring. Det instinktive niveau aktiveres, millioner af års evolutionær visdom bliver tilgængelig. Dette er ikke enhed i den absolutte forstand som i Dynamisk Stilhed, men oplevelsen af at være forbundet med hele livets væv på tværs af alle grænser.</w:t>
-      </w:r>
-    </w:p>
-    <w:p>
-      <w:pPr>
-        <w:pStyle w:val="BodyText"/>
-      </w:pPr>
-      <w:r>
-        <w:t xml:space="preserve">Du oplever 100 sekunders cyklus — 6 cyklusser hver 10. minut. Bevægelse fra horisonten til midtlinjen som bærer livets matrix. Det universelle der transcenderer det individuelle og relationelle. Instinktiv erkendelse og urgammel visdom bliver tilgængelig. Forbindelse med hele menneskeheden og alt levende. Primary Respiration som organiserende kraft for al heling.</w:t>
-      </w:r>
-    </w:p>
-    <w:p>
-      <w:pPr>
-        <w:pStyle w:val="BodyText"/>
-      </w:pPr>
-      <w:r>
-        <w:rPr>
-          <w:bCs/>
-          <w:b/>
-        </w:rPr>
-        <w:t xml:space="preserve">Det relationelle felt integreret</w:t>
-      </w:r>
-    </w:p>
-    <w:p>
-      <w:pPr>
-        <w:pStyle w:val="BodyText"/>
-      </w:pPr>
-      <w:r>
-        <w:t xml:space="preserve">Rum D inkluderer og transcenderer Rum C’s relationelle kvaliteter. Det terapeutiske rum mellem behandler og klient bliver nu del af et større felt. Co-reguleringen udvides fra det nære til det universelle — vi regulerer ikke kun med hinanden men med livets egen rytme.</w:t>
-      </w:r>
-    </w:p>
-    <w:p>
-      <w:pPr>
-        <w:pStyle w:val="BodyText"/>
-      </w:pPr>
-      <w:r>
-        <w:t xml:space="preserve">Familien, venskaberne, det nære samfund fra Rum C er stadig til stede men nu som aspekter af noget større. The Long Tide organiserer alle de relationelle felter, forbinder dem i én samlet bevægelse. De embryologiske kræfter arbejder nu ikke kun gennem individet eller relationen men gennem hele det universelle felt.</w:t>
-      </w:r>
-    </w:p>
-    <w:p>
-      <w:pPr>
-        <w:pStyle w:val="BodyText"/>
-      </w:pPr>
-      <w:r>
-        <w:t xml:space="preserve">Du mærker Rum C’s relationelle felt nu båret af The Long Tide. Co-regulering udvides til universel synkronisering. Det nære samfund som del af hele menneskeheden. Alle individuelle og relationelle processer organiseret af én rytme. De embryologiske kræfter arbejder gennem det universelle. Integration af alle tidligere zoner i én samlet bevægelse.</w:t>
-      </w:r>
-    </w:p>
-    <w:p>
-      <w:pPr>
-        <w:pStyle w:val="BodyText"/>
-      </w:pPr>
-      <w:r>
-        <w:rPr>
-          <w:bCs/>
-          <w:b/>
-        </w:rPr>
-        <w:t xml:space="preserve">Porten til Dynamisk Stilhed</w:t>
-      </w:r>
-    </w:p>
-    <w:p>
-      <w:pPr>
-        <w:pStyle w:val="BodyText"/>
-      </w:pPr>
-      <w:r>
-        <w:t xml:space="preserve">I Rum D forberedes det ultimative møde med livets oprindelse. The Long Tide’s bevægelse peger naturligt mod sin egen kilde — Dynamisk Stilhed. I øjeblikke af fuldstændig synkronisering og overgivelse kan grænsen mellem bevægelse og stilhed blive gennemsigtig.</w:t>
-      </w:r>
-    </w:p>
-    <w:p>
-      <w:pPr>
-        <w:pStyle w:val="BodyText"/>
-      </w:pPr>
-      <w:r>
-        <w:t xml:space="preserve">Her fornemmes at selv The Long Tide udspringer fra noget dybere — det umanifesterede potentiale, livets arnested. Rum E’s kvaliteter begynder at vise sig som mulighed — ikke som noget vi kan gribe men som nådens potentiale. Paradokset hvor al bevægelse udspringer fra stilhed bliver til levende erfaring.</w:t>
-      </w:r>
-    </w:p>
-    <w:p>
-      <w:pPr>
-        <w:pStyle w:val="BodyText"/>
-      </w:pPr>
-      <w:r>
-        <w:t xml:space="preserve">Du fornemmer Dynamisk Stilhed som The Long Tide’s oprindelse. Porten til det umanifesterede potentiale. Bevægelse og stilhed som to aspekter af samme virkelighed. Muligheden for øjeblikkelig transmutation. Nådens potentiale der venter uden for viljen. Forberedelsen til Rum E’s paradoksale virkelighed.</w:t>
-      </w:r>
-    </w:p>
-    <w:p>
-      <w:pPr>
-        <w:pStyle w:val="BodyText"/>
-      </w:pPr>
-      <w:r>
-        <w:rPr>
-          <w:bCs/>
-          <w:b/>
-        </w:rPr>
-        <w:t xml:space="preserve">Som ét universelt felt</w:t>
-      </w:r>
-    </w:p>
-    <w:p>
-      <w:pPr>
-        <w:pStyle w:val="BodyText"/>
-      </w:pPr>
-      <w:r>
-        <w:t xml:space="preserve">The Long Tide er ét universelt felt der bevæger sig fra horisonten gennem alt vi rører ved. Det relationelle bæres med ind i en dybere rytme, og porten mod Dynamisk Stilhed begynder at vise sig — én kraft der altid har været til stede, ikke et hierarki af lag men aspekter af samme bevægelse. Vi mærker den nu fordi betingelserne har samlet sig — fordi sansningen er blevet stille nok til at horisonten kan høres. Når vi bliver bevæget af den, opdager vi at vi aldrig var adskilt fra livets store rytme; vi har bare manglet den ro der skal til for at lade den nå os.</w:t>
+        <w:t xml:space="preserve">Når væskekroppen har fundet sin rytme og grænsen mellem behandler og klient bliver mere flydende, opstår et fælles felt — et relationelt rum hvor vi møder vores naturlige biologiske arv som sociale væsener.</w:t>
+      </w:r>
+    </w:p>
+    <w:p>
+      <w:pPr>
+        <w:pStyle w:val="BodyText"/>
+      </w:pPr>
+      <w:r>
+        <w:rPr>
+          <w:bCs/>
+          <w:b/>
+        </w:rPr>
+        <w:t xml:space="preserve">Det relationelle som naturlig funktion</w:t>
+      </w:r>
+    </w:p>
+    <w:p>
+      <w:pPr>
+        <w:pStyle w:val="BodyText"/>
+      </w:pPr>
+      <w:r>
+        <w:t xml:space="preserve">Her udfolder Rum C sig som vores medfødte kapacitet til at fungere i relation. Som pattedyr er vi biologisk udviklet til at leve, udveksle og co-regulere med andre. Dette er ikke en tillært færdighed men en iboende del af vores natur — vi er skabt til at finde balance gennem forbindelse med familie, venskaber, kollegaer og det nære samfund.</w:t>
+      </w:r>
+    </w:p>
+    <w:p>
+      <w:pPr>
+        <w:pStyle w:val="BodyText"/>
+      </w:pPr>
+      <w:r>
+        <w:t xml:space="preserve">I behandlingssituationen manifesterer dette sig som det terapeutiske rum mellem behandler og klient — et fælles felt hvor begge systemer mødes og påvirker hinanden. Dette er et dybere niveau end det individuelle, hvor heling sker gennem selve relationen. Det nære samfund — vores by, region, arbejdsplads — udgør den naturlige kontekst hvor vores biologiske behov for tilhørsforhold og udveksling udfolder sig.</w:t>
+      </w:r>
+    </w:p>
+    <w:p>
+      <w:pPr>
+        <w:pStyle w:val="BodyText"/>
+      </w:pPr>
+      <w:r>
+        <w:t xml:space="preserve">Du oplever det fælles felt mellem behandler og klient som levende realitet. Co-regulering som naturlig biologisk funktion. Nervesystemernes gensidige påvirkning og stabilisering. Det relationelle rum som container for dybere processer. Forbindelse til familie, venskaber og nært samfund som helende kraft. Integration af det individuelle i den større sociale kontekst.</w:t>
+      </w:r>
+    </w:p>
+    <w:p>
+      <w:pPr>
+        <w:pStyle w:val="BodyText"/>
+      </w:pPr>
+      <w:r>
+        <w:rPr>
+          <w:bCs/>
+          <w:b/>
+        </w:rPr>
+        <w:t xml:space="preserve">Væskekroppens kvaliteter i det fælles</w:t>
+      </w:r>
+    </w:p>
+    <w:p>
+      <w:pPr>
+        <w:pStyle w:val="BodyText"/>
+      </w:pPr>
+      <w:r>
+        <w:t xml:space="preserve">Rum C inkluderer og udvider væskekroppens egenskaber fra Rum B ind i det relationelle felt. Den simultane respons gennem væskekroppen bliver nu til fælles respons mellem to eller flere systemer. Kapaciteten til The Neutral udvides til at omfatte det fælles rum. Automatic Shifting kan nu bevæge sig ikke kun gennem individet men gennem det relationelle felt.</w:t>
+      </w:r>
+    </w:p>
+    <w:p>
+      <w:pPr>
+        <w:pStyle w:val="BodyText"/>
+      </w:pPr>
+      <w:r>
+        <w:t xml:space="preserve">Den oprindelige midtlinje fra Rum B bliver reference ikke kun for individet men for hele det terapeutiske rum. Det autonome nervesystems fleksibilitet understøttes og forstærkes gennem mødet med andres regulerede systemer. De embryologiske kræfter arbejder nu gennem det relationelle interface.</w:t>
+      </w:r>
+    </w:p>
+    <w:p>
+      <w:pPr>
+        <w:pStyle w:val="BodyText"/>
+      </w:pPr>
+      <w:r>
+        <w:t xml:space="preserve">Du mærker væskekroppens egenskaber nu aktive i det fælles felt. Simultan respons gennem flere forbundne systemer. The Neutral som fælles tilstand mellem behandler og klient. Automatic Shifting gennem det relationelle rum. Co-regulering som forstærker nervesystemets fleksibilitet. De embryologiske kræfter arbejder gennem relationen.</w:t>
+      </w:r>
+    </w:p>
+    <w:p>
+      <w:pPr>
+        <w:pStyle w:val="BodyText"/>
+      </w:pPr>
+      <w:r>
+        <w:rPr>
+          <w:bCs/>
+          <w:b/>
+        </w:rPr>
+        <w:t xml:space="preserve">Broen til det universelle</w:t>
+      </w:r>
+    </w:p>
+    <w:p>
+      <w:pPr>
+        <w:pStyle w:val="BodyText"/>
+      </w:pPr>
+      <w:r>
+        <w:t xml:space="preserve">Rum C’s relationelle felt peger naturligt mod noget større — mod det som rækker ud over det nære og kendte. Her forberedes overgangen til det universelle, til det som forbinder hele menneskeheden. Det instinktive og fælles-menneskelige begynder at vise sig gennem det relationelle.</w:t>
+      </w:r>
+    </w:p>
+    <w:p>
+      <w:pPr>
+        <w:pStyle w:val="BodyText"/>
+      </w:pPr>
+      <w:r>
+        <w:t xml:space="preserve">Dette er ikke længere kun familie og lokalt samfund, men forbindelsen til noget der transcenderer individuelle og lokale grænser. The Long Tide’s universelle bevægelse fornemmes i baggrunden — den kraft som forbinder alt levende på tværs af det individuelle og det nært relationelle. Rum D forberedes gennem erkendelsen af at vi er del af noget langt større.</w:t>
+      </w:r>
+    </w:p>
+    <w:p>
+      <w:pPr>
+        <w:pStyle w:val="BodyText"/>
+      </w:pPr>
+      <w:r>
+        <w:t xml:space="preserve">Du fornemmer det universelle der viser sig gennem det partikulære. Forbindelsen til menneskeheden som helhed. Det instinktive og arketypiske der lever i alle. The Long Tide’s tilstedeværelse i baggrunden. Det fælles på tværs af alle individuelle og relationelle grænser. Åbningen mod Rum D hvor det universelle felt dominerer.</w:t>
+      </w:r>
+    </w:p>
+    <w:p>
+      <w:pPr>
+        <w:pStyle w:val="BodyText"/>
+      </w:pPr>
+      <w:r>
+        <w:rPr>
+          <w:bCs/>
+          <w:b/>
+        </w:rPr>
+        <w:t xml:space="preserve">Som ét fælles rum</w:t>
+      </w:r>
+    </w:p>
+    <w:p>
+      <w:pPr>
+        <w:pStyle w:val="BodyText"/>
+      </w:pPr>
+      <w:r>
+        <w:t xml:space="preserve">Det relationelle felt er ét fælles rum der opstår når to systemer møder hinanden. Væskekroppens kvaliteter lever videre i co-reguleringens biologiske rytme, og åbningen mod det universelle peger naturligt videre — alt vibrerer samtidigt i hvert øjeblik af mødet, som tonaliteter af samme forbindelse snarere end lag der skal gennemleves. At vi er sociale væsener tilhører vores fysiologi — vores arv som pattedyr. Helingen sker ofte præcis her hvor to nervesystemer finder hinanden, og når vi hviler i det fælles rum, peger det af sig selv mod noget større — som en naturlig forlængelse af det nære, ikke som en flugt fra det.</w:t>
       </w:r>
     </w:p>
     <w:p>
@@ -12754,7 +13073,7 @@
           <w:iCs/>
           <w:i/>
         </w:rPr>
-        <w:t xml:space="preserve">De 100 sekunder er ikke en målbar konstant. Cyklusserne kommer i et bredere spektrum — nogle gange 80, nogle gange 120 — og varierer fra klient til klient og fra øjeblik til øjeblik. Tallet er en pejling, ikke en definition. Hvad vi lytter til er rytmens natur, ikke dens præcision.</w:t>
+        <w:t xml:space="preserve">Det relationelle felt er ikke metafor men biologi. Når to nervesystemer mødes uden trussel, opstår en målbar fælles regulering — det er det system der opstod blandt sociale pattedyr og som vi alle bærer. Vi bygger på en eksisterende neurobiologisk arkitektur, ikke på spirituel idé.</w:t>
       </w:r>
     </w:p>
     <w:p>
@@ -12766,7 +13085,7 @@
           <w:iCs/>
           <w:i/>
         </w:rPr>
-        <w:t xml:space="preserve">Læringen af at mærke Long Tide sker ikke gennem instruktion. Det sker oftest ved at sidde sammen med en mere erfaren behandler ved den samme klient — over tid genkender hænderne det andre hænder allerede mærker. Det er en mundtlig tradition, ikke en målbar færdighed.</w:t>
+        <w:t xml:space="preserve">I det relationelle felt bliver behandleren også ændret. Det er ikke en énvejsbevægelse fra os til klienten. Vi mærker noget i os selv vågne i takt med klientens åbning. At anerkende dette uden at lade vores eget materiale fylde feltet er en daglig disciplin.</w:t>
       </w:r>
     </w:p>
     <w:p>
@@ -12778,64 +13097,7 @@
           <w:iCs/>
           <w:i/>
         </w:rPr>
-        <w:t xml:space="preserve">En vanskelig erkendelse: nogle gange tror vi at mærke Long Tide, men det er noget andet — en intern rytme i os selv, en forventning, en forestilling om hvordan det skal føles. At kunne skelne mellem det indre billede og den faktiske oplevelse er en del af modningen.</w:t>
-      </w:r>
-    </w:p>
-    <w:p>
-      <w:pPr>
-        <w:pStyle w:val="BodyText"/>
-      </w:pPr>
-      <w:r>
-        <w:rPr>
-          <w:bCs/>
-          <w:b/>
-        </w:rPr>
-        <w:t xml:space="preserve">[REFLEKSIONSSPØRGSMÅL]</w:t>
-      </w:r>
-    </w:p>
-    <w:p>
-      <w:pPr>
-        <w:numPr>
-          <w:ilvl w:val="0"/>
-          <w:numId w:val="1060"/>
-        </w:numPr>
-      </w:pPr>
-      <w:r>
-        <w:t xml:space="preserve">Hvad sker der i et arbejde når du holder op med at lede efter The Long Tide og lader den finde dig?</w:t>
-      </w:r>
-    </w:p>
-    <w:p>
-      <w:pPr>
-        <w:numPr>
-          <w:ilvl w:val="0"/>
-          <w:numId w:val="1060"/>
-        </w:numPr>
-      </w:pPr>
-      <w:r>
-        <w:t xml:space="preserve">Roen der gør Long Tide hørbar er ikke teknik. Hvad i dit liv lige nu hjælper den ro frem, og hvad afskærmer den?</w:t>
-      </w:r>
-    </w:p>
-    <w:p>
-      <w:pPr>
-        <w:numPr>
-          <w:ilvl w:val="0"/>
-          <w:numId w:val="1060"/>
-        </w:numPr>
-      </w:pPr>
-      <w:r>
-        <w:t xml:space="preserve">Mellem at observere og at blive bevæget findes en fin skift. Beskriv øjeblikket — eller dets fravær — fra dit seneste klient-arbejde.</w:t>
-      </w:r>
-    </w:p>
-    <w:p>
-      <w:pPr>
-        <w:pStyle w:val="FirstParagraph"/>
-      </w:pPr>
-      <w:r>
-        <w:rPr>
-          <w:bCs/>
-          <w:b/>
-        </w:rPr>
-        <w:t xml:space="preserve">[BRØDTEKST: Rum E — Dynamisk Stilhed]</w:t>
+        <w:t xml:space="preserve">Når det relationelle felt overvælder klienten, er det ofte fordi det er længe siden de har været i et trygt felt. Selv det at føle sig set kan være krævende. Vores opgave er ikke at gå frem, men at give feltet plads og tid til at modne i sit eget tempo.</w:t>
       </w:r>
     </w:p>
     <w:p>
@@ -12847,147 +13109,7 @@
           <w:iCs/>
           <w:i/>
         </w:rPr>
-        <w:t xml:space="preserve">I sjældne øjeblikke af nåde træder du ind i Dynamisk Stilhed — paradoksernes verden hvor fuldstændig stilstand indeholder al bevægelse, hvor du er syg det ene øjeblik og det næste er det væk.</w:t>
-      </w:r>
-    </w:p>
-    <w:p>
-      <w:pPr>
-        <w:pStyle w:val="BodyText"/>
-      </w:pPr>
-      <w:r>
-        <w:rPr>
-          <w:bCs/>
-          <w:b/>
-        </w:rPr>
-        <w:t xml:space="preserve">Dynamisk Stilhed som livets arnested</w:t>
-      </w:r>
-    </w:p>
-    <w:p>
-      <w:pPr>
-        <w:pStyle w:val="BodyText"/>
-      </w:pPr>
-      <w:r>
-        <w:t xml:space="preserve">Her er kilden hvorfra alt udspringer — det umanifesterede potentiale der indeholder skabelonen til selve livet. Ikke tom stilhed men et levende felt af rent potentiale. Dette er verdenen af transsubstantiation, hvor heling sker på måder der transcenderer vores forståelse. Midtlinjens essens viser sig at være dynamisk stilhed selv — punktet hvorfra al bevægelse udspringer og vender tilbage til.</w:t>
-      </w:r>
-    </w:p>
-    <w:p>
-      <w:pPr>
-        <w:pStyle w:val="BodyText"/>
-      </w:pPr>
-      <w:r>
-        <w:t xml:space="preserve">I Rum E opleves direkte at blive skabt af livet selv i det levende øjeblik. Breath of Life viser sig som den potente ild der bærer livskraften fra stilheden ud i manifestation. Her mødes paradokserne — adskillelse og enhed erfaret samtidigt, stilstand som indeholder al bevægelse, det øjeblikkelige som rummer evigheden.</w:t>
-      </w:r>
-    </w:p>
-    <w:p>
-      <w:pPr>
-        <w:pStyle w:val="BodyText"/>
-      </w:pPr>
-      <w:r>
-        <w:t xml:space="preserve">Du oplever livets arnested — kilden til alt manifesteret og umanifesteret. Blueprint for al sundhed i sin rene form. Paradokset hvor stilstand indeholder al bevægelse. Verdenen af øjeblikkelig transmutation. Oplevelsen af at blive skabt øjeblik for øjeblik. Midtlinjens essens som dynamisk stilhed.</w:t>
-      </w:r>
-    </w:p>
-    <w:p>
-      <w:pPr>
-        <w:pStyle w:val="BodyText"/>
-      </w:pPr>
-      <w:r>
-        <w:rPr>
-          <w:bCs/>
-          <w:b/>
-        </w:rPr>
-        <w:t xml:space="preserve">The Long Tide og Primary Respiration</w:t>
-      </w:r>
-    </w:p>
-    <w:p>
-      <w:pPr>
-        <w:pStyle w:val="BodyText"/>
-      </w:pPr>
-      <w:r>
-        <w:t xml:space="preserve">Dynamisk Stilhed manifesterer sig gennem Rum D’s The Long Tide. Dette er det første nedkog fra stilheden — hvor det umanifesterede begynder at udtrykke sig i bevægelse og rytme. The Long Tide viser sig at være Breath of Life’s første udtryk, den kaleidoskopiske energi der bærer livets potentiale ud i verden.</w:t>
-      </w:r>
-    </w:p>
-    <w:p>
-      <w:pPr>
-        <w:pStyle w:val="BodyText"/>
-      </w:pPr>
-      <w:r>
-        <w:t xml:space="preserve">Alle tidligere zoner — det fysiske, væskekroppen, det relationelle, det universelle — viser sig at udspringe fra denne ene kilde. Primary Respiration er stilhedens åndedræt, den bevægelse som opstår fra det ubevægelige. De embryologiske kræfters ultimative oprindelse åbenbares som denne dynamiske stilhed.</w:t>
-      </w:r>
-    </w:p>
-    <w:p>
-      <w:pPr>
-        <w:pStyle w:val="BodyText"/>
-      </w:pPr>
-      <w:r>
-        <w:t xml:space="preserve">Du mærker Breath of Life som første manifestation fra stilheden. The Long Tide som udtryk for stilhedens bevægelse. Primary Respiration’s oprindelse i det ubevægelige. Alle zoners ultimative kilde i én stilhed. Forbindelsen mellem stilhed og bevægelse som én realitet. De embryologiske kræfters udspring fra det umanifesterede.</w:t>
-      </w:r>
-    </w:p>
-    <w:p>
-      <w:pPr>
-        <w:pStyle w:val="BodyText"/>
-      </w:pPr>
-      <w:r>
-        <w:rPr>
-          <w:bCs/>
-          <w:b/>
-        </w:rPr>
-        <w:t xml:space="preserve">Kærlighed og mysteriet</w:t>
-      </w:r>
-    </w:p>
-    <w:p>
-      <w:pPr>
-        <w:pStyle w:val="BodyText"/>
-      </w:pPr>
-      <w:r>
-        <w:t xml:space="preserve">Fra Dynamisk Stilhed åbner sig det som ligger hinsides alle zoner — det vi ikke har ord for. Her møder vi havet af kærlighed, den ubetingede accept som livet har for alt skabt. Dette er ikke noget vi kan gribe eller forstå, kun modtage gennem nåde.</w:t>
-      </w:r>
-    </w:p>
-    <w:p>
-      <w:pPr>
-        <w:pStyle w:val="BodyText"/>
-      </w:pPr>
-      <w:r>
-        <w:t xml:space="preserve">Mysteriet viser sig ikke som noget der skal løses men som selve livets essens — det evigt ukendte som alligevel kender os fuldstændigt. Den kærlighed vi møder her er ikke følelse men selve den kraft der holder alt sammen, der tillader alt at eksistere præcis som det er. Her opleves at vi aldrig har været adskilt, at adskillelsen var illusionen.</w:t>
-      </w:r>
-    </w:p>
-    <w:p>
-      <w:pPr>
-        <w:pStyle w:val="BodyText"/>
-      </w:pPr>
-      <w:r>
-        <w:t xml:space="preserve">Du fornemmer havet af ubetinget kærlighed. Mysteriet som ikke kan gribes kun modtages. Erkendelsen af aldrig at have været adskilt. Kærligheden som selve livets sammenholdskraft. Det som ligger hinsides ord og forståelse. Nåden som den eneste vej ind.</w:t>
-      </w:r>
-    </w:p>
-    <w:p>
-      <w:pPr>
-        <w:pStyle w:val="BodyText"/>
-      </w:pPr>
-      <w:r>
-        <w:rPr>
-          <w:bCs/>
-          <w:b/>
-        </w:rPr>
-        <w:t xml:space="preserve">Som ét umanifesteret felt</w:t>
-      </w:r>
-    </w:p>
-    <w:p>
-      <w:pPr>
-        <w:pStyle w:val="BodyText"/>
-      </w:pPr>
-      <w:r>
-        <w:t xml:space="preserve">Dynamisk Stilhed er ét umanifesteret felt der hverken kan gribes eller forklares — kun mødes. The Long Tides oprindelse og det vi kalder kærlighed er samme virkelighed set fra forskellige vinkler, og når vores ord her begynder at blive upræcise, er det fordi mysteriet og nåden er det eneste sprog der er tilbage. Adskillelsen mellem behandler og klient opløses sammen med adskillelsen mellem stilstand og bevægelse — tilbage er den rene tilstedeværelse hvor heling ikke længere er noget der gøres, men noget der er. Hvis Rum A var hvor vores hænder først mødte kroppen, er Rum E hvor kroppen og hænderne aldrig var adskilt fra livets oprindelse.</w:t>
-      </w:r>
-    </w:p>
-    <w:p>
-      <w:pPr>
-        <w:pStyle w:val="BodyText"/>
-      </w:pPr>
-      <w:r>
-        <w:rPr>
-          <w:bCs/>
-          <w:b/>
-        </w:rPr>
-        <w:t xml:space="preserve">[INSPIRATION — nye vinkler at overveje]</w:t>
+        <w:t xml:space="preserve">I Rum C er det ikke længere behandleren der heler klienten. Det er feltet selv, der bærer helingen. Når to nervesystemer mødes i tryghed, opstår noget tredje — et felt der har sin egen intelligens, sin egen retning, sin egen healing-kapacitet. Vi indgår begge i det og bliver begge ændret.</w:t>
       </w:r>
     </w:p>
     <w:p>
@@ -12999,7 +13121,64 @@
           <w:iCs/>
           <w:i/>
         </w:rPr>
-        <w:t xml:space="preserve">Dynamisk Stilhed er ikke en højere bevidsthedstilstand eller et behandlings-mål. Den dukker op nogle gange uden at vi har planlagt det, og den lader sig ikke trænes. Det meste arbejde sker i Rum A til D, og det er som det skal være. Rum E er bonus, ikke mål.</w:t>
+        <w:t xml:space="preserve">At være holdt i et trygt relationelt felt er en af de dybeste oplevelser et menneske kan have. For mange klienter er det den første gang de mærker, at deres væsen kan rumme dem. I det møde åbner noget der har været lukket — ikke fordi vi gjorde noget, men fordi feltet var sikkert nok.</w:t>
+      </w:r>
+    </w:p>
+    <w:p>
+      <w:pPr>
+        <w:pStyle w:val="BodyText"/>
+      </w:pPr>
+      <w:r>
+        <w:rPr>
+          <w:bCs/>
+          <w:b/>
+        </w:rPr>
+        <w:t xml:space="preserve">[REFLEKSIONSSPØRGSMÅL]</w:t>
+      </w:r>
+    </w:p>
+    <w:p>
+      <w:pPr>
+        <w:numPr>
+          <w:ilvl w:val="0"/>
+          <w:numId w:val="1059"/>
+        </w:numPr>
+      </w:pPr>
+      <w:r>
+        <w:t xml:space="preserve">Det fælles rum opstår — det laves ikke. Hvilke betingelser i dig selv inviterer det frem?</w:t>
+      </w:r>
+    </w:p>
+    <w:p>
+      <w:pPr>
+        <w:numPr>
+          <w:ilvl w:val="0"/>
+          <w:numId w:val="1059"/>
+        </w:numPr>
+      </w:pPr>
+      <w:r>
+        <w:t xml:space="preserve">Et andet menneskes regulering registreres ofte i kroppen før i hovedet. Hvor møder du den først?</w:t>
+      </w:r>
+    </w:p>
+    <w:p>
+      <w:pPr>
+        <w:numPr>
+          <w:ilvl w:val="0"/>
+          <w:numId w:val="1059"/>
+        </w:numPr>
+      </w:pPr>
+      <w:r>
+        <w:t xml:space="preserve">Når feltet selv heler — vidne, vært eller ledsager — hvilken position er sværest at hvile i?</w:t>
+      </w:r>
+    </w:p>
+    <w:p>
+      <w:pPr>
+        <w:pStyle w:val="FirstParagraph"/>
+      </w:pPr>
+      <w:r>
+        <w:rPr>
+          <w:bCs/>
+          <w:b/>
+        </w:rPr>
+        <w:t xml:space="preserve">[BRØDTEKST: Rum D — The Long Tide / Primary Respiration]</w:t>
       </w:r>
     </w:p>
     <w:p>
@@ -13011,7 +13190,147 @@
           <w:iCs/>
           <w:i/>
         </w:rPr>
-        <w:t xml:space="preserve">Når sproget rammer sin grænse i Rum E, bliver det fristende at gribe til store ord. Men ord er ord. De peger og svigter. Det vigtigste er ikke ordet vi vælger — kærlighed, mysteriet, nåde, tilstedeværelse — men at vi ikke forveksler ordet med fænomenet.</w:t>
+        <w:t xml:space="preserve">Nu træder du ind i det universelle felt — hvor The Long Tide bevæger sig fra horisonten med sin dybe, langsomme rytme, bærende livets matrix og skabelonen for optimal funktion.</w:t>
+      </w:r>
+    </w:p>
+    <w:p>
+      <w:pPr>
+        <w:pStyle w:val="BodyText"/>
+      </w:pPr>
+      <w:r>
+        <w:rPr>
+          <w:bCs/>
+          <w:b/>
+        </w:rPr>
+        <w:t xml:space="preserve">The Long Tide som universelt felt</w:t>
+      </w:r>
+    </w:p>
+    <w:p>
+      <w:pPr>
+        <w:pStyle w:val="BodyText"/>
+      </w:pPr>
+      <w:r>
+        <w:t xml:space="preserve">Dette er Primary Respiration’s energetiske udtryk — den universelle bevægelse der kommer fra horisonten mod kroppens midtlinje med sin 100 sekunders cyklus. Her transcenderer vi det individuelle og det nært relationelle for at møde det som forbinder alt levende. The Long Tide bærer livets blueprint, den perfekte skabelon som aldrig mistes.</w:t>
+      </w:r>
+    </w:p>
+    <w:p>
+      <w:pPr>
+        <w:pStyle w:val="BodyText"/>
+      </w:pPr>
+      <w:r>
+        <w:t xml:space="preserve">I Rum D opleves direkte hvordan vi er del af noget langt større — ikke som idé men som levende erfaring. Det instinktive niveau aktiveres, millioner af års evolutionær visdom bliver tilgængelig. Dette er ikke enhed i den absolutte forstand som i Dynamisk Stilhed, men oplevelsen af at være forbundet med hele livets væv på tværs af alle grænser.</w:t>
+      </w:r>
+    </w:p>
+    <w:p>
+      <w:pPr>
+        <w:pStyle w:val="BodyText"/>
+      </w:pPr>
+      <w:r>
+        <w:t xml:space="preserve">Du oplever 100 sekunders cyklus — 6 cyklusser hver 10. minut. Bevægelse fra horisonten til midtlinjen som bærer livets matrix. Det universelle der transcenderer det individuelle og relationelle. Instinktiv erkendelse og urgammel visdom bliver tilgængelig. Forbindelse med hele menneskeheden og alt levende. Primary Respiration som organiserende kraft for al heling.</w:t>
+      </w:r>
+    </w:p>
+    <w:p>
+      <w:pPr>
+        <w:pStyle w:val="BodyText"/>
+      </w:pPr>
+      <w:r>
+        <w:rPr>
+          <w:bCs/>
+          <w:b/>
+        </w:rPr>
+        <w:t xml:space="preserve">Det relationelle felt integreret</w:t>
+      </w:r>
+    </w:p>
+    <w:p>
+      <w:pPr>
+        <w:pStyle w:val="BodyText"/>
+      </w:pPr>
+      <w:r>
+        <w:t xml:space="preserve">Rum D inkluderer og transcenderer Rum C’s relationelle kvaliteter. Det terapeutiske rum mellem behandler og klient bliver nu del af et større felt. Co-reguleringen udvides fra det nære til det universelle — vi regulerer ikke kun med hinanden men med livets egen rytme.</w:t>
+      </w:r>
+    </w:p>
+    <w:p>
+      <w:pPr>
+        <w:pStyle w:val="BodyText"/>
+      </w:pPr>
+      <w:r>
+        <w:t xml:space="preserve">Familien, venskaberne, det nære samfund fra Rum C er stadig til stede men nu som aspekter af noget større. The Long Tide organiserer alle de relationelle felter, forbinder dem i én samlet bevægelse. De embryologiske kræfter arbejder nu ikke kun gennem individet eller relationen men gennem hele det universelle felt.</w:t>
+      </w:r>
+    </w:p>
+    <w:p>
+      <w:pPr>
+        <w:pStyle w:val="BodyText"/>
+      </w:pPr>
+      <w:r>
+        <w:t xml:space="preserve">Du mærker Rum C’s relationelle felt nu båret af The Long Tide. Co-regulering udvides til universel synkronisering. Det nære samfund som del af hele menneskeheden. Alle individuelle og relationelle processer organiseret af én rytme. De embryologiske kræfter arbejder gennem det universelle. Integration af alle tidligere zoner i én samlet bevægelse.</w:t>
+      </w:r>
+    </w:p>
+    <w:p>
+      <w:pPr>
+        <w:pStyle w:val="BodyText"/>
+      </w:pPr>
+      <w:r>
+        <w:rPr>
+          <w:bCs/>
+          <w:b/>
+        </w:rPr>
+        <w:t xml:space="preserve">Porten til Dynamisk Stilhed</w:t>
+      </w:r>
+    </w:p>
+    <w:p>
+      <w:pPr>
+        <w:pStyle w:val="BodyText"/>
+      </w:pPr>
+      <w:r>
+        <w:t xml:space="preserve">I Rum D forberedes det ultimative møde med livets oprindelse. The Long Tide’s bevægelse peger naturligt mod sin egen kilde — Dynamisk Stilhed. I øjeblikke af fuldstændig synkronisering og overgivelse kan grænsen mellem bevægelse og stilhed blive gennemsigtig.</w:t>
+      </w:r>
+    </w:p>
+    <w:p>
+      <w:pPr>
+        <w:pStyle w:val="BodyText"/>
+      </w:pPr>
+      <w:r>
+        <w:t xml:space="preserve">Her fornemmes at selv The Long Tide udspringer fra noget dybere — det umanifesterede potentiale, livets arnested. Rum E’s kvaliteter begynder at vise sig som mulighed — ikke som noget vi kan gribe men som nådens potentiale. Paradokset hvor al bevægelse udspringer fra stilhed bliver til levende erfaring.</w:t>
+      </w:r>
+    </w:p>
+    <w:p>
+      <w:pPr>
+        <w:pStyle w:val="BodyText"/>
+      </w:pPr>
+      <w:r>
+        <w:t xml:space="preserve">Du fornemmer Dynamisk Stilhed som The Long Tide’s oprindelse. Porten til det umanifesterede potentiale. Bevægelse og stilhed som to aspekter af samme virkelighed. Muligheden for øjeblikkelig transmutation. Nådens potentiale der venter uden for viljen. Forberedelsen til Rum E’s paradoksale virkelighed.</w:t>
+      </w:r>
+    </w:p>
+    <w:p>
+      <w:pPr>
+        <w:pStyle w:val="BodyText"/>
+      </w:pPr>
+      <w:r>
+        <w:rPr>
+          <w:bCs/>
+          <w:b/>
+        </w:rPr>
+        <w:t xml:space="preserve">Som ét universelt felt</w:t>
+      </w:r>
+    </w:p>
+    <w:p>
+      <w:pPr>
+        <w:pStyle w:val="BodyText"/>
+      </w:pPr>
+      <w:r>
+        <w:t xml:space="preserve">The Long Tide er ét universelt felt der bevæger sig fra horisonten gennem alt vi rører ved. Det relationelle bæres med ind i en dybere rytme, og porten mod Dynamisk Stilhed begynder at vise sig — én kraft der altid har været til stede, ikke et hierarki af lag men aspekter af samme bevægelse. Vi mærker den nu fordi betingelserne har samlet sig — fordi sansningen er blevet stille nok til at horisonten kan høres. Når vi bliver bevæget af den, opdager vi at vi aldrig var adskilt fra livets store rytme; vi har bare manglet den ro der skal til for at lade den nå os.</w:t>
+      </w:r>
+    </w:p>
+    <w:p>
+      <w:pPr>
+        <w:pStyle w:val="BodyText"/>
+      </w:pPr>
+      <w:r>
+        <w:rPr>
+          <w:bCs/>
+          <w:b/>
+        </w:rPr>
+        <w:t xml:space="preserve">[INSPIRATION — nye vinkler at overveje]</w:t>
       </w:r>
     </w:p>
     <w:p>
@@ -13023,7 +13342,359 @@
           <w:iCs/>
           <w:i/>
         </w:rPr>
+        <w:t xml:space="preserve">De 100 sekunder er ikke en målbar konstant. Cyklusserne kommer i et bredere spektrum — nogle gange 80, nogle gange 120 — og varierer fra klient til klient og fra øjeblik til øjeblik. Tallet er en pejling, ikke en definition. Hvad vi lytter til er rytmens natur, ikke dens præcision.</w:t>
+      </w:r>
+    </w:p>
+    <w:p>
+      <w:pPr>
+        <w:pStyle w:val="BodyText"/>
+      </w:pPr>
+      <w:r>
+        <w:rPr>
+          <w:iCs/>
+          <w:i/>
+        </w:rPr>
+        <w:t xml:space="preserve">Læringen af at mærke Long Tide sker ikke gennem instruktion. Det sker oftest ved at sidde sammen med en mere erfaren behandler ved den samme klient — over tid genkender hænderne det andre hænder allerede mærker. Det er en mundtlig tradition, ikke en målbar færdighed.</w:t>
+      </w:r>
+    </w:p>
+    <w:p>
+      <w:pPr>
+        <w:pStyle w:val="BodyText"/>
+      </w:pPr>
+      <w:r>
+        <w:rPr>
+          <w:iCs/>
+          <w:i/>
+        </w:rPr>
+        <w:t xml:space="preserve">En vanskelig erkendelse: nogle gange tror vi at mærke Long Tide, men det er noget andet — en intern rytme i os selv, en forventning, en forestilling om hvordan det skal føles. At kunne skelne mellem det indre billede og den faktiske oplevelse er en del af modningen.</w:t>
+      </w:r>
+    </w:p>
+    <w:p>
+      <w:pPr>
+        <w:pStyle w:val="BodyText"/>
+      </w:pPr>
+      <w:r>
+        <w:rPr>
+          <w:iCs/>
+          <w:i/>
+        </w:rPr>
+        <w:t xml:space="preserve">Long Tide er kosmos, der bevæger sig gennem dig. Den kommer fra horisonten ind mod din midtlinje, og den fortsætter ud igen — som havets evige åndedrag. Når vi mærker den, mærker vi ikke</w:t>
+      </w:r>
+      <w:r>
+        <w:rPr>
+          <w:iCs/>
+          <w:i/>
+        </w:rPr>
+        <w:t xml:space="preserve"> </w:t>
+      </w:r>
+      <w:r>
+        <w:rPr>
+          <w:iCs/>
+          <w:i/>
+        </w:rPr>
+        <w:t xml:space="preserve">‘</w:t>
+      </w:r>
+      <w:r>
+        <w:rPr>
+          <w:iCs/>
+          <w:i/>
+        </w:rPr>
+        <w:t xml:space="preserve">kroppens rytme</w:t>
+      </w:r>
+      <w:r>
+        <w:rPr>
+          <w:iCs/>
+          <w:i/>
+        </w:rPr>
+        <w:t xml:space="preserve">’</w:t>
+      </w:r>
+      <w:r>
+        <w:rPr>
+          <w:iCs/>
+          <w:i/>
+        </w:rPr>
+        <w:t xml:space="preserve">, men det at livet selv ånder, og at vi er en del af dets ånde.</w:t>
+      </w:r>
+    </w:p>
+    <w:p>
+      <w:pPr>
+        <w:pStyle w:val="BodyText"/>
+      </w:pPr>
+      <w:r>
+        <w:rPr>
+          <w:iCs/>
+          <w:i/>
+        </w:rPr>
+        <w:t xml:space="preserve">I Long Tide hviler kroppen i et større felt af organisering. Det er ikke længere kun den enkelte organisme der ordner sig — den ordner sig i forhold til noget større, en universel matrix der har plads til alt. Behandling i Rum D er at synkronisere os med denne større matrix og lade dens orden formidle sig.</w:t>
+      </w:r>
+    </w:p>
+    <w:p>
+      <w:pPr>
+        <w:pStyle w:val="BodyText"/>
+      </w:pPr>
+      <w:r>
+        <w:rPr>
+          <w:bCs/>
+          <w:b/>
+        </w:rPr>
+        <w:t xml:space="preserve">[REFLEKSIONSSPØRGSMÅL]</w:t>
+      </w:r>
+    </w:p>
+    <w:p>
+      <w:pPr>
+        <w:numPr>
+          <w:ilvl w:val="0"/>
+          <w:numId w:val="1060"/>
+        </w:numPr>
+      </w:pPr>
+      <w:r>
+        <w:t xml:space="preserve">Hvad sker der i et arbejde når du holder op med at lede efter The Long Tide og lader den finde dig?</w:t>
+      </w:r>
+    </w:p>
+    <w:p>
+      <w:pPr>
+        <w:numPr>
+          <w:ilvl w:val="0"/>
+          <w:numId w:val="1060"/>
+        </w:numPr>
+      </w:pPr>
+      <w:r>
+        <w:t xml:space="preserve">Roen der gør Long Tide hørbar er ikke teknik. Hvad i dit liv lige nu hjælper den ro frem, og hvad afskærmer den?</w:t>
+      </w:r>
+    </w:p>
+    <w:p>
+      <w:pPr>
+        <w:numPr>
+          <w:ilvl w:val="0"/>
+          <w:numId w:val="1060"/>
+        </w:numPr>
+      </w:pPr>
+      <w:r>
+        <w:t xml:space="preserve">Mellem at observere og at blive bevæget findes en fin skift. Beskriv øjeblikket — eller dets fravær — fra dit seneste klient-arbejde.</w:t>
+      </w:r>
+    </w:p>
+    <w:p>
+      <w:pPr>
+        <w:pStyle w:val="FirstParagraph"/>
+      </w:pPr>
+      <w:r>
+        <w:rPr>
+          <w:bCs/>
+          <w:b/>
+        </w:rPr>
+        <w:t xml:space="preserve">[BRØDTEKST: Rum E — Dynamisk Stilhed]</w:t>
+      </w:r>
+    </w:p>
+    <w:p>
+      <w:pPr>
+        <w:pStyle w:val="BodyText"/>
+      </w:pPr>
+      <w:r>
+        <w:rPr>
+          <w:iCs/>
+          <w:i/>
+        </w:rPr>
+        <w:t xml:space="preserve">I sjældne øjeblikke af nåde træder du ind i Dynamisk Stilhed — paradoksernes verden hvor fuldstændig stilstand indeholder al bevægelse, hvor du er syg det ene øjeblik og det næste er det væk.</w:t>
+      </w:r>
+    </w:p>
+    <w:p>
+      <w:pPr>
+        <w:pStyle w:val="BodyText"/>
+      </w:pPr>
+      <w:r>
+        <w:rPr>
+          <w:bCs/>
+          <w:b/>
+        </w:rPr>
+        <w:t xml:space="preserve">Dynamisk Stilhed som livets arnested</w:t>
+      </w:r>
+    </w:p>
+    <w:p>
+      <w:pPr>
+        <w:pStyle w:val="BodyText"/>
+      </w:pPr>
+      <w:r>
+        <w:t xml:space="preserve">Her er kilden hvorfra alt udspringer — det umanifesterede potentiale der indeholder skabelonen til selve livet. Ikke tom stilhed men et levende felt af rent potentiale. Dette er verdenen af transsubstantiation, hvor heling sker på måder der transcenderer vores forståelse. Midtlinjens essens viser sig at være dynamisk stilhed selv — punktet hvorfra al bevægelse udspringer og vender tilbage til.</w:t>
+      </w:r>
+    </w:p>
+    <w:p>
+      <w:pPr>
+        <w:pStyle w:val="BodyText"/>
+      </w:pPr>
+      <w:r>
+        <w:t xml:space="preserve">I Rum E opleves direkte at blive skabt af livet selv i det levende øjeblik. Breath of Life viser sig som den potente ild der bærer livskraften fra stilheden ud i manifestation. Her mødes paradokserne — adskillelse og enhed erfaret samtidigt, stilstand som indeholder al bevægelse, det øjeblikkelige som rummer evigheden.</w:t>
+      </w:r>
+    </w:p>
+    <w:p>
+      <w:pPr>
+        <w:pStyle w:val="BodyText"/>
+      </w:pPr>
+      <w:r>
+        <w:t xml:space="preserve">Du oplever livets arnested — kilden til alt manifesteret og umanifesteret. Blueprint for al sundhed i sin rene form. Paradokset hvor stilstand indeholder al bevægelse. Verdenen af øjeblikkelig transmutation. Oplevelsen af at blive skabt øjeblik for øjeblik. Midtlinjens essens som dynamisk stilhed.</w:t>
+      </w:r>
+    </w:p>
+    <w:p>
+      <w:pPr>
+        <w:pStyle w:val="BodyText"/>
+      </w:pPr>
+      <w:r>
+        <w:rPr>
+          <w:bCs/>
+          <w:b/>
+        </w:rPr>
+        <w:t xml:space="preserve">The Long Tide og Primary Respiration</w:t>
+      </w:r>
+    </w:p>
+    <w:p>
+      <w:pPr>
+        <w:pStyle w:val="BodyText"/>
+      </w:pPr>
+      <w:r>
+        <w:t xml:space="preserve">Dynamisk Stilhed manifesterer sig gennem Rum D’s The Long Tide. Dette er det første nedkog fra stilheden — hvor det umanifesterede begynder at udtrykke sig i bevægelse og rytme. The Long Tide viser sig at være Breath of Life’s første udtryk, den kaleidoskopiske energi der bærer livets potentiale ud i verden.</w:t>
+      </w:r>
+    </w:p>
+    <w:p>
+      <w:pPr>
+        <w:pStyle w:val="BodyText"/>
+      </w:pPr>
+      <w:r>
+        <w:t xml:space="preserve">Alle tidligere zoner — det fysiske, væskekroppen, det relationelle, det universelle — viser sig at udspringe fra denne ene kilde. Primary Respiration er stilhedens åndedræt, den bevægelse som opstår fra det ubevægelige. De embryologiske kræfters ultimative oprindelse åbenbares som denne dynamiske stilhed.</w:t>
+      </w:r>
+    </w:p>
+    <w:p>
+      <w:pPr>
+        <w:pStyle w:val="BodyText"/>
+      </w:pPr>
+      <w:r>
+        <w:t xml:space="preserve">Du mærker Breath of Life som første manifestation fra stilheden. The Long Tide som udtryk for stilhedens bevægelse. Primary Respiration’s oprindelse i det ubevægelige. Alle zoners ultimative kilde i én stilhed. Forbindelsen mellem stilhed og bevægelse som én realitet. De embryologiske kræfters udspring fra det umanifesterede.</w:t>
+      </w:r>
+    </w:p>
+    <w:p>
+      <w:pPr>
+        <w:pStyle w:val="BodyText"/>
+      </w:pPr>
+      <w:r>
+        <w:rPr>
+          <w:bCs/>
+          <w:b/>
+        </w:rPr>
+        <w:t xml:space="preserve">Kærlighed og mysteriet</w:t>
+      </w:r>
+    </w:p>
+    <w:p>
+      <w:pPr>
+        <w:pStyle w:val="BodyText"/>
+      </w:pPr>
+      <w:r>
+        <w:t xml:space="preserve">Fra Dynamisk Stilhed åbner sig det som ligger hinsides alle zoner — det vi ikke har ord for. Her møder vi havet af kærlighed, den ubetingede accept som livet har for alt skabt. Dette er ikke noget vi kan gribe eller forstå, kun modtage gennem nåde.</w:t>
+      </w:r>
+    </w:p>
+    <w:p>
+      <w:pPr>
+        <w:pStyle w:val="BodyText"/>
+      </w:pPr>
+      <w:r>
+        <w:t xml:space="preserve">Mysteriet viser sig ikke som noget der skal løses men som selve livets essens — det evigt ukendte som alligevel kender os fuldstændigt. Den kærlighed vi møder her er ikke følelse men selve den kraft der holder alt sammen, der tillader alt at eksistere præcis som det er. Her opleves at vi aldrig har været adskilt, at adskillelsen var illusionen.</w:t>
+      </w:r>
+    </w:p>
+    <w:p>
+      <w:pPr>
+        <w:pStyle w:val="BodyText"/>
+      </w:pPr>
+      <w:r>
+        <w:t xml:space="preserve">Du fornemmer havet af ubetinget kærlighed. Mysteriet som ikke kan gribes kun modtages. Erkendelsen af aldrig at have været adskilt. Kærligheden som selve livets sammenholdskraft. Det som ligger hinsides ord og forståelse. Nåden som den eneste vej ind.</w:t>
+      </w:r>
+    </w:p>
+    <w:p>
+      <w:pPr>
+        <w:pStyle w:val="BodyText"/>
+      </w:pPr>
+      <w:r>
+        <w:rPr>
+          <w:bCs/>
+          <w:b/>
+        </w:rPr>
+        <w:t xml:space="preserve">Som ét umanifesteret felt</w:t>
+      </w:r>
+    </w:p>
+    <w:p>
+      <w:pPr>
+        <w:pStyle w:val="BodyText"/>
+      </w:pPr>
+      <w:r>
+        <w:t xml:space="preserve">Dynamisk Stilhed er ét umanifesteret felt der hverken kan gribes eller forklares — kun mødes. The Long Tides oprindelse og det vi kalder kærlighed er samme virkelighed set fra forskellige vinkler, og når vores ord her begynder at blive upræcise, er det fordi mysteriet og nåden er det eneste sprog der er tilbage. Adskillelsen mellem behandler og klient opløses sammen med adskillelsen mellem stilstand og bevægelse — tilbage er den rene tilstedeværelse hvor heling ikke længere er noget der gøres, men noget der er. Hvis Rum A var hvor vores hænder først mødte kroppen, er Rum E hvor kroppen og hænderne aldrig var adskilt fra livets oprindelse.</w:t>
+      </w:r>
+    </w:p>
+    <w:p>
+      <w:pPr>
+        <w:pStyle w:val="BodyText"/>
+      </w:pPr>
+      <w:r>
+        <w:rPr>
+          <w:bCs/>
+          <w:b/>
+        </w:rPr>
+        <w:t xml:space="preserve">[INSPIRATION — nye vinkler at overveje]</w:t>
+      </w:r>
+    </w:p>
+    <w:p>
+      <w:pPr>
+        <w:pStyle w:val="BodyText"/>
+      </w:pPr>
+      <w:r>
+        <w:rPr>
+          <w:iCs/>
+          <w:i/>
+        </w:rPr>
+        <w:t xml:space="preserve">Dynamisk Stilhed er ikke en højere bevidsthedstilstand eller et behandlings-mål. Den dukker op nogle gange uden at vi har planlagt det, og den lader sig ikke trænes. Det meste arbejde sker i Rum A til D, og det er som det skal være. Rum E er bonus, ikke mål.</w:t>
+      </w:r>
+    </w:p>
+    <w:p>
+      <w:pPr>
+        <w:pStyle w:val="BodyText"/>
+      </w:pPr>
+      <w:r>
+        <w:rPr>
+          <w:iCs/>
+          <w:i/>
+        </w:rPr>
+        <w:t xml:space="preserve">Når sproget rammer sin grænse i Rum E, bliver det fristende at gribe til store ord. Men ord er ord. De peger og svigter. Det vigtigste er ikke ordet vi vælger — kærlighed, mysteriet, nåde, tilstedeværelse — men at vi ikke forveksler ordet med fænomenet.</w:t>
+      </w:r>
+    </w:p>
+    <w:p>
+      <w:pPr>
+        <w:pStyle w:val="BodyText"/>
+      </w:pPr>
+      <w:r>
+        <w:rPr>
+          <w:iCs/>
+          <w:i/>
+        </w:rPr>
         <w:t xml:space="preserve">Rum E er det rum der har været til stede under alle de andre. Da vi i Rum A mærkede vævets historie, var stilheden allerede der. Den dukker bare ikke altid op i forgrunden. Når den gør, er det som om noget kort har ladet sig se af sig selv.</w:t>
+      </w:r>
+    </w:p>
+    <w:p>
+      <w:pPr>
+        <w:pStyle w:val="BodyText"/>
+      </w:pPr>
+      <w:r>
+        <w:rPr>
+          <w:iCs/>
+          <w:i/>
+        </w:rPr>
+        <w:t xml:space="preserve">Dynamisk Stilhed er kilde-feltet. Alt i organismen, alt levende, alt skabt, springer ud af denne stilhed og vender tilbage til den. Når vi i en behandling træder ind i feltet, træder vi ind i samme strøm der dannede stjernerne, samme kraft der skabte hver enkelt celle vi nu sidder med under hænderne.</w:t>
+      </w:r>
+    </w:p>
+    <w:p>
+      <w:pPr>
+        <w:pStyle w:val="BodyText"/>
+      </w:pPr>
+      <w:r>
+        <w:rPr>
+          <w:iCs/>
+          <w:i/>
+        </w:rPr>
+        <w:t xml:space="preserve">At nå Rum E er at komme hjem. Det er det sted klienten genkender uden at have været der, og som de altid har vidst eksisterede. I dette møde forsvinder distinktionerne — mellem behandler og klient, mellem syg og hel, mellem nu og evigheden — og noget hviler i sig selv som det altid har gjort.</w:t>
       </w:r>
     </w:p>
     <w:p>

</xml_diff>

<commit_message>
Redigerbart udkast: batch 2 — 4 nye paragraffer pr. begreb 7-12 (i alt 7 hver)
</commit_message>
<xml_diff>
--- a/tools/output/manuskript-redigerbar.docx
+++ b/tools/output/manuskript-redigerbar.docx
@@ -4050,6 +4050,124 @@
       </w:pPr>
       <w:r>
         <w:rPr>
+          <w:iCs/>
+          <w:i/>
+        </w:rPr>
+        <w:t xml:space="preserve">I behandlingssituationen finder hænderne ofte et primært fulcrum først — et sted hvor systemet selv organiserer sig. Det kan være et helt andet sted end klagepunktet. Resten af behandlingen organiserer sig ofte rundt om dette første fulcrum, og det er værd at blive der længe.</w:t>
+      </w:r>
+    </w:p>
+    <w:p>
+      <w:pPr>
+        <w:pStyle w:val="BodyText"/>
+      </w:pPr>
+      <w:r>
+        <w:rPr>
+          <w:iCs/>
+          <w:i/>
+        </w:rPr>
+        <w:t xml:space="preserve">Fulcrums har forskellig karakter hos forskellige klienter. Hos den hyperaktive er de ofte for mange og for bevægelige; hos den nedlukkede er de få og rigide. Hos den balancerede er der få men dybt forankrede fulcrums omkring midtlinjen. Klientens fulcrum-mønster fortæller om systemets aktuelle organisering.</w:t>
+      </w:r>
+    </w:p>
+    <w:p>
+      <w:pPr>
+        <w:pStyle w:val="BodyText"/>
+      </w:pPr>
+      <w:r>
+        <w:rPr>
+          <w:iCs/>
+          <w:i/>
+        </w:rPr>
+        <w:t xml:space="preserve">Når et dysfunktionelt fulcrum slipper, er det ofte mærkbart i hele kroppen samtidig. Klienten kan opleve det som et</w:t>
+      </w:r>
+      <w:r>
+        <w:rPr>
+          <w:iCs/>
+          <w:i/>
+        </w:rPr>
+        <w:t xml:space="preserve"> </w:t>
+      </w:r>
+      <w:r>
+        <w:rPr>
+          <w:iCs/>
+          <w:i/>
+        </w:rPr>
+        <w:t xml:space="preserve">‘</w:t>
+      </w:r>
+      <w:r>
+        <w:rPr>
+          <w:iCs/>
+          <w:i/>
+        </w:rPr>
+        <w:t xml:space="preserve">fald</w:t>
+      </w:r>
+      <w:r>
+        <w:rPr>
+          <w:iCs/>
+          <w:i/>
+        </w:rPr>
+        <w:t xml:space="preserve">’</w:t>
+      </w:r>
+      <w:r>
+        <w:rPr>
+          <w:iCs/>
+          <w:i/>
+        </w:rPr>
+        <w:t xml:space="preserve">, en</w:t>
+      </w:r>
+      <w:r>
+        <w:rPr>
+          <w:iCs/>
+          <w:i/>
+        </w:rPr>
+        <w:t xml:space="preserve"> </w:t>
+      </w:r>
+      <w:r>
+        <w:rPr>
+          <w:iCs/>
+          <w:i/>
+        </w:rPr>
+        <w:t xml:space="preserve">‘</w:t>
+      </w:r>
+      <w:r>
+        <w:rPr>
+          <w:iCs/>
+          <w:i/>
+        </w:rPr>
+        <w:t xml:space="preserve">lettelse</w:t>
+      </w:r>
+      <w:r>
+        <w:rPr>
+          <w:iCs/>
+          <w:i/>
+        </w:rPr>
+        <w:t xml:space="preserve">’</w:t>
+      </w:r>
+      <w:r>
+        <w:rPr>
+          <w:iCs/>
+          <w:i/>
+        </w:rPr>
+        <w:t xml:space="preserve">, en pludselig udglatning af spændinger der ikke nødvendigvis var lokaliseret til det område. Det er en bekræftelse på at fulcrums ordner mere end deres umiddelbare område.</w:t>
+      </w:r>
+    </w:p>
+    <w:p>
+      <w:pPr>
+        <w:pStyle w:val="BodyText"/>
+      </w:pPr>
+      <w:r>
+        <w:rPr>
+          <w:iCs/>
+          <w:i/>
+        </w:rPr>
+        <w:t xml:space="preserve">Fulcrums findes på flere skalaer samtidigt. På cellulært niveau organiserer hver celle sig omkring et fulcrum; på lokalt niveau finder ledforbindelser deres dynamiske centrum; på global skala bevæger hele kroppen sig omkring sit samlede tyngdepunkt. At lytte på flere niveauer giver et rigere billede.</w:t>
+      </w:r>
+    </w:p>
+    <w:p>
+      <w:pPr>
+        <w:pStyle w:val="BodyText"/>
+      </w:pPr>
+      <w:r>
+        <w:rPr>
           <w:bCs/>
           <w:b/>
         </w:rPr>
@@ -4248,6 +4366,54 @@
       </w:pPr>
       <w:r>
         <w:rPr>
+          <w:iCs/>
+          <w:i/>
+        </w:rPr>
+        <w:t xml:space="preserve">I behandlingssituationen kommer stillpoints ofte i en bestemt rækkefølge — først lokale, så bredere, så hele systemet. Mod slutningen af en god behandling kan der opstå en serie stillpoints i Long Tide som synes at organisere alt det foregående. Det er ikke tilfældigt; det er rytmisk.</w:t>
+      </w:r>
+    </w:p>
+    <w:p>
+      <w:pPr>
+        <w:pStyle w:val="BodyText"/>
+      </w:pPr>
+      <w:r>
+        <w:rPr>
+          <w:iCs/>
+          <w:i/>
+        </w:rPr>
+        <w:t xml:space="preserve">Forskellen mellem en induceret og en spontan stillpoint mærkes tydeligt i hænderne. Den inducerede har en bestemt karakter — vi har skabt en pause. Den spontane føles som om systemet selv har valgt det. Klinisk er den spontane oftest mere transformativ, fordi systemets eget timing er respekteret.</w:t>
+      </w:r>
+    </w:p>
+    <w:p>
+      <w:pPr>
+        <w:pStyle w:val="BodyText"/>
+      </w:pPr>
+      <w:r>
+        <w:rPr>
+          <w:iCs/>
+          <w:i/>
+        </w:rPr>
+        <w:t xml:space="preserve">Stillpointens dybde mærkes på hvor stille hænderne bliver. Et overfladisk stillpoint efterlader stadig nogle pulseringer mærkbare. Et dybere fjerner næsten al rytme. Det dybeste — i Long Tide — opleves som om alt vævet holder vejret samtidigt. Hver dybde har sin egen karakter.</w:t>
+      </w:r>
+    </w:p>
+    <w:p>
+      <w:pPr>
+        <w:pStyle w:val="BodyText"/>
+      </w:pPr>
+      <w:r>
+        <w:rPr>
+          <w:iCs/>
+          <w:i/>
+        </w:rPr>
+        <w:t xml:space="preserve">Hos klienter der har gennemlevet meget, kan stillpoints være ledsaget af følelser eller minder der pludselig løsnes. Hos andre er de stille i sig selv — bare en pause. Det er ikke et tegn på dybde at meget kommer op; det er bare en forskel i hvordan systemet afgiver det det har båret.</w:t>
+      </w:r>
+    </w:p>
+    <w:p>
+      <w:pPr>
+        <w:pStyle w:val="BodyText"/>
+      </w:pPr>
+      <w:r>
+        <w:rPr>
           <w:bCs/>
           <w:b/>
         </w:rPr>
@@ -4446,6 +4612,131 @@
       </w:pPr>
       <w:r>
         <w:rPr>
+          <w:iCs/>
+          <w:i/>
+        </w:rPr>
+        <w:t xml:space="preserve">I behandlingssituationen mærker hænderne transmutation som flere lag der løsner sig efter hinanden. Først kan der være modstand der opløses; så en anden kvalitet der træder frem; så en tredje. Hvert lag tager den tid det tager. At lade hver fase være færdig før den næste begynder er essentielt.</w:t>
+      </w:r>
+    </w:p>
+    <w:p>
+      <w:pPr>
+        <w:pStyle w:val="BodyText"/>
+      </w:pPr>
+      <w:r>
+        <w:rPr>
+          <w:iCs/>
+          <w:i/>
+        </w:rPr>
+        <w:t xml:space="preserve">Transmutation har forskellig karakter i forskellige vævs-typer. I muskel-fascia mærkes den som blødgøring og udvidelse; i ledforbindelser som ny bevægelighed; i organer som fornyet rytmisk pulsering; i nervesystem som dybere ro. Hver vævstype taler sit eget sprog i transmutationsprocessen.</w:t>
+      </w:r>
+    </w:p>
+    <w:p>
+      <w:pPr>
+        <w:pStyle w:val="BodyText"/>
+      </w:pPr>
+      <w:r>
+        <w:rPr>
+          <w:iCs/>
+          <w:i/>
+        </w:rPr>
+        <w:t xml:space="preserve">Transmutation kan både mærkes og</w:t>
+      </w:r>
+      <w:r>
+        <w:rPr>
+          <w:iCs/>
+          <w:i/>
+        </w:rPr>
+        <w:t xml:space="preserve"> </w:t>
+      </w:r>
+      <w:r>
+        <w:rPr>
+          <w:iCs/>
+          <w:i/>
+        </w:rPr>
+        <w:t xml:space="preserve">‘</w:t>
+      </w:r>
+      <w:r>
+        <w:rPr>
+          <w:iCs/>
+          <w:i/>
+        </w:rPr>
+        <w:t xml:space="preserve">vides</w:t>
+      </w:r>
+      <w:r>
+        <w:rPr>
+          <w:iCs/>
+          <w:i/>
+        </w:rPr>
+        <w:t xml:space="preserve">’</w:t>
+      </w:r>
+      <w:r>
+        <w:rPr>
+          <w:iCs/>
+          <w:i/>
+        </w:rPr>
+        <w:t xml:space="preserve"> </w:t>
+      </w:r>
+      <w:r>
+        <w:rPr>
+          <w:iCs/>
+          <w:i/>
+        </w:rPr>
+        <w:t xml:space="preserve">uden at man helt kan beskrive det. Hænderne registrerer noget, og samtidig opstår en indre genkendelse hos behandleren — en uudtalt sikkerhed på, at noget er ændret. Begge informationer er gyldige og ofte nødvendige sammen.</w:t>
+      </w:r>
+    </w:p>
+    <w:p>
+      <w:pPr>
+        <w:pStyle w:val="BodyText"/>
+      </w:pPr>
+      <w:r>
+        <w:rPr>
+          <w:iCs/>
+          <w:i/>
+        </w:rPr>
+        <w:t xml:space="preserve">Transmutation kommer ofte i kølvandet på frigivelse af bound potency. Når kraften slipper sin lokale opgave, er der pludselig</w:t>
+      </w:r>
+      <w:r>
+        <w:rPr>
+          <w:iCs/>
+          <w:i/>
+        </w:rPr>
+        <w:t xml:space="preserve"> </w:t>
+      </w:r>
+      <w:r>
+        <w:rPr>
+          <w:iCs/>
+          <w:i/>
+        </w:rPr>
+        <w:t xml:space="preserve">‘</w:t>
+      </w:r>
+      <w:r>
+        <w:rPr>
+          <w:iCs/>
+          <w:i/>
+        </w:rPr>
+        <w:t xml:space="preserve">noget at arbejde med</w:t>
+      </w:r>
+      <w:r>
+        <w:rPr>
+          <w:iCs/>
+          <w:i/>
+        </w:rPr>
+        <w:t xml:space="preserve">’</w:t>
+      </w:r>
+      <w:r>
+        <w:rPr>
+          <w:iCs/>
+          <w:i/>
+        </w:rPr>
+        <w:t xml:space="preserve">, og vævet får mulighed for at omorganisere sig. De to fænomener er knyttet sammen — frigjort potency er det der gør transmutation mulig.</w:t>
+      </w:r>
+    </w:p>
+    <w:p>
+      <w:pPr>
+        <w:pStyle w:val="BodyText"/>
+      </w:pPr>
+      <w:r>
+        <w:rPr>
           <w:bCs/>
           <w:b/>
         </w:rPr>
@@ -4722,6 +5013,54 @@
       </w:pPr>
       <w:r>
         <w:rPr>
+          <w:iCs/>
+          <w:i/>
+        </w:rPr>
+        <w:t xml:space="preserve">Vi genkender indgangen til The Neutral ved en samlet kvalitetsændring. Hænderne mærker en bredere koherens, klientens åndedrag bliver dybere men roligere, det relationelle felt bliver klarere. Det er ikke ét tegn — det er flere små signaler der lægger sig sammen i et samlet billede.</w:t>
+      </w:r>
+    </w:p>
+    <w:p>
+      <w:pPr>
+        <w:pStyle w:val="BodyText"/>
+      </w:pPr>
+      <w:r>
+        <w:rPr>
+          <w:iCs/>
+          <w:i/>
+        </w:rPr>
+        <w:t xml:space="preserve">Forskellige klienter kommer til The Neutral via forskellige veje. Nogle gennem afslapning af nervesystemet; nogle gennem fluide skift; nogle gennem relationel tryghed; nogle pludselig som om noget falder på plads. At kende klientens vej hjælper med ikke at tvinge en bestemt route der ikke passer.</w:t>
+      </w:r>
+    </w:p>
+    <w:p>
+      <w:pPr>
+        <w:pStyle w:val="BodyText"/>
+      </w:pPr>
+      <w:r>
+        <w:rPr>
+          <w:iCs/>
+          <w:i/>
+        </w:rPr>
+        <w:t xml:space="preserve">Når The Neutral er etableret, mærker hænderne en stabilitet i feltet der ikke før var der. Klientens system bevæger sig som ét snarere end som dele. Behandlerens egne hænder bliver mere stille af sig selv. Tiden bliver mindre presserende. Disse er ikke tilfældige sammenfald.</w:t>
+      </w:r>
+    </w:p>
+    <w:p>
+      <w:pPr>
+        <w:pStyle w:val="BodyText"/>
+      </w:pPr>
+      <w:r>
+        <w:rPr>
+          <w:iCs/>
+          <w:i/>
+        </w:rPr>
+        <w:t xml:space="preserve">The Neutral og det fænomen der kaldes Holistic Shift er to sider af samme sag. Holistic Shift er det biologiske udtryk — autonome skift, åndedrags-ændring, hjerterytme-koherens. The Neutral er den oplevede kvalitet — det stille rum hvor alt finder sammen. De forekommer altid sammen.</w:t>
+      </w:r>
+    </w:p>
+    <w:p>
+      <w:pPr>
+        <w:pStyle w:val="BodyText"/>
+      </w:pPr>
+      <w:r>
+        <w:rPr>
           <w:bCs/>
           <w:b/>
         </w:rPr>
@@ -4955,6 +5294,173 @@
       </w:pPr>
       <w:r>
         <w:rPr>
+          <w:iCs/>
+          <w:i/>
+        </w:rPr>
+        <w:t xml:space="preserve">I behandlingssituationen ses Automatic Shifting ofte som hænderne der pludselig bliver opmærksomme på et nyt sted. Det område vi var ved føles</w:t>
+      </w:r>
+      <w:r>
+        <w:rPr>
+          <w:iCs/>
+          <w:i/>
+        </w:rPr>
+        <w:t xml:space="preserve"> </w:t>
+      </w:r>
+      <w:r>
+        <w:rPr>
+          <w:iCs/>
+          <w:i/>
+        </w:rPr>
+        <w:t xml:space="preserve">‘</w:t>
+      </w:r>
+      <w:r>
+        <w:rPr>
+          <w:iCs/>
+          <w:i/>
+        </w:rPr>
+        <w:t xml:space="preserve">mæt</w:t>
+      </w:r>
+      <w:r>
+        <w:rPr>
+          <w:iCs/>
+          <w:i/>
+        </w:rPr>
+        <w:t xml:space="preserve">’</w:t>
+      </w:r>
+      <w:r>
+        <w:rPr>
+          <w:iCs/>
+          <w:i/>
+        </w:rPr>
+        <w:t xml:space="preserve"> </w:t>
+      </w:r>
+      <w:r>
+        <w:rPr>
+          <w:iCs/>
+          <w:i/>
+        </w:rPr>
+        <w:t xml:space="preserve">eller</w:t>
+      </w:r>
+      <w:r>
+        <w:rPr>
+          <w:iCs/>
+          <w:i/>
+        </w:rPr>
+        <w:t xml:space="preserve"> </w:t>
+      </w:r>
+      <w:r>
+        <w:rPr>
+          <w:iCs/>
+          <w:i/>
+        </w:rPr>
+        <w:t xml:space="preserve">‘</w:t>
+      </w:r>
+      <w:r>
+        <w:rPr>
+          <w:iCs/>
+          <w:i/>
+        </w:rPr>
+        <w:t xml:space="preserve">færdigt</w:t>
+      </w:r>
+      <w:r>
+        <w:rPr>
+          <w:iCs/>
+          <w:i/>
+        </w:rPr>
+        <w:t xml:space="preserve">’</w:t>
+      </w:r>
+      <w:r>
+        <w:rPr>
+          <w:iCs/>
+          <w:i/>
+        </w:rPr>
+        <w:t xml:space="preserve">; et andet område kalder. Det er ikke vores valg — det er systemets valg, som vi følger snarere end leder.</w:t>
+      </w:r>
+    </w:p>
+    <w:p>
+      <w:pPr>
+        <w:pStyle w:val="BodyText"/>
+      </w:pPr>
+      <w:r>
+        <w:rPr>
+          <w:iCs/>
+          <w:i/>
+        </w:rPr>
+        <w:t xml:space="preserve">Shifting-mønstre varierer mellem klienter. Nogle skifter hurtigt og let mellem mange områder; andre har lange perioder ved samme sted før et skift kommer. Der er ikke ét rigtigt mønster — hvert system har sit eget tempo, og det er informativt om hvor klienten aktuelt arbejder fra.</w:t>
+      </w:r>
+    </w:p>
+    <w:p>
+      <w:pPr>
+        <w:pStyle w:val="BodyText"/>
+      </w:pPr>
+      <w:r>
+        <w:rPr>
+          <w:iCs/>
+          <w:i/>
+        </w:rPr>
+        <w:t xml:space="preserve">Når shifting går i ring og vender tilbage til samme områder igen og igen, er det ofte fordi noget endnu ikke er klar til at slippe. Vi lader processen vende tilbage; ofte sker der noget på det femte besøg som ikke skete på det første. Tålmodighed har sin egen virkning.</w:t>
+      </w:r>
+    </w:p>
+    <w:p>
+      <w:pPr>
+        <w:pStyle w:val="BodyText"/>
+      </w:pPr>
+      <w:r>
+        <w:rPr>
+          <w:iCs/>
+          <w:i/>
+        </w:rPr>
+        <w:t xml:space="preserve">Når Automatic Shifting holder op midt i en behandling og hænderne</w:t>
+      </w:r>
+      <w:r>
+        <w:rPr>
+          <w:iCs/>
+          <w:i/>
+        </w:rPr>
+        <w:t xml:space="preserve"> </w:t>
+      </w:r>
+      <w:r>
+        <w:rPr>
+          <w:iCs/>
+          <w:i/>
+        </w:rPr>
+        <w:t xml:space="preserve">‘</w:t>
+      </w:r>
+      <w:r>
+        <w:rPr>
+          <w:iCs/>
+          <w:i/>
+        </w:rPr>
+        <w:t xml:space="preserve">sidder fast</w:t>
+      </w:r>
+      <w:r>
+        <w:rPr>
+          <w:iCs/>
+          <w:i/>
+        </w:rPr>
+        <w:t xml:space="preserve">’</w:t>
+      </w:r>
+      <w:r>
+        <w:rPr>
+          <w:iCs/>
+          <w:i/>
+        </w:rPr>
+        <w:t xml:space="preserve"> </w:t>
+      </w:r>
+      <w:r>
+        <w:rPr>
+          <w:iCs/>
+          <w:i/>
+        </w:rPr>
+        <w:t xml:space="preserve">et bestemt sted, er det værd at lytte længere her. Ofte er der ikke et nyt skift fordi noget dybt er ved at organisere sig på det aktuelle sted. At blive er en del af processen, ikke en fejl.</w:t>
+      </w:r>
+    </w:p>
+    <w:p>
+      <w:pPr>
+        <w:pStyle w:val="BodyText"/>
+      </w:pPr>
+      <w:r>
+        <w:rPr>
           <w:bCs/>
           <w:b/>
         </w:rPr>
@@ -5145,6 +5651,138 @@
           <w:i/>
         </w:rPr>
         <w:t xml:space="preserve">Den iboende plan kan inkludere ubehag — smerte, følelser, midlertidig dysregulering. Vi må kende forskellen mellem nyttig smerte (transmutation, der hører til processen) og overvældelse (der ikke gør). Når planen leder gennem ubehag, er udfordringen at holde plads uden at lindre væk.</w:t>
+      </w:r>
+    </w:p>
+    <w:p>
+      <w:pPr>
+        <w:pStyle w:val="BodyText"/>
+      </w:pPr>
+      <w:r>
+        <w:rPr>
+          <w:iCs/>
+          <w:i/>
+        </w:rPr>
+        <w:t xml:space="preserve">Den iboende plan viser sig sjældent i begyndelsen af en behandling. Først efter klienten er faldet til ro, efter de første lag er mødt, begynder retningen at træde frem. At vente på den uden at presse er en del af det at lade planen styre. Den kommer når den kommer.</w:t>
+      </w:r>
+    </w:p>
+    <w:p>
+      <w:pPr>
+        <w:pStyle w:val="BodyText"/>
+      </w:pPr>
+      <w:r>
+        <w:rPr>
+          <w:iCs/>
+          <w:i/>
+        </w:rPr>
+        <w:t xml:space="preserve">Hos nogle klienter er den iboende plan tydelig fra første berøring; hos andre er den sløret af mange års kompensation eller traumer. Når planen er sløret, bliver vores opgave først at hjælpe systemet med at lytte til sig selv igen. Det er ofte den længste del af arbejdet.</w:t>
+      </w:r>
+    </w:p>
+    <w:p>
+      <w:pPr>
+        <w:pStyle w:val="BodyText"/>
+      </w:pPr>
+      <w:r>
+        <w:rPr>
+          <w:iCs/>
+          <w:i/>
+        </w:rPr>
+        <w:t xml:space="preserve">Når vi følger den iboende plan, er der en kvalitet af</w:t>
+      </w:r>
+      <w:r>
+        <w:rPr>
+          <w:iCs/>
+          <w:i/>
+        </w:rPr>
+        <w:t xml:space="preserve"> </w:t>
+      </w:r>
+      <w:r>
+        <w:rPr>
+          <w:iCs/>
+          <w:i/>
+        </w:rPr>
+        <w:t xml:space="preserve">‘</w:t>
+      </w:r>
+      <w:r>
+        <w:rPr>
+          <w:iCs/>
+          <w:i/>
+        </w:rPr>
+        <w:t xml:space="preserve">lethed</w:t>
+      </w:r>
+      <w:r>
+        <w:rPr>
+          <w:iCs/>
+          <w:i/>
+        </w:rPr>
+        <w:t xml:space="preserve">’</w:t>
+      </w:r>
+      <w:r>
+        <w:rPr>
+          <w:iCs/>
+          <w:i/>
+        </w:rPr>
+        <w:t xml:space="preserve"> </w:t>
+      </w:r>
+      <w:r>
+        <w:rPr>
+          <w:iCs/>
+          <w:i/>
+        </w:rPr>
+        <w:t xml:space="preserve">i behandlingen — vi behøver ikke skubbe, vi behøver ikke vælge. Når vi i stedet er begyndt at indføre vores egen plan, mærkes det som modstand: vævet svarer ikke, klienten bliver mere distanceret, hænderne</w:t>
+      </w:r>
+      <w:r>
+        <w:rPr>
+          <w:iCs/>
+          <w:i/>
+        </w:rPr>
+        <w:t xml:space="preserve"> </w:t>
+      </w:r>
+      <w:r>
+        <w:rPr>
+          <w:iCs/>
+          <w:i/>
+        </w:rPr>
+        <w:t xml:space="preserve">‘</w:t>
+      </w:r>
+      <w:r>
+        <w:rPr>
+          <w:iCs/>
+          <w:i/>
+        </w:rPr>
+        <w:t xml:space="preserve">kæmper</w:t>
+      </w:r>
+      <w:r>
+        <w:rPr>
+          <w:iCs/>
+          <w:i/>
+        </w:rPr>
+        <w:t xml:space="preserve">’</w:t>
+      </w:r>
+      <w:r>
+        <w:rPr>
+          <w:iCs/>
+          <w:i/>
+        </w:rPr>
+        <w:t xml:space="preserve"> </w:t>
+      </w:r>
+      <w:r>
+        <w:rPr>
+          <w:iCs/>
+          <w:i/>
+        </w:rPr>
+        <w:t xml:space="preserve">med at finde retning.</w:t>
+      </w:r>
+    </w:p>
+    <w:p>
+      <w:pPr>
+        <w:pStyle w:val="BodyText"/>
+      </w:pPr>
+      <w:r>
+        <w:rPr>
+          <w:iCs/>
+          <w:i/>
+        </w:rPr>
+        <w:t xml:space="preserve">Når vi kortvarigt overhører den iboende plan og indfører vores egen retning, kan vi mærke det med det samme — feltet bliver fladere, mindre koherent. Korrektionen er ikke at gøre noget anderledes, men at trække opmærksomheden tilbage til at lytte. Planen er stadig der.</w:t>
       </w:r>
     </w:p>
     <w:p>

</xml_diff>

<commit_message>
Redigerbart udkast: batch 3 — 4 nye paragraffer pr. begreb 13-18 (alle 18 nu med 7 hver)
</commit_message>
<xml_diff>
--- a/tools/output/manuskript-redigerbar.docx
+++ b/tools/output/manuskript-redigerbar.docx
@@ -6062,6 +6062,159 @@
       </w:pPr>
       <w:r>
         <w:rPr>
+          <w:iCs/>
+          <w:i/>
+        </w:rPr>
+        <w:t xml:space="preserve">I behandlingssituationen mærkes Fluid Body ofte først som en ændret hånd-fornemmelse. Vævet under fingrene bliver mindre</w:t>
+      </w:r>
+      <w:r>
+        <w:rPr>
+          <w:iCs/>
+          <w:i/>
+        </w:rPr>
+        <w:t xml:space="preserve"> </w:t>
+      </w:r>
+      <w:r>
+        <w:rPr>
+          <w:iCs/>
+          <w:i/>
+        </w:rPr>
+        <w:t xml:space="preserve">‘</w:t>
+      </w:r>
+      <w:r>
+        <w:rPr>
+          <w:iCs/>
+          <w:i/>
+        </w:rPr>
+        <w:t xml:space="preserve">tørt</w:t>
+      </w:r>
+      <w:r>
+        <w:rPr>
+          <w:iCs/>
+          <w:i/>
+        </w:rPr>
+        <w:t xml:space="preserve">’</w:t>
+      </w:r>
+      <w:r>
+        <w:rPr>
+          <w:iCs/>
+          <w:i/>
+        </w:rPr>
+        <w:t xml:space="preserve">, mere</w:t>
+      </w:r>
+      <w:r>
+        <w:rPr>
+          <w:iCs/>
+          <w:i/>
+        </w:rPr>
+        <w:t xml:space="preserve"> </w:t>
+      </w:r>
+      <w:r>
+        <w:rPr>
+          <w:iCs/>
+          <w:i/>
+        </w:rPr>
+        <w:t xml:space="preserve">‘</w:t>
+      </w:r>
+      <w:r>
+        <w:rPr>
+          <w:iCs/>
+          <w:i/>
+        </w:rPr>
+        <w:t xml:space="preserve">levende</w:t>
+      </w:r>
+      <w:r>
+        <w:rPr>
+          <w:iCs/>
+          <w:i/>
+        </w:rPr>
+        <w:t xml:space="preserve">’</w:t>
+      </w:r>
+      <w:r>
+        <w:rPr>
+          <w:iCs/>
+          <w:i/>
+        </w:rPr>
+        <w:t xml:space="preserve">. Det er ikke noget vi kan fremtvinge — det viser sig når klientens system har givet sin tilladelse, ofte gennem etablering af The Neutral.</w:t>
+      </w:r>
+    </w:p>
+    <w:p>
+      <w:pPr>
+        <w:pStyle w:val="BodyText"/>
+      </w:pPr>
+      <w:r>
+        <w:rPr>
+          <w:iCs/>
+          <w:i/>
+        </w:rPr>
+        <w:t xml:space="preserve">Hos sportsudøvere og kropsvante klienter er Fluid Body ofte hurtigt tilgængelig — vævet er allerede vant til at bevæge sig som ét felt. Hos klienter der har levet i meget hovedfokuseret tilstand, kan det tage længere tid for væsken at samle sig. Det er ikke et tegn på dybde, kun på vej.</w:t>
+      </w:r>
+    </w:p>
+    <w:p>
+      <w:pPr>
+        <w:pStyle w:val="BodyText"/>
+      </w:pPr>
+      <w:r>
+        <w:rPr>
+          <w:iCs/>
+          <w:i/>
+        </w:rPr>
+        <w:t xml:space="preserve">Når Fluid Body træder ind, ændrer hænderne ofte deres positionering af sig selv. Det vi før mærkede lokalt — en spænding her, en tæthed der — bliver pludselig dele af et større fluid felt. Vores fokus udvider sig fra punktet til feltet, fordi det er det som klienten nu er.</w:t>
+      </w:r>
+    </w:p>
+    <w:p>
+      <w:pPr>
+        <w:pStyle w:val="BodyText"/>
+      </w:pPr>
+      <w:r>
+        <w:rPr>
+          <w:iCs/>
+          <w:i/>
+        </w:rPr>
+        <w:t xml:space="preserve">Vævet husker sin fluid-oprindelse selv mange år efter, det er blevet</w:t>
+      </w:r>
+      <w:r>
+        <w:rPr>
+          <w:iCs/>
+          <w:i/>
+        </w:rPr>
+        <w:t xml:space="preserve"> </w:t>
+      </w:r>
+      <w:r>
+        <w:rPr>
+          <w:iCs/>
+          <w:i/>
+        </w:rPr>
+        <w:t xml:space="preserve">‘</w:t>
+      </w:r>
+      <w:r>
+        <w:rPr>
+          <w:iCs/>
+          <w:i/>
+        </w:rPr>
+        <w:t xml:space="preserve">tørt</w:t>
+      </w:r>
+      <w:r>
+        <w:rPr>
+          <w:iCs/>
+          <w:i/>
+        </w:rPr>
+        <w:t xml:space="preserve">’</w:t>
+      </w:r>
+      <w:r>
+        <w:rPr>
+          <w:iCs/>
+          <w:i/>
+        </w:rPr>
+        <w:t xml:space="preserve">. Når Fluid Body vågner, er det ikke en ny tilstand — det er en gammel tilstand der genfindes. Hænderne mærker det som noget der allerede vidste det skulle være sådan; klienten beskriver det ofte som genkendelse.</w:t>
+      </w:r>
+    </w:p>
+    <w:p>
+      <w:pPr>
+        <w:pStyle w:val="BodyText"/>
+      </w:pPr>
+      <w:r>
+        <w:rPr>
           <w:bCs/>
           <w:b/>
         </w:rPr>
@@ -6307,6 +6460,89 @@
       </w:pPr>
       <w:r>
         <w:rPr>
+          <w:iCs/>
+          <w:i/>
+        </w:rPr>
+        <w:t xml:space="preserve">I behandlingssituationen mærkes læsionsfeltet ofte som et område hvor hænderne ikke</w:t>
+      </w:r>
+      <w:r>
+        <w:rPr>
+          <w:iCs/>
+          <w:i/>
+        </w:rPr>
+        <w:t xml:space="preserve"> </w:t>
+      </w:r>
+      <w:r>
+        <w:rPr>
+          <w:iCs/>
+          <w:i/>
+        </w:rPr>
+        <w:t xml:space="preserve">‘</w:t>
+      </w:r>
+      <w:r>
+        <w:rPr>
+          <w:iCs/>
+          <w:i/>
+        </w:rPr>
+        <w:t xml:space="preserve">kommer ind</w:t>
+      </w:r>
+      <w:r>
+        <w:rPr>
+          <w:iCs/>
+          <w:i/>
+        </w:rPr>
+        <w:t xml:space="preserve">’</w:t>
+      </w:r>
+      <w:r>
+        <w:rPr>
+          <w:iCs/>
+          <w:i/>
+        </w:rPr>
+        <w:t xml:space="preserve">. Der er en stilhed eller tæthed der adskiller sig fra resten af vævet. At blive ved feltets kant uden at presse er ofte den mest virksomme tilgang — feltet åbner sig når det selv er klar.</w:t>
+      </w:r>
+    </w:p>
+    <w:p>
+      <w:pPr>
+        <w:pStyle w:val="BodyText"/>
+      </w:pPr>
+      <w:r>
+        <w:rPr>
+          <w:iCs/>
+          <w:i/>
+        </w:rPr>
+        <w:t xml:space="preserve">Læsionsfelter har forskellig karakter. Nogle er små og dybt fokuserede; andre er store og diffuse. Nogle er akutte og levende; andre kroniske og stillestående. Klientens samlede mønster af læsionsfelter fortæller om systemets historie — hvad det har båret, hvor det har trukket sig tilbage.</w:t>
+      </w:r>
+    </w:p>
+    <w:p>
+      <w:pPr>
+        <w:pStyle w:val="BodyText"/>
+      </w:pPr>
+      <w:r>
+        <w:rPr>
+          <w:iCs/>
+          <w:i/>
+        </w:rPr>
+        <w:t xml:space="preserve">Når et læsionsfelt begynder at slippe, er der ofte en gradvis åbning af feltets kanter. Hænderne mærker først en blødgøring i kantområdet; så en udvidelse af feltet selv; så en tilbagevenden af bevægelse i området. Det sker sjældent pludseligt — oftere som en langsom omfordeling.</w:t>
+      </w:r>
+    </w:p>
+    <w:p>
+      <w:pPr>
+        <w:pStyle w:val="BodyText"/>
+      </w:pPr>
+      <w:r>
+        <w:rPr>
+          <w:iCs/>
+          <w:i/>
+        </w:rPr>
+        <w:t xml:space="preserve">Læsionsfeltet er stedet hvor potency er bundet. Når feltet slipper, er det fordi den bundne potency ikke længere er nødvendig at holde lokalt. Den vender tilbage til den almene cirkulation, og området får adgang til feltets samlede ressourcer igen. De to fænomener er det samme set fra to vinkler.</w:t>
+      </w:r>
+    </w:p>
+    <w:p>
+      <w:pPr>
+        <w:pStyle w:val="BodyText"/>
+      </w:pPr>
+      <w:r>
+        <w:rPr>
           <w:bCs/>
           <w:b/>
         </w:rPr>
@@ -6676,6 +6912,89 @@
       </w:pPr>
       <w:r>
         <w:rPr>
+          <w:iCs/>
+          <w:i/>
+        </w:rPr>
+        <w:t xml:space="preserve">I behandlingssituationen mærker hænderne potency som en kvalitativ kraft i feltet snarere end som lokaliseret bevægelse. Det er som en intensitet eller koncentration der enten er åbent flydende eller bundet til et bestemt sted. Forskellen er en del af det første hænderne læser i en behandling.</w:t>
+      </w:r>
+    </w:p>
+    <w:p>
+      <w:pPr>
+        <w:pStyle w:val="BodyText"/>
+      </w:pPr>
+      <w:r>
+        <w:rPr>
+          <w:iCs/>
+          <w:i/>
+        </w:rPr>
+        <w:t xml:space="preserve">Potency har forskellig karakter afhængigt af hvor i organismen den er. I cerebrospinalvæsken mærkes den ofte som let og fluide; i fascia som tættere og strømmende; i organer som mere indeholdt. Klinisk lytter vi til disse kvalitative forskelle som information om systemets aktuelle organisering.</w:t>
+      </w:r>
+    </w:p>
+    <w:p>
+      <w:pPr>
+        <w:pStyle w:val="BodyText"/>
+      </w:pPr>
+      <w:r>
+        <w:rPr>
+          <w:iCs/>
+          <w:i/>
+        </w:rPr>
+        <w:t xml:space="preserve">Når potency mobiliseres fra en bunden tilstand, mærkes det ofte som en indre</w:t>
+      </w:r>
+      <w:r>
+        <w:rPr>
+          <w:iCs/>
+          <w:i/>
+        </w:rPr>
+        <w:t xml:space="preserve"> </w:t>
+      </w:r>
+      <w:r>
+        <w:rPr>
+          <w:iCs/>
+          <w:i/>
+        </w:rPr>
+        <w:t xml:space="preserve">‘</w:t>
+      </w:r>
+      <w:r>
+        <w:rPr>
+          <w:iCs/>
+          <w:i/>
+        </w:rPr>
+        <w:t xml:space="preserve">genåbning</w:t>
+      </w:r>
+      <w:r>
+        <w:rPr>
+          <w:iCs/>
+          <w:i/>
+        </w:rPr>
+        <w:t xml:space="preserve">’</w:t>
+      </w:r>
+      <w:r>
+        <w:rPr>
+          <w:iCs/>
+          <w:i/>
+        </w:rPr>
+        <w:t xml:space="preserve">. Hænderne registrerer en ændring i feltets kraft og retning. Klienten oplever det undertiden som varme, kuldegysninger, eller en svag elektrisk fornemmelse — det er feltet der genfordeler sin kraft.</w:t>
+      </w:r>
+    </w:p>
+    <w:p>
+      <w:pPr>
+        <w:pStyle w:val="BodyText"/>
+      </w:pPr>
+      <w:r>
+        <w:rPr>
+          <w:iCs/>
+          <w:i/>
+        </w:rPr>
+        <w:t xml:space="preserve">Potency manifesterer sig gennem Primary Respiration — den er det der bærer rytmen og giver den dens helbredende kraft. Når Primary Respiration er stærk og koherent, er potency tilgængelig; når rytmen er svag eller fragmenteret, er potency ofte bundet i lokale opgaver. De to fænomener er knyttet sammen.</w:t>
+      </w:r>
+    </w:p>
+    <w:p>
+      <w:pPr>
+        <w:pStyle w:val="BodyText"/>
+      </w:pPr>
+      <w:r>
+        <w:rPr>
           <w:bCs/>
           <w:b/>
         </w:rPr>
@@ -6928,6 +7247,96 @@
       </w:pPr>
       <w:r>
         <w:rPr>
+          <w:iCs/>
+          <w:i/>
+        </w:rPr>
+        <w:t xml:space="preserve">I behandlingssituationen kommer ignition sjældent som planlagt — den dukker op når betingelserne er rette. Hænderne mærker en pludselig kvalitetsændring i feltet: noget tænder, noget begynder at gløde af sig selv. Det er et af de øjeblikke vi ikke kan forudbestille, men kun forberede.</w:t>
+      </w:r>
+    </w:p>
+    <w:p>
+      <w:pPr>
+        <w:pStyle w:val="BodyText"/>
+      </w:pPr>
+      <w:r>
+        <w:rPr>
+          <w:iCs/>
+          <w:i/>
+        </w:rPr>
+        <w:t xml:space="preserve">Ignition viser sig forskelligt afhængigt af, hvor i organismen den sker. I bækkenet mærkes den som en grundforankring; i hjertet som en udvidelse; i kraniet som en lyshed. Klientens egen oplevelse afspejler ofte præcis hvor i kroppen ignition har fundet sit sted, og det giver os en indikation.</w:t>
+      </w:r>
+    </w:p>
+    <w:p>
+      <w:pPr>
+        <w:pStyle w:val="BodyText"/>
+      </w:pPr>
+      <w:r>
+        <w:rPr>
+          <w:iCs/>
+          <w:i/>
+        </w:rPr>
+        <w:t xml:space="preserve">Når ignition lykkes, mærker hænderne ofte en</w:t>
+      </w:r>
+      <w:r>
+        <w:rPr>
+          <w:iCs/>
+          <w:i/>
+        </w:rPr>
+        <w:t xml:space="preserve"> </w:t>
+      </w:r>
+      <w:r>
+        <w:rPr>
+          <w:iCs/>
+          <w:i/>
+        </w:rPr>
+        <w:t xml:space="preserve">‘</w:t>
+      </w:r>
+      <w:r>
+        <w:rPr>
+          <w:iCs/>
+          <w:i/>
+        </w:rPr>
+        <w:t xml:space="preserve">opadgående</w:t>
+      </w:r>
+      <w:r>
+        <w:rPr>
+          <w:iCs/>
+          <w:i/>
+        </w:rPr>
+        <w:t xml:space="preserve">’</w:t>
+      </w:r>
+      <w:r>
+        <w:rPr>
+          <w:iCs/>
+          <w:i/>
+        </w:rPr>
+        <w:t xml:space="preserve"> </w:t>
+      </w:r>
+      <w:r>
+        <w:rPr>
+          <w:iCs/>
+          <w:i/>
+        </w:rPr>
+        <w:t xml:space="preserve">kvalitet i feltet — som om noget har genfundet sin orientering. Klienten beskriver det undertiden som lethed, klarhed, eller en mærkbar tilstedeværelse i et område der før følte sig fjern. Forandringen er typisk varig.</w:t>
+      </w:r>
+    </w:p>
+    <w:p>
+      <w:pPr>
+        <w:pStyle w:val="BodyText"/>
+      </w:pPr>
+      <w:r>
+        <w:rPr>
+          <w:iCs/>
+          <w:i/>
+        </w:rPr>
+        <w:t xml:space="preserve">Ignition og potency er knyttede fænomener. Ignition er det øjeblik, hvor bunden potency frigives og finder sit nye anvendelses-felt; potency er den substans, der gør ignition mulig. Vi kan ikke skille de to — uden potency ingen ignition; uden ignition ingen ny anvendelse af potency.</w:t>
+      </w:r>
+    </w:p>
+    <w:p>
+      <w:pPr>
+        <w:pStyle w:val="BodyText"/>
+      </w:pPr>
+      <w:r>
+        <w:rPr>
           <w:bCs/>
           <w:b/>
         </w:rPr>
@@ -7126,6 +7535,96 @@
       </w:pPr>
       <w:r>
         <w:rPr>
+          <w:iCs/>
+          <w:i/>
+        </w:rPr>
+        <w:t xml:space="preserve">I behandlingssituationen mærkes axial fluctuations ofte tydeligst når klienten er i Rum B — i den fluide tilstand. Hænderne registrerer dem som en bølgende bevægelse langs aksen, og rytmen kan variere fra langsom og dyb til hurtigere og mere overfladisk afhængigt af klientens aktuelle organisering.</w:t>
+      </w:r>
+    </w:p>
+    <w:p>
+      <w:pPr>
+        <w:pStyle w:val="BodyText"/>
+      </w:pPr>
+      <w:r>
+        <w:rPr>
+          <w:iCs/>
+          <w:i/>
+        </w:rPr>
+        <w:t xml:space="preserve">Hos klienter med god midt-organisering er fluctuationerne ofte ensartede og rolige. Hos klienter med traumer eller fragmentering kan fluctuationerne være afbrudte, sprungne, eller helt manglende i visse zoner. Det fragmenterede mønster er ikke en fejl at rette — det er informativt om hvor vi skal lytte længere.</w:t>
+      </w:r>
+    </w:p>
+    <w:p>
+      <w:pPr>
+        <w:pStyle w:val="BodyText"/>
+      </w:pPr>
+      <w:r>
+        <w:rPr>
+          <w:iCs/>
+          <w:i/>
+        </w:rPr>
+        <w:t xml:space="preserve">Sunde axial fluctuations har en kvalitet af</w:t>
+      </w:r>
+      <w:r>
+        <w:rPr>
+          <w:iCs/>
+          <w:i/>
+        </w:rPr>
+        <w:t xml:space="preserve"> </w:t>
+      </w:r>
+      <w:r>
+        <w:rPr>
+          <w:iCs/>
+          <w:i/>
+        </w:rPr>
+        <w:t xml:space="preserve">‘</w:t>
+      </w:r>
+      <w:r>
+        <w:rPr>
+          <w:iCs/>
+          <w:i/>
+        </w:rPr>
+        <w:t xml:space="preserve">fyldighed</w:t>
+      </w:r>
+      <w:r>
+        <w:rPr>
+          <w:iCs/>
+          <w:i/>
+        </w:rPr>
+        <w:t xml:space="preserve">’</w:t>
+      </w:r>
+      <w:r>
+        <w:rPr>
+          <w:iCs/>
+          <w:i/>
+        </w:rPr>
+        <w:t xml:space="preserve"> </w:t>
+      </w:r>
+      <w:r>
+        <w:rPr>
+          <w:iCs/>
+          <w:i/>
+        </w:rPr>
+        <w:t xml:space="preserve">— bølgen bærer hele kropsbredden samtidigt og forbinder bækken med kraniet i én bevægelse. Når fluctuationerne er svage, er det ikke nødvendigvis et tegn på sygdom — bare på at systemet aktuelt arbejder på et andet niveau.</w:t>
+      </w:r>
+    </w:p>
+    <w:p>
+      <w:pPr>
+        <w:pStyle w:val="BodyText"/>
+      </w:pPr>
+      <w:r>
+        <w:rPr>
+          <w:iCs/>
+          <w:i/>
+        </w:rPr>
+        <w:t xml:space="preserve">Axial fluctuations og midtlinjen er afhængige af hinanden. Uden klar midtlinje fragmenteres fluctuationerne; uden fluctuationer mangler midtlinjen sin bevægelses-kvalitet. Når begge er til stede sammen, opleves kroppen som ét organiseret felt der både har form (midtlinje) og bevægelse (fluctuationer).</w:t>
+      </w:r>
+    </w:p>
+    <w:p>
+      <w:pPr>
+        <w:pStyle w:val="BodyText"/>
+      </w:pPr>
+      <w:r>
+        <w:rPr>
           <w:bCs/>
           <w:b/>
         </w:rPr>
@@ -7405,6 +7904,54 @@
           <w:i/>
         </w:rPr>
         <w:t xml:space="preserve">, er det altid en relativ adskillelse, ikke en absolut. Helheden er der stadig, men dens kommunikationskanaler er sløret. Vores arbejde er at gøre de kanaler mærkbare igen — ikke at samle delene, for de var aldrig adskilt.</w:t>
+      </w:r>
+    </w:p>
+    <w:p>
+      <w:pPr>
+        <w:pStyle w:val="BodyText"/>
+      </w:pPr>
+      <w:r>
+        <w:rPr>
+          <w:iCs/>
+          <w:i/>
+        </w:rPr>
+        <w:t xml:space="preserve">I behandlingssituationen er wholeness ofte det første hænderne registrerer når de lander — er feltet helt eller fragmenteret. Det fortæller med det samme om systemets aktuelle organisering. Resten af behandlingen organiserer sig ofte efter denne første registrering: hvor er helheden klar, hvor er den sløret.</w:t>
+      </w:r>
+    </w:p>
+    <w:p>
+      <w:pPr>
+        <w:pStyle w:val="BodyText"/>
+      </w:pPr>
+      <w:r>
+        <w:rPr>
+          <w:iCs/>
+          <w:i/>
+        </w:rPr>
+        <w:t xml:space="preserve">Klienter har forskellige profiler af wholeness. Nogle er fragmenterede i specifikke områder (typisk hvor traumer eller skader har skabt isolation); andre har generel diffus fragmentering; andre igen har god wholeness i kroppen men ikke i nervesystemet eller omvendt. Mønstret er ikke binært — det er nuanceret.</w:t>
+      </w:r>
+    </w:p>
+    <w:p>
+      <w:pPr>
+        <w:pStyle w:val="BodyText"/>
+      </w:pPr>
+      <w:r>
+        <w:rPr>
+          <w:iCs/>
+          <w:i/>
+        </w:rPr>
+        <w:t xml:space="preserve">Når wholeness reorganiserer sig under behandling, sker det ofte i bølger. Et område samler sig, så et andet, så et tredje. Til sidst er der en samlet kvalitet, hvor alle dele bevæger sig som ét. Det er et af de stærkeste signaler på, at den iboende behandlingsplan har gjort sit arbejde.</w:t>
+      </w:r>
+    </w:p>
+    <w:p>
+      <w:pPr>
+        <w:pStyle w:val="BodyText"/>
+      </w:pPr>
+      <w:r>
+        <w:rPr>
+          <w:iCs/>
+          <w:i/>
+        </w:rPr>
+        <w:t xml:space="preserve">Wholeness er forudsætningen for alle de andre begreber. Uden wholeness er der ikke noget felt at bevæge sig i; uden den er Primary Respiration, potency, midtlinjen alt sammen lokale fragmenter. Wholeness er ikke ét begreb blandt flere — det er den baggrund hvorpå alle de andre tegner sig.</w:t>
       </w:r>
     </w:p>
     <w:p>

</xml_diff>

<commit_message>
Redigerbart udkast: batch 4 — 4 nye paragraffer pr. rum (alle 5 nu med 7 hver)
</commit_message>
<xml_diff>
--- a/tools/output/manuskript-redigerbar.docx
+++ b/tools/output/manuskript-redigerbar.docx
@@ -13532,207 +13532,10 @@
       </w:pPr>
       <w:r>
         <w:rPr>
-          <w:bCs/>
-          <w:b/>
-        </w:rPr>
-        <w:t xml:space="preserve">[REFLEKSIONSSPØRGSMÅL]</w:t>
-      </w:r>
-    </w:p>
-    <w:p>
-      <w:pPr>
-        <w:numPr>
-          <w:ilvl w:val="0"/>
-          <w:numId w:val="1057"/>
-        </w:numPr>
-      </w:pPr>
-      <w:r>
-        <w:t xml:space="preserve">Tænk på et område i en klients krop der har båret en kompensation længe. Hvilken slags samtale opstår mellem dine hænder og dets historie?</w:t>
-      </w:r>
-    </w:p>
-    <w:p>
-      <w:pPr>
-        <w:numPr>
-          <w:ilvl w:val="0"/>
-          <w:numId w:val="1057"/>
-        </w:numPr>
-      </w:pPr>
-      <w:r>
-        <w:t xml:space="preserve">Stivhed og åbning lever i hinanden i samme væv. Mærk lige nu i din egen krop — hvor sidder den samtidighed for dig?</w:t>
-      </w:r>
-    </w:p>
-    <w:p>
-      <w:pPr>
-        <w:numPr>
-          <w:ilvl w:val="0"/>
-          <w:numId w:val="1057"/>
-        </w:numPr>
-      </w:pPr>
-      <w:r>
-        <w:t xml:space="preserve">Det vi kalder dysfunktion gav engang mening for systemet. Hvad gjorde det muligt at overleve dengang, og hvad har det kostet siden?</w:t>
-      </w:r>
-    </w:p>
-    <w:p>
-      <w:pPr>
-        <w:pStyle w:val="FirstParagraph"/>
-      </w:pPr>
-      <w:r>
-        <w:rPr>
-          <w:bCs/>
-          <w:b/>
-        </w:rPr>
-        <w:t xml:space="preserve">[BRØDTEKST: Rum B — Væskekroppen]</w:t>
-      </w:r>
-    </w:p>
-    <w:p>
-      <w:pPr>
-        <w:pStyle w:val="BodyText"/>
-      </w:pPr>
-      <w:r>
-        <w:rPr>
           <w:iCs/>
           <w:i/>
         </w:rPr>
-        <w:t xml:space="preserve">Når tilliden etableres og kroppen begynder at slippe sin vagtsomhed, mærker du hvordan noget dybere vågner under dine hænder. Væskekroppen — millioner af år gammel og vis — begynder at røre på sig.</w:t>
-      </w:r>
-    </w:p>
-    <w:p>
-      <w:pPr>
-        <w:pStyle w:val="BodyText"/>
-      </w:pPr>
-      <w:r>
-        <w:rPr>
-          <w:bCs/>
-          <w:b/>
-        </w:rPr>
-        <w:t xml:space="preserve">Væskekroppens vågnende respons</w:t>
-      </w:r>
-    </w:p>
-    <w:p>
-      <w:pPr>
-        <w:pStyle w:val="BodyText"/>
-      </w:pPr>
-      <w:r>
-        <w:t xml:space="preserve">Her lever væskekroppen i sin naturlige tilstand — som ét levende kontinuum gennem hele organismen. Alle væsker fungerer som en funktionel enhed hvor respons sker simultant gennem hele matrixen, ikke sekvensielt som i nervesystemet. Dette er niveauet hvor kroppen kan gå til The Neutral, hvor det autonome nervesystem bliver fleksibelt og kan suspenderes, så de embryologiske kræfter kan overtage.</w:t>
-      </w:r>
-    </w:p>
-    <w:p>
-      <w:pPr>
-        <w:pStyle w:val="BodyText"/>
-      </w:pPr>
-      <w:r>
-        <w:t xml:space="preserve">Væskekroppen fungerer som bro mellem det energetiske blueprint og den fysiske krop. Den bærer protoplasma-kvaliteterne fra fosterstadiet videre gennem livet. Her findes kapaciteten til Automatic Shifting — hvor behandlingen springer fra sted til sted orkestreret af helhedens prioriteter. Den oprindelige midtlinje er det naturlige fulcrum som alt organiserer sig omkring.</w:t>
-      </w:r>
-    </w:p>
-    <w:p>
-      <w:pPr>
-        <w:pStyle w:val="BodyText"/>
-      </w:pPr>
-      <w:r>
-        <w:t xml:space="preserve">Du oplever et hav af væske der ånder under Primary Respiration. Simultan respons gennem hele væskekroppen som én samlet substans. Kapaciteten til at gå til The Neutral og kontakte de embryologiske kræfter. Det autonome nervesystems fleksibilitet og evne til suspension. Automatic Shifting som naturlig mulighed i væskemediet. Den oprindelige midtlinje som stabilt, organiserende fulcrum.</w:t>
-      </w:r>
-    </w:p>
-    <w:p>
-      <w:pPr>
-        <w:pStyle w:val="BodyText"/>
-      </w:pPr>
-      <w:r>
-        <w:rPr>
-          <w:bCs/>
-          <w:b/>
-        </w:rPr>
-        <w:t xml:space="preserve">Den medbragte tilstand</w:t>
-      </w:r>
-    </w:p>
-    <w:p>
-      <w:pPr>
-        <w:pStyle w:val="BodyText"/>
-      </w:pPr>
-      <w:r>
-        <w:t xml:space="preserve">Væskekroppen rummer hele Rum A — både den normale fysiske krop og alle dens dysfunktionelle områder. De traumatiske tilstande, arvævet, de låste mønstre fra den fysiske krop eksisterer stadig i væskens matrix, men nu i en anden kontekst. De rigide strukturer begynder at få væskekvalitet uden at være fuldt forløst.</w:t>
-      </w:r>
-    </w:p>
-    <w:p>
-      <w:pPr>
-        <w:pStyle w:val="BodyText"/>
-      </w:pPr>
-      <w:r>
-        <w:t xml:space="preserve">Det autonome nervesystems låsthed fra Rum A er stadig til stede men møder nu væskekroppens iboende fleksibilitet. De kompenserende midtlinjer og falske fulcrums eksisterer side om side med den oprindelige midtlinje. Adskillelsen mellem systemer begynder at opløses men er ikke fuldt integreret.</w:t>
-      </w:r>
-    </w:p>
-    <w:p>
-      <w:pPr>
-        <w:pStyle w:val="BodyText"/>
-      </w:pPr>
-      <w:r>
-        <w:t xml:space="preserve">Du mærker den fysiske krops normale funktion nu holdt i væskekontinuumet. Læsionsfelter og traumatiske aftryk der stadig ikke kan gå til neutral. Fast væv der begynder at få væskekvalitet men bevarer sin låsthed. Både normale og falske fulcrums rummet simultant i væsken. Det autonome nervesystems gradvise overgang mod fleksibilitet. Potentialet for heling der endnu ikke er aktiveret.</w:t>
-      </w:r>
-    </w:p>
-    <w:p>
-      <w:pPr>
-        <w:pStyle w:val="BodyText"/>
-      </w:pPr>
-      <w:r>
-        <w:rPr>
-          <w:bCs/>
-          <w:b/>
-        </w:rPr>
-        <w:t xml:space="preserve">Åbningen mod det relationelle</w:t>
-      </w:r>
-    </w:p>
-    <w:p>
-      <w:pPr>
-        <w:pStyle w:val="BodyText"/>
-      </w:pPr>
-      <w:r>
-        <w:t xml:space="preserve">Væskekroppen søger nu forbindelse til det større terapeutiske rum — det fælles felt mellem behandler og klient. Dette er ikke længere kun individuel proces men begyndelsen på erkendelsen af at heling sker i relation. Det relationelle aspekt er naturligt for os som pattedyr — vi er biologisk skabt til at co-regulere, til at finde balance gennem forbindelse.</w:t>
-      </w:r>
-    </w:p>
-    <w:p>
-      <w:pPr>
-        <w:pStyle w:val="BodyText"/>
-      </w:pPr>
-      <w:r>
-        <w:t xml:space="preserve">Her forberedes mødet mellem behandlerens og klientens væskekroppe. Grænsen ved huden viser sig at være mere flydende end antaget. Det terapeutiske rum bliver en container hvor dybere processer kan udfolde sig trygt. Denne zone peger mod vores naturlige behov for fællesskab — familie, venskaber, det nære samfund.</w:t>
-      </w:r>
-    </w:p>
-    <w:p>
-      <w:pPr>
-        <w:pStyle w:val="BodyText"/>
-      </w:pPr>
-      <w:r>
-        <w:t xml:space="preserve">Du fornemmer længslen efter det relationelle og fælles terapeutiske rum. Forberedelsen til mødet mellem to væskekroppe. Det biologiske behov for co-regulering og forbindelse. Grænsen mellem behandler og klient bliver mere gennemsigtig. Det terapeutiske rum som tryg container for dybere processer. Åbningen mod vores naturlige funktion som sociale væsener.</w:t>
-      </w:r>
-    </w:p>
-    <w:p>
-      <w:pPr>
-        <w:pStyle w:val="BodyText"/>
-      </w:pPr>
-      <w:r>
-        <w:rPr>
-          <w:bCs/>
-          <w:b/>
-        </w:rPr>
-        <w:t xml:space="preserve">Som ét levende kontinuum</w:t>
-      </w:r>
-    </w:p>
-    <w:p>
-      <w:pPr>
-        <w:pStyle w:val="BodyText"/>
-      </w:pPr>
-      <w:r>
-        <w:t xml:space="preserve">Væskekroppen er ét sammenhængende felt der ånder gennem alt det vi rører ved. Det medbragte fra det fysiske og den vågnende respons lever i samme matrix, og åbningen mod det relationelle ligger latent i selve væskens bevægelse. Hukommelsen om det fysiske er væskekroppens måde at bære helheden — og selve denne hukommelse gør forløsning mulig, fordi intet er forsvundet. Når vi følger væskens egen rytme, opdager vi at vores opgave ikke er at forene noget. Det er allerede forenet. Vi tillader bare at det viser sig.</w:t>
-      </w:r>
-    </w:p>
-    <w:p>
-      <w:pPr>
-        <w:pStyle w:val="BodyText"/>
-      </w:pPr>
-      <w:r>
-        <w:rPr>
-          <w:bCs/>
-          <w:b/>
-        </w:rPr>
-        <w:t xml:space="preserve">[INSPIRATION — nye vinkler at overveje]</w:t>
+        <w:t xml:space="preserve">I behandlingssituationen er Rum A oftest indgangen — den krop hænderne lander på. Vi mærker først vævets faste struktur, dets historie, dets kompensationer. Først når denne indgang er fuldt anerkendt, åbner systemet sig for de dybere lag. Rum A er ikke et trin der skal forlades, men en kvalitet der bliver.</w:t>
       </w:r>
     </w:p>
     <w:p>
@@ -13744,7 +13547,7 @@
           <w:iCs/>
           <w:i/>
         </w:rPr>
-        <w:t xml:space="preserve">Væskekroppen i Rum B er ikke kun blod og lymfe — det er hele kroppens samlede væskemiljø der begynder at bevæge sig som én sammenhængende enhed. Det vi mærker når Rum B vågner er denne matrix der træder ud af adskilte kompartments og bliver ét felt.</w:t>
+        <w:t xml:space="preserve">Forskellige klienter har forskellige profiler i Rum A. Atleten har et tonet, organiseret væv; den langtidssyge har tæt, beskyttende struktur; den traumatiserede har områder af adskilt væv. Profilen er informativ — den fortæller om systemets aktuelle organiseringsmønster og hvor lytten skal gå hen først.</w:t>
       </w:r>
     </w:p>
     <w:p>
@@ -13756,287 +13559,287 @@
           <w:iCs/>
           <w:i/>
         </w:rPr>
-        <w:t xml:space="preserve">Overgangen fra Rum A til Rum B mærkes ofte først som en kvalitetsændring i vævet. Det bliver</w:t>
-      </w:r>
+        <w:t xml:space="preserve">Når Rum A er fuldt mødt, ændrer vævet kvalitet. Hænderne mærker en større tilgængelighed — det fastsiddende blødgøres, det adskilte begynder at kommunikere. Klienten oplever det som en ankring i kroppen, en samling. Det er forudsætningen for at de andre rum kan åbne sig på en bæredygtig måde.</w:t>
+      </w:r>
+    </w:p>
+    <w:p>
+      <w:pPr>
+        <w:pStyle w:val="BodyText"/>
+      </w:pPr>
       <w:r>
         <w:rPr>
           <w:iCs/>
           <w:i/>
         </w:rPr>
-        <w:t xml:space="preserve"> </w:t>
-      </w:r>
+        <w:t xml:space="preserve">Rum A er ikke det samme som overflade-anatomien. Den anatomiske skelet er udgangspunktet, men Rum A inkluderer hele den fysiske krops levende kvalitet — tone, vævs-tæthed, organisering, struktur, holdning. At lytte til Rum A er at lytte til det levende, ikke til formen.</w:t>
+      </w:r>
+    </w:p>
+    <w:p>
+      <w:pPr>
+        <w:pStyle w:val="BodyText"/>
+      </w:pPr>
+      <w:r>
+        <w:rPr>
+          <w:bCs/>
+          <w:b/>
+        </w:rPr>
+        <w:t xml:space="preserve">[REFLEKSIONSSPØRGSMÅL]</w:t>
+      </w:r>
+    </w:p>
+    <w:p>
+      <w:pPr>
+        <w:numPr>
+          <w:ilvl w:val="0"/>
+          <w:numId w:val="1057"/>
+        </w:numPr>
+      </w:pPr>
+      <w:r>
+        <w:t xml:space="preserve">Tænk på et område i en klients krop der har båret en kompensation længe. Hvilken slags samtale opstår mellem dine hænder og dets historie?</w:t>
+      </w:r>
+    </w:p>
+    <w:p>
+      <w:pPr>
+        <w:numPr>
+          <w:ilvl w:val="0"/>
+          <w:numId w:val="1057"/>
+        </w:numPr>
+      </w:pPr>
+      <w:r>
+        <w:t xml:space="preserve">Stivhed og åbning lever i hinanden i samme væv. Mærk lige nu i din egen krop — hvor sidder den samtidighed for dig?</w:t>
+      </w:r>
+    </w:p>
+    <w:p>
+      <w:pPr>
+        <w:numPr>
+          <w:ilvl w:val="0"/>
+          <w:numId w:val="1057"/>
+        </w:numPr>
+      </w:pPr>
+      <w:r>
+        <w:t xml:space="preserve">Det vi kalder dysfunktion gav engang mening for systemet. Hvad gjorde det muligt at overleve dengang, og hvad har det kostet siden?</w:t>
+      </w:r>
+    </w:p>
+    <w:p>
+      <w:pPr>
+        <w:pStyle w:val="FirstParagraph"/>
+      </w:pPr>
+      <w:r>
+        <w:rPr>
+          <w:bCs/>
+          <w:b/>
+        </w:rPr>
+        <w:t xml:space="preserve">[BRØDTEKST: Rum B — Væskekroppen]</w:t>
+      </w:r>
+    </w:p>
+    <w:p>
+      <w:pPr>
+        <w:pStyle w:val="BodyText"/>
+      </w:pPr>
       <w:r>
         <w:rPr>
           <w:iCs/>
           <w:i/>
         </w:rPr>
-        <w:t xml:space="preserve">‘</w:t>
-      </w:r>
+        <w:t xml:space="preserve">Når tilliden etableres og kroppen begynder at slippe sin vagtsomhed, mærker du hvordan noget dybere vågner under dine hænder. Væskekroppen — millioner af år gammel og vis — begynder at røre på sig.</w:t>
+      </w:r>
+    </w:p>
+    <w:p>
+      <w:pPr>
+        <w:pStyle w:val="BodyText"/>
+      </w:pPr>
+      <w:r>
+        <w:rPr>
+          <w:bCs/>
+          <w:b/>
+        </w:rPr>
+        <w:t xml:space="preserve">Væskekroppens vågnende respons</w:t>
+      </w:r>
+    </w:p>
+    <w:p>
+      <w:pPr>
+        <w:pStyle w:val="BodyText"/>
+      </w:pPr>
+      <w:r>
+        <w:t xml:space="preserve">Her lever væskekroppen i sin naturlige tilstand — som ét levende kontinuum gennem hele organismen. Alle væsker fungerer som en funktionel enhed hvor respons sker simultant gennem hele matrixen, ikke sekvensielt som i nervesystemet. Dette er niveauet hvor kroppen kan gå til The Neutral, hvor det autonome nervesystem bliver fleksibelt og kan suspenderes, så de embryologiske kræfter kan overtage.</w:t>
+      </w:r>
+    </w:p>
+    <w:p>
+      <w:pPr>
+        <w:pStyle w:val="BodyText"/>
+      </w:pPr>
+      <w:r>
+        <w:t xml:space="preserve">Væskekroppen fungerer som bro mellem det energetiske blueprint og den fysiske krop. Den bærer protoplasma-kvaliteterne fra fosterstadiet videre gennem livet. Her findes kapaciteten til Automatic Shifting — hvor behandlingen springer fra sted til sted orkestreret af helhedens prioriteter. Den oprindelige midtlinje er det naturlige fulcrum som alt organiserer sig omkring.</w:t>
+      </w:r>
+    </w:p>
+    <w:p>
+      <w:pPr>
+        <w:pStyle w:val="BodyText"/>
+      </w:pPr>
+      <w:r>
+        <w:t xml:space="preserve">Du oplever et hav af væske der ånder under Primary Respiration. Simultan respons gennem hele væskekroppen som én samlet substans. Kapaciteten til at gå til The Neutral og kontakte de embryologiske kræfter. Det autonome nervesystems fleksibilitet og evne til suspension. Automatic Shifting som naturlig mulighed i væskemediet. Den oprindelige midtlinje som stabilt, organiserende fulcrum.</w:t>
+      </w:r>
+    </w:p>
+    <w:p>
+      <w:pPr>
+        <w:pStyle w:val="BodyText"/>
+      </w:pPr>
+      <w:r>
+        <w:rPr>
+          <w:bCs/>
+          <w:b/>
+        </w:rPr>
+        <w:t xml:space="preserve">Den medbragte tilstand</w:t>
+      </w:r>
+    </w:p>
+    <w:p>
+      <w:pPr>
+        <w:pStyle w:val="BodyText"/>
+      </w:pPr>
+      <w:r>
+        <w:t xml:space="preserve">Væskekroppen rummer hele Rum A — både den normale fysiske krop og alle dens dysfunktionelle områder. De traumatiske tilstande, arvævet, de låste mønstre fra den fysiske krop eksisterer stadig i væskens matrix, men nu i en anden kontekst. De rigide strukturer begynder at få væskekvalitet uden at være fuldt forløst.</w:t>
+      </w:r>
+    </w:p>
+    <w:p>
+      <w:pPr>
+        <w:pStyle w:val="BodyText"/>
+      </w:pPr>
+      <w:r>
+        <w:t xml:space="preserve">Det autonome nervesystems låsthed fra Rum A er stadig til stede men møder nu væskekroppens iboende fleksibilitet. De kompenserende midtlinjer og falske fulcrums eksisterer side om side med den oprindelige midtlinje. Adskillelsen mellem systemer begynder at opløses men er ikke fuldt integreret.</w:t>
+      </w:r>
+    </w:p>
+    <w:p>
+      <w:pPr>
+        <w:pStyle w:val="BodyText"/>
+      </w:pPr>
+      <w:r>
+        <w:t xml:space="preserve">Du mærker den fysiske krops normale funktion nu holdt i væskekontinuumet. Læsionsfelter og traumatiske aftryk der stadig ikke kan gå til neutral. Fast væv der begynder at få væskekvalitet men bevarer sin låsthed. Både normale og falske fulcrums rummet simultant i væsken. Det autonome nervesystems gradvise overgang mod fleksibilitet. Potentialet for heling der endnu ikke er aktiveret.</w:t>
+      </w:r>
+    </w:p>
+    <w:p>
+      <w:pPr>
+        <w:pStyle w:val="BodyText"/>
+      </w:pPr>
+      <w:r>
+        <w:rPr>
+          <w:bCs/>
+          <w:b/>
+        </w:rPr>
+        <w:t xml:space="preserve">Åbningen mod det relationelle</w:t>
+      </w:r>
+    </w:p>
+    <w:p>
+      <w:pPr>
+        <w:pStyle w:val="BodyText"/>
+      </w:pPr>
+      <w:r>
+        <w:t xml:space="preserve">Væskekroppen søger nu forbindelse til det større terapeutiske rum — det fælles felt mellem behandler og klient. Dette er ikke længere kun individuel proces men begyndelsen på erkendelsen af at heling sker i relation. Det relationelle aspekt er naturligt for os som pattedyr — vi er biologisk skabt til at co-regulere, til at finde balance gennem forbindelse.</w:t>
+      </w:r>
+    </w:p>
+    <w:p>
+      <w:pPr>
+        <w:pStyle w:val="BodyText"/>
+      </w:pPr>
+      <w:r>
+        <w:t xml:space="preserve">Her forberedes mødet mellem behandlerens og klientens væskekroppe. Grænsen ved huden viser sig at være mere flydende end antaget. Det terapeutiske rum bliver en container hvor dybere processer kan udfolde sig trygt. Denne zone peger mod vores naturlige behov for fællesskab — familie, venskaber, det nære samfund.</w:t>
+      </w:r>
+    </w:p>
+    <w:p>
+      <w:pPr>
+        <w:pStyle w:val="BodyText"/>
+      </w:pPr>
+      <w:r>
+        <w:t xml:space="preserve">Du fornemmer længslen efter det relationelle og fælles terapeutiske rum. Forberedelsen til mødet mellem to væskekroppe. Det biologiske behov for co-regulering og forbindelse. Grænsen mellem behandler og klient bliver mere gennemsigtig. Det terapeutiske rum som tryg container for dybere processer. Åbningen mod vores naturlige funktion som sociale væsener.</w:t>
+      </w:r>
+    </w:p>
+    <w:p>
+      <w:pPr>
+        <w:pStyle w:val="BodyText"/>
+      </w:pPr>
+      <w:r>
+        <w:rPr>
+          <w:bCs/>
+          <w:b/>
+        </w:rPr>
+        <w:t xml:space="preserve">Som ét levende kontinuum</w:t>
+      </w:r>
+    </w:p>
+    <w:p>
+      <w:pPr>
+        <w:pStyle w:val="BodyText"/>
+      </w:pPr>
+      <w:r>
+        <w:t xml:space="preserve">Væskekroppen er ét sammenhængende felt der ånder gennem alt det vi rører ved. Det medbragte fra det fysiske og den vågnende respons lever i samme matrix, og åbningen mod det relationelle ligger latent i selve væskens bevægelse. Hukommelsen om det fysiske er væskekroppens måde at bære helheden — og selve denne hukommelse gør forløsning mulig, fordi intet er forsvundet. Når vi følger væskens egen rytme, opdager vi at vores opgave ikke er at forene noget. Det er allerede forenet. Vi tillader bare at det viser sig.</w:t>
+      </w:r>
+    </w:p>
+    <w:p>
+      <w:pPr>
+        <w:pStyle w:val="BodyText"/>
+      </w:pPr>
+      <w:r>
+        <w:rPr>
+          <w:bCs/>
+          <w:b/>
+        </w:rPr>
+        <w:t xml:space="preserve">[INSPIRATION — nye vinkler at overveje]</w:t>
+      </w:r>
+    </w:p>
+    <w:p>
+      <w:pPr>
+        <w:pStyle w:val="BodyText"/>
+      </w:pPr>
       <w:r>
         <w:rPr>
           <w:iCs/>
           <w:i/>
         </w:rPr>
-        <w:t xml:space="preserve">vådere</w:t>
-      </w:r>
+        <w:t xml:space="preserve">Væskekroppen i Rum B er ikke kun blod og lymfe — det er hele kroppens samlede væskemiljø der begynder at bevæge sig som én sammenhængende enhed. Det vi mærker når Rum B vågner er denne matrix der træder ud af adskilte kompartments og bliver ét felt.</w:t>
+      </w:r>
+    </w:p>
+    <w:p>
+      <w:pPr>
+        <w:pStyle w:val="BodyText"/>
+      </w:pPr>
       <w:r>
         <w:rPr>
           <w:iCs/>
           <w:i/>
         </w:rPr>
-        <w:t xml:space="preserve">’</w:t>
+        <w:t xml:space="preserve">Overgangen fra Rum A til Rum B mærkes ofte først som en kvalitetsændring i vævet. Det bliver</w:t>
       </w:r>
       <w:r>
         <w:rPr>
           <w:iCs/>
           <w:i/>
         </w:rPr>
-        <w:t xml:space="preserve">, mere flydende. Klienten beskriver det nogle gange som om de bliver tunge eller lette samtidigt. Det er paradokset ved væskekroppen — den har vægt og letvægt på én gang.</w:t>
-      </w:r>
-    </w:p>
-    <w:p>
-      <w:pPr>
-        <w:pStyle w:val="BodyText"/>
-      </w:pPr>
+        <w:t xml:space="preserve"> </w:t>
+      </w:r>
       <w:r>
         <w:rPr>
           <w:iCs/>
           <w:i/>
         </w:rPr>
-        <w:t xml:space="preserve">Når Rum B nægter at vågne, er det oftest fordi nervesystemet endnu ikke har givet sin tilladelse. Væskekroppen er afhængig af parasympatisk dominans for at flyde frit. Hvis behandlingen forhastes, blokerer den sympatiske aktivering den proces vi venter på.</w:t>
-      </w:r>
-    </w:p>
-    <w:p>
-      <w:pPr>
-        <w:pStyle w:val="BodyText"/>
-      </w:pPr>
-      <w:r>
-        <w:rPr>
-          <w:bCs/>
-          <w:b/>
-        </w:rPr>
-        <w:t xml:space="preserve">[REFLEKSIONSSPØRGSMÅL]</w:t>
-      </w:r>
-    </w:p>
-    <w:p>
-      <w:pPr>
-        <w:numPr>
-          <w:ilvl w:val="0"/>
-          <w:numId w:val="1058"/>
-        </w:numPr>
-      </w:pPr>
-      <w:r>
-        <w:t xml:space="preserve">Hvis det allerede er forenet, hvad ændrer det så ved den helingshandling du tror du udfører?</w:t>
-      </w:r>
-    </w:p>
-    <w:p>
-      <w:pPr>
-        <w:numPr>
-          <w:ilvl w:val="0"/>
-          <w:numId w:val="1058"/>
-        </w:numPr>
-      </w:pPr>
-      <w:r>
-        <w:t xml:space="preserve">Væsken bærer hukommelse på en måde strukturen ikke gør. I dit seneste klient-arbejde — hvilken slags hukommelse mærkede du væsken bære?</w:t>
-      </w:r>
-    </w:p>
-    <w:p>
-      <w:pPr>
-        <w:numPr>
-          <w:ilvl w:val="0"/>
-          <w:numId w:val="1058"/>
-        </w:numPr>
-      </w:pPr>
-      <w:r>
-        <w:t xml:space="preserve">Lige før dine hænder slipper ledelsen, sker der noget i din egen krop. Beskriv den signal-bevægelse, hvis du kan finde ord for den.</w:t>
-      </w:r>
-    </w:p>
-    <w:p>
-      <w:pPr>
-        <w:pStyle w:val="FirstParagraph"/>
-      </w:pPr>
-      <w:r>
-        <w:rPr>
-          <w:bCs/>
-          <w:b/>
-        </w:rPr>
-        <w:t xml:space="preserve">[BRØDTEKST: Rum C — Det Relationelle Felt]</w:t>
-      </w:r>
-    </w:p>
-    <w:p>
-      <w:pPr>
-        <w:pStyle w:val="BodyText"/>
-      </w:pPr>
+        <w:t xml:space="preserve">‘</w:t>
+      </w:r>
       <w:r>
         <w:rPr>
           <w:iCs/>
           <w:i/>
         </w:rPr>
-        <w:t xml:space="preserve">Når væskekroppen har fundet sin rytme og grænsen mellem behandler og klient bliver mere flydende, opstår et fælles felt — et relationelt rum hvor vi møder vores naturlige biologiske arv som sociale væsener.</w:t>
-      </w:r>
-    </w:p>
-    <w:p>
-      <w:pPr>
-        <w:pStyle w:val="BodyText"/>
-      </w:pPr>
-      <w:r>
-        <w:rPr>
-          <w:bCs/>
-          <w:b/>
-        </w:rPr>
-        <w:t xml:space="preserve">Det relationelle som naturlig funktion</w:t>
-      </w:r>
-    </w:p>
-    <w:p>
-      <w:pPr>
-        <w:pStyle w:val="BodyText"/>
-      </w:pPr>
-      <w:r>
-        <w:t xml:space="preserve">Her udfolder Rum C sig som vores medfødte kapacitet til at fungere i relation. Som pattedyr er vi biologisk udviklet til at leve, udveksle og co-regulere med andre. Dette er ikke en tillært færdighed men en iboende del af vores natur — vi er skabt til at finde balance gennem forbindelse med familie, venskaber, kollegaer og det nære samfund.</w:t>
-      </w:r>
-    </w:p>
-    <w:p>
-      <w:pPr>
-        <w:pStyle w:val="BodyText"/>
-      </w:pPr>
-      <w:r>
-        <w:t xml:space="preserve">I behandlingssituationen manifesterer dette sig som det terapeutiske rum mellem behandler og klient — et fælles felt hvor begge systemer mødes og påvirker hinanden. Dette er et dybere niveau end det individuelle, hvor heling sker gennem selve relationen. Det nære samfund — vores by, region, arbejdsplads — udgør den naturlige kontekst hvor vores biologiske behov for tilhørsforhold og udveksling udfolder sig.</w:t>
-      </w:r>
-    </w:p>
-    <w:p>
-      <w:pPr>
-        <w:pStyle w:val="BodyText"/>
-      </w:pPr>
-      <w:r>
-        <w:t xml:space="preserve">Du oplever det fælles felt mellem behandler og klient som levende realitet. Co-regulering som naturlig biologisk funktion. Nervesystemernes gensidige påvirkning og stabilisering. Det relationelle rum som container for dybere processer. Forbindelse til familie, venskaber og nært samfund som helende kraft. Integration af det individuelle i den større sociale kontekst.</w:t>
-      </w:r>
-    </w:p>
-    <w:p>
-      <w:pPr>
-        <w:pStyle w:val="BodyText"/>
-      </w:pPr>
-      <w:r>
-        <w:rPr>
-          <w:bCs/>
-          <w:b/>
-        </w:rPr>
-        <w:t xml:space="preserve">Væskekroppens kvaliteter i det fælles</w:t>
-      </w:r>
-    </w:p>
-    <w:p>
-      <w:pPr>
-        <w:pStyle w:val="BodyText"/>
-      </w:pPr>
-      <w:r>
-        <w:t xml:space="preserve">Rum C inkluderer og udvider væskekroppens egenskaber fra Rum B ind i det relationelle felt. Den simultane respons gennem væskekroppen bliver nu til fælles respons mellem to eller flere systemer. Kapaciteten til The Neutral udvides til at omfatte det fælles rum. Automatic Shifting kan nu bevæge sig ikke kun gennem individet men gennem det relationelle felt.</w:t>
-      </w:r>
-    </w:p>
-    <w:p>
-      <w:pPr>
-        <w:pStyle w:val="BodyText"/>
-      </w:pPr>
-      <w:r>
-        <w:t xml:space="preserve">Den oprindelige midtlinje fra Rum B bliver reference ikke kun for individet men for hele det terapeutiske rum. Det autonome nervesystems fleksibilitet understøttes og forstærkes gennem mødet med andres regulerede systemer. De embryologiske kræfter arbejder nu gennem det relationelle interface.</w:t>
-      </w:r>
-    </w:p>
-    <w:p>
-      <w:pPr>
-        <w:pStyle w:val="BodyText"/>
-      </w:pPr>
-      <w:r>
-        <w:t xml:space="preserve">Du mærker væskekroppens egenskaber nu aktive i det fælles felt. Simultan respons gennem flere forbundne systemer. The Neutral som fælles tilstand mellem behandler og klient. Automatic Shifting gennem det relationelle rum. Co-regulering som forstærker nervesystemets fleksibilitet. De embryologiske kræfter arbejder gennem relationen.</w:t>
-      </w:r>
-    </w:p>
-    <w:p>
-      <w:pPr>
-        <w:pStyle w:val="BodyText"/>
-      </w:pPr>
-      <w:r>
-        <w:rPr>
-          <w:bCs/>
-          <w:b/>
-        </w:rPr>
-        <w:t xml:space="preserve">Broen til det universelle</w:t>
-      </w:r>
-    </w:p>
-    <w:p>
-      <w:pPr>
-        <w:pStyle w:val="BodyText"/>
-      </w:pPr>
-      <w:r>
-        <w:t xml:space="preserve">Rum C’s relationelle felt peger naturligt mod noget større — mod det som rækker ud over det nære og kendte. Her forberedes overgangen til det universelle, til det som forbinder hele menneskeheden. Det instinktive og fælles-menneskelige begynder at vise sig gennem det relationelle.</w:t>
-      </w:r>
-    </w:p>
-    <w:p>
-      <w:pPr>
-        <w:pStyle w:val="BodyText"/>
-      </w:pPr>
-      <w:r>
-        <w:t xml:space="preserve">Dette er ikke længere kun familie og lokalt samfund, men forbindelsen til noget der transcenderer individuelle og lokale grænser. The Long Tide’s universelle bevægelse fornemmes i baggrunden — den kraft som forbinder alt levende på tværs af det individuelle og det nært relationelle. Rum D forberedes gennem erkendelsen af at vi er del af noget langt større.</w:t>
-      </w:r>
-    </w:p>
-    <w:p>
-      <w:pPr>
-        <w:pStyle w:val="BodyText"/>
-      </w:pPr>
-      <w:r>
-        <w:t xml:space="preserve">Du fornemmer det universelle der viser sig gennem det partikulære. Forbindelsen til menneskeheden som helhed. Det instinktive og arketypiske der lever i alle. The Long Tide’s tilstedeværelse i baggrunden. Det fælles på tværs af alle individuelle og relationelle grænser. Åbningen mod Rum D hvor det universelle felt dominerer.</w:t>
-      </w:r>
-    </w:p>
-    <w:p>
-      <w:pPr>
-        <w:pStyle w:val="BodyText"/>
-      </w:pPr>
-      <w:r>
-        <w:rPr>
-          <w:bCs/>
-          <w:b/>
-        </w:rPr>
-        <w:t xml:space="preserve">Som ét fælles rum</w:t>
-      </w:r>
-    </w:p>
-    <w:p>
-      <w:pPr>
-        <w:pStyle w:val="BodyText"/>
-      </w:pPr>
-      <w:r>
-        <w:t xml:space="preserve">Det relationelle felt er ét fælles rum der opstår når to systemer møder hinanden. Væskekroppens kvaliteter lever videre i co-reguleringens biologiske rytme, og åbningen mod det universelle peger naturligt videre — alt vibrerer samtidigt i hvert øjeblik af mødet, som tonaliteter af samme forbindelse snarere end lag der skal gennemleves. At vi er sociale væsener tilhører vores fysiologi — vores arv som pattedyr. Helingen sker ofte præcis her hvor to nervesystemer finder hinanden, og når vi hviler i det fælles rum, peger det af sig selv mod noget større — som en naturlig forlængelse af det nære, ikke som en flugt fra det.</w:t>
-      </w:r>
-    </w:p>
-    <w:p>
-      <w:pPr>
-        <w:pStyle w:val="BodyText"/>
-      </w:pPr>
-      <w:r>
-        <w:rPr>
-          <w:bCs/>
-          <w:b/>
-        </w:rPr>
-        <w:t xml:space="preserve">[INSPIRATION — nye vinkler at overveje]</w:t>
-      </w:r>
-    </w:p>
-    <w:p>
-      <w:pPr>
-        <w:pStyle w:val="BodyText"/>
-      </w:pPr>
+        <w:t xml:space="preserve">vådere</w:t>
+      </w:r>
       <w:r>
         <w:rPr>
           <w:iCs/>
           <w:i/>
         </w:rPr>
-        <w:t xml:space="preserve">Det relationelle felt er ikke metafor men biologi. Når to nervesystemer mødes uden trussel, opstår en målbar fælles regulering — det er det system der opstod blandt sociale pattedyr og som vi alle bærer. Vi bygger på en eksisterende neurobiologisk arkitektur, ikke på spirituel idé.</w:t>
-      </w:r>
-    </w:p>
-    <w:p>
-      <w:pPr>
-        <w:pStyle w:val="BodyText"/>
-      </w:pPr>
+        <w:t xml:space="preserve">’</w:t>
+      </w:r>
       <w:r>
         <w:rPr>
           <w:iCs/>
           <w:i/>
         </w:rPr>
-        <w:t xml:space="preserve">I det relationelle felt bliver behandleren også ændret. Det er ikke en énvejsbevægelse fra os til klienten. Vi mærker noget i os selv vågne i takt med klientens åbning. At anerkende dette uden at lade vores eget materiale fylde feltet er en daglig disciplin.</w:t>
+        <w:t xml:space="preserve">, mere flydende. Klienten beskriver det nogle gange som om de bliver tunge eller lette samtidigt. Det er paradokset ved væskekroppen — den har vægt og letvægt på én gang.</w:t>
       </w:r>
     </w:p>
     <w:p>
@@ -14048,64 +13851,7 @@
           <w:iCs/>
           <w:i/>
         </w:rPr>
-        <w:t xml:space="preserve">Når det relationelle felt overvælder klienten, er det ofte fordi det er længe siden de har været i et trygt felt. Selv det at føle sig set kan være krævende. Vores opgave er ikke at gå frem, men at give feltet plads og tid til at modne i sit eget tempo.</w:t>
-      </w:r>
-    </w:p>
-    <w:p>
-      <w:pPr>
-        <w:pStyle w:val="BodyText"/>
-      </w:pPr>
-      <w:r>
-        <w:rPr>
-          <w:bCs/>
-          <w:b/>
-        </w:rPr>
-        <w:t xml:space="preserve">[REFLEKSIONSSPØRGSMÅL]</w:t>
-      </w:r>
-    </w:p>
-    <w:p>
-      <w:pPr>
-        <w:numPr>
-          <w:ilvl w:val="0"/>
-          <w:numId w:val="1059"/>
-        </w:numPr>
-      </w:pPr>
-      <w:r>
-        <w:t xml:space="preserve">Det fælles rum opstår — det laves ikke. Hvilke betingelser i dig selv inviterer det frem?</w:t>
-      </w:r>
-    </w:p>
-    <w:p>
-      <w:pPr>
-        <w:numPr>
-          <w:ilvl w:val="0"/>
-          <w:numId w:val="1059"/>
-        </w:numPr>
-      </w:pPr>
-      <w:r>
-        <w:t xml:space="preserve">Et andet menneskes regulering registreres ofte i kroppen før i hovedet. Hvor møder du den først?</w:t>
-      </w:r>
-    </w:p>
-    <w:p>
-      <w:pPr>
-        <w:numPr>
-          <w:ilvl w:val="0"/>
-          <w:numId w:val="1059"/>
-        </w:numPr>
-      </w:pPr>
-      <w:r>
-        <w:t xml:space="preserve">Når feltet selv heler — vidne, vært eller ledsager — hvilken position er sværest at hvile i?</w:t>
-      </w:r>
-    </w:p>
-    <w:p>
-      <w:pPr>
-        <w:pStyle w:val="FirstParagraph"/>
-      </w:pPr>
-      <w:r>
-        <w:rPr>
-          <w:bCs/>
-          <w:b/>
-        </w:rPr>
-        <w:t xml:space="preserve">[BRØDTEKST: Rum D — The Long Tide / Primary Respiration]</w:t>
+        <w:t xml:space="preserve">Når Rum B nægter at vågne, er det oftest fordi nervesystemet endnu ikke har givet sin tilladelse. Væskekroppen er afhængig af parasympatisk dominans for at flyde frit. Hvis behandlingen forhastes, blokerer den sympatiske aktivering den proces vi venter på.</w:t>
       </w:r>
     </w:p>
     <w:p>
@@ -14117,147 +13863,7 @@
           <w:iCs/>
           <w:i/>
         </w:rPr>
-        <w:t xml:space="preserve">Nu træder du ind i det universelle felt — hvor The Long Tide bevæger sig fra horisonten med sin dybe, langsomme rytme, bærende livets matrix og skabelonen for optimal funktion.</w:t>
-      </w:r>
-    </w:p>
-    <w:p>
-      <w:pPr>
-        <w:pStyle w:val="BodyText"/>
-      </w:pPr>
-      <w:r>
-        <w:rPr>
-          <w:bCs/>
-          <w:b/>
-        </w:rPr>
-        <w:t xml:space="preserve">The Long Tide som universelt felt</w:t>
-      </w:r>
-    </w:p>
-    <w:p>
-      <w:pPr>
-        <w:pStyle w:val="BodyText"/>
-      </w:pPr>
-      <w:r>
-        <w:t xml:space="preserve">Dette er Primary Respiration’s energetiske udtryk — den universelle bevægelse der kommer fra horisonten mod kroppens midtlinje med sin 100 sekunders cyklus. Her transcenderer vi det individuelle og det nært relationelle for at møde det som forbinder alt levende. The Long Tide bærer livets blueprint, den perfekte skabelon som aldrig mistes.</w:t>
-      </w:r>
-    </w:p>
-    <w:p>
-      <w:pPr>
-        <w:pStyle w:val="BodyText"/>
-      </w:pPr>
-      <w:r>
-        <w:t xml:space="preserve">I Rum D opleves direkte hvordan vi er del af noget langt større — ikke som idé men som levende erfaring. Det instinktive niveau aktiveres, millioner af års evolutionær visdom bliver tilgængelig. Dette er ikke enhed i den absolutte forstand som i Dynamisk Stilhed, men oplevelsen af at være forbundet med hele livets væv på tværs af alle grænser.</w:t>
-      </w:r>
-    </w:p>
-    <w:p>
-      <w:pPr>
-        <w:pStyle w:val="BodyText"/>
-      </w:pPr>
-      <w:r>
-        <w:t xml:space="preserve">Du oplever 100 sekunders cyklus — 6 cyklusser hver 10. minut. Bevægelse fra horisonten til midtlinjen som bærer livets matrix. Det universelle der transcenderer det individuelle og relationelle. Instinktiv erkendelse og urgammel visdom bliver tilgængelig. Forbindelse med hele menneskeheden og alt levende. Primary Respiration som organiserende kraft for al heling.</w:t>
-      </w:r>
-    </w:p>
-    <w:p>
-      <w:pPr>
-        <w:pStyle w:val="BodyText"/>
-      </w:pPr>
-      <w:r>
-        <w:rPr>
-          <w:bCs/>
-          <w:b/>
-        </w:rPr>
-        <w:t xml:space="preserve">Det relationelle felt integreret</w:t>
-      </w:r>
-    </w:p>
-    <w:p>
-      <w:pPr>
-        <w:pStyle w:val="BodyText"/>
-      </w:pPr>
-      <w:r>
-        <w:t xml:space="preserve">Rum D inkluderer og transcenderer Rum C’s relationelle kvaliteter. Det terapeutiske rum mellem behandler og klient bliver nu del af et større felt. Co-reguleringen udvides fra det nære til det universelle — vi regulerer ikke kun med hinanden men med livets egen rytme.</w:t>
-      </w:r>
-    </w:p>
-    <w:p>
-      <w:pPr>
-        <w:pStyle w:val="BodyText"/>
-      </w:pPr>
-      <w:r>
-        <w:t xml:space="preserve">Familien, venskaberne, det nære samfund fra Rum C er stadig til stede men nu som aspekter af noget større. The Long Tide organiserer alle de relationelle felter, forbinder dem i én samlet bevægelse. De embryologiske kræfter arbejder nu ikke kun gennem individet eller relationen men gennem hele det universelle felt.</w:t>
-      </w:r>
-    </w:p>
-    <w:p>
-      <w:pPr>
-        <w:pStyle w:val="BodyText"/>
-      </w:pPr>
-      <w:r>
-        <w:t xml:space="preserve">Du mærker Rum C’s relationelle felt nu båret af The Long Tide. Co-regulering udvides til universel synkronisering. Det nære samfund som del af hele menneskeheden. Alle individuelle og relationelle processer organiseret af én rytme. De embryologiske kræfter arbejder gennem det universelle. Integration af alle tidligere zoner i én samlet bevægelse.</w:t>
-      </w:r>
-    </w:p>
-    <w:p>
-      <w:pPr>
-        <w:pStyle w:val="BodyText"/>
-      </w:pPr>
-      <w:r>
-        <w:rPr>
-          <w:bCs/>
-          <w:b/>
-        </w:rPr>
-        <w:t xml:space="preserve">Porten til Dynamisk Stilhed</w:t>
-      </w:r>
-    </w:p>
-    <w:p>
-      <w:pPr>
-        <w:pStyle w:val="BodyText"/>
-      </w:pPr>
-      <w:r>
-        <w:t xml:space="preserve">I Rum D forberedes det ultimative møde med livets oprindelse. The Long Tide’s bevægelse peger naturligt mod sin egen kilde — Dynamisk Stilhed. I øjeblikke af fuldstændig synkronisering og overgivelse kan grænsen mellem bevægelse og stilhed blive gennemsigtig.</w:t>
-      </w:r>
-    </w:p>
-    <w:p>
-      <w:pPr>
-        <w:pStyle w:val="BodyText"/>
-      </w:pPr>
-      <w:r>
-        <w:t xml:space="preserve">Her fornemmes at selv The Long Tide udspringer fra noget dybere — det umanifesterede potentiale, livets arnested. Rum E’s kvaliteter begynder at vise sig som mulighed — ikke som noget vi kan gribe men som nådens potentiale. Paradokset hvor al bevægelse udspringer fra stilhed bliver til levende erfaring.</w:t>
-      </w:r>
-    </w:p>
-    <w:p>
-      <w:pPr>
-        <w:pStyle w:val="BodyText"/>
-      </w:pPr>
-      <w:r>
-        <w:t xml:space="preserve">Du fornemmer Dynamisk Stilhed som The Long Tide’s oprindelse. Porten til det umanifesterede potentiale. Bevægelse og stilhed som to aspekter af samme virkelighed. Muligheden for øjeblikkelig transmutation. Nådens potentiale der venter uden for viljen. Forberedelsen til Rum E’s paradoksale virkelighed.</w:t>
-      </w:r>
-    </w:p>
-    <w:p>
-      <w:pPr>
-        <w:pStyle w:val="BodyText"/>
-      </w:pPr>
-      <w:r>
-        <w:rPr>
-          <w:bCs/>
-          <w:b/>
-        </w:rPr>
-        <w:t xml:space="preserve">Som ét universelt felt</w:t>
-      </w:r>
-    </w:p>
-    <w:p>
-      <w:pPr>
-        <w:pStyle w:val="BodyText"/>
-      </w:pPr>
-      <w:r>
-        <w:t xml:space="preserve">The Long Tide er ét universelt felt der bevæger sig fra horisonten gennem alt vi rører ved. Det relationelle bæres med ind i en dybere rytme, og porten mod Dynamisk Stilhed begynder at vise sig — én kraft der altid har været til stede, ikke et hierarki af lag men aspekter af samme bevægelse. Vi mærker den nu fordi betingelserne har samlet sig — fordi sansningen er blevet stille nok til at horisonten kan høres. Når vi bliver bevæget af den, opdager vi at vi aldrig var adskilt fra livets store rytme; vi har bare manglet den ro der skal til for at lade den nå os.</w:t>
-      </w:r>
-    </w:p>
-    <w:p>
-      <w:pPr>
-        <w:pStyle w:val="BodyText"/>
-      </w:pPr>
-      <w:r>
-        <w:rPr>
-          <w:bCs/>
-          <w:b/>
-        </w:rPr>
-        <w:t xml:space="preserve">[INSPIRATION — nye vinkler at overveje]</w:t>
+        <w:t xml:space="preserve">I behandlingssituationen kommer overgangen til Rum B ofte gradvist. Først blødgøres vævet lokalt; så bredere; så bevæger hele organismen sig som ét fluid felt. Hænderne kan ikke fremtvinge denne overgang — de kan kun give plads til den. Klienten mærker det ofte før behandleren kan beskrive det.</w:t>
       </w:r>
     </w:p>
     <w:p>
@@ -14269,7 +13875,7 @@
           <w:iCs/>
           <w:i/>
         </w:rPr>
-        <w:t xml:space="preserve">De 100 sekunder er ikke en målbar konstant. Cyklusserne kommer i et bredere spektrum — nogle gange 80, nogle gange 120 — og varierer fra klient til klient og fra øjeblik til øjeblik. Tallet er en pejling, ikke en definition. Hvad vi lytter til er rytmens natur, ikke dens præcision.</w:t>
+        <w:t xml:space="preserve">Hos klienter der lever meget i hovedet, kan Rum B være tilgængelig først efter længere arbejde. Hos klienter med god kropsforankring åbner den sig næsten automatisk når The Neutral er etableret. Hos klienter med lange traumer kan Rum B være beskyttet — adgangen til væsken er en tærskel der skal mødes med tålmodighed.</w:t>
       </w:r>
     </w:p>
     <w:p>
@@ -14281,7 +13887,7 @@
           <w:iCs/>
           <w:i/>
         </w:rPr>
-        <w:t xml:space="preserve">Læringen af at mærke Long Tide sker ikke gennem instruktion. Det sker oftest ved at sidde sammen med en mere erfaren behandler ved den samme klient — over tid genkender hænderne det andre hænder allerede mærker. Det er en mundtlig tradition, ikke en målbar færdighed.</w:t>
+        <w:t xml:space="preserve">Når Rum B er fuldt etableret, mærker hænderne en bredere koherens. Det er ikke længere kun lokale strukturer der bevæger sig, men hele organismen som én fluid enhed. Klientens åndedrag bliver dybere og mere langsomt; deres ansigt får ofte en blødere kvalitet. Disse er ikke tilfældige sammenfald.</w:t>
       </w:r>
     </w:p>
     <w:p>
@@ -14293,7 +13899,7 @@
           <w:iCs/>
           <w:i/>
         </w:rPr>
-        <w:t xml:space="preserve">En vanskelig erkendelse: nogle gange tror vi at mærke Long Tide, men det er noget andet — en intern rytme i os selv, en forventning, en forestilling om hvordan det skal føles. At kunne skelne mellem det indre billede og den faktiske oplevelse er en del af modningen.</w:t>
+        <w:t xml:space="preserve">Rum B er forbindelsen mellem den faste krop (Rum A) og de subtile rum (Rum C-E). Uden Rum B kan vi ikke nå Long Tide-rummet — væskens åbning er den nødvendige passage. Det er en af de grunde, vi ikke springer rummene over: hver indeholder den foregående og forbereder den næste.</w:t>
       </w:r>
     </w:p>
     <w:p>
@@ -14312,33 +13918,33 @@
       <w:pPr>
         <w:numPr>
           <w:ilvl w:val="0"/>
-          <w:numId w:val="1060"/>
-        </w:numPr>
-      </w:pPr>
-      <w:r>
-        <w:t xml:space="preserve">Hvad sker der i et arbejde når du holder op med at lede efter The Long Tide og lader den finde dig?</w:t>
-      </w:r>
-    </w:p>
-    <w:p>
-      <w:pPr>
-        <w:numPr>
-          <w:ilvl w:val="0"/>
-          <w:numId w:val="1060"/>
-        </w:numPr>
-      </w:pPr>
-      <w:r>
-        <w:t xml:space="preserve">Roen der gør Long Tide hørbar er ikke teknik. Hvad i dit liv lige nu hjælper den ro frem, og hvad afskærmer den?</w:t>
-      </w:r>
-    </w:p>
-    <w:p>
-      <w:pPr>
-        <w:numPr>
-          <w:ilvl w:val="0"/>
-          <w:numId w:val="1060"/>
-        </w:numPr>
-      </w:pPr>
-      <w:r>
-        <w:t xml:space="preserve">Mellem at observere og at blive bevæget findes en fin skift. Beskriv øjeblikket — eller dets fravær — fra dit seneste klient-arbejde.</w:t>
+          <w:numId w:val="1058"/>
+        </w:numPr>
+      </w:pPr>
+      <w:r>
+        <w:t xml:space="preserve">Hvis det allerede er forenet, hvad ændrer det så ved den helingshandling du tror du udfører?</w:t>
+      </w:r>
+    </w:p>
+    <w:p>
+      <w:pPr>
+        <w:numPr>
+          <w:ilvl w:val="0"/>
+          <w:numId w:val="1058"/>
+        </w:numPr>
+      </w:pPr>
+      <w:r>
+        <w:t xml:space="preserve">Væsken bærer hukommelse på en måde strukturen ikke gør. I dit seneste klient-arbejde — hvilken slags hukommelse mærkede du væsken bære?</w:t>
+      </w:r>
+    </w:p>
+    <w:p>
+      <w:pPr>
+        <w:numPr>
+          <w:ilvl w:val="0"/>
+          <w:numId w:val="1058"/>
+        </w:numPr>
+      </w:pPr>
+      <w:r>
+        <w:t xml:space="preserve">Lige før dine hænder slipper ledelsen, sker der noget i din egen krop. Beskriv den signal-bevægelse, hvis du kan finde ord for den.</w:t>
       </w:r>
     </w:p>
     <w:p>
@@ -14350,7 +13956,7 @@
           <w:bCs/>
           <w:b/>
         </w:rPr>
-        <w:t xml:space="preserve">[BRØDTEKST: Rum E — Dynamisk Stilhed]</w:t>
+        <w:t xml:space="preserve">[BRØDTEKST: Rum C — Det Relationelle Felt]</w:t>
       </w:r>
     </w:p>
     <w:p>
@@ -14362,135 +13968,135 @@
           <w:iCs/>
           <w:i/>
         </w:rPr>
-        <w:t xml:space="preserve">I sjældne øjeblikke af nåde træder du ind i Dynamisk Stilhed — paradoksernes verden hvor fuldstændig stilstand indeholder al bevægelse, hvor du er syg det ene øjeblik og det næste er det væk.</w:t>
-      </w:r>
-    </w:p>
-    <w:p>
-      <w:pPr>
-        <w:pStyle w:val="BodyText"/>
-      </w:pPr>
-      <w:r>
-        <w:rPr>
-          <w:bCs/>
-          <w:b/>
-        </w:rPr>
-        <w:t xml:space="preserve">Dynamisk Stilhed som livets arnested</w:t>
-      </w:r>
-    </w:p>
-    <w:p>
-      <w:pPr>
-        <w:pStyle w:val="BodyText"/>
-      </w:pPr>
-      <w:r>
-        <w:t xml:space="preserve">Her er kilden hvorfra alt udspringer — det umanifesterede potentiale der indeholder skabelonen til selve livet. Ikke tom stilhed men et levende felt af rent potentiale. Dette er verdenen af transsubstantiation, hvor heling sker på måder der transcenderer vores forståelse. Midtlinjens essens viser sig at være dynamisk stilhed selv — punktet hvorfra al bevægelse udspringer og vender tilbage til.</w:t>
-      </w:r>
-    </w:p>
-    <w:p>
-      <w:pPr>
-        <w:pStyle w:val="BodyText"/>
-      </w:pPr>
-      <w:r>
-        <w:t xml:space="preserve">I Rum E opleves direkte at blive skabt af livet selv i det levende øjeblik. Breath of Life viser sig som den potente ild der bærer livskraften fra stilheden ud i manifestation. Her mødes paradokserne — adskillelse og enhed erfaret samtidigt, stilstand som indeholder al bevægelse, det øjeblikkelige som rummer evigheden.</w:t>
-      </w:r>
-    </w:p>
-    <w:p>
-      <w:pPr>
-        <w:pStyle w:val="BodyText"/>
-      </w:pPr>
-      <w:r>
-        <w:t xml:space="preserve">Du oplever livets arnested — kilden til alt manifesteret og umanifesteret. Blueprint for al sundhed i sin rene form. Paradokset hvor stilstand indeholder al bevægelse. Verdenen af øjeblikkelig transmutation. Oplevelsen af at blive skabt øjeblik for øjeblik. Midtlinjens essens som dynamisk stilhed.</w:t>
-      </w:r>
-    </w:p>
-    <w:p>
-      <w:pPr>
-        <w:pStyle w:val="BodyText"/>
-      </w:pPr>
-      <w:r>
-        <w:rPr>
-          <w:bCs/>
-          <w:b/>
-        </w:rPr>
-        <w:t xml:space="preserve">The Long Tide og Primary Respiration</w:t>
-      </w:r>
-    </w:p>
-    <w:p>
-      <w:pPr>
-        <w:pStyle w:val="BodyText"/>
-      </w:pPr>
-      <w:r>
-        <w:t xml:space="preserve">Dynamisk Stilhed manifesterer sig gennem Rum D’s The Long Tide. Dette er det første nedkog fra stilheden — hvor det umanifesterede begynder at udtrykke sig i bevægelse og rytme. The Long Tide viser sig at være Breath of Life’s første udtryk, den kaleidoskopiske energi der bærer livets potentiale ud i verden.</w:t>
-      </w:r>
-    </w:p>
-    <w:p>
-      <w:pPr>
-        <w:pStyle w:val="BodyText"/>
-      </w:pPr>
-      <w:r>
-        <w:t xml:space="preserve">Alle tidligere zoner — det fysiske, væskekroppen, det relationelle, det universelle — viser sig at udspringe fra denne ene kilde. Primary Respiration er stilhedens åndedræt, den bevægelse som opstår fra det ubevægelige. De embryologiske kræfters ultimative oprindelse åbenbares som denne dynamiske stilhed.</w:t>
-      </w:r>
-    </w:p>
-    <w:p>
-      <w:pPr>
-        <w:pStyle w:val="BodyText"/>
-      </w:pPr>
-      <w:r>
-        <w:t xml:space="preserve">Du mærker Breath of Life som første manifestation fra stilheden. The Long Tide som udtryk for stilhedens bevægelse. Primary Respiration’s oprindelse i det ubevægelige. Alle zoners ultimative kilde i én stilhed. Forbindelsen mellem stilhed og bevægelse som én realitet. De embryologiske kræfters udspring fra det umanifesterede.</w:t>
-      </w:r>
-    </w:p>
-    <w:p>
-      <w:pPr>
-        <w:pStyle w:val="BodyText"/>
-      </w:pPr>
-      <w:r>
-        <w:rPr>
-          <w:bCs/>
-          <w:b/>
-        </w:rPr>
-        <w:t xml:space="preserve">Kærlighed og mysteriet</w:t>
-      </w:r>
-    </w:p>
-    <w:p>
-      <w:pPr>
-        <w:pStyle w:val="BodyText"/>
-      </w:pPr>
-      <w:r>
-        <w:t xml:space="preserve">Fra Dynamisk Stilhed åbner sig det som ligger hinsides alle zoner — det vi ikke har ord for. Her møder vi havet af kærlighed, den ubetingede accept som livet har for alt skabt. Dette er ikke noget vi kan gribe eller forstå, kun modtage gennem nåde.</w:t>
-      </w:r>
-    </w:p>
-    <w:p>
-      <w:pPr>
-        <w:pStyle w:val="BodyText"/>
-      </w:pPr>
-      <w:r>
-        <w:t xml:space="preserve">Mysteriet viser sig ikke som noget der skal løses men som selve livets essens — det evigt ukendte som alligevel kender os fuldstændigt. Den kærlighed vi møder her er ikke følelse men selve den kraft der holder alt sammen, der tillader alt at eksistere præcis som det er. Her opleves at vi aldrig har været adskilt, at adskillelsen var illusionen.</w:t>
-      </w:r>
-    </w:p>
-    <w:p>
-      <w:pPr>
-        <w:pStyle w:val="BodyText"/>
-      </w:pPr>
-      <w:r>
-        <w:t xml:space="preserve">Du fornemmer havet af ubetinget kærlighed. Mysteriet som ikke kan gribes kun modtages. Erkendelsen af aldrig at have været adskilt. Kærligheden som selve livets sammenholdskraft. Det som ligger hinsides ord og forståelse. Nåden som den eneste vej ind.</w:t>
-      </w:r>
-    </w:p>
-    <w:p>
-      <w:pPr>
-        <w:pStyle w:val="BodyText"/>
-      </w:pPr>
-      <w:r>
-        <w:rPr>
-          <w:bCs/>
-          <w:b/>
-        </w:rPr>
-        <w:t xml:space="preserve">Som ét umanifesteret felt</w:t>
-      </w:r>
-    </w:p>
-    <w:p>
-      <w:pPr>
-        <w:pStyle w:val="BodyText"/>
-      </w:pPr>
-      <w:r>
-        <w:t xml:space="preserve">Dynamisk Stilhed er ét umanifesteret felt der hverken kan gribes eller forklares — kun mødes. The Long Tides oprindelse og det vi kalder kærlighed er samme virkelighed set fra forskellige vinkler, og når vores ord her begynder at blive upræcise, er det fordi mysteriet og nåden er det eneste sprog der er tilbage. Adskillelsen mellem behandler og klient opløses sammen med adskillelsen mellem stilstand og bevægelse — tilbage er den rene tilstedeværelse hvor heling ikke længere er noget der gøres, men noget der er. Hvis Rum A var hvor vores hænder først mødte kroppen, er Rum E hvor kroppen og hænderne aldrig var adskilt fra livets oprindelse.</w:t>
+        <w:t xml:space="preserve">Når væskekroppen har fundet sin rytme og grænsen mellem behandler og klient bliver mere flydende, opstår et fælles felt — et relationelt rum hvor vi møder vores naturlige biologiske arv som sociale væsener.</w:t>
+      </w:r>
+    </w:p>
+    <w:p>
+      <w:pPr>
+        <w:pStyle w:val="BodyText"/>
+      </w:pPr>
+      <w:r>
+        <w:rPr>
+          <w:bCs/>
+          <w:b/>
+        </w:rPr>
+        <w:t xml:space="preserve">Det relationelle som naturlig funktion</w:t>
+      </w:r>
+    </w:p>
+    <w:p>
+      <w:pPr>
+        <w:pStyle w:val="BodyText"/>
+      </w:pPr>
+      <w:r>
+        <w:t xml:space="preserve">Her udfolder Rum C sig som vores medfødte kapacitet til at fungere i relation. Som pattedyr er vi biologisk udviklet til at leve, udveksle og co-regulere med andre. Dette er ikke en tillært færdighed men en iboende del af vores natur — vi er skabt til at finde balance gennem forbindelse med familie, venskaber, kollegaer og det nære samfund.</w:t>
+      </w:r>
+    </w:p>
+    <w:p>
+      <w:pPr>
+        <w:pStyle w:val="BodyText"/>
+      </w:pPr>
+      <w:r>
+        <w:t xml:space="preserve">I behandlingssituationen manifesterer dette sig som det terapeutiske rum mellem behandler og klient — et fælles felt hvor begge systemer mødes og påvirker hinanden. Dette er et dybere niveau end det individuelle, hvor heling sker gennem selve relationen. Det nære samfund — vores by, region, arbejdsplads — udgør den naturlige kontekst hvor vores biologiske behov for tilhørsforhold og udveksling udfolder sig.</w:t>
+      </w:r>
+    </w:p>
+    <w:p>
+      <w:pPr>
+        <w:pStyle w:val="BodyText"/>
+      </w:pPr>
+      <w:r>
+        <w:t xml:space="preserve">Du oplever det fælles felt mellem behandler og klient som levende realitet. Co-regulering som naturlig biologisk funktion. Nervesystemernes gensidige påvirkning og stabilisering. Det relationelle rum som container for dybere processer. Forbindelse til familie, venskaber og nært samfund som helende kraft. Integration af det individuelle i den større sociale kontekst.</w:t>
+      </w:r>
+    </w:p>
+    <w:p>
+      <w:pPr>
+        <w:pStyle w:val="BodyText"/>
+      </w:pPr>
+      <w:r>
+        <w:rPr>
+          <w:bCs/>
+          <w:b/>
+        </w:rPr>
+        <w:t xml:space="preserve">Væskekroppens kvaliteter i det fælles</w:t>
+      </w:r>
+    </w:p>
+    <w:p>
+      <w:pPr>
+        <w:pStyle w:val="BodyText"/>
+      </w:pPr>
+      <w:r>
+        <w:t xml:space="preserve">Rum C inkluderer og udvider væskekroppens egenskaber fra Rum B ind i det relationelle felt. Den simultane respons gennem væskekroppen bliver nu til fælles respons mellem to eller flere systemer. Kapaciteten til The Neutral udvides til at omfatte det fælles rum. Automatic Shifting kan nu bevæge sig ikke kun gennem individet men gennem det relationelle felt.</w:t>
+      </w:r>
+    </w:p>
+    <w:p>
+      <w:pPr>
+        <w:pStyle w:val="BodyText"/>
+      </w:pPr>
+      <w:r>
+        <w:t xml:space="preserve">Den oprindelige midtlinje fra Rum B bliver reference ikke kun for individet men for hele det terapeutiske rum. Det autonome nervesystems fleksibilitet understøttes og forstærkes gennem mødet med andres regulerede systemer. De embryologiske kræfter arbejder nu gennem det relationelle interface.</w:t>
+      </w:r>
+    </w:p>
+    <w:p>
+      <w:pPr>
+        <w:pStyle w:val="BodyText"/>
+      </w:pPr>
+      <w:r>
+        <w:t xml:space="preserve">Du mærker væskekroppens egenskaber nu aktive i det fælles felt. Simultan respons gennem flere forbundne systemer. The Neutral som fælles tilstand mellem behandler og klient. Automatic Shifting gennem det relationelle rum. Co-regulering som forstærker nervesystemets fleksibilitet. De embryologiske kræfter arbejder gennem relationen.</w:t>
+      </w:r>
+    </w:p>
+    <w:p>
+      <w:pPr>
+        <w:pStyle w:val="BodyText"/>
+      </w:pPr>
+      <w:r>
+        <w:rPr>
+          <w:bCs/>
+          <w:b/>
+        </w:rPr>
+        <w:t xml:space="preserve">Broen til det universelle</w:t>
+      </w:r>
+    </w:p>
+    <w:p>
+      <w:pPr>
+        <w:pStyle w:val="BodyText"/>
+      </w:pPr>
+      <w:r>
+        <w:t xml:space="preserve">Rum C’s relationelle felt peger naturligt mod noget større — mod det som rækker ud over det nære og kendte. Her forberedes overgangen til det universelle, til det som forbinder hele menneskeheden. Det instinktive og fælles-menneskelige begynder at vise sig gennem det relationelle.</w:t>
+      </w:r>
+    </w:p>
+    <w:p>
+      <w:pPr>
+        <w:pStyle w:val="BodyText"/>
+      </w:pPr>
+      <w:r>
+        <w:t xml:space="preserve">Dette er ikke længere kun familie og lokalt samfund, men forbindelsen til noget der transcenderer individuelle og lokale grænser. The Long Tide’s universelle bevægelse fornemmes i baggrunden — den kraft som forbinder alt levende på tværs af det individuelle og det nært relationelle. Rum D forberedes gennem erkendelsen af at vi er del af noget langt større.</w:t>
+      </w:r>
+    </w:p>
+    <w:p>
+      <w:pPr>
+        <w:pStyle w:val="BodyText"/>
+      </w:pPr>
+      <w:r>
+        <w:t xml:space="preserve">Du fornemmer det universelle der viser sig gennem det partikulære. Forbindelsen til menneskeheden som helhed. Det instinktive og arketypiske der lever i alle. The Long Tide’s tilstedeværelse i baggrunden. Det fælles på tværs af alle individuelle og relationelle grænser. Åbningen mod Rum D hvor det universelle felt dominerer.</w:t>
+      </w:r>
+    </w:p>
+    <w:p>
+      <w:pPr>
+        <w:pStyle w:val="BodyText"/>
+      </w:pPr>
+      <w:r>
+        <w:rPr>
+          <w:bCs/>
+          <w:b/>
+        </w:rPr>
+        <w:t xml:space="preserve">Som ét fælles rum</w:t>
+      </w:r>
+    </w:p>
+    <w:p>
+      <w:pPr>
+        <w:pStyle w:val="BodyText"/>
+      </w:pPr>
+      <w:r>
+        <w:t xml:space="preserve">Det relationelle felt er ét fælles rum der opstår når to systemer møder hinanden. Væskekroppens kvaliteter lever videre i co-reguleringens biologiske rytme, og åbningen mod det universelle peger naturligt videre — alt vibrerer samtidigt i hvert øjeblik af mødet, som tonaliteter af samme forbindelse snarere end lag der skal gennemleves. At vi er sociale væsener tilhører vores fysiologi — vores arv som pattedyr. Helingen sker ofte præcis her hvor to nervesystemer finder hinanden, og når vi hviler i det fælles rum, peger det af sig selv mod noget større — som en naturlig forlængelse af det nære, ikke som en flugt fra det.</w:t>
       </w:r>
     </w:p>
     <w:p>
@@ -14514,7 +14120,7 @@
           <w:iCs/>
           <w:i/>
         </w:rPr>
-        <w:t xml:space="preserve">Dynamisk Stilhed er ikke en højere bevidsthedstilstand eller et behandlings-mål. Den dukker op nogle gange uden at vi har planlagt det, og den lader sig ikke trænes. Det meste arbejde sker i Rum A til D, og det er som det skal være. Rum E er bonus, ikke mål.</w:t>
+        <w:t xml:space="preserve">Det relationelle felt er ikke metafor men biologi. Når to nervesystemer mødes uden trussel, opstår en målbar fælles regulering — det er det system der opstod blandt sociale pattedyr og som vi alle bærer. Vi bygger på en eksisterende neurobiologisk arkitektur, ikke på spirituel idé.</w:t>
       </w:r>
     </w:p>
     <w:p>
@@ -14526,7 +14132,7 @@
           <w:iCs/>
           <w:i/>
         </w:rPr>
-        <w:t xml:space="preserve">Når sproget rammer sin grænse i Rum E, bliver det fristende at gribe til store ord. Men ord er ord. De peger og svigter. Det vigtigste er ikke ordet vi vælger — kærlighed, mysteriet, nåde, tilstedeværelse — men at vi ikke forveksler ordet med fænomenet.</w:t>
+        <w:t xml:space="preserve">I det relationelle felt bliver behandleren også ændret. Det er ikke en énvejsbevægelse fra os til klienten. Vi mærker noget i os selv vågne i takt med klientens åbning. At anerkende dette uden at lade vores eget materiale fylde feltet er en daglig disciplin.</w:t>
       </w:r>
     </w:p>
     <w:p>
@@ -14538,7 +14144,711 @@
           <w:iCs/>
           <w:i/>
         </w:rPr>
+        <w:t xml:space="preserve">Når det relationelle felt overvælder klienten, er det ofte fordi det er længe siden de har været i et trygt felt. Selv det at føle sig set kan være krævende. Vores opgave er ikke at gå frem, men at give feltet plads og tid til at modne i sit eget tempo.</w:t>
+      </w:r>
+    </w:p>
+    <w:p>
+      <w:pPr>
+        <w:pStyle w:val="BodyText"/>
+      </w:pPr>
+      <w:r>
+        <w:rPr>
+          <w:iCs/>
+          <w:i/>
+        </w:rPr>
+        <w:t xml:space="preserve">I behandlingssituationen mærkes det relationelle felt ofte først som en ændret tilstedeværelse i rummet. Klienten og behandleren begynder at åndedrætte i en bestemt rytme uden at planlægge det. Hænderne mærker en bredere koherens. Noget tredje — som ingen af os bringer alene — opstår i samspillet.</w:t>
+      </w:r>
+    </w:p>
+    <w:p>
+      <w:pPr>
+        <w:pStyle w:val="BodyText"/>
+      </w:pPr>
+      <w:r>
+        <w:rPr>
+          <w:iCs/>
+          <w:i/>
+        </w:rPr>
+        <w:t xml:space="preserve">Det relationelle felts kvalitet varierer mellem behandlinger. Nogle gange er det stille og tilbagetrukket; andre gange aktivt og bevægeligt; andre gange ladet med følelser eller minder. Hver kvalitet er informativ om klientens aktuelle behov. Det er ikke noget vi vælger — det er noget der opstår mellem os.</w:t>
+      </w:r>
+    </w:p>
+    <w:p>
+      <w:pPr>
+        <w:pStyle w:val="BodyText"/>
+      </w:pPr>
+      <w:r>
+        <w:rPr>
+          <w:iCs/>
+          <w:i/>
+        </w:rPr>
+        <w:t xml:space="preserve">Når det relationelle felt er fuldt etableret, ophører rolle-skellet midlertidigt. Behandleren er ikke længere</w:t>
+      </w:r>
+      <w:r>
+        <w:rPr>
+          <w:iCs/>
+          <w:i/>
+        </w:rPr>
+        <w:t xml:space="preserve"> </w:t>
+      </w:r>
+      <w:r>
+        <w:rPr>
+          <w:iCs/>
+          <w:i/>
+        </w:rPr>
+        <w:t xml:space="preserve">‘</w:t>
+      </w:r>
+      <w:r>
+        <w:rPr>
+          <w:iCs/>
+          <w:i/>
+        </w:rPr>
+        <w:t xml:space="preserve">den der gør</w:t>
+      </w:r>
+      <w:r>
+        <w:rPr>
+          <w:iCs/>
+          <w:i/>
+        </w:rPr>
+        <w:t xml:space="preserve">’</w:t>
+      </w:r>
+      <w:r>
+        <w:rPr>
+          <w:iCs/>
+          <w:i/>
+        </w:rPr>
+        <w:t xml:space="preserve">; klienten er ikke længere</w:t>
+      </w:r>
+      <w:r>
+        <w:rPr>
+          <w:iCs/>
+          <w:i/>
+        </w:rPr>
+        <w:t xml:space="preserve"> </w:t>
+      </w:r>
+      <w:r>
+        <w:rPr>
+          <w:iCs/>
+          <w:i/>
+        </w:rPr>
+        <w:t xml:space="preserve">‘</w:t>
+      </w:r>
+      <w:r>
+        <w:rPr>
+          <w:iCs/>
+          <w:i/>
+        </w:rPr>
+        <w:t xml:space="preserve">den der modtager</w:t>
+      </w:r>
+      <w:r>
+        <w:rPr>
+          <w:iCs/>
+          <w:i/>
+        </w:rPr>
+        <w:t xml:space="preserve">’</w:t>
+      </w:r>
+      <w:r>
+        <w:rPr>
+          <w:iCs/>
+          <w:i/>
+        </w:rPr>
+        <w:t xml:space="preserve">. Begge er deltagere i et fælles felt. Det er sjældent vi taler om dette under behandlingen — det mærkes, det udfolder sig, det forsvinder igen.</w:t>
+      </w:r>
+    </w:p>
+    <w:p>
+      <w:pPr>
+        <w:pStyle w:val="BodyText"/>
+      </w:pPr>
+      <w:r>
+        <w:rPr>
+          <w:iCs/>
+          <w:i/>
+        </w:rPr>
+        <w:t xml:space="preserve">Rum C adskiller sig fra både Rum A og Rum B ved at involvere to nervesystemer i stedet for ét. Det er ikke længere klientens system alene der bærer behandlingen; det er feltet mellem os. Det stiller andre krav til behandleren — vi skal kunne være distinkte og åbne på samme tid.</w:t>
+      </w:r>
+    </w:p>
+    <w:p>
+      <w:pPr>
+        <w:pStyle w:val="BodyText"/>
+      </w:pPr>
+      <w:r>
+        <w:rPr>
+          <w:bCs/>
+          <w:b/>
+        </w:rPr>
+        <w:t xml:space="preserve">[REFLEKSIONSSPØRGSMÅL]</w:t>
+      </w:r>
+    </w:p>
+    <w:p>
+      <w:pPr>
+        <w:numPr>
+          <w:ilvl w:val="0"/>
+          <w:numId w:val="1059"/>
+        </w:numPr>
+      </w:pPr>
+      <w:r>
+        <w:t xml:space="preserve">Det fælles rum opstår — det laves ikke. Hvilke betingelser i dig selv inviterer det frem?</w:t>
+      </w:r>
+    </w:p>
+    <w:p>
+      <w:pPr>
+        <w:numPr>
+          <w:ilvl w:val="0"/>
+          <w:numId w:val="1059"/>
+        </w:numPr>
+      </w:pPr>
+      <w:r>
+        <w:t xml:space="preserve">Et andet menneskes regulering registreres ofte i kroppen før i hovedet. Hvor møder du den først?</w:t>
+      </w:r>
+    </w:p>
+    <w:p>
+      <w:pPr>
+        <w:numPr>
+          <w:ilvl w:val="0"/>
+          <w:numId w:val="1059"/>
+        </w:numPr>
+      </w:pPr>
+      <w:r>
+        <w:t xml:space="preserve">Når feltet selv heler — vidne, vært eller ledsager — hvilken position er sværest at hvile i?</w:t>
+      </w:r>
+    </w:p>
+    <w:p>
+      <w:pPr>
+        <w:pStyle w:val="FirstParagraph"/>
+      </w:pPr>
+      <w:r>
+        <w:rPr>
+          <w:bCs/>
+          <w:b/>
+        </w:rPr>
+        <w:t xml:space="preserve">[BRØDTEKST: Rum D — The Long Tide / Primary Respiration]</w:t>
+      </w:r>
+    </w:p>
+    <w:p>
+      <w:pPr>
+        <w:pStyle w:val="BodyText"/>
+      </w:pPr>
+      <w:r>
+        <w:rPr>
+          <w:iCs/>
+          <w:i/>
+        </w:rPr>
+        <w:t xml:space="preserve">Nu træder du ind i det universelle felt — hvor The Long Tide bevæger sig fra horisonten med sin dybe, langsomme rytme, bærende livets matrix og skabelonen for optimal funktion.</w:t>
+      </w:r>
+    </w:p>
+    <w:p>
+      <w:pPr>
+        <w:pStyle w:val="BodyText"/>
+      </w:pPr>
+      <w:r>
+        <w:rPr>
+          <w:bCs/>
+          <w:b/>
+        </w:rPr>
+        <w:t xml:space="preserve">The Long Tide som universelt felt</w:t>
+      </w:r>
+    </w:p>
+    <w:p>
+      <w:pPr>
+        <w:pStyle w:val="BodyText"/>
+      </w:pPr>
+      <w:r>
+        <w:t xml:space="preserve">Dette er Primary Respiration’s energetiske udtryk — den universelle bevægelse der kommer fra horisonten mod kroppens midtlinje med sin 100 sekunders cyklus. Her transcenderer vi det individuelle og det nært relationelle for at møde det som forbinder alt levende. The Long Tide bærer livets blueprint, den perfekte skabelon som aldrig mistes.</w:t>
+      </w:r>
+    </w:p>
+    <w:p>
+      <w:pPr>
+        <w:pStyle w:val="BodyText"/>
+      </w:pPr>
+      <w:r>
+        <w:t xml:space="preserve">I Rum D opleves direkte hvordan vi er del af noget langt større — ikke som idé men som levende erfaring. Det instinktive niveau aktiveres, millioner af års evolutionær visdom bliver tilgængelig. Dette er ikke enhed i den absolutte forstand som i Dynamisk Stilhed, men oplevelsen af at være forbundet med hele livets væv på tværs af alle grænser.</w:t>
+      </w:r>
+    </w:p>
+    <w:p>
+      <w:pPr>
+        <w:pStyle w:val="BodyText"/>
+      </w:pPr>
+      <w:r>
+        <w:t xml:space="preserve">Du oplever 100 sekunders cyklus — 6 cyklusser hver 10. minut. Bevægelse fra horisonten til midtlinjen som bærer livets matrix. Det universelle der transcenderer det individuelle og relationelle. Instinktiv erkendelse og urgammel visdom bliver tilgængelig. Forbindelse med hele menneskeheden og alt levende. Primary Respiration som organiserende kraft for al heling.</w:t>
+      </w:r>
+    </w:p>
+    <w:p>
+      <w:pPr>
+        <w:pStyle w:val="BodyText"/>
+      </w:pPr>
+      <w:r>
+        <w:rPr>
+          <w:bCs/>
+          <w:b/>
+        </w:rPr>
+        <w:t xml:space="preserve">Det relationelle felt integreret</w:t>
+      </w:r>
+    </w:p>
+    <w:p>
+      <w:pPr>
+        <w:pStyle w:val="BodyText"/>
+      </w:pPr>
+      <w:r>
+        <w:t xml:space="preserve">Rum D inkluderer og transcenderer Rum C’s relationelle kvaliteter. Det terapeutiske rum mellem behandler og klient bliver nu del af et større felt. Co-reguleringen udvides fra det nære til det universelle — vi regulerer ikke kun med hinanden men med livets egen rytme.</w:t>
+      </w:r>
+    </w:p>
+    <w:p>
+      <w:pPr>
+        <w:pStyle w:val="BodyText"/>
+      </w:pPr>
+      <w:r>
+        <w:t xml:space="preserve">Familien, venskaberne, det nære samfund fra Rum C er stadig til stede men nu som aspekter af noget større. The Long Tide organiserer alle de relationelle felter, forbinder dem i én samlet bevægelse. De embryologiske kræfter arbejder nu ikke kun gennem individet eller relationen men gennem hele det universelle felt.</w:t>
+      </w:r>
+    </w:p>
+    <w:p>
+      <w:pPr>
+        <w:pStyle w:val="BodyText"/>
+      </w:pPr>
+      <w:r>
+        <w:t xml:space="preserve">Du mærker Rum C’s relationelle felt nu båret af The Long Tide. Co-regulering udvides til universel synkronisering. Det nære samfund som del af hele menneskeheden. Alle individuelle og relationelle processer organiseret af én rytme. De embryologiske kræfter arbejder gennem det universelle. Integration af alle tidligere zoner i én samlet bevægelse.</w:t>
+      </w:r>
+    </w:p>
+    <w:p>
+      <w:pPr>
+        <w:pStyle w:val="BodyText"/>
+      </w:pPr>
+      <w:r>
+        <w:rPr>
+          <w:bCs/>
+          <w:b/>
+        </w:rPr>
+        <w:t xml:space="preserve">Porten til Dynamisk Stilhed</w:t>
+      </w:r>
+    </w:p>
+    <w:p>
+      <w:pPr>
+        <w:pStyle w:val="BodyText"/>
+      </w:pPr>
+      <w:r>
+        <w:t xml:space="preserve">I Rum D forberedes det ultimative møde med livets oprindelse. The Long Tide’s bevægelse peger naturligt mod sin egen kilde — Dynamisk Stilhed. I øjeblikke af fuldstændig synkronisering og overgivelse kan grænsen mellem bevægelse og stilhed blive gennemsigtig.</w:t>
+      </w:r>
+    </w:p>
+    <w:p>
+      <w:pPr>
+        <w:pStyle w:val="BodyText"/>
+      </w:pPr>
+      <w:r>
+        <w:t xml:space="preserve">Her fornemmes at selv The Long Tide udspringer fra noget dybere — det umanifesterede potentiale, livets arnested. Rum E’s kvaliteter begynder at vise sig som mulighed — ikke som noget vi kan gribe men som nådens potentiale. Paradokset hvor al bevægelse udspringer fra stilhed bliver til levende erfaring.</w:t>
+      </w:r>
+    </w:p>
+    <w:p>
+      <w:pPr>
+        <w:pStyle w:val="BodyText"/>
+      </w:pPr>
+      <w:r>
+        <w:t xml:space="preserve">Du fornemmer Dynamisk Stilhed som The Long Tide’s oprindelse. Porten til det umanifesterede potentiale. Bevægelse og stilhed som to aspekter af samme virkelighed. Muligheden for øjeblikkelig transmutation. Nådens potentiale der venter uden for viljen. Forberedelsen til Rum E’s paradoksale virkelighed.</w:t>
+      </w:r>
+    </w:p>
+    <w:p>
+      <w:pPr>
+        <w:pStyle w:val="BodyText"/>
+      </w:pPr>
+      <w:r>
+        <w:rPr>
+          <w:bCs/>
+          <w:b/>
+        </w:rPr>
+        <w:t xml:space="preserve">Som ét universelt felt</w:t>
+      </w:r>
+    </w:p>
+    <w:p>
+      <w:pPr>
+        <w:pStyle w:val="BodyText"/>
+      </w:pPr>
+      <w:r>
+        <w:t xml:space="preserve">The Long Tide er ét universelt felt der bevæger sig fra horisonten gennem alt vi rører ved. Det relationelle bæres med ind i en dybere rytme, og porten mod Dynamisk Stilhed begynder at vise sig — én kraft der altid har været til stede, ikke et hierarki af lag men aspekter af samme bevægelse. Vi mærker den nu fordi betingelserne har samlet sig — fordi sansningen er blevet stille nok til at horisonten kan høres. Når vi bliver bevæget af den, opdager vi at vi aldrig var adskilt fra livets store rytme; vi har bare manglet den ro der skal til for at lade den nå os.</w:t>
+      </w:r>
+    </w:p>
+    <w:p>
+      <w:pPr>
+        <w:pStyle w:val="BodyText"/>
+      </w:pPr>
+      <w:r>
+        <w:rPr>
+          <w:bCs/>
+          <w:b/>
+        </w:rPr>
+        <w:t xml:space="preserve">[INSPIRATION — nye vinkler at overveje]</w:t>
+      </w:r>
+    </w:p>
+    <w:p>
+      <w:pPr>
+        <w:pStyle w:val="BodyText"/>
+      </w:pPr>
+      <w:r>
+        <w:rPr>
+          <w:iCs/>
+          <w:i/>
+        </w:rPr>
+        <w:t xml:space="preserve">De 100 sekunder er ikke en målbar konstant. Cyklusserne kommer i et bredere spektrum — nogle gange 80, nogle gange 120 — og varierer fra klient til klient og fra øjeblik til øjeblik. Tallet er en pejling, ikke en definition. Hvad vi lytter til er rytmens natur, ikke dens præcision.</w:t>
+      </w:r>
+    </w:p>
+    <w:p>
+      <w:pPr>
+        <w:pStyle w:val="BodyText"/>
+      </w:pPr>
+      <w:r>
+        <w:rPr>
+          <w:iCs/>
+          <w:i/>
+        </w:rPr>
+        <w:t xml:space="preserve">Læringen af at mærke Long Tide sker ikke gennem instruktion. Det sker oftest ved at sidde sammen med en mere erfaren behandler ved den samme klient — over tid genkender hænderne det andre hænder allerede mærker. Det er en mundtlig tradition, ikke en målbar færdighed.</w:t>
+      </w:r>
+    </w:p>
+    <w:p>
+      <w:pPr>
+        <w:pStyle w:val="BodyText"/>
+      </w:pPr>
+      <w:r>
+        <w:rPr>
+          <w:iCs/>
+          <w:i/>
+        </w:rPr>
+        <w:t xml:space="preserve">En vanskelig erkendelse: nogle gange tror vi at mærke Long Tide, men det er noget andet — en intern rytme i os selv, en forventning, en forestilling om hvordan det skal føles. At kunne skelne mellem det indre billede og den faktiske oplevelse er en del af modningen.</w:t>
+      </w:r>
+    </w:p>
+    <w:p>
+      <w:pPr>
+        <w:pStyle w:val="BodyText"/>
+      </w:pPr>
+      <w:r>
+        <w:rPr>
+          <w:iCs/>
+          <w:i/>
+        </w:rPr>
+        <w:t xml:space="preserve">I behandlingssituationen kommer Long Tide sjældent som det første rum vi besøger. Den åbner sig oftest mod slutningen af en behandling, efter de andre rum har gjort deres arbejde. Hænderne mærker en udvidelse af opmærksomheden — fra kroppen til rummet til horisonten. Det er en perception der udvikler sig over tid.</w:t>
+      </w:r>
+    </w:p>
+    <w:p>
+      <w:pPr>
+        <w:pStyle w:val="BodyText"/>
+      </w:pPr>
+      <w:r>
+        <w:rPr>
+          <w:iCs/>
+          <w:i/>
+        </w:rPr>
+        <w:t xml:space="preserve">Forskellige klienter oplever Long Tide forskelligt. Nogle mærker den som en stor bølgende bevægelse; andre som en stille ankring; andre igen som en udvidelse af kroppens grænser. Disse beskrivelser hjælper os ikke med at validere eller invalidere — de er bare informative om hvordan klientens system er åbent for det universelle.</w:t>
+      </w:r>
+    </w:p>
+    <w:p>
+      <w:pPr>
+        <w:pStyle w:val="BodyText"/>
+      </w:pPr>
+      <w:r>
+        <w:rPr>
+          <w:iCs/>
+          <w:i/>
+        </w:rPr>
+        <w:t xml:space="preserve">Når Long Tide er stærk og koherent, opleves hele behandlingen som båret af noget større. Hænderne behøver næsten ikke gøre noget; klienten falder dybere af sig selv; tiden mister sit tempo. Det er en kvalitet der adskiller sig markant fra arbejdet i de andre rum — bredere, langsommere, mere altomfattende.</w:t>
+      </w:r>
+    </w:p>
+    <w:p>
+      <w:pPr>
+        <w:pStyle w:val="BodyText"/>
+      </w:pPr>
+      <w:r>
+        <w:rPr>
+          <w:iCs/>
+          <w:i/>
+        </w:rPr>
+        <w:t xml:space="preserve">Long Tide forbinder den enkelte organisme med noget større — det universelle felt af Primary Respiration. Det er ikke metafor: rytmen er den samme der bevæger sig gennem hele biosfæren. At mærke den er at mærke at klientens organisme aldrig var separat fra livets samlede åndedrag, kun en lokalisering af det.</w:t>
+      </w:r>
+    </w:p>
+    <w:p>
+      <w:pPr>
+        <w:pStyle w:val="BodyText"/>
+      </w:pPr>
+      <w:r>
+        <w:rPr>
+          <w:bCs/>
+          <w:b/>
+        </w:rPr>
+        <w:t xml:space="preserve">[REFLEKSIONSSPØRGSMÅL]</w:t>
+      </w:r>
+    </w:p>
+    <w:p>
+      <w:pPr>
+        <w:numPr>
+          <w:ilvl w:val="0"/>
+          <w:numId w:val="1060"/>
+        </w:numPr>
+      </w:pPr>
+      <w:r>
+        <w:t xml:space="preserve">Hvad sker der i et arbejde når du holder op med at lede efter The Long Tide og lader den finde dig?</w:t>
+      </w:r>
+    </w:p>
+    <w:p>
+      <w:pPr>
+        <w:numPr>
+          <w:ilvl w:val="0"/>
+          <w:numId w:val="1060"/>
+        </w:numPr>
+      </w:pPr>
+      <w:r>
+        <w:t xml:space="preserve">Roen der gør Long Tide hørbar er ikke teknik. Hvad i dit liv lige nu hjælper den ro frem, og hvad afskærmer den?</w:t>
+      </w:r>
+    </w:p>
+    <w:p>
+      <w:pPr>
+        <w:numPr>
+          <w:ilvl w:val="0"/>
+          <w:numId w:val="1060"/>
+        </w:numPr>
+      </w:pPr>
+      <w:r>
+        <w:t xml:space="preserve">Mellem at observere og at blive bevæget findes en fin skift. Beskriv øjeblikket — eller dets fravær — fra dit seneste klient-arbejde.</w:t>
+      </w:r>
+    </w:p>
+    <w:p>
+      <w:pPr>
+        <w:pStyle w:val="FirstParagraph"/>
+      </w:pPr>
+      <w:r>
+        <w:rPr>
+          <w:bCs/>
+          <w:b/>
+        </w:rPr>
+        <w:t xml:space="preserve">[BRØDTEKST: Rum E — Dynamisk Stilhed]</w:t>
+      </w:r>
+    </w:p>
+    <w:p>
+      <w:pPr>
+        <w:pStyle w:val="BodyText"/>
+      </w:pPr>
+      <w:r>
+        <w:rPr>
+          <w:iCs/>
+          <w:i/>
+        </w:rPr>
+        <w:t xml:space="preserve">I sjældne øjeblikke af nåde træder du ind i Dynamisk Stilhed — paradoksernes verden hvor fuldstændig stilstand indeholder al bevægelse, hvor du er syg det ene øjeblik og det næste er det væk.</w:t>
+      </w:r>
+    </w:p>
+    <w:p>
+      <w:pPr>
+        <w:pStyle w:val="BodyText"/>
+      </w:pPr>
+      <w:r>
+        <w:rPr>
+          <w:bCs/>
+          <w:b/>
+        </w:rPr>
+        <w:t xml:space="preserve">Dynamisk Stilhed som livets arnested</w:t>
+      </w:r>
+    </w:p>
+    <w:p>
+      <w:pPr>
+        <w:pStyle w:val="BodyText"/>
+      </w:pPr>
+      <w:r>
+        <w:t xml:space="preserve">Her er kilden hvorfra alt udspringer — det umanifesterede potentiale der indeholder skabelonen til selve livet. Ikke tom stilhed men et levende felt af rent potentiale. Dette er verdenen af transsubstantiation, hvor heling sker på måder der transcenderer vores forståelse. Midtlinjens essens viser sig at være dynamisk stilhed selv — punktet hvorfra al bevægelse udspringer og vender tilbage til.</w:t>
+      </w:r>
+    </w:p>
+    <w:p>
+      <w:pPr>
+        <w:pStyle w:val="BodyText"/>
+      </w:pPr>
+      <w:r>
+        <w:t xml:space="preserve">I Rum E opleves direkte at blive skabt af livet selv i det levende øjeblik. Breath of Life viser sig som den potente ild der bærer livskraften fra stilheden ud i manifestation. Her mødes paradokserne — adskillelse og enhed erfaret samtidigt, stilstand som indeholder al bevægelse, det øjeblikkelige som rummer evigheden.</w:t>
+      </w:r>
+    </w:p>
+    <w:p>
+      <w:pPr>
+        <w:pStyle w:val="BodyText"/>
+      </w:pPr>
+      <w:r>
+        <w:t xml:space="preserve">Du oplever livets arnested — kilden til alt manifesteret og umanifesteret. Blueprint for al sundhed i sin rene form. Paradokset hvor stilstand indeholder al bevægelse. Verdenen af øjeblikkelig transmutation. Oplevelsen af at blive skabt øjeblik for øjeblik. Midtlinjens essens som dynamisk stilhed.</w:t>
+      </w:r>
+    </w:p>
+    <w:p>
+      <w:pPr>
+        <w:pStyle w:val="BodyText"/>
+      </w:pPr>
+      <w:r>
+        <w:rPr>
+          <w:bCs/>
+          <w:b/>
+        </w:rPr>
+        <w:t xml:space="preserve">The Long Tide og Primary Respiration</w:t>
+      </w:r>
+    </w:p>
+    <w:p>
+      <w:pPr>
+        <w:pStyle w:val="BodyText"/>
+      </w:pPr>
+      <w:r>
+        <w:t xml:space="preserve">Dynamisk Stilhed manifesterer sig gennem Rum D’s The Long Tide. Dette er det første nedkog fra stilheden — hvor det umanifesterede begynder at udtrykke sig i bevægelse og rytme. The Long Tide viser sig at være Breath of Life’s første udtryk, den kaleidoskopiske energi der bærer livets potentiale ud i verden.</w:t>
+      </w:r>
+    </w:p>
+    <w:p>
+      <w:pPr>
+        <w:pStyle w:val="BodyText"/>
+      </w:pPr>
+      <w:r>
+        <w:t xml:space="preserve">Alle tidligere zoner — det fysiske, væskekroppen, det relationelle, det universelle — viser sig at udspringe fra denne ene kilde. Primary Respiration er stilhedens åndedræt, den bevægelse som opstår fra det ubevægelige. De embryologiske kræfters ultimative oprindelse åbenbares som denne dynamiske stilhed.</w:t>
+      </w:r>
+    </w:p>
+    <w:p>
+      <w:pPr>
+        <w:pStyle w:val="BodyText"/>
+      </w:pPr>
+      <w:r>
+        <w:t xml:space="preserve">Du mærker Breath of Life som første manifestation fra stilheden. The Long Tide som udtryk for stilhedens bevægelse. Primary Respiration’s oprindelse i det ubevægelige. Alle zoners ultimative kilde i én stilhed. Forbindelsen mellem stilhed og bevægelse som én realitet. De embryologiske kræfters udspring fra det umanifesterede.</w:t>
+      </w:r>
+    </w:p>
+    <w:p>
+      <w:pPr>
+        <w:pStyle w:val="BodyText"/>
+      </w:pPr>
+      <w:r>
+        <w:rPr>
+          <w:bCs/>
+          <w:b/>
+        </w:rPr>
+        <w:t xml:space="preserve">Kærlighed og mysteriet</w:t>
+      </w:r>
+    </w:p>
+    <w:p>
+      <w:pPr>
+        <w:pStyle w:val="BodyText"/>
+      </w:pPr>
+      <w:r>
+        <w:t xml:space="preserve">Fra Dynamisk Stilhed åbner sig det som ligger hinsides alle zoner — det vi ikke har ord for. Her møder vi havet af kærlighed, den ubetingede accept som livet har for alt skabt. Dette er ikke noget vi kan gribe eller forstå, kun modtage gennem nåde.</w:t>
+      </w:r>
+    </w:p>
+    <w:p>
+      <w:pPr>
+        <w:pStyle w:val="BodyText"/>
+      </w:pPr>
+      <w:r>
+        <w:t xml:space="preserve">Mysteriet viser sig ikke som noget der skal løses men som selve livets essens — det evigt ukendte som alligevel kender os fuldstændigt. Den kærlighed vi møder her er ikke følelse men selve den kraft der holder alt sammen, der tillader alt at eksistere præcis som det er. Her opleves at vi aldrig har været adskilt, at adskillelsen var illusionen.</w:t>
+      </w:r>
+    </w:p>
+    <w:p>
+      <w:pPr>
+        <w:pStyle w:val="BodyText"/>
+      </w:pPr>
+      <w:r>
+        <w:t xml:space="preserve">Du fornemmer havet af ubetinget kærlighed. Mysteriet som ikke kan gribes kun modtages. Erkendelsen af aldrig at have været adskilt. Kærligheden som selve livets sammenholdskraft. Det som ligger hinsides ord og forståelse. Nåden som den eneste vej ind.</w:t>
+      </w:r>
+    </w:p>
+    <w:p>
+      <w:pPr>
+        <w:pStyle w:val="BodyText"/>
+      </w:pPr>
+      <w:r>
+        <w:rPr>
+          <w:bCs/>
+          <w:b/>
+        </w:rPr>
+        <w:t xml:space="preserve">Som ét umanifesteret felt</w:t>
+      </w:r>
+    </w:p>
+    <w:p>
+      <w:pPr>
+        <w:pStyle w:val="BodyText"/>
+      </w:pPr>
+      <w:r>
+        <w:t xml:space="preserve">Dynamisk Stilhed er ét umanifesteret felt der hverken kan gribes eller forklares — kun mødes. The Long Tides oprindelse og det vi kalder kærlighed er samme virkelighed set fra forskellige vinkler, og når vores ord her begynder at blive upræcise, er det fordi mysteriet og nåden er det eneste sprog der er tilbage. Adskillelsen mellem behandler og klient opløses sammen med adskillelsen mellem stilstand og bevægelse — tilbage er den rene tilstedeværelse hvor heling ikke længere er noget der gøres, men noget der er. Hvis Rum A var hvor vores hænder først mødte kroppen, er Rum E hvor kroppen og hænderne aldrig var adskilt fra livets oprindelse.</w:t>
+      </w:r>
+    </w:p>
+    <w:p>
+      <w:pPr>
+        <w:pStyle w:val="BodyText"/>
+      </w:pPr>
+      <w:r>
+        <w:rPr>
+          <w:bCs/>
+          <w:b/>
+        </w:rPr>
+        <w:t xml:space="preserve">[INSPIRATION — nye vinkler at overveje]</w:t>
+      </w:r>
+    </w:p>
+    <w:p>
+      <w:pPr>
+        <w:pStyle w:val="BodyText"/>
+      </w:pPr>
+      <w:r>
+        <w:rPr>
+          <w:iCs/>
+          <w:i/>
+        </w:rPr>
+        <w:t xml:space="preserve">Dynamisk Stilhed er ikke en højere bevidsthedstilstand eller et behandlings-mål. Den dukker op nogle gange uden at vi har planlagt det, og den lader sig ikke trænes. Det meste arbejde sker i Rum A til D, og det er som det skal være. Rum E er bonus, ikke mål.</w:t>
+      </w:r>
+    </w:p>
+    <w:p>
+      <w:pPr>
+        <w:pStyle w:val="BodyText"/>
+      </w:pPr>
+      <w:r>
+        <w:rPr>
+          <w:iCs/>
+          <w:i/>
+        </w:rPr>
+        <w:t xml:space="preserve">Når sproget rammer sin grænse i Rum E, bliver det fristende at gribe til store ord. Men ord er ord. De peger og svigter. Det vigtigste er ikke ordet vi vælger — kærlighed, mysteriet, nåde, tilstedeværelse — men at vi ikke forveksler ordet med fænomenet.</w:t>
+      </w:r>
+    </w:p>
+    <w:p>
+      <w:pPr>
+        <w:pStyle w:val="BodyText"/>
+      </w:pPr>
+      <w:r>
+        <w:rPr>
+          <w:iCs/>
+          <w:i/>
+        </w:rPr>
         <w:t xml:space="preserve">Rum E er det rum der har været til stede under alle de andre. Da vi i Rum A mærkede vævets historie, var stilheden allerede der. Den dukker bare ikke altid op i forgrunden. Når den gør, er det som om noget kort har ladet sig se af sig selv.</w:t>
+      </w:r>
+    </w:p>
+    <w:p>
+      <w:pPr>
+        <w:pStyle w:val="BodyText"/>
+      </w:pPr>
+      <w:r>
+        <w:rPr>
+          <w:iCs/>
+          <w:i/>
+        </w:rPr>
+        <w:t xml:space="preserve">I behandlingssituationen viser Dynamisk Stilhed sig sjældent på vores invitation. Den dukker op når alle de andre rum har gjort deres arbejde — eller indimellem helt uden den foregående proces. Hænderne mærker en samlet stilhed der ikke er fravær men en kvalitet der bærer alt det øvrige.</w:t>
+      </w:r>
+    </w:p>
+    <w:p>
+      <w:pPr>
+        <w:pStyle w:val="BodyText"/>
+      </w:pPr>
+      <w:r>
+        <w:rPr>
+          <w:iCs/>
+          <w:i/>
+        </w:rPr>
+        <w:t xml:space="preserve">Klienter beskriver mødet med Dynamisk Stilhed forskelligt. Nogle som dyb hvile; andre som klarhed; andre som genkendelse af noget de altid har vidst. Beskrivelserne varierer, men den fælles kvalitet er at noget hviler i sig selv — uden at klienten føler sig adskilt fra det.</w:t>
+      </w:r>
+    </w:p>
+    <w:p>
+      <w:pPr>
+        <w:pStyle w:val="BodyText"/>
+      </w:pPr>
+      <w:r>
+        <w:rPr>
+          <w:iCs/>
+          <w:i/>
+        </w:rPr>
+        <w:t xml:space="preserve">Effekterne af Dynamisk Stilhed kan vare længe efter behandlingen. Klienter rapporterer ofte en undertone af ro de næste dage eller uger — som om noget har genfundet sin baseline. Det er ikke en effekt vi har skabt; det er en kvalitet der har fået plads til at vise sig.</w:t>
+      </w:r>
+    </w:p>
+    <w:p>
+      <w:pPr>
+        <w:pStyle w:val="BodyText"/>
+      </w:pPr>
+      <w:r>
+        <w:rPr>
+          <w:iCs/>
+          <w:i/>
+        </w:rPr>
+        <w:t xml:space="preserve">Dynamisk Stilhed er det rum hvori alle de andre rum hviler. Den er ikke et af de fem — den er den baggrund de fire andre udfolder sig på. Rum A til D har deres egne kvaliteter, men de bæres alle af stilheden. At mærke den er at mærke det grundlag al behandling allerede står på.</w:t>
       </w:r>
     </w:p>
     <w:p>

</xml_diff>

<commit_message>
Redigerbart udkast: 7 inspirations-paragraffer pr. stadie 1-5
</commit_message>
<xml_diff>
--- a/tools/output/manuskript-redigerbar.docx
+++ b/tools/output/manuskript-redigerbar.docx
@@ -16574,6 +16574,144 @@
           <w:bCs/>
           <w:b/>
         </w:rPr>
+        <w:t xml:space="preserve">[INSPIRATION — nye vinkler at overveje]</w:t>
+      </w:r>
+    </w:p>
+    <w:p>
+      <w:pPr>
+        <w:pStyle w:val="BodyText"/>
+      </w:pPr>
+      <w:r>
+        <w:rPr>
+          <w:iCs/>
+          <w:i/>
+        </w:rPr>
+        <w:t xml:space="preserve">Det første stadie mærkes ofte som en kropslig anspændthed — skulderne sidder oppe, nakken er stiv, åndedrættet er overfladisk. Vi forsøger at forstå med hovedet og mister kontakten med hænderne. Oplevelsen af at</w:t>
+      </w:r>
+      <w:r>
+        <w:rPr>
+          <w:iCs/>
+          <w:i/>
+        </w:rPr>
+        <w:t xml:space="preserve"> </w:t>
+      </w:r>
+      <w:r>
+        <w:rPr>
+          <w:iCs/>
+          <w:i/>
+        </w:rPr>
+        <w:t xml:space="preserve">‘</w:t>
+      </w:r>
+      <w:r>
+        <w:rPr>
+          <w:iCs/>
+          <w:i/>
+        </w:rPr>
+        <w:t xml:space="preserve">gøre det rigtigt</w:t>
+      </w:r>
+      <w:r>
+        <w:rPr>
+          <w:iCs/>
+          <w:i/>
+        </w:rPr>
+        <w:t xml:space="preserve">’</w:t>
+      </w:r>
+      <w:r>
+        <w:rPr>
+          <w:iCs/>
+          <w:i/>
+        </w:rPr>
+        <w:t xml:space="preserve"> </w:t>
+      </w:r>
+      <w:r>
+        <w:rPr>
+          <w:iCs/>
+          <w:i/>
+        </w:rPr>
+        <w:t xml:space="preserve">presser sig ind i hver eneste behandling vi giver.</w:t>
+      </w:r>
+    </w:p>
+    <w:p>
+      <w:pPr>
+        <w:pStyle w:val="BodyText"/>
+      </w:pPr>
+      <w:r>
+        <w:rPr>
+          <w:iCs/>
+          <w:i/>
+        </w:rPr>
+        <w:t xml:space="preserve">Behandlere i første stadie har ofte en oplevelse af at svinge mellem dage med klarhed og dage med tvivl. Den ene dag mærker vi alt med sikkerhed; næste dag føles hænderne fremmede. Disse svingninger er ikke tegn på inkompetence — de er tegn på at sansningen endnu ikke har fundet sin baseline.</w:t>
+      </w:r>
+    </w:p>
+    <w:p>
+      <w:pPr>
+        <w:pStyle w:val="BodyText"/>
+      </w:pPr>
+      <w:r>
+        <w:rPr>
+          <w:iCs/>
+          <w:i/>
+        </w:rPr>
+        <w:t xml:space="preserve">I første stadie bruger vi mange teknikker. Hver klagepunkt får sin egen tilgang, hver behandling sin egen plan. Det er ikke en fejl — det er en nødvendig fase af læringen. Det er gennem teknikkernes mangfoldighed at vi senere bliver i stand til at slippe dem og bare være til stede.</w:t>
+      </w:r>
+    </w:p>
+    <w:p>
+      <w:pPr>
+        <w:pStyle w:val="BodyText"/>
+      </w:pPr>
+      <w:r>
+        <w:rPr>
+          <w:iCs/>
+          <w:i/>
+        </w:rPr>
+        <w:t xml:space="preserve">Overgangen fra første til andet stadie viser sig ofte som tøvende pauser i den mentale aktivitet. Mens vi behandler, opstår der pludselig et mellemrum — vi havde en plan, og så blev den væk. I begyndelsen er det skræmmende; senere bliver det det vi venter på.</w:t>
+      </w:r>
+    </w:p>
+    <w:p>
+      <w:pPr>
+        <w:pStyle w:val="BodyText"/>
+      </w:pPr>
+      <w:r>
+        <w:rPr>
+          <w:iCs/>
+          <w:i/>
+        </w:rPr>
+        <w:t xml:space="preserve">Første stadie er ikke noget vi vokser fra — det er noget vi vokser igennem. Hver ny behandlingsstil, hvert nyt fagligt område, hver gang vi møder en klient med en ny problemstilling, kan vi befinde os i første stadie igen. Det er ikke regression. Det er den dybde læring kræver.</w:t>
+      </w:r>
+    </w:p>
+    <w:p>
+      <w:pPr>
+        <w:pStyle w:val="BodyText"/>
+      </w:pPr>
+      <w:r>
+        <w:rPr>
+          <w:iCs/>
+          <w:i/>
+        </w:rPr>
+        <w:t xml:space="preserve">Selv erfarne behandlere genkender første stadie hos sig selv på særligt udfordrende dage. Når vi er trætte, presset, eller møder noget der overrasker os, kan tankestrømmen vende tilbage. At kunne genkende det uden at dømme os selv er en del af det at være i stadiet uden at være fanget i det.</w:t>
+      </w:r>
+    </w:p>
+    <w:p>
+      <w:pPr>
+        <w:pStyle w:val="BodyText"/>
+      </w:pPr>
+      <w:r>
+        <w:rPr>
+          <w:iCs/>
+          <w:i/>
+        </w:rPr>
+        <w:t xml:space="preserve">Første stadie giver fundamentet. Det vi lærer her — anatomi, teknik, faglig orientering — bliver det ankerpunkt vi senere kan slippe fra. Uden første stadies disciplinerede arbejde har de senere stadier ikke noget at hvile på. Den intense søgen er ikke uden formål; den bygger den substans hvorfra slipperne kan blive bæredygtige.</w:t>
+      </w:r>
+    </w:p>
+    <w:p>
+      <w:pPr>
+        <w:pStyle w:val="BodyText"/>
+      </w:pPr>
+      <w:r>
+        <w:rPr>
+          <w:bCs/>
+          <w:b/>
+        </w:rPr>
         <w:t xml:space="preserve">[REFLEKSIONSSPØRGSMÅL]</w:t>
       </w:r>
     </w:p>
@@ -17199,6 +17337,270 @@
           <w:bCs/>
           <w:b/>
         </w:rPr>
+        <w:t xml:space="preserve">[INSPIRATION — nye vinkler at overveje]</w:t>
+      </w:r>
+    </w:p>
+    <w:p>
+      <w:pPr>
+        <w:pStyle w:val="BodyText"/>
+      </w:pPr>
+      <w:r>
+        <w:rPr>
+          <w:iCs/>
+          <w:i/>
+        </w:rPr>
+        <w:t xml:space="preserve">I andet stadie begynder vi at mærke væske-kvaliteter i hænderne. Vævet er ikke længere kun fast og lokalt — der er noget der bevæger sig som én sammenhængende strøm. Det første tegn er ofte en uventet</w:t>
+      </w:r>
+      <w:r>
+        <w:rPr>
+          <w:iCs/>
+          <w:i/>
+        </w:rPr>
+        <w:t xml:space="preserve"> </w:t>
+      </w:r>
+      <w:r>
+        <w:rPr>
+          <w:iCs/>
+          <w:i/>
+        </w:rPr>
+        <w:t xml:space="preserve">‘</w:t>
+      </w:r>
+      <w:r>
+        <w:rPr>
+          <w:iCs/>
+          <w:i/>
+        </w:rPr>
+        <w:t xml:space="preserve">fugtighed</w:t>
+      </w:r>
+      <w:r>
+        <w:rPr>
+          <w:iCs/>
+          <w:i/>
+        </w:rPr>
+        <w:t xml:space="preserve">’</w:t>
+      </w:r>
+      <w:r>
+        <w:rPr>
+          <w:iCs/>
+          <w:i/>
+        </w:rPr>
+        <w:t xml:space="preserve"> </w:t>
+      </w:r>
+      <w:r>
+        <w:rPr>
+          <w:iCs/>
+          <w:i/>
+        </w:rPr>
+        <w:t xml:space="preserve">eller</w:t>
+      </w:r>
+      <w:r>
+        <w:rPr>
+          <w:iCs/>
+          <w:i/>
+        </w:rPr>
+        <w:t xml:space="preserve"> </w:t>
+      </w:r>
+      <w:r>
+        <w:rPr>
+          <w:iCs/>
+          <w:i/>
+        </w:rPr>
+        <w:t xml:space="preserve">‘</w:t>
+      </w:r>
+      <w:r>
+        <w:rPr>
+          <w:iCs/>
+          <w:i/>
+        </w:rPr>
+        <w:t xml:space="preserve">flydenhed</w:t>
+      </w:r>
+      <w:r>
+        <w:rPr>
+          <w:iCs/>
+          <w:i/>
+        </w:rPr>
+        <w:t xml:space="preserve">’</w:t>
+      </w:r>
+      <w:r>
+        <w:rPr>
+          <w:iCs/>
+          <w:i/>
+        </w:rPr>
+        <w:t xml:space="preserve"> </w:t>
+      </w:r>
+      <w:r>
+        <w:rPr>
+          <w:iCs/>
+          <w:i/>
+        </w:rPr>
+        <w:t xml:space="preserve">under fingerspidserne, hvor vi før kun mærkede struktur.</w:t>
+      </w:r>
+    </w:p>
+    <w:p>
+      <w:pPr>
+        <w:pStyle w:val="BodyText"/>
+      </w:pPr>
+      <w:r>
+        <w:rPr>
+          <w:iCs/>
+          <w:i/>
+        </w:rPr>
+        <w:t xml:space="preserve">Pauserne i den mentale aktivitet bliver mere stabile. Vi kan sidde ved en klient i flere minutter uden at planlægge eller analysere. I stedet er der bare en lytten. Det føles ofte uvant i begyndelsen — som om noget mangler — men over tid bliver det den tilstand vi længes efter at vende tilbage til.</w:t>
+      </w:r>
+    </w:p>
+    <w:p>
+      <w:pPr>
+        <w:pStyle w:val="BodyText"/>
+      </w:pPr>
+      <w:r>
+        <w:rPr>
+          <w:iCs/>
+          <w:i/>
+        </w:rPr>
+        <w:t xml:space="preserve">I andet stadie begynder Primary Respiration at træde frem. Den er der ikke som en idé længere — den er der som en faktisk perception. Hænderne registrerer en langsom rytme der ikke følger åndedrættet eller hjerteslaget. Først som en svag fornemmelse; senere som en tydelig bæren.</w:t>
+      </w:r>
+    </w:p>
+    <w:p>
+      <w:pPr>
+        <w:pStyle w:val="BodyText"/>
+      </w:pPr>
+      <w:r>
+        <w:rPr>
+          <w:iCs/>
+          <w:i/>
+        </w:rPr>
+        <w:t xml:space="preserve">Behandlinger i andet stadie bliver mindre tekniske og mere lyttende. Vi har stadig vores faglige redskaber, men de bruges sjældnere. I stedet bliver vores grundholdning at vente på det systemet selv vil. Det er ofte i denne fase at klienter rapporterer</w:t>
+      </w:r>
+      <w:r>
+        <w:rPr>
+          <w:iCs/>
+          <w:i/>
+        </w:rPr>
+        <w:t xml:space="preserve"> </w:t>
+      </w:r>
+      <w:r>
+        <w:rPr>
+          <w:iCs/>
+          <w:i/>
+        </w:rPr>
+        <w:t xml:space="preserve">‘</w:t>
+      </w:r>
+      <w:r>
+        <w:rPr>
+          <w:iCs/>
+          <w:i/>
+        </w:rPr>
+        <w:t xml:space="preserve">noget anderledes</w:t>
+      </w:r>
+      <w:r>
+        <w:rPr>
+          <w:iCs/>
+          <w:i/>
+        </w:rPr>
+        <w:t xml:space="preserve">’</w:t>
+      </w:r>
+      <w:r>
+        <w:rPr>
+          <w:iCs/>
+          <w:i/>
+        </w:rPr>
+        <w:t xml:space="preserve"> </w:t>
+      </w:r>
+      <w:r>
+        <w:rPr>
+          <w:iCs/>
+          <w:i/>
+        </w:rPr>
+        <w:t xml:space="preserve">uden at kunne sætte ord på det.</w:t>
+      </w:r>
+    </w:p>
+    <w:p>
+      <w:pPr>
+        <w:pStyle w:val="BodyText"/>
+      </w:pPr>
+      <w:r>
+        <w:rPr>
+          <w:iCs/>
+          <w:i/>
+        </w:rPr>
+        <w:t xml:space="preserve">Andet stadie er sårbart. Vi har sluppet en del af det første stadies sikkerhed (planen, teknikken), men har endnu ikke fuld tillid til det vi mærker. Tvivl og selvbebrejdelse kan være intense. At blive ved med at lytte trods tvivlen er det der gradvist styrker den nye kapacitet.</w:t>
+      </w:r>
+    </w:p>
+    <w:p>
+      <w:pPr>
+        <w:pStyle w:val="BodyText"/>
+      </w:pPr>
+      <w:r>
+        <w:rPr>
+          <w:iCs/>
+          <w:i/>
+        </w:rPr>
+        <w:t xml:space="preserve">Overgangen til tredje stadie sker når vi opdager at klienten ikke længere er en isoleret enhed for os. Feltet mellem os bliver mærkbart. Det er ikke længere kun deres krop vi behandler — vi er begge i et fælles rum. Først er det skræmmende; senere bliver det selve behandlingen.</w:t>
+      </w:r>
+    </w:p>
+    <w:p>
+      <w:pPr>
+        <w:pStyle w:val="BodyText"/>
+      </w:pPr>
+      <w:r>
+        <w:rPr>
+          <w:iCs/>
+          <w:i/>
+        </w:rPr>
+        <w:t xml:space="preserve">Andet stadie kan strække sig over mange år. Det er ikke en fase vi</w:t>
+      </w:r>
+      <w:r>
+        <w:rPr>
+          <w:iCs/>
+          <w:i/>
+        </w:rPr>
+        <w:t xml:space="preserve"> </w:t>
+      </w:r>
+      <w:r>
+        <w:rPr>
+          <w:iCs/>
+          <w:i/>
+        </w:rPr>
+        <w:t xml:space="preserve">‘</w:t>
+      </w:r>
+      <w:r>
+        <w:rPr>
+          <w:iCs/>
+          <w:i/>
+        </w:rPr>
+        <w:t xml:space="preserve">kommer igennem</w:t>
+      </w:r>
+      <w:r>
+        <w:rPr>
+          <w:iCs/>
+          <w:i/>
+        </w:rPr>
+        <w:t xml:space="preserve">’</w:t>
+      </w:r>
+      <w:r>
+        <w:rPr>
+          <w:iCs/>
+          <w:i/>
+        </w:rPr>
+        <w:t xml:space="preserve"> </w:t>
+      </w:r>
+      <w:r>
+        <w:rPr>
+          <w:iCs/>
+          <w:i/>
+        </w:rPr>
+        <w:t xml:space="preserve">hurtigt. Hver ny dybde i mødet med klienter åbner nye muligheder for at lytte til væsken og rytmerne. Det er ikke ineffektivt — det er det stadie hvor håndværket modnes til kunst.</w:t>
+      </w:r>
+    </w:p>
+    <w:p>
+      <w:pPr>
+        <w:pStyle w:val="BodyText"/>
+      </w:pPr>
+      <w:r>
+        <w:rPr>
+          <w:bCs/>
+          <w:b/>
+        </w:rPr>
         <w:t xml:space="preserve">[REFLEKSIONSSPØRGSMÅL]</w:t>
       </w:r>
     </w:p>
@@ -17801,6 +18203,291 @@
           <w:bCs/>
           <w:b/>
         </w:rPr>
+        <w:t xml:space="preserve">[INSPIRATION — nye vinkler at overveje]</w:t>
+      </w:r>
+    </w:p>
+    <w:p>
+      <w:pPr>
+        <w:pStyle w:val="BodyText"/>
+      </w:pPr>
+      <w:r>
+        <w:rPr>
+          <w:iCs/>
+          <w:i/>
+        </w:rPr>
+        <w:t xml:space="preserve">Tredje stadie begynder ofte med en uventet oplevelse — vi mærker at klientens åndedrag og vores eget følges ad uden at vi har planlagt det. Det er ikke synkronisering som teknik; det er biologisk co-regulering. Det første tegn er ofte at behandlingen pludselig virker mindre vores og mere fælles.</w:t>
+      </w:r>
+    </w:p>
+    <w:p>
+      <w:pPr>
+        <w:pStyle w:val="BodyText"/>
+      </w:pPr>
+      <w:r>
+        <w:rPr>
+          <w:iCs/>
+          <w:i/>
+        </w:rPr>
+        <w:t xml:space="preserve">I tredje stadie ophører distinktionen mellem</w:t>
+      </w:r>
+      <w:r>
+        <w:rPr>
+          <w:iCs/>
+          <w:i/>
+        </w:rPr>
+        <w:t xml:space="preserve"> </w:t>
+      </w:r>
+      <w:r>
+        <w:rPr>
+          <w:iCs/>
+          <w:i/>
+        </w:rPr>
+        <w:t xml:space="preserve">‘</w:t>
+      </w:r>
+      <w:r>
+        <w:rPr>
+          <w:iCs/>
+          <w:i/>
+        </w:rPr>
+        <w:t xml:space="preserve">hvad vi giver</w:t>
+      </w:r>
+      <w:r>
+        <w:rPr>
+          <w:iCs/>
+          <w:i/>
+        </w:rPr>
+        <w:t xml:space="preserve">’</w:t>
+      </w:r>
+      <w:r>
+        <w:rPr>
+          <w:iCs/>
+          <w:i/>
+        </w:rPr>
+        <w:t xml:space="preserve"> </w:t>
+      </w:r>
+      <w:r>
+        <w:rPr>
+          <w:iCs/>
+          <w:i/>
+        </w:rPr>
+        <w:t xml:space="preserve">og</w:t>
+      </w:r>
+      <w:r>
+        <w:rPr>
+          <w:iCs/>
+          <w:i/>
+        </w:rPr>
+        <w:t xml:space="preserve"> </w:t>
+      </w:r>
+      <w:r>
+        <w:rPr>
+          <w:iCs/>
+          <w:i/>
+        </w:rPr>
+        <w:t xml:space="preserve">‘</w:t>
+      </w:r>
+      <w:r>
+        <w:rPr>
+          <w:iCs/>
+          <w:i/>
+        </w:rPr>
+        <w:t xml:space="preserve">hvad vi modtager</w:t>
+      </w:r>
+      <w:r>
+        <w:rPr>
+          <w:iCs/>
+          <w:i/>
+        </w:rPr>
+        <w:t xml:space="preserve">’</w:t>
+      </w:r>
+      <w:r>
+        <w:rPr>
+          <w:iCs/>
+          <w:i/>
+        </w:rPr>
+        <w:t xml:space="preserve"> </w:t>
+      </w:r>
+      <w:r>
+        <w:rPr>
+          <w:iCs/>
+          <w:i/>
+        </w:rPr>
+        <w:t xml:space="preserve">midlertidigt. Vi bliver lige så meget ændret af behandlingen som klienten. Det er ikke en svaghed eller grænseoverskridelse — det er hvordan det relationelle felt fungerer. At anerkende det uden at være bange for det er en del af stadiet.</w:t>
+      </w:r>
+    </w:p>
+    <w:p>
+      <w:pPr>
+        <w:pStyle w:val="BodyText"/>
+      </w:pPr>
+      <w:r>
+        <w:rPr>
+          <w:iCs/>
+          <w:i/>
+        </w:rPr>
+        <w:t xml:space="preserve">Behandlere i tredje stadie mærker ofte deres egne følelser, kropslige fornemmelser eller minder dukke op under sessioner. Det er ikke nødvendigvis vores eget materiale — det kan være feltets respons. At kunne skelne mellem det der hører til klienten, til feltet, og til os selv, er en finmotorisk færdighed der udvikles over tid.</w:t>
+      </w:r>
+    </w:p>
+    <w:p>
+      <w:pPr>
+        <w:pStyle w:val="BodyText"/>
+      </w:pPr>
+      <w:r>
+        <w:rPr>
+          <w:iCs/>
+          <w:i/>
+        </w:rPr>
+        <w:t xml:space="preserve">I tredje stadie ændrer behandlinger sig kvalitativt. De bliver mindre fokuserede på lokale problemer og mere på hele organismens orientering. Klienten kommer ofte ud af sessionen med en oplevelse der er svær at sætte ord på —</w:t>
+      </w:r>
+      <w:r>
+        <w:rPr>
+          <w:iCs/>
+          <w:i/>
+        </w:rPr>
+        <w:t xml:space="preserve"> </w:t>
+      </w:r>
+      <w:r>
+        <w:rPr>
+          <w:iCs/>
+          <w:i/>
+        </w:rPr>
+        <w:t xml:space="preserve">‘</w:t>
+      </w:r>
+      <w:r>
+        <w:rPr>
+          <w:iCs/>
+          <w:i/>
+        </w:rPr>
+        <w:t xml:space="preserve">noget skiftede</w:t>
+      </w:r>
+      <w:r>
+        <w:rPr>
+          <w:iCs/>
+          <w:i/>
+        </w:rPr>
+        <w:t xml:space="preserve">’</w:t>
+      </w:r>
+      <w:r>
+        <w:rPr>
+          <w:iCs/>
+          <w:i/>
+        </w:rPr>
+        <w:t xml:space="preserve">,</w:t>
+      </w:r>
+      <w:r>
+        <w:rPr>
+          <w:iCs/>
+          <w:i/>
+        </w:rPr>
+        <w:t xml:space="preserve"> </w:t>
+      </w:r>
+      <w:r>
+        <w:rPr>
+          <w:iCs/>
+          <w:i/>
+        </w:rPr>
+        <w:t xml:space="preserve">‘</w:t>
+      </w:r>
+      <w:r>
+        <w:rPr>
+          <w:iCs/>
+          <w:i/>
+        </w:rPr>
+        <w:t xml:space="preserve">jeg blev set</w:t>
+      </w:r>
+      <w:r>
+        <w:rPr>
+          <w:iCs/>
+          <w:i/>
+        </w:rPr>
+        <w:t xml:space="preserve">’</w:t>
+      </w:r>
+      <w:r>
+        <w:rPr>
+          <w:iCs/>
+          <w:i/>
+        </w:rPr>
+        <w:t xml:space="preserve">,</w:t>
+      </w:r>
+      <w:r>
+        <w:rPr>
+          <w:iCs/>
+          <w:i/>
+        </w:rPr>
+        <w:t xml:space="preserve"> </w:t>
+      </w:r>
+      <w:r>
+        <w:rPr>
+          <w:iCs/>
+          <w:i/>
+        </w:rPr>
+        <w:t xml:space="preserve">‘</w:t>
+      </w:r>
+      <w:r>
+        <w:rPr>
+          <w:iCs/>
+          <w:i/>
+        </w:rPr>
+        <w:t xml:space="preserve">vi mødte hinanden</w:t>
+      </w:r>
+      <w:r>
+        <w:rPr>
+          <w:iCs/>
+          <w:i/>
+        </w:rPr>
+        <w:t xml:space="preserve">’</w:t>
+      </w:r>
+      <w:r>
+        <w:rPr>
+          <w:iCs/>
+          <w:i/>
+        </w:rPr>
+        <w:t xml:space="preserve">. Det er feltets virkning, ikke teknikkens.</w:t>
+      </w:r>
+    </w:p>
+    <w:p>
+      <w:pPr>
+        <w:pStyle w:val="BodyText"/>
+      </w:pPr>
+      <w:r>
+        <w:rPr>
+          <w:iCs/>
+          <w:i/>
+        </w:rPr>
+        <w:t xml:space="preserve">Risikoen i tredje stadie er at miste sig selv i feltet. Når grænserne mellem behandler og klient bliver fluide, kan vi tabe vores eget anker. Klinisk modenhed i tredje stadie er at kunne være distinkt og åben på samme tid — at have en stemme, der kan holde feltet, samtidig med at den ikke fylder feltet.</w:t>
+      </w:r>
+    </w:p>
+    <w:p>
+      <w:pPr>
+        <w:pStyle w:val="BodyText"/>
+      </w:pPr>
+      <w:r>
+        <w:rPr>
+          <w:iCs/>
+          <w:i/>
+        </w:rPr>
+        <w:t xml:space="preserve">Overgangen til fjerde stadie sker når feltet ikke længere kun er mellem os og én klient, men begynder at åbne sig mod det universelle. Vi mærker at det vi sidder i ikke er begrænset til denne person, dette rum, dette øjeblik. Det er en gradvis udvidelse, ikke et pludseligt skifte.</w:t>
+      </w:r>
+    </w:p>
+    <w:p>
+      <w:pPr>
+        <w:pStyle w:val="BodyText"/>
+      </w:pPr>
+      <w:r>
+        <w:rPr>
+          <w:iCs/>
+          <w:i/>
+        </w:rPr>
+        <w:t xml:space="preserve">Tredje stadie giver behandleren en helt anden form for trættet. Det er ikke fysisk udmattelse fra mange klienter — det er feltets vægt. At være i intim relationel kontakt med menneske efter menneske kalder på en restitution der ikke er bare hvile. Det er en del af håndværket at kunne genoplade på det relationelle plan.</w:t>
+      </w:r>
+    </w:p>
+    <w:p>
+      <w:pPr>
+        <w:pStyle w:val="BodyText"/>
+      </w:pPr>
+      <w:r>
+        <w:rPr>
+          <w:bCs/>
+          <w:b/>
+        </w:rPr>
         <w:t xml:space="preserve">[REFLEKSIONSSPØRGSMÅL]</w:t>
       </w:r>
     </w:p>
@@ -18393,6 +19080,249 @@
           <w:bCs/>
           <w:b/>
         </w:rPr>
+        <w:t xml:space="preserve">[INSPIRATION — nye vinkler at overveje]</w:t>
+      </w:r>
+    </w:p>
+    <w:p>
+      <w:pPr>
+        <w:pStyle w:val="BodyText"/>
+      </w:pPr>
+      <w:r>
+        <w:rPr>
+          <w:iCs/>
+          <w:i/>
+        </w:rPr>
+        <w:t xml:space="preserve">Fjerde stadie begynder ofte med en oplevelse af at noget bærer behandlingen — ikke os, ikke klienten, men noget større. Vores opmærksomhed udvider sig fra kroppen til rummet til horisonten. Long Tide bliver ikke længere noget vi prøver at mærke, men det grundlag al perception finder sted i.</w:t>
+      </w:r>
+    </w:p>
+    <w:p>
+      <w:pPr>
+        <w:pStyle w:val="BodyText"/>
+      </w:pPr>
+      <w:r>
+        <w:rPr>
+          <w:iCs/>
+          <w:i/>
+        </w:rPr>
+        <w:t xml:space="preserve">I fjerde stadie behandler vi mindre og mindre. Hænderne hviler stadig, klienten ligger stadig, men det</w:t>
+      </w:r>
+      <w:r>
+        <w:rPr>
+          <w:iCs/>
+          <w:i/>
+        </w:rPr>
+        <w:t xml:space="preserve"> </w:t>
+      </w:r>
+      <w:r>
+        <w:rPr>
+          <w:iCs/>
+          <w:i/>
+        </w:rPr>
+        <w:t xml:space="preserve">‘</w:t>
+      </w:r>
+      <w:r>
+        <w:rPr>
+          <w:iCs/>
+          <w:i/>
+        </w:rPr>
+        <w:t xml:space="preserve">arbejde</w:t>
+      </w:r>
+      <w:r>
+        <w:rPr>
+          <w:iCs/>
+          <w:i/>
+        </w:rPr>
+        <w:t xml:space="preserve">’</w:t>
+      </w:r>
+      <w:r>
+        <w:rPr>
+          <w:iCs/>
+          <w:i/>
+        </w:rPr>
+        <w:t xml:space="preserve"> </w:t>
+      </w:r>
+      <w:r>
+        <w:rPr>
+          <w:iCs/>
+          <w:i/>
+        </w:rPr>
+        <w:t xml:space="preserve">vi før gjorde, gøres ikke længere. I stedet sker der noget der ikke kan tilskrives os eller dem. Det er ofte den dybeste behandling vi kan tilbyde, og samtidig den der kræver mindst aktiv handling.</w:t>
+      </w:r>
+    </w:p>
+    <w:p>
+      <w:pPr>
+        <w:pStyle w:val="BodyText"/>
+      </w:pPr>
+      <w:r>
+        <w:rPr>
+          <w:iCs/>
+          <w:i/>
+        </w:rPr>
+        <w:t xml:space="preserve">Tiden ændrer karakter i fjerde stadie. Behandlinger kan vare i et halvtimes ur og samtidig opleves som timer. Eller de kan vare to timer og opleves som minutter. Både klient og behandler oplever ofte denne tids-dilatation, og det er informativt — det er et tegn på at vi er i Long Tide-rummets felt.</w:t>
+      </w:r>
+    </w:p>
+    <w:p>
+      <w:pPr>
+        <w:pStyle w:val="BodyText"/>
+      </w:pPr>
+      <w:r>
+        <w:rPr>
+          <w:iCs/>
+          <w:i/>
+        </w:rPr>
+        <w:t xml:space="preserve">Behandlere i fjerde stadie taler ofte mindre om teknik og mere om perception. Når vi forklarer hvad vi gør, bruger vi ord som</w:t>
+      </w:r>
+      <w:r>
+        <w:rPr>
+          <w:iCs/>
+          <w:i/>
+        </w:rPr>
+        <w:t xml:space="preserve"> </w:t>
+      </w:r>
+      <w:r>
+        <w:rPr>
+          <w:iCs/>
+          <w:i/>
+        </w:rPr>
+        <w:t xml:space="preserve">‘</w:t>
+      </w:r>
+      <w:r>
+        <w:rPr>
+          <w:iCs/>
+          <w:i/>
+        </w:rPr>
+        <w:t xml:space="preserve">lytte</w:t>
+      </w:r>
+      <w:r>
+        <w:rPr>
+          <w:iCs/>
+          <w:i/>
+        </w:rPr>
+        <w:t xml:space="preserve">’</w:t>
+      </w:r>
+      <w:r>
+        <w:rPr>
+          <w:iCs/>
+          <w:i/>
+        </w:rPr>
+        <w:t xml:space="preserve">,</w:t>
+      </w:r>
+      <w:r>
+        <w:rPr>
+          <w:iCs/>
+          <w:i/>
+        </w:rPr>
+        <w:t xml:space="preserve"> </w:t>
+      </w:r>
+      <w:r>
+        <w:rPr>
+          <w:iCs/>
+          <w:i/>
+        </w:rPr>
+        <w:t xml:space="preserve">‘</w:t>
+      </w:r>
+      <w:r>
+        <w:rPr>
+          <w:iCs/>
+          <w:i/>
+        </w:rPr>
+        <w:t xml:space="preserve">rumme</w:t>
+      </w:r>
+      <w:r>
+        <w:rPr>
+          <w:iCs/>
+          <w:i/>
+        </w:rPr>
+        <w:t xml:space="preserve">’</w:t>
+      </w:r>
+      <w:r>
+        <w:rPr>
+          <w:iCs/>
+          <w:i/>
+        </w:rPr>
+        <w:t xml:space="preserve">,</w:t>
+      </w:r>
+      <w:r>
+        <w:rPr>
+          <w:iCs/>
+          <w:i/>
+        </w:rPr>
+        <w:t xml:space="preserve"> </w:t>
+      </w:r>
+      <w:r>
+        <w:rPr>
+          <w:iCs/>
+          <w:i/>
+        </w:rPr>
+        <w:t xml:space="preserve">‘</w:t>
+      </w:r>
+      <w:r>
+        <w:rPr>
+          <w:iCs/>
+          <w:i/>
+        </w:rPr>
+        <w:t xml:space="preserve">være med</w:t>
+      </w:r>
+      <w:r>
+        <w:rPr>
+          <w:iCs/>
+          <w:i/>
+        </w:rPr>
+        <w:t xml:space="preserve">’</w:t>
+      </w:r>
+      <w:r>
+        <w:rPr>
+          <w:iCs/>
+          <w:i/>
+        </w:rPr>
+        <w:t xml:space="preserve">. Tekniske termer bliver irrelevante — ikke fordi de er forkerte, men fordi de ikke længere beskriver hvad der faktisk sker i sessionen.</w:t>
+      </w:r>
+    </w:p>
+    <w:p>
+      <w:pPr>
+        <w:pStyle w:val="BodyText"/>
+      </w:pPr>
+      <w:r>
+        <w:rPr>
+          <w:iCs/>
+          <w:i/>
+        </w:rPr>
+        <w:t xml:space="preserve">I fjerde stadie kan behandlinger have effekter der rækker langt ud over det øjeblikkelige problem. Klienten kommer ind med en specifik klagepunkt, og det de oplever bagefter er en orientering der spænder over hele deres liv. Det er ikke noget vi har planlagt — det er Long Tide-rummets natur.</w:t>
+      </w:r>
+    </w:p>
+    <w:p>
+      <w:pPr>
+        <w:pStyle w:val="BodyText"/>
+      </w:pPr>
+      <w:r>
+        <w:rPr>
+          <w:iCs/>
+          <w:i/>
+        </w:rPr>
+        <w:t xml:space="preserve">Sårbarheden i fjerde stadie er at miste forbindelsen til det praktiske og det jordnære. Vi kan blive så optaget af det subtile at vi mister det konkrete. Klinisk modenhed på dette niveau er at kunne være i Long Tide og samtidig huske at klienten har en krop, en hverdag, en konkret virkelighed.</w:t>
+      </w:r>
+    </w:p>
+    <w:p>
+      <w:pPr>
+        <w:pStyle w:val="BodyText"/>
+      </w:pPr>
+      <w:r>
+        <w:rPr>
+          <w:iCs/>
+          <w:i/>
+        </w:rPr>
+        <w:t xml:space="preserve">Fjerde stadie giver behandleren en ny form for tilstedeværelse. Vi behøver ikke gøre noget særligt for at være effektive — vores blotte tilstedeværelse i et trygt felt har effekt. Klienter kan melde forbedringer mellem sessioner som ikke er relateret til specifikke behandlings-greb. Det er feltets virkning, ikke teknikkens.</w:t>
+      </w:r>
+    </w:p>
+    <w:p>
+      <w:pPr>
+        <w:pStyle w:val="BodyText"/>
+      </w:pPr>
+      <w:r>
+        <w:rPr>
+          <w:bCs/>
+          <w:b/>
+        </w:rPr>
         <w:t xml:space="preserve">[REFLEKSIONSSPØRGSMÅL]</w:t>
       </w:r>
     </w:p>
@@ -18990,6 +19920,144 @@
       </w:r>
       <w:r>
         <w:t xml:space="preserve">The Long Tides bevægelse har ført hertil gennem øjeblikke af fuldstændig overgivelse. Oplevelsen af at blive bevæget er blevet til oplevelsen af at blive skabt. Den observerende del opløses i glimt i det observerede.</w:t>
+      </w:r>
+    </w:p>
+    <w:p>
+      <w:pPr>
+        <w:pStyle w:val="BodyText"/>
+      </w:pPr>
+      <w:r>
+        <w:rPr>
+          <w:bCs/>
+          <w:b/>
+        </w:rPr>
+        <w:t xml:space="preserve">[INSPIRATION — nye vinkler at overveje]</w:t>
+      </w:r>
+    </w:p>
+    <w:p>
+      <w:pPr>
+        <w:pStyle w:val="BodyText"/>
+      </w:pPr>
+      <w:r>
+        <w:rPr>
+          <w:iCs/>
+          <w:i/>
+        </w:rPr>
+        <w:t xml:space="preserve">Femte stadie er ikke et stadie vi kommer til — det er en kvalitet der lejlighedsvis viser sig på vejen. De fleste behandlere oplever korte øjeblikke af det selv tidligt i deres rejse, lange før de er</w:t>
+      </w:r>
+      <w:r>
+        <w:rPr>
+          <w:iCs/>
+          <w:i/>
+        </w:rPr>
+        <w:t xml:space="preserve"> </w:t>
+      </w:r>
+      <w:r>
+        <w:rPr>
+          <w:iCs/>
+          <w:i/>
+        </w:rPr>
+        <w:t xml:space="preserve">‘</w:t>
+      </w:r>
+      <w:r>
+        <w:rPr>
+          <w:iCs/>
+          <w:i/>
+        </w:rPr>
+        <w:t xml:space="preserve">i</w:t>
+      </w:r>
+      <w:r>
+        <w:rPr>
+          <w:iCs/>
+          <w:i/>
+        </w:rPr>
+        <w:t xml:space="preserve">’</w:t>
+      </w:r>
+      <w:r>
+        <w:rPr>
+          <w:iCs/>
+          <w:i/>
+        </w:rPr>
+        <w:t xml:space="preserve"> </w:t>
+      </w:r>
+      <w:r>
+        <w:rPr>
+          <w:iCs/>
+          <w:i/>
+        </w:rPr>
+        <w:t xml:space="preserve">stadiet. Det er ikke afhængigt af år af praksis; det er afhængigt af betingelser.</w:t>
+      </w:r>
+    </w:p>
+    <w:p>
+      <w:pPr>
+        <w:pStyle w:val="BodyText"/>
+      </w:pPr>
+      <w:r>
+        <w:rPr>
+          <w:iCs/>
+          <w:i/>
+        </w:rPr>
+        <w:t xml:space="preserve">I femte stadie ophører den oplevede distinktion mellem behandler, klient og felt midlertidigt. Det er ikke en blanding af tre — det er en samtidig oplevelse af én. Bagefter kan vi ikke beskrive hvem der gjorde hvad. Det er sjældent og uforudsigeligt, og det kan hverken kaldes frem eller forhindres.</w:t>
+      </w:r>
+    </w:p>
+    <w:p>
+      <w:pPr>
+        <w:pStyle w:val="BodyText"/>
+      </w:pPr>
+      <w:r>
+        <w:rPr>
+          <w:iCs/>
+          <w:i/>
+        </w:rPr>
+        <w:t xml:space="preserve">Behandlinger der finder vej til femte stadie efterlader ofte både klient og behandler stille bagefter. Der er sjældent meget at sige. Klienten oplever ofte en samlet ro de næste dage eller uger; behandleren mærker det som om noget er trukket tilbage til hvor det hører hjemme. Det er ikke effekter vi har skabt.</w:t>
+      </w:r>
+    </w:p>
+    <w:p>
+      <w:pPr>
+        <w:pStyle w:val="BodyText"/>
+      </w:pPr>
+      <w:r>
+        <w:rPr>
+          <w:iCs/>
+          <w:i/>
+        </w:rPr>
+        <w:t xml:space="preserve">I femte stadie ophører selv den lytten vi har trænet os op i. Der er ikke længere en der lytter til noget; der er bare lytten — eller bare det der er. Det er vanskeligt at beskrive uden at falde ind i mystiske ord, men de fleste behandlere der har oplevet det genkender beskrivelsen umiddelbart.</w:t>
+      </w:r>
+    </w:p>
+    <w:p>
+      <w:pPr>
+        <w:pStyle w:val="BodyText"/>
+      </w:pPr>
+      <w:r>
+        <w:rPr>
+          <w:iCs/>
+          <w:i/>
+        </w:rPr>
+        <w:t xml:space="preserve">Risikoen ved at sigte mod femte stadie er at skabe en illusion om det. Vi kan beslutte at noget var stilhed, når det egentlig var afslapning eller udmattelse. Klinisk modenhed er at kunne lade stadiet komme uden at kalde det frem, og at kunne anerkende dets fravær uden at føle os mislykkede.</w:t>
+      </w:r>
+    </w:p>
+    <w:p>
+      <w:pPr>
+        <w:pStyle w:val="BodyText"/>
+      </w:pPr>
+      <w:r>
+        <w:rPr>
+          <w:iCs/>
+          <w:i/>
+        </w:rPr>
+        <w:t xml:space="preserve">Femte stadie kan ikke trænes som teknik. Det kan kun forberedes ved at de fire foregående stadier er fuldt mødt. Når der ikke længere er forberedelse at gøre — når al teknik, al lytten, alt nærvær er på plads — kan stilheden vise sig. Den kommer altid i stedet for, ikke som tilføjelse til arbejdet.</w:t>
+      </w:r>
+    </w:p>
+    <w:p>
+      <w:pPr>
+        <w:pStyle w:val="BodyText"/>
+      </w:pPr>
+      <w:r>
+        <w:rPr>
+          <w:iCs/>
+          <w:i/>
+        </w:rPr>
+        <w:t xml:space="preserve">Selv erfarne behandlere oplever femte stadie sjældent. Det er ikke et tegn på at vi ikke er nået langt nok. Det er en påmindelse om at den dybeste dybde ikke er en præstation. Det vi kalder god behandling involverer ofte ikke femte stadie — bare gode kvaliteter af de fire foregående.</w:t>
       </w:r>
     </w:p>
     <w:p>

</xml_diff>

<commit_message>
Redigerbart udkast: 7 inspirations-paragraffer pr. essentiel egenskab
</commit_message>
<xml_diff>
--- a/tools/output/manuskript-redigerbar.docx
+++ b/tools/output/manuskript-redigerbar.docx
@@ -10973,6 +10973,102 @@
           <w:bCs/>
           <w:b/>
         </w:rPr>
+        <w:t xml:space="preserve">[INSPIRATION — nye vinkler at overveje]</w:t>
+      </w:r>
+    </w:p>
+    <w:p>
+      <w:pPr>
+        <w:pStyle w:val="BodyText"/>
+      </w:pPr>
+      <w:r>
+        <w:rPr>
+          <w:iCs/>
+          <w:i/>
+        </w:rPr>
+        <w:t xml:space="preserve">Den neutrale lytten begynder allerede inden hænderne lander. Den kvalitet vi bringer ind i rummet — hvilken intention vi har, hvilke forventninger vi bærer — registreres af klientens system før den fysiske kontakt. Forberedelsen er en del af lytningen, ikke en separat fase.</w:t>
+      </w:r>
+    </w:p>
+    <w:p>
+      <w:pPr>
+        <w:pStyle w:val="BodyText"/>
+      </w:pPr>
+      <w:r>
+        <w:rPr>
+          <w:iCs/>
+          <w:i/>
+        </w:rPr>
+        <w:t xml:space="preserve">Den neutrale lytten adskiller sig fra klinisk vurdering ved fraværet af kategori. Vurdering placerer det vi mærker i forud-kendte kasser. Lytten lader fænomenet være sig selv først, og lader sproget komme bagefter — hvis det overhovedet kommer. Det er to forskellige perceptions-modi, ikke to grader af samme.</w:t>
+      </w:r>
+    </w:p>
+    <w:p>
+      <w:pPr>
+        <w:pStyle w:val="BodyText"/>
+      </w:pPr>
+      <w:r>
+        <w:rPr>
+          <w:iCs/>
+          <w:i/>
+        </w:rPr>
+        <w:t xml:space="preserve">Det er sjældent agendaen forsvinder helt — oftere bliver vi opmærksomme på den. At kunne mærke at vi har en plan, og lade planen træde til side uden at fortrænge den, er noget andet end at være helt neutral. Det er en levende disciplin, ikke en opnået tilstand.</w:t>
+      </w:r>
+    </w:p>
+    <w:p>
+      <w:pPr>
+        <w:pStyle w:val="BodyText"/>
+      </w:pPr>
+      <w:r>
+        <w:rPr>
+          <w:iCs/>
+          <w:i/>
+        </w:rPr>
+        <w:t xml:space="preserve">Når lytten begynder at trække sig sammen, kan det mærkes som en svag krampe i hænderne, en let fokusering der bliver til søgen. Det er sjældent dramatisk. Men over tid lærer behandleren at registrere disse mikroskopiske skift som tegn på at agendaen er begyndt at overtage feltet.</w:t>
+      </w:r>
+    </w:p>
+    <w:p>
+      <w:pPr>
+        <w:pStyle w:val="BodyText"/>
+      </w:pPr>
+      <w:r>
+        <w:rPr>
+          <w:iCs/>
+          <w:i/>
+        </w:rPr>
+        <w:t xml:space="preserve">Nogle klienter responderer på neutral lytten ved at åbne sig, andre ved at trække sig. Det er ikke et tegn på at lytningen er forkert — snarere på at klientens system har sin egen tærskel for hvor meget rum det kan modtage. Lytningen tilpasser sig denne tærskel uden at miste sin kvalitet.</w:t>
+      </w:r>
+    </w:p>
+    <w:p>
+      <w:pPr>
+        <w:pStyle w:val="BodyText"/>
+      </w:pPr>
+      <w:r>
+        <w:rPr>
+          <w:iCs/>
+          <w:i/>
+        </w:rPr>
+        <w:t xml:space="preserve">Den neutrale lytten modnes ikke ved at blive mere intens, men ved at blive mere rummelig. Den unge behandler lytter ofte ved at fokusere; den modne behandler lytter ved at brede opmærksomheden ud. Begge er gyldige, men kvaliteten af det vi mærker forskydes med årene.</w:t>
+      </w:r>
+    </w:p>
+    <w:p>
+      <w:pPr>
+        <w:pStyle w:val="BodyText"/>
+      </w:pPr>
+      <w:r>
+        <w:rPr>
+          <w:iCs/>
+          <w:i/>
+        </w:rPr>
+        <w:t xml:space="preserve">Den lytten der er neutral, har en særlig kvalitet af tilgængelighed uden tilbøjelighed. Den er hverken passiv eller aktiv, hverken forventende eller indolent. Den har en parathed der ikke retter sig mod noget bestemt — og det er præcis denne åbne parathed der giver klientens system rum til at vise sig.</w:t>
+      </w:r>
+    </w:p>
+    <w:p>
+      <w:pPr>
+        <w:pStyle w:val="BodyText"/>
+      </w:pPr>
+      <w:r>
+        <w:rPr>
+          <w:bCs/>
+          <w:b/>
+        </w:rPr>
         <w:t xml:space="preserve">[REFLEKSIONSSPØRGSMÅL]</w:t>
       </w:r>
     </w:p>
@@ -11054,6 +11150,102 @@
           <w:bCs/>
           <w:b/>
         </w:rPr>
+        <w:t xml:space="preserve">[INSPIRATION — nye vinkler at overveje]</w:t>
+      </w:r>
+    </w:p>
+    <w:p>
+      <w:pPr>
+        <w:pStyle w:val="BodyText"/>
+      </w:pPr>
+      <w:r>
+        <w:rPr>
+          <w:iCs/>
+          <w:i/>
+        </w:rPr>
+        <w:t xml:space="preserve">Selvreguleringen er ikke noget vi kun gør før behandlingen — den fortsætter gennem hele sessionen som mikroskopiske justeringer. Når vi mærker vores eget åndedrag blive overfladisk eller skuldrene løfte sig, er det signal om at finde tilbage til det centrale uden at afbryde kontakten med klienten.</w:t>
+      </w:r>
+    </w:p>
+    <w:p>
+      <w:pPr>
+        <w:pStyle w:val="BodyText"/>
+      </w:pPr>
+      <w:r>
+        <w:rPr>
+          <w:iCs/>
+          <w:i/>
+        </w:rPr>
+        <w:t xml:space="preserve">Co-regulering sker uanset om vi er bevidste om det eller ej. To nervesystemer i samme rum påvirker hinanden. Forskellen er om vores egen tilstand er stabil nok til at virke som et anker, eller om vi følger med ind i klientens dysregulering uden at registrere det.</w:t>
+      </w:r>
+    </w:p>
+    <w:p>
+      <w:pPr>
+        <w:pStyle w:val="BodyText"/>
+      </w:pPr>
+      <w:r>
+        <w:rPr>
+          <w:iCs/>
+          <w:i/>
+        </w:rPr>
+        <w:t xml:space="preserve">Tegnene på at vi har mistet vores forankring er ofte subtile: tankerne begynder at vandre, vi mærker en let utålmodighed, hænderne får en let intention de ikke havde før. At kunne registrere disse tidlige signaler er forskellen mellem at miste sig selv og at finde tilbage.</w:t>
+      </w:r>
+    </w:p>
+    <w:p>
+      <w:pPr>
+        <w:pStyle w:val="BodyText"/>
+      </w:pPr>
+      <w:r>
+        <w:rPr>
+          <w:iCs/>
+          <w:i/>
+        </w:rPr>
+        <w:t xml:space="preserve">Afslapning og selvregulering er ikke det samme. Vi kan være afslappede uden at være regulerede — slappe i muskulaturen men diffuse i opmærksomheden. Selvregulering har en kvalitet af koherens, en samling af systemet omkring midten, som afslapning alene ikke nødvendigvis indeholder.</w:t>
+      </w:r>
+    </w:p>
+    <w:p>
+      <w:pPr>
+        <w:pStyle w:val="BodyText"/>
+      </w:pPr>
+      <w:r>
+        <w:rPr>
+          <w:iCs/>
+          <w:i/>
+        </w:rPr>
+        <w:t xml:space="preserve">Hver behandler har sit eget sæt af reguleringsstrategier. For nogle er det åndedraget, for andre fødderne mod gulvet, for andre igen en indre orientering mod et bestemt punkt i kroppen. Det vigtige er ikke metoden men dens pålidelighed — at den faktisk virker når vi har brug for den.</w:t>
+      </w:r>
+    </w:p>
+    <w:p>
+      <w:pPr>
+        <w:pStyle w:val="BodyText"/>
+      </w:pPr>
+      <w:r>
+        <w:rPr>
+          <w:iCs/>
+          <w:i/>
+        </w:rPr>
+        <w:t xml:space="preserve">Med årene vokser kapaciteten til at blive i regulering selv under intensivt klinisk pres. Det betyder ikke at vi aldrig forskydes, men at restitueringstiden bliver kortere. Den modne behandler kan mærke en bølge af klientens dysregulering passere gennem feltet uden at miste sin egen forankring.</w:t>
+      </w:r>
+    </w:p>
+    <w:p>
+      <w:pPr>
+        <w:pStyle w:val="BodyText"/>
+      </w:pPr>
+      <w:r>
+        <w:rPr>
+          <w:iCs/>
+          <w:i/>
+        </w:rPr>
+        <w:t xml:space="preserve">Mellem to klienter er det sjældent nok at gå på toilettet og drikke vand. Den fysiologiske reset kræver bevidst opmærksomhed — en kort genfinding af jordingen, en stilhed der lader det forrige aftryk slippe. Selv to minutter brugt rigtigt kan være forskellen på en frisk eller en slidt næste session.</w:t>
+      </w:r>
+    </w:p>
+    <w:p>
+      <w:pPr>
+        <w:pStyle w:val="BodyText"/>
+      </w:pPr>
+      <w:r>
+        <w:rPr>
+          <w:bCs/>
+          <w:b/>
+        </w:rPr>
         <w:t xml:space="preserve">[REFLEKSIONSSPØRGSMÅL]</w:t>
       </w:r>
     </w:p>
@@ -11153,6 +11345,137 @@
           <w:bCs/>
           <w:b/>
         </w:rPr>
+        <w:t xml:space="preserve">[INSPIRATION — nye vinkler at overveje]</w:t>
+      </w:r>
+    </w:p>
+    <w:p>
+      <w:pPr>
+        <w:pStyle w:val="BodyText"/>
+      </w:pPr>
+      <w:r>
+        <w:rPr>
+          <w:iCs/>
+          <w:i/>
+        </w:rPr>
+        <w:t xml:space="preserve">Skiftet fra forarbejde til egentlig terapeutisk proces kommer ofte uden varsel. Hænderne mærker pludselig at noget er anderledes — vævet har en anden karakter, åndedrættet har skiftet kvalitet, rummet selv føles forandret. At kunne registrere dette skift øjeblikkeligt er en af de finere kliniske færdigheder.</w:t>
+      </w:r>
+    </w:p>
+    <w:p>
+      <w:pPr>
+        <w:pStyle w:val="BodyText"/>
+      </w:pPr>
+      <w:r>
+        <w:rPr>
+          <w:iCs/>
+          <w:i/>
+        </w:rPr>
+        <w:t xml:space="preserve">Symptomlindring og terapeutisk proces er ikke det samme. Et symptom kan aftage uden at noget grundlæggende har ændret sig — et væv slapper af, men mønsteret består. Den ægte proces involverer en omorganisering på et dybere lag, hvor strukturen selv finder ny ligevægt.</w:t>
+      </w:r>
+    </w:p>
+    <w:p>
+      <w:pPr>
+        <w:pStyle w:val="BodyText"/>
+      </w:pPr>
+      <w:r>
+        <w:rPr>
+          <w:iCs/>
+          <w:i/>
+        </w:rPr>
+        <w:t xml:space="preserve">Den ro der ledsager terapeutisk proces, har en specifik kvalitet af fylde. Den er ikke tom stilhed men en mætning af potentiale. Hænderne mærker det som et felt der er blevet bredere, mere koherent, mere tilgængeligt. Klienter beskriver det ofte som at synke ned i sig selv.</w:t>
+      </w:r>
+    </w:p>
+    <w:p>
+      <w:pPr>
+        <w:pStyle w:val="BodyText"/>
+      </w:pPr>
+      <w:r>
+        <w:rPr>
+          <w:iCs/>
+          <w:i/>
+        </w:rPr>
+        <w:t xml:space="preserve">Den terapeutiske proces forløber sjældent lineært. Den kan tage pauser, gentage sig, fordybes i bølger. Hvad der ligner stagnation er ofte integration. At kunne lade processen folde sig ud i sit eget tempo, uden at fortolke pauserne som mangel på fremgang, er en del af håndværket.</w:t>
+      </w:r>
+    </w:p>
+    <w:p>
+      <w:pPr>
+        <w:pStyle w:val="BodyText"/>
+      </w:pPr>
+      <w:r>
+        <w:rPr>
+          <w:iCs/>
+          <w:i/>
+        </w:rPr>
+        <w:t xml:space="preserve">To behandlinger med samme klient kan have helt forskellige signaturer. Den ene gang viser processen sig som langsom omformning, den anden som hurtige skift. Det er ikke os der vælger formen — det er klientens system der i øjeblikket beslutter hvilken vej forandringen skal tage.</w:t>
+      </w:r>
+    </w:p>
+    <w:p>
+      <w:pPr>
+        <w:pStyle w:val="BodyText"/>
+      </w:pPr>
+      <w:r>
+        <w:rPr>
+          <w:iCs/>
+          <w:i/>
+        </w:rPr>
+        <w:t xml:space="preserve">Sansningen af den terapeutiske proces udvikles ikke gennem tænkning men gennem tusindevis af behandlinger. Hver gang vi har siddet med en klient og bagefter genkendt</w:t>
+      </w:r>
+      <w:r>
+        <w:rPr>
+          <w:iCs/>
+          <w:i/>
+        </w:rPr>
+        <w:t xml:space="preserve"> </w:t>
+      </w:r>
+      <w:r>
+        <w:rPr>
+          <w:iCs/>
+          <w:i/>
+        </w:rPr>
+        <w:t xml:space="preserve">‘</w:t>
+      </w:r>
+      <w:r>
+        <w:rPr>
+          <w:iCs/>
+          <w:i/>
+        </w:rPr>
+        <w:t xml:space="preserve">der skete noget</w:t>
+      </w:r>
+      <w:r>
+        <w:rPr>
+          <w:iCs/>
+          <w:i/>
+        </w:rPr>
+        <w:t xml:space="preserve">’</w:t>
+      </w:r>
+      <w:r>
+        <w:rPr>
+          <w:iCs/>
+          <w:i/>
+        </w:rPr>
+        <w:t xml:space="preserve">, skærper hænderne deres genkendelse. Det er en kropslig læring der ikke kan forceres frem.</w:t>
+      </w:r>
+    </w:p>
+    <w:p>
+      <w:pPr>
+        <w:pStyle w:val="BodyText"/>
+      </w:pPr>
+      <w:r>
+        <w:rPr>
+          <w:iCs/>
+          <w:i/>
+        </w:rPr>
+        <w:t xml:space="preserve">Det sker også at sessionen forløber uden at den terapeutiske proces træder tydeligt frem. Det er ikke nødvendigvis tegn på at intet skete — ofte arbejder systemet på et niveau vi ikke kan registrere i øjeblikket. Klientens efterforløb afslører ofte det vi ikke kunne mærke direkte.</w:t>
+      </w:r>
+    </w:p>
+    <w:p>
+      <w:pPr>
+        <w:pStyle w:val="BodyText"/>
+      </w:pPr>
+      <w:r>
+        <w:rPr>
+          <w:bCs/>
+          <w:b/>
+        </w:rPr>
         <w:t xml:space="preserve">[REFLEKSIONSSPØRGSMÅL]</w:t>
       </w:r>
     </w:p>
@@ -11285,6 +11608,102 @@
           <w:bCs/>
           <w:b/>
         </w:rPr>
+        <w:t xml:space="preserve">[INSPIRATION — nye vinkler at overveje]</w:t>
+      </w:r>
+    </w:p>
+    <w:p>
+      <w:pPr>
+        <w:pStyle w:val="BodyText"/>
+      </w:pPr>
+      <w:r>
+        <w:rPr>
+          <w:iCs/>
+          <w:i/>
+        </w:rPr>
+        <w:t xml:space="preserve">Trangen til at gøre noget melder sig næsten altid på et tidspunkt — særligt når processen virker langsom eller uklar. At kunne mærke trangen og lade den passere uden at handle på den er en disciplin der modnes over år. Det er ikke fravær af intention; det er valg.</w:t>
+      </w:r>
+    </w:p>
+    <w:p>
+      <w:pPr>
+        <w:pStyle w:val="BodyText"/>
+      </w:pPr>
+      <w:r>
+        <w:rPr>
+          <w:iCs/>
+          <w:i/>
+        </w:rPr>
+        <w:t xml:space="preserve">Tålmodighed er ikke passivitet. Den passive behandler er fraværende, fjern, måske endda kedet. Den tålmodige behandler er fuldt til stede, opmærksom, engageret — bare uden at presse. Det er en aktiv venten, en tilstedeværelse der har givet slip på resultatet uden at give slip på engagementet.</w:t>
+      </w:r>
+    </w:p>
+    <w:p>
+      <w:pPr>
+        <w:pStyle w:val="BodyText"/>
+      </w:pPr>
+      <w:r>
+        <w:rPr>
+          <w:iCs/>
+          <w:i/>
+        </w:rPr>
+        <w:t xml:space="preserve">Uvisheden er ikke en ulempe ved arbejdet — den er noget af det vi arbejder med. Den åbner det rum hvor klientens system kan vise hvad vi ikke kunne forestille os. At kunne hvile i ikke-at-vide er ikke det samme som at være forvirret; det er at have plads til at blive overrasket.</w:t>
+      </w:r>
+    </w:p>
+    <w:p>
+      <w:pPr>
+        <w:pStyle w:val="BodyText"/>
+      </w:pPr>
+      <w:r>
+        <w:rPr>
+          <w:iCs/>
+          <w:i/>
+        </w:rPr>
+        <w:t xml:space="preserve">Den unge behandler tror ofte at uvisheden er tegn på manglende kompetence. Den modne behandler genkender den som signal om at processen er åben. Skiftet fra at fortolke uvished som mangel til at læse den som mulighed er en af de vigtigste indre forskydninger i behandlerens udvikling.</w:t>
+      </w:r>
+    </w:p>
+    <w:p>
+      <w:pPr>
+        <w:pStyle w:val="BodyText"/>
+      </w:pPr>
+      <w:r>
+        <w:rPr>
+          <w:iCs/>
+          <w:i/>
+        </w:rPr>
+        <w:t xml:space="preserve">Når vi mister tålmodigheden uden at vide det, viser det sig ofte som en forhastet konklusion — vi tror vi har forstået processen, og hænderne begynder at arbejde ud fra denne forståelse. Det er præcis i dette øjeblik, at vi mister kontakten med det der faktisk er ved at ske.</w:t>
+      </w:r>
+    </w:p>
+    <w:p>
+      <w:pPr>
+        <w:pStyle w:val="BodyText"/>
+      </w:pPr>
+      <w:r>
+        <w:rPr>
+          <w:iCs/>
+          <w:i/>
+        </w:rPr>
+        <w:t xml:space="preserve">Nogle klienters processer udfolder sig i løbet af minutter; andres tager hele behandlinger eller endda flere sessioner. Tålmodigheden tilpasser sig dette individuelle tempo. At forsøge at fremskynde en langsom proces eller bremse en hurtig er at gå på tværs af systemets egen visdom.</w:t>
+      </w:r>
+    </w:p>
+    <w:p>
+      <w:pPr>
+        <w:pStyle w:val="BodyText"/>
+      </w:pPr>
+      <w:r>
+        <w:rPr>
+          <w:iCs/>
+          <w:i/>
+        </w:rPr>
+        <w:t xml:space="preserve">Når processen ser ud til at gå i stå midt i en behandling, kan minutterne føles meget lange. Klientens tavshed, vores eget åndedrag, tikkende klokker, det hele bliver tydeligt. Det er ofte præcis i denne tilsyneladende tomhed, at den dybeste integration foregår.</w:t>
+      </w:r>
+    </w:p>
+    <w:p>
+      <w:pPr>
+        <w:pStyle w:val="BodyText"/>
+      </w:pPr>
+      <w:r>
+        <w:rPr>
+          <w:bCs/>
+          <w:b/>
+        </w:rPr>
         <w:t xml:space="preserve">[REFLEKSIONSSPØRGSMÅL]</w:t>
       </w:r>
     </w:p>
@@ -11381,6 +11800,144 @@
           <w:bCs/>
           <w:b/>
         </w:rPr>
+        <w:t xml:space="preserve">[INSPIRATION — nye vinkler at overveje]</w:t>
+      </w:r>
+    </w:p>
+    <w:p>
+      <w:pPr>
+        <w:pStyle w:val="BodyText"/>
+      </w:pPr>
+      <w:r>
+        <w:rPr>
+          <w:iCs/>
+          <w:i/>
+        </w:rPr>
+        <w:t xml:space="preserve">Helhedens invitation viser sig sjældent som et råb. Oftere er det en svag trækning af opmærksomheden mod et område, en fornemmelse af at hænderne</w:t>
+      </w:r>
+      <w:r>
+        <w:rPr>
+          <w:iCs/>
+          <w:i/>
+        </w:rPr>
+        <w:t xml:space="preserve"> </w:t>
+      </w:r>
+      <w:r>
+        <w:rPr>
+          <w:iCs/>
+          <w:i/>
+        </w:rPr>
+        <w:t xml:space="preserve">‘</w:t>
+      </w:r>
+      <w:r>
+        <w:rPr>
+          <w:iCs/>
+          <w:i/>
+        </w:rPr>
+        <w:t xml:space="preserve">falder</w:t>
+      </w:r>
+      <w:r>
+        <w:rPr>
+          <w:iCs/>
+          <w:i/>
+        </w:rPr>
+        <w:t xml:space="preserve">’</w:t>
+      </w:r>
+      <w:r>
+        <w:rPr>
+          <w:iCs/>
+          <w:i/>
+        </w:rPr>
+        <w:t xml:space="preserve"> </w:t>
+      </w:r>
+      <w:r>
+        <w:rPr>
+          <w:iCs/>
+          <w:i/>
+        </w:rPr>
+        <w:t xml:space="preserve">et bestemt sted hen, en let resonans i feltet. At kunne mærke disse subtile pegne kræver en lyttende kvalitet, ikke en søgende.</w:t>
+      </w:r>
+    </w:p>
+    <w:p>
+      <w:pPr>
+        <w:pStyle w:val="BodyText"/>
+      </w:pPr>
+      <w:r>
+        <w:rPr>
+          <w:iCs/>
+          <w:i/>
+        </w:rPr>
+        <w:t xml:space="preserve">Klientens beskrevne symptom og kroppens prioritet falder ikke altid sammen. En klient med skuldersmerter kan have et system der kalder mod bækkenet eller åndedrættet. At kunne lytte forbi det tydelige symptom uden at ignorere klientens lidelse er en finstemt klinisk balancegang.</w:t>
+      </w:r>
+    </w:p>
+    <w:p>
+      <w:pPr>
+        <w:pStyle w:val="BodyText"/>
+      </w:pPr>
+      <w:r>
+        <w:rPr>
+          <w:iCs/>
+          <w:i/>
+        </w:rPr>
+        <w:t xml:space="preserve">Helheden synes at have sin egen rangordning af hvad der skal løses først. Det er sjældent vi kan forstå rationalet bagved — men når vi følger det, viser efterfølgende behandlinger ofte at den valgte vej var mere effektiv end den vi ville have valgt rationelt.</w:t>
+      </w:r>
+    </w:p>
+    <w:p>
+      <w:pPr>
+        <w:pStyle w:val="BodyText"/>
+      </w:pPr>
+      <w:r>
+        <w:rPr>
+          <w:iCs/>
+          <w:i/>
+        </w:rPr>
+        <w:t xml:space="preserve">Et område der afviser arbejde, har en bestemt kvalitet under hænderne. Det er ikke spændt eller modstandsfuldt på den almindelige måde — det er stille, lukket, ikke til stede. At forveksle denne afvisning med modstand og forsøge at presse igennem er en af de almindelige kliniske fejl.</w:t>
+      </w:r>
+    </w:p>
+    <w:p>
+      <w:pPr>
+        <w:pStyle w:val="BodyText"/>
+      </w:pPr>
+      <w:r>
+        <w:rPr>
+          <w:iCs/>
+          <w:i/>
+        </w:rPr>
+        <w:t xml:space="preserve">Det kræver tillid at lade systemet vælge. Vi har lært at diagnosticere, at se sammenhænge, at lægge planer. At lade alt dette træde tilbage og lade kroppen pege er en omvendt logik. Det føles ofte forkert i begyndelsen — og bliver med tiden den eneste rigtige vej.</w:t>
+      </w:r>
+    </w:p>
+    <w:p>
+      <w:pPr>
+        <w:pStyle w:val="BodyText"/>
+      </w:pPr>
+      <w:r>
+        <w:rPr>
+          <w:iCs/>
+          <w:i/>
+        </w:rPr>
+        <w:t xml:space="preserve">Helhedens prioritering kan ændre sig undervejs. Det område der inviterede ved behandlingens start, kan være færdigt halvvejs igennem, og noget andet træder frem. At følge denne forskydning frem for at holde fast i den oprindelige plan er en del af det dynamiske arbejde.</w:t>
+      </w:r>
+    </w:p>
+    <w:p>
+      <w:pPr>
+        <w:pStyle w:val="BodyText"/>
+      </w:pPr>
+      <w:r>
+        <w:rPr>
+          <w:iCs/>
+          <w:i/>
+        </w:rPr>
+        <w:t xml:space="preserve">Når vi virkelig giver helheden lov til at lede, er der øjeblikke hvor behandlingen tager retninger der overrasker os. Klienten klagede over et knæ, og pludselig er det åndedrættet der frigøres. Det er sjældent vi kunne have forudsagt det — og næsten altid mere virkningsfuldt end det vi havde planlagt.</w:t>
+      </w:r>
+    </w:p>
+    <w:p>
+      <w:pPr>
+        <w:pStyle w:val="BodyText"/>
+      </w:pPr>
+      <w:r>
+        <w:rPr>
+          <w:bCs/>
+          <w:b/>
+        </w:rPr>
         <w:t xml:space="preserve">[REFLEKSIONSSPØRGSMÅL]</w:t>
       </w:r>
     </w:p>
@@ -11480,6 +12037,102 @@
           <w:bCs/>
           <w:b/>
         </w:rPr>
+        <w:t xml:space="preserve">[INSPIRATION — nye vinkler at overveje]</w:t>
+      </w:r>
+    </w:p>
+    <w:p>
+      <w:pPr>
+        <w:pStyle w:val="BodyText"/>
+      </w:pPr>
+      <w:r>
+        <w:rPr>
+          <w:iCs/>
+          <w:i/>
+        </w:rPr>
+        <w:t xml:space="preserve">Synkroniseringen kræver konstant mikroskopiske justeringer. Vævets retning ændrer sig let, hastigheden skifter, kvaliteten varierer. Hænderne er ikke statiske — de er i levende dialog med bevægelsen, justerer sig fra øjeblik til øjeblik uden at klienten registrerer det som aktivt arbejde fra vores side.</w:t>
+      </w:r>
+    </w:p>
+    <w:p>
+      <w:pPr>
+        <w:pStyle w:val="BodyText"/>
+      </w:pPr>
+      <w:r>
+        <w:rPr>
+          <w:iCs/>
+          <w:i/>
+        </w:rPr>
+        <w:t xml:space="preserve">Forskellen mellem at følge og at lede er ofte meget lille. En lille fremskubning af hånden, en mikroskopisk forventning om hvor bevægelsen skal hen — og pludselig er vi gået fra synkron til styrende. At kunne mærke denne grænse, og blive på den rigtige side, er en finstemt færdighed.</w:t>
+      </w:r>
+    </w:p>
+    <w:p>
+      <w:pPr>
+        <w:pStyle w:val="BodyText"/>
+      </w:pPr>
+      <w:r>
+        <w:rPr>
+          <w:iCs/>
+          <w:i/>
+        </w:rPr>
+        <w:t xml:space="preserve">Når synkroniseringen brydes, mærkes det ofte først som en let modstand i vævet — som om kroppen registrerer at vi ikke længere er med. Det kan også vise sig som at bevægelsen taber kvalitet, bliver mindre koherent, eller stopper helt. Disse er signaler om at finde tilbage til lytten.</w:t>
+      </w:r>
+    </w:p>
+    <w:p>
+      <w:pPr>
+        <w:pStyle w:val="BodyText"/>
+      </w:pPr>
+      <w:r>
+        <w:rPr>
+          <w:iCs/>
+          <w:i/>
+        </w:rPr>
+        <w:t xml:space="preserve">Når kroppen vælger ekstremt langsom bevægelse, kommunikerer den noget. Det kan være om at integration kræver tid, om at processen er på et følsomt sted, om at systemet beder os om at sænke vores eget tempo. At respektere denne langsomhed uden at forsøge at opmuntre den er at høre hvad der bliver sagt.</w:t>
+      </w:r>
+    </w:p>
+    <w:p>
+      <w:pPr>
+        <w:pStyle w:val="BodyText"/>
+      </w:pPr>
+      <w:r>
+        <w:rPr>
+          <w:iCs/>
+          <w:i/>
+        </w:rPr>
+        <w:t xml:space="preserve">Trangen til at hjælpe bevægelsen videre melder sig ofte når den er allermest langsom eller stopper helt. Det er præcis her, at vi forstyrrer mest. At kunne mærke trangen som signal om at gøre mindre, ikke mere, er en af de modige indre vendinger i behandlingen.</w:t>
+      </w:r>
+    </w:p>
+    <w:p>
+      <w:pPr>
+        <w:pStyle w:val="BodyText"/>
+      </w:pPr>
+      <w:r>
+        <w:rPr>
+          <w:iCs/>
+          <w:i/>
+        </w:rPr>
+        <w:t xml:space="preserve">Nogle klienters væv bevæger sig så hurtigt at vores opmærksomhed knap kan følge med; andres så langsomt at vi tror der ingen bevægelse er. Synkroniseringen tilpasser sig dette individuelle tempo. Den rigtige hastighed er aldrig vores; den tilhører altid systemet vi sidder hos.</w:t>
+      </w:r>
+    </w:p>
+    <w:p>
+      <w:pPr>
+        <w:pStyle w:val="BodyText"/>
+      </w:pPr>
+      <w:r>
+        <w:rPr>
+          <w:iCs/>
+          <w:i/>
+        </w:rPr>
+        <w:t xml:space="preserve">En pause i bevægelsen er ikke fravær af bevægelse — det er bevægelse der har skiftet niveau. Mens den ydre form står stille, sker der ofte noget på et finere lag. At kunne være i pausen uden at fylde den er at give plads til denne skjulte bevægelse.</w:t>
+      </w:r>
+    </w:p>
+    <w:p>
+      <w:pPr>
+        <w:pStyle w:val="BodyText"/>
+      </w:pPr>
+      <w:r>
+        <w:rPr>
+          <w:bCs/>
+          <w:b/>
+        </w:rPr>
         <w:t xml:space="preserve">[REFLEKSIONSSPØRGSMÅL]</w:t>
       </w:r>
     </w:p>
@@ -11561,6 +12214,102 @@
           <w:bCs/>
           <w:b/>
         </w:rPr>
+        <w:t xml:space="preserve">[INSPIRATION — nye vinkler at overveje]</w:t>
+      </w:r>
+    </w:p>
+    <w:p>
+      <w:pPr>
+        <w:pStyle w:val="BodyText"/>
+      </w:pPr>
+      <w:r>
+        <w:rPr>
+          <w:iCs/>
+          <w:i/>
+        </w:rPr>
+        <w:t xml:space="preserve">Hvordan hænderne lander, er allerede en kommunikation. Vægten af kontakten, tempoet, retningen — alt sender signaler ind i klientens system. Ofte mærker klientens nervesystem hvad der er muligt eller ikke muligt i de første sekunder, før der er begyndt egentlig behandling.</w:t>
+      </w:r>
+    </w:p>
+    <w:p>
+      <w:pPr>
+        <w:pStyle w:val="BodyText"/>
+      </w:pPr>
+      <w:r>
+        <w:rPr>
+          <w:iCs/>
+          <w:i/>
+        </w:rPr>
+        <w:t xml:space="preserve">Berøringen er et sprog uden ord, og det taler hele tiden. Hver sekund kommunikerer vores hænder noget om vores tilstand, vores intention, vores nærvær. Klienten registrerer dette på et niveau der ligger under det bevidste, men der bliver hørt — og responderet på.</w:t>
+      </w:r>
+    </w:p>
+    <w:p>
+      <w:pPr>
+        <w:pStyle w:val="BodyText"/>
+      </w:pPr>
+      <w:r>
+        <w:rPr>
+          <w:iCs/>
+          <w:i/>
+        </w:rPr>
+        <w:t xml:space="preserve">Blød berøring og kollapset berøring er ikke det samme. Den bløde har form, struktur, klar tilstedeværelse — bare uden tryk. Den kollapsede har mistet sit center, sin retning. Klientens system genkender forskellen øjeblikkeligt og responderer kun på den første.</w:t>
+      </w:r>
+    </w:p>
+    <w:p>
+      <w:pPr>
+        <w:pStyle w:val="BodyText"/>
+      </w:pPr>
+      <w:r>
+        <w:rPr>
+          <w:iCs/>
+          <w:i/>
+        </w:rPr>
+        <w:t xml:space="preserve">Klientens første response på vores berøring fortæller meget. Et åbent system folder sig let ud; et lukket trækker sig let; et oversensitivt overreagerer. Disse første signaler er ofte de vigtigste i hele sessionen — de viser hvilken kvalitet af berøring resten af behandlingen kalder på.</w:t>
+      </w:r>
+    </w:p>
+    <w:p>
+      <w:pPr>
+        <w:pStyle w:val="BodyText"/>
+      </w:pPr>
+      <w:r>
+        <w:rPr>
+          <w:iCs/>
+          <w:i/>
+        </w:rPr>
+        <w:t xml:space="preserve">Klienter har vidt forskellige tærskler for berøringskvalitet. Den traumatiserede kan opfatte selv let kontakt som invasion; den somatisk lukkede kan have brug for tydeligere kontakt for overhovedet at registrere os. At kunne læse den individuelle tærskel og tilpasse berøringen er en del af det kliniske håndværk.</w:t>
+      </w:r>
+    </w:p>
+    <w:p>
+      <w:pPr>
+        <w:pStyle w:val="BodyText"/>
+      </w:pPr>
+      <w:r>
+        <w:rPr>
+          <w:iCs/>
+          <w:i/>
+        </w:rPr>
+        <w:t xml:space="preserve">Kvaliteten af berøring er noget vi øver, ikke noget vi er. Det er en daglig praksis — at mærke hvad hænderne gør, justere, lære. Selv erfarne behandlere kan opdage at deres berøring er blevet mekanisk eller distraheret, og må vende tilbage til den grundlæggende kvalitet igen.</w:t>
+      </w:r>
+    </w:p>
+    <w:p>
+      <w:pPr>
+        <w:pStyle w:val="BodyText"/>
+      </w:pPr>
+      <w:r>
+        <w:rPr>
+          <w:iCs/>
+          <w:i/>
+        </w:rPr>
+        <w:t xml:space="preserve">Den neutrale berøring er ikke fravær af kvalitet — den er en bestemt kvalitet. Den har en aktiv tilstedeværelse uden bestemt retning, en åbenhed der er etableret med præcision. Klienten kan mærke forskellen mellem en behandler der bare lægger hænderne på, og en der har valgt sin neutralitet.</w:t>
+      </w:r>
+    </w:p>
+    <w:p>
+      <w:pPr>
+        <w:pStyle w:val="BodyText"/>
+      </w:pPr>
+      <w:r>
+        <w:rPr>
+          <w:bCs/>
+          <w:b/>
+        </w:rPr>
         <w:t xml:space="preserve">[REFLEKSIONSSPØRGSMÅL]</w:t>
       </w:r>
     </w:p>
@@ -11631,6 +12380,186 @@
       </w:pPr>
       <w:r>
         <w:t xml:space="preserve">Den naturlige afslutning har sin egen kvalitet — en fornemmelse af fuldførelse, af at cirklen er sluttet for denne gang. Dette sker sjældent præcis når klokken siger sessionen skal slutte. At kunne genkende og respektere denne naturlige afslutning frem for at følge klokken kræver både erfaring og tillid til processen.</w:t>
+      </w:r>
+    </w:p>
+    <w:p>
+      <w:pPr>
+        <w:pStyle w:val="BodyText"/>
+      </w:pPr>
+      <w:r>
+        <w:rPr>
+          <w:bCs/>
+          <w:b/>
+        </w:rPr>
+        <w:t xml:space="preserve">[INSPIRATION — nye vinkler at overveje]</w:t>
+      </w:r>
+    </w:p>
+    <w:p>
+      <w:pPr>
+        <w:pStyle w:val="BodyText"/>
+      </w:pPr>
+      <w:r>
+        <w:rPr>
+          <w:iCs/>
+          <w:i/>
+        </w:rPr>
+        <w:t xml:space="preserve">Mod slutningen af en optimal behandling viser der sig ofte en bestemt kvalitet — en bølge af integration der er ved at folde sig ud. Hænderne mærker det som en samlende bevægelse, en slags hjemkomst. At genkende denne bølge er ofte tegnet på at behandlingen nærmer sig sin naturlige afslutning.</w:t>
+      </w:r>
+    </w:p>
+    <w:p>
+      <w:pPr>
+        <w:pStyle w:val="BodyText"/>
+      </w:pPr>
+      <w:r>
+        <w:rPr>
+          <w:iCs/>
+          <w:i/>
+        </w:rPr>
+        <w:t xml:space="preserve">Mætning har en specifik kvalitet i vævet — en fylde der er begyndt at lukke sig. Det er ikke modstand men signalering om at systemet har modtaget hvad det kan absorbere lige nu. At kunne mærke denne kvalitet og respektere den er en del af det differentierede arbejde.</w:t>
+      </w:r>
+    </w:p>
+    <w:p>
+      <w:pPr>
+        <w:pStyle w:val="BodyText"/>
+      </w:pPr>
+      <w:r>
+        <w:rPr>
+          <w:iCs/>
+          <w:i/>
+        </w:rPr>
+        <w:t xml:space="preserve">En for kort behandling efterlader processen uden at have nået integration; en for lang overstrækker kapaciteten. Begge kan virke kontraproduktivt. Den rigtige længde er sjældent den klokken angiver — den er den klientens system selv definerer gennem sine subtile signaler.</w:t>
+      </w:r>
+    </w:p>
+    <w:p>
+      <w:pPr>
+        <w:pStyle w:val="BodyText"/>
+      </w:pPr>
+      <w:r>
+        <w:rPr>
+          <w:iCs/>
+          <w:i/>
+        </w:rPr>
+        <w:t xml:space="preserve">Når vi har overskredet systemets kapacitet, mister behandlingen ofte sin friskhed. Vævet bliver mindre responsivt, energien i feltet aftager, kvaliteten der var der midtvejs forsvinder. At kunne registrere denne kvalitative ændring og afslutte i stedet for at fortsætte er en del af håndværket.</w:t>
+      </w:r>
+    </w:p>
+    <w:p>
+      <w:pPr>
+        <w:pStyle w:val="BodyText"/>
+      </w:pPr>
+      <w:r>
+        <w:rPr>
+          <w:iCs/>
+          <w:i/>
+        </w:rPr>
+        <w:t xml:space="preserve">Det kræver mod at afslutte en behandling før klokken siger det er tid. Vi har lært at give</w:t>
+      </w:r>
+      <w:r>
+        <w:rPr>
+          <w:iCs/>
+          <w:i/>
+        </w:rPr>
+        <w:t xml:space="preserve"> </w:t>
+      </w:r>
+      <w:r>
+        <w:rPr>
+          <w:iCs/>
+          <w:i/>
+        </w:rPr>
+        <w:t xml:space="preserve">‘</w:t>
+      </w:r>
+      <w:r>
+        <w:rPr>
+          <w:iCs/>
+          <w:i/>
+        </w:rPr>
+        <w:t xml:space="preserve">fuld behandling</w:t>
+      </w:r>
+      <w:r>
+        <w:rPr>
+          <w:iCs/>
+          <w:i/>
+        </w:rPr>
+        <w:t xml:space="preserve">’</w:t>
+      </w:r>
+      <w:r>
+        <w:rPr>
+          <w:iCs/>
+          <w:i/>
+        </w:rPr>
+        <w:t xml:space="preserve"> </w:t>
+      </w:r>
+      <w:r>
+        <w:rPr>
+          <w:iCs/>
+          <w:i/>
+        </w:rPr>
+        <w:t xml:space="preserve">og kan opleve det som mangelfuldt at slutte tidligt. Men når systemet er færdigt, er det færdigt — og at trække sessionen er at gå på tværs af det vi netop har skabt.</w:t>
+      </w:r>
+    </w:p>
+    <w:p>
+      <w:pPr>
+        <w:pStyle w:val="BodyText"/>
+      </w:pPr>
+      <w:r>
+        <w:rPr>
+          <w:iCs/>
+          <w:i/>
+        </w:rPr>
+        <w:t xml:space="preserve">Samme klient kan have brug for forskellig længde i forskellige sessioner. Den ene gang er behandlingen færdig efter 30 minutter, den næste skal der bruges fulde 75. At kunne tilpasse sig disse variationer uden at spørge</w:t>
+      </w:r>
+      <w:r>
+        <w:rPr>
+          <w:iCs/>
+          <w:i/>
+        </w:rPr>
+        <w:t xml:space="preserve"> </w:t>
+      </w:r>
+      <w:r>
+        <w:rPr>
+          <w:iCs/>
+          <w:i/>
+        </w:rPr>
+        <w:t xml:space="preserve">‘</w:t>
+      </w:r>
+      <w:r>
+        <w:rPr>
+          <w:iCs/>
+          <w:i/>
+        </w:rPr>
+        <w:t xml:space="preserve">hvad har de betalt for</w:t>
+      </w:r>
+      <w:r>
+        <w:rPr>
+          <w:iCs/>
+          <w:i/>
+        </w:rPr>
+        <w:t xml:space="preserve">’</w:t>
+      </w:r>
+      <w:r>
+        <w:rPr>
+          <w:iCs/>
+          <w:i/>
+        </w:rPr>
+        <w:t xml:space="preserve"> </w:t>
+      </w:r>
+      <w:r>
+        <w:rPr>
+          <w:iCs/>
+          <w:i/>
+        </w:rPr>
+        <w:t xml:space="preserve">er en del af den kliniske respekt for processen.</w:t>
+      </w:r>
+    </w:p>
+    <w:p>
+      <w:pPr>
+        <w:pStyle w:val="BodyText"/>
+      </w:pPr>
+      <w:r>
+        <w:rPr>
+          <w:iCs/>
+          <w:i/>
+        </w:rPr>
+        <w:t xml:space="preserve">Efter den aktive del af behandlingen kommer ofte en integrationsfase, hvor systemet sætter sig. Denne fase kan ligne afslutning, men kalder på at vi bliver siddende et øjeblik mere — uden at arbejde, uden at udløse noget, blot som vidne til at processen finder sin egen ro.</w:t>
       </w:r>
     </w:p>
     <w:p>

</xml_diff>